<commit_message>
Deploying to gh-pages from @ Morrison-Lab/sds@f3b9b50a899f57825c542a014e391979c32d7a56 🚀
</commit_message>
<xml_diff>
--- a/categorical-tests-handout.docx
+++ b/categorical-tests-handout.docx
@@ -15,7 +15,7 @@
         <w:pStyle w:val="Date"/>
       </w:pPr>
       <w:r>
-        <w:t xml:space="preserve">Last modified: 2026-10-19 03:33:48 (PDT)</w:t>
+        <w:t xml:space="preserve">Last modified: 2026-10-19 03:48:43 (PDT)</w:t>
       </w:r>
     </w:p>
     <w:p>
@@ -386,7 +386,7 @@
       </w:r>
     </w:p>
     <w:bookmarkEnd w:id="11"/>
-    <w:bookmarkStart w:id="32" w:name="sec-two-group-categorical"/>
+    <w:bookmarkStart w:id="47" w:name="sec-two-group-categorical"/>
     <w:p>
       <w:pPr>
         <w:pStyle w:val="Heading2"/>
@@ -5006,7 +5006,7 @@
       </w:r>
     </w:p>
     <w:bookmarkEnd w:id="29"/>
-    <w:bookmarkStart w:id="31" w:name="sec-2x2-measures"/>
+    <w:bookmarkStart w:id="46" w:name="sec-2x2-measures"/>
     <w:p>
       <w:pPr>
         <w:pStyle w:val="Heading3"/>
@@ -5055,19 +5055,90 @@
         <w:t xml:space="preserve"> </w:t>
       </w:r>
       <w:r>
-        <w:t xml:space="preserve">Risk differences, risk ratios, and odds ratios measure the strength</w:t>
-      </w:r>
-      <w:r>
-        <w:t xml:space="preserve"> </w:t>
-      </w:r>
-      <w:r>
-        <w:t xml:space="preserve">of the association;</w:t>
-      </w:r>
-      <w:r>
-        <w:t xml:space="preserve"> </w:t>
-      </w:r>
-      <w:r>
-        <w:t xml:space="preserve">see</w:t>
+        <w:t xml:space="preserve">The</w:t>
+      </w:r>
+      <w:r>
+        <w:t xml:space="preserve"> </w:t>
+      </w:r>
+      <w:hyperlink w:anchor="def-risk-difference">
+        <w:r>
+          <w:rPr>
+            <w:rStyle w:val="Hyperlink"/>
+          </w:rPr>
+          <w:t xml:space="preserve">risk difference</w:t>
+        </w:r>
+      </w:hyperlink>
+      <w:r>
+        <w:t xml:space="preserve">, the</w:t>
+      </w:r>
+      <w:r>
+        <w:t xml:space="preserve"> </w:t>
+      </w:r>
+      <w:hyperlink w:anchor="def-risk-ratio">
+        <w:r>
+          <w:rPr>
+            <w:rStyle w:val="Hyperlink"/>
+          </w:rPr>
+          <w:t xml:space="preserve">risk ratio</w:t>
+        </w:r>
+      </w:hyperlink>
+      <w:r>
+        <w:t xml:space="preserve"> </w:t>
+      </w:r>
+      <w:r>
+        <w:t xml:space="preserve">and the</w:t>
+      </w:r>
+      <w:r>
+        <w:t xml:space="preserve"> </w:t>
+      </w:r>
+      <w:hyperlink w:anchor="def-odds-ratio">
+        <w:r>
+          <w:rPr>
+            <w:rStyle w:val="Hyperlink"/>
+          </w:rPr>
+          <w:t xml:space="preserve">odds ratio</w:t>
+        </w:r>
+      </w:hyperlink>
+      <w:r>
+        <w:t xml:space="preserve"> </w:t>
+      </w:r>
+      <w:r>
+        <w:t xml:space="preserve">measure the strength of the association.</w:t>
+      </w:r>
+    </w:p>
+    <w:bookmarkStart w:id="33" w:name="def-outcome-risk"/>
+    <w:p>
+      <w:pPr>
+        <w:pStyle w:val="BodyText"/>
+      </w:pPr>
+      <w:r>
+        <w:rPr>
+          <w:b/>
+          <w:bCs/>
+        </w:rPr>
+        <w:t xml:space="preserve">Definition 4 (Risk of a binary outcome)</w:t>
+      </w:r>
+      <w:r>
+        <w:t xml:space="preserve"> </w:t>
+      </w:r>
+      <w:r>
+        <w:t xml:space="preserve">The</w:t>
+      </w:r>
+      <w:r>
+        <w:t xml:space="preserve"> </w:t>
+      </w:r>
+      <w:r>
+        <w:rPr>
+          <w:b/>
+          <w:bCs/>
+        </w:rPr>
+        <w:t xml:space="preserve">risk</w:t>
+      </w:r>
+      <w:r>
+        <w:t xml:space="preserve"> </w:t>
+      </w:r>
+      <w:r>
+        <w:t xml:space="preserve">of a</w:t>
       </w:r>
       <w:r>
         <w:t xml:space="preserve"> </w:t>
@@ -5077,18 +5148,2334 @@
           <w:rPr>
             <w:rStyle w:val="Hyperlink"/>
           </w:rPr>
-          <w:t xml:space="preserve">Odds Ratios and Relative Risks</w:t>
+          <w:t xml:space="preserve">binary</w:t>
         </w:r>
       </w:hyperlink>
       <w:r>
+        <w:t xml:space="preserve"> </w:t>
+      </w:r>
+      <w:r>
+        <w:t xml:space="preserve">outcome in a group</w:t>
+      </w:r>
+      <w:r>
+        <w:t xml:space="preserve"> </w:t>
+      </w:r>
+      <w:r>
+        <w:t xml:space="preserve">is the</w:t>
+      </w:r>
+      <w:r>
+        <w:t xml:space="preserve"> </w:t>
+      </w:r>
+      <w:hyperlink r:id="rId31">
+        <w:r>
+          <w:rPr>
+            <w:rStyle w:val="Hyperlink"/>
+          </w:rPr>
+          <w:t xml:space="preserve">probability</w:t>
+        </w:r>
+      </w:hyperlink>
+      <w:r>
+        <w:t xml:space="preserve"> </w:t>
+      </w:r>
+      <w:r>
+        <w:t xml:space="preserve">that a member of the group has the outcome.</w:t>
+      </w:r>
+    </w:p>
+    <w:p>
+      <w:pPr>
+        <w:pStyle w:val="BodyText"/>
+      </w:pPr>
+      <w:r>
+        <w:t xml:space="preserve">The risk lies in</w:t>
+      </w:r>
+      <w:r>
+        <w:t xml:space="preserve"> </w:t>
+      </w:r>
+      <m:oMath>
+        <m:r>
+          <m:rPr>
+            <m:sty m:val="p"/>
+          </m:rPr>
+          <m:t>[</m:t>
+        </m:r>
+        <m:r>
+          <m:t>0</m:t>
+        </m:r>
+        <m:r>
+          <m:rPr>
+            <m:sty m:val="p"/>
+          </m:rPr>
+          <m:t>,</m:t>
+        </m:r>
+        <m:r>
+          <m:t>1</m:t>
+        </m:r>
+        <m:r>
+          <m:rPr>
+            <m:sty m:val="p"/>
+          </m:rPr>
+          <m:t>]</m:t>
+        </m:r>
+      </m:oMath>
+      <w:r>
+        <w:t xml:space="preserve">, and its</w:t>
+      </w:r>
+      <w:r>
+        <w:t xml:space="preserve"> </w:t>
+      </w:r>
+      <w:hyperlink r:id="rId32">
+        <w:r>
+          <w:rPr>
+            <w:rStyle w:val="Hyperlink"/>
+          </w:rPr>
+          <w:t xml:space="preserve">maximum likelihood estimate</w:t>
+        </w:r>
+      </w:hyperlink>
+      <w:r>
+        <w:t xml:space="preserve"> </w:t>
+      </w:r>
+      <w:r>
+        <w:t xml:space="preserve">is the proportion of the group’s observations that have the outcome.</w:t>
+      </w:r>
+    </w:p>
+    <w:p>
+      <w:pPr>
+        <w:pStyle w:val="BodyText"/>
+      </w:pPr>
+      <w:r>
+        <w:t xml:space="preserve">Source:</w:t>
+      </w:r>
+      <w:r>
+        <w:t xml:space="preserve"> </w:t>
+      </w:r>
+      <w:r>
+        <w:t xml:space="preserve">Wikipedia contributors [7]</w:t>
+      </w:r>
+      <w:r>
         <w:t xml:space="preserve">.</w:t>
       </w:r>
     </w:p>
+    <w:bookmarkEnd w:id="33"/>
+    <w:bookmarkStart w:id="34" w:name="exm-hers-outcome-risk"/>
     <w:p>
       <w:pPr>
         <w:pStyle w:val="BodyText"/>
       </w:pPr>
       <w:r>
+        <w:rPr>
+          <w:b/>
+          <w:bCs/>
+        </w:rPr>
+        <w:t xml:space="preserve">Example 5 (Risk of regular exercise in each HERS treatment group)</w:t>
+      </w:r>
+      <w:r>
+        <w:t xml:space="preserve"> </w:t>
+      </w:r>
+      <w:r>
+        <w:t xml:space="preserve">In</w:t>
+      </w:r>
+      <w:r>
+        <w:t xml:space="preserve"> </w:t>
+      </w:r>
+      <w:hyperlink w:anchor="tbl-hers-crosstab">
+        <w:r>
+          <w:rPr>
+            <w:rStyle w:val="Hyperlink"/>
+          </w:rPr>
+          <w:t xml:space="preserve">Table 1</w:t>
+        </w:r>
+      </w:hyperlink>
+      <w:r>
+        <w:t xml:space="preserve">, the outcome is regular exercise at baseline.</w:t>
+      </w:r>
+      <w:r>
+        <w:t xml:space="preserve"> </w:t>
+      </w:r>
+      <w:r>
+        <w:t xml:space="preserve">The estimated</w:t>
+      </w:r>
+      <w:r>
+        <w:t xml:space="preserve"> </w:t>
+      </w:r>
+      <w:hyperlink w:anchor="def-outcome-risk">
+        <w:r>
+          <w:rPr>
+            <w:rStyle w:val="Hyperlink"/>
+          </w:rPr>
+          <w:t xml:space="preserve">risk</w:t>
+        </w:r>
+      </w:hyperlink>
+      <w:r>
+        <w:t xml:space="preserve"> </w:t>
+      </w:r>
+      <w:r>
+        <w:t xml:space="preserve">in each treatment group</w:t>
+      </w:r>
+      <w:r>
+        <w:t xml:space="preserve"> </w:t>
+      </w:r>
+      <w:r>
+        <w:t xml:space="preserve">is the proportion of that group’s column who exercise regularly:</w:t>
+      </w:r>
+    </w:p>
+    <w:p>
+      <w:pPr>
+        <w:pStyle w:val="SourceCode"/>
+      </w:pPr>
+      <w:r>
+        <w:rPr>
+          <w:rStyle w:val="NormalTok"/>
+        </w:rPr>
+        <w:t xml:space="preserve">risk_hat </w:t>
+      </w:r>
+      <w:r>
+        <w:rPr>
+          <w:rStyle w:val="OtherTok"/>
+        </w:rPr>
+        <w:t xml:space="preserve">&lt;-</w:t>
+      </w:r>
+      <w:r>
+        <w:rPr>
+          <w:rStyle w:val="NormalTok"/>
+        </w:rPr>
+        <w:t xml:space="preserve"> </w:t>
+      </w:r>
+      <w:r>
+        <w:rPr>
+          <w:rStyle w:val="FunctionTok"/>
+        </w:rPr>
+        <w:t xml:space="preserve">prop.table</w:t>
+      </w:r>
+      <w:r>
+        <w:rPr>
+          <w:rStyle w:val="NormalTok"/>
+        </w:rPr>
+        <w:t xml:space="preserve">(</w:t>
+      </w:r>
+      <w:r>
+        <w:rPr>
+          <w:rStyle w:val="FunctionTok"/>
+        </w:rPr>
+        <w:t xml:space="preserve">table</w:t>
+      </w:r>
+      <w:r>
+        <w:rPr>
+          <w:rStyle w:val="NormalTok"/>
+        </w:rPr>
+        <w:t xml:space="preserve">(hers</w:t>
+      </w:r>
+      <w:r>
+        <w:rPr>
+          <w:rStyle w:val="SpecialCharTok"/>
+        </w:rPr>
+        <w:t xml:space="preserve">$</w:t>
+      </w:r>
+      <w:r>
+        <w:rPr>
+          <w:rStyle w:val="NormalTok"/>
+        </w:rPr>
+        <w:t xml:space="preserve">exercise, hers</w:t>
+      </w:r>
+      <w:r>
+        <w:rPr>
+          <w:rStyle w:val="SpecialCharTok"/>
+        </w:rPr>
+        <w:t xml:space="preserve">$</w:t>
+      </w:r>
+      <w:r>
+        <w:rPr>
+          <w:rStyle w:val="NormalTok"/>
+        </w:rPr>
+        <w:t xml:space="preserve">HT), </w:t>
+      </w:r>
+      <w:r>
+        <w:rPr>
+          <w:rStyle w:val="AttributeTok"/>
+        </w:rPr>
+        <w:t xml:space="preserve">margin =</w:t>
+      </w:r>
+      <w:r>
+        <w:rPr>
+          <w:rStyle w:val="NormalTok"/>
+        </w:rPr>
+        <w:t xml:space="preserve"> </w:t>
+      </w:r>
+      <w:r>
+        <w:rPr>
+          <w:rStyle w:val="DecValTok"/>
+        </w:rPr>
+        <w:t xml:space="preserve">2</w:t>
+      </w:r>
+      <w:r>
+        <w:rPr>
+          <w:rStyle w:val="NormalTok"/>
+        </w:rPr>
+        <w:t xml:space="preserve">)[</w:t>
+      </w:r>
+      <w:r>
+        <w:rPr>
+          <w:rStyle w:val="StringTok"/>
+        </w:rPr>
+        <w:t xml:space="preserve">"yes"</w:t>
+      </w:r>
+      <w:r>
+        <w:rPr>
+          <w:rStyle w:val="NormalTok"/>
+        </w:rPr>
+        <w:t xml:space="preserve">, ]</w:t>
+      </w:r>
+      <w:r>
+        <w:br/>
+      </w:r>
+      <w:r>
+        <w:rPr>
+          <w:rStyle w:val="NormalTok"/>
+        </w:rPr>
+        <w:t xml:space="preserve">risk_hat</w:t>
+      </w:r>
+      <w:r>
+        <w:br/>
+      </w:r>
+      <w:r>
+        <w:rPr>
+          <w:rStyle w:val="CommentTok"/>
+        </w:rPr>
+        <w:t xml:space="preserve">#&gt;         placebo hormone therapy </w:t>
+      </w:r>
+      <w:r>
+        <w:br/>
+      </w:r>
+      <w:r>
+        <w:rPr>
+          <w:rStyle w:val="CommentTok"/>
+        </w:rPr>
+        <w:t xml:space="preserve">#&gt;        0.383225        0.389855</w:t>
+      </w:r>
+    </w:p>
+    <w:p>
+      <w:pPr>
+        <w:pStyle w:val="FirstParagraph"/>
+      </w:pPr>
+      <w:r>
+        <w:t xml:space="preserve">The estimated risk of regular exercise is</w:t>
+      </w:r>
+      <w:r>
+        <w:t xml:space="preserve"> </w:t>
+      </w:r>
+      <w:r>
+        <w:t xml:space="preserve">0.383 in the placebo group</w:t>
+      </w:r>
+      <w:r>
+        <w:t xml:space="preserve"> </w:t>
+      </w:r>
+      <w:r>
+        <w:t xml:space="preserve">and 0.39 in the hormone therapy group.</w:t>
+      </w:r>
+    </w:p>
+    <w:bookmarkEnd w:id="34"/>
+    <w:bookmarkStart w:id="35" w:name="def-reference-group"/>
+    <w:p>
+      <w:pPr>
+        <w:pStyle w:val="BodyText"/>
+      </w:pPr>
+      <w:r>
+        <w:rPr>
+          <w:b/>
+          <w:bCs/>
+        </w:rPr>
+        <w:t xml:space="preserve">Definition 5 (Reference group)</w:t>
+      </w:r>
+      <w:r>
+        <w:t xml:space="preserve"> </w:t>
+      </w:r>
+      <w:r>
+        <w:t xml:space="preserve">In a comparison of an outcome measure between two groups,</w:t>
+      </w:r>
+      <w:r>
+        <w:t xml:space="preserve"> </w:t>
+      </w:r>
+      <w:r>
+        <w:t xml:space="preserve">the</w:t>
+      </w:r>
+      <w:r>
+        <w:t xml:space="preserve"> </w:t>
+      </w:r>
+      <w:r>
+        <w:rPr>
+          <w:b/>
+          <w:bCs/>
+        </w:rPr>
+        <w:t xml:space="preserve">reference group</w:t>
+      </w:r>
+      <w:r>
+        <w:t xml:space="preserve"> </w:t>
+      </w:r>
+      <w:r>
+        <w:t xml:space="preserve">is the group whose measure is the subtrahend of a difference</w:t>
+      </w:r>
+      <w:r>
+        <w:t xml:space="preserve"> </w:t>
+      </w:r>
+      <w:r>
+        <w:t xml:space="preserve">or the denominator of a quotient.</w:t>
+      </w:r>
+      <w:r>
+        <w:t xml:space="preserve"> </w:t>
+      </w:r>
+      <w:r>
+        <w:t xml:space="preserve">The other group is the group being compared with it.</w:t>
+      </w:r>
+    </w:p>
+    <w:bookmarkEnd w:id="35"/>
+    <w:bookmarkStart w:id="36" w:name="exm-hers-reference-group"/>
+    <w:p>
+      <w:pPr>
+        <w:pStyle w:val="BodyText"/>
+      </w:pPr>
+      <w:r>
+        <w:rPr>
+          <w:b/>
+          <w:bCs/>
+        </w:rPr>
+        <w:t xml:space="preserve">Example 6 (The placebo group as the reference group in HERS)</w:t>
+      </w:r>
+      <w:r>
+        <w:t xml:space="preserve"> </w:t>
+      </w:r>
+      <w:r>
+        <w:t xml:space="preserve">To compare the</w:t>
+      </w:r>
+      <w:r>
+        <w:t xml:space="preserve"> </w:t>
+      </w:r>
+      <w:hyperlink w:anchor="def-outcome-risk">
+        <w:r>
+          <w:rPr>
+            <w:rStyle w:val="Hyperlink"/>
+          </w:rPr>
+          <w:t xml:space="preserve">risks</w:t>
+        </w:r>
+      </w:hyperlink>
+      <w:r>
+        <w:t xml:space="preserve"> </w:t>
+      </w:r>
+      <w:r>
+        <w:t xml:space="preserve">of regular exercise in</w:t>
+      </w:r>
+      <w:r>
+        <w:t xml:space="preserve"> </w:t>
+      </w:r>
+      <w:hyperlink w:anchor="exm-hers-outcome-risk">
+        <w:r>
+          <w:rPr>
+            <w:rStyle w:val="Hyperlink"/>
+          </w:rPr>
+          <w:t xml:space="preserve">Example 5</w:t>
+        </w:r>
+      </w:hyperlink>
+      <w:r>
+        <w:t xml:space="preserve">,</w:t>
+      </w:r>
+      <w:r>
+        <w:t xml:space="preserve"> </w:t>
+      </w:r>
+      <w:r>
+        <w:t xml:space="preserve">take the placebo group as the</w:t>
+      </w:r>
+      <w:r>
+        <w:t xml:space="preserve"> </w:t>
+      </w:r>
+      <w:hyperlink w:anchor="def-reference-group">
+        <w:r>
+          <w:rPr>
+            <w:rStyle w:val="Hyperlink"/>
+          </w:rPr>
+          <w:t xml:space="preserve">reference group</w:t>
+        </w:r>
+      </w:hyperlink>
+      <w:r>
+        <w:t xml:space="preserve"> </w:t>
+      </w:r>
+      <w:r>
+        <w:t xml:space="preserve">and the hormone therapy group as the group being compared with it.</w:t>
+      </w:r>
+      <w:r>
+        <w:t xml:space="preserve"> </w:t>
+      </w:r>
+      <w:r>
+        <w:t xml:space="preserve">Then a difference is hormone therapy minus placebo,</w:t>
+      </w:r>
+      <w:r>
+        <w:t xml:space="preserve"> </w:t>
+      </w:r>
+      <w:r>
+        <w:t xml:space="preserve">and a quotient is hormone therapy divided by placebo.</w:t>
+      </w:r>
+    </w:p>
+    <w:bookmarkEnd w:id="36"/>
+    <w:bookmarkStart w:id="37" w:name="def-risk-difference"/>
+    <w:p>
+      <w:pPr>
+        <w:pStyle w:val="BodyText"/>
+      </w:pPr>
+      <w:r>
+        <w:rPr>
+          <w:b/>
+          <w:bCs/>
+        </w:rPr>
+        <w:t xml:space="preserve">Definition 6 (Risk difference (also called the absolute risk reduction))</w:t>
+      </w:r>
+      <w:r>
+        <w:t xml:space="preserve"> </w:t>
+      </w:r>
+      <w:r>
+        <w:t xml:space="preserve">Let:</w:t>
+      </w:r>
+    </w:p>
+    <w:p>
+      <w:pPr>
+        <w:pStyle w:val="Compact"/>
+        <w:numPr>
+          <w:ilvl w:val="0"/>
+          <w:numId w:val="1003"/>
+        </w:numPr>
+      </w:pPr>
+      <m:oMath>
+        <m:sSub>
+          <m:e>
+            <m:r>
+              <m:t>π</m:t>
+            </m:r>
+          </m:e>
+          <m:sub>
+            <m:r>
+              <m:t>1</m:t>
+            </m:r>
+          </m:sub>
+        </m:sSub>
+      </m:oMath>
+      <w:r>
+        <w:t xml:space="preserve"> </w:t>
+      </w:r>
+      <w:r>
+        <w:t xml:space="preserve">be the</w:t>
+      </w:r>
+      <w:r>
+        <w:t xml:space="preserve"> </w:t>
+      </w:r>
+      <w:hyperlink w:anchor="def-outcome-risk">
+        <w:r>
+          <w:rPr>
+            <w:rStyle w:val="Hyperlink"/>
+          </w:rPr>
+          <w:t xml:space="preserve">risk</w:t>
+        </w:r>
+      </w:hyperlink>
+      <w:r>
+        <w:t xml:space="preserve"> </w:t>
+      </w:r>
+      <w:r>
+        <w:t xml:space="preserve">of a</w:t>
+      </w:r>
+      <w:r>
+        <w:t xml:space="preserve"> </w:t>
+      </w:r>
+      <w:hyperlink r:id="rId30">
+        <w:r>
+          <w:rPr>
+            <w:rStyle w:val="Hyperlink"/>
+          </w:rPr>
+          <w:t xml:space="preserve">binary</w:t>
+        </w:r>
+      </w:hyperlink>
+      <w:r>
+        <w:t xml:space="preserve"> </w:t>
+      </w:r>
+      <w:r>
+        <w:t xml:space="preserve">outcome in group 1.</w:t>
+      </w:r>
+    </w:p>
+    <w:p>
+      <w:pPr>
+        <w:pStyle w:val="Compact"/>
+        <w:numPr>
+          <w:ilvl w:val="0"/>
+          <w:numId w:val="1003"/>
+        </w:numPr>
+      </w:pPr>
+      <m:oMath>
+        <m:sSub>
+          <m:e>
+            <m:r>
+              <m:t>π</m:t>
+            </m:r>
+          </m:e>
+          <m:sub>
+            <m:r>
+              <m:t>2</m:t>
+            </m:r>
+          </m:sub>
+        </m:sSub>
+      </m:oMath>
+      <w:r>
+        <w:t xml:space="preserve"> </w:t>
+      </w:r>
+      <w:r>
+        <w:t xml:space="preserve">be the risk of the same outcome in the</w:t>
+      </w:r>
+      <w:r>
+        <w:t xml:space="preserve"> </w:t>
+      </w:r>
+      <w:hyperlink w:anchor="def-reference-group">
+        <w:r>
+          <w:rPr>
+            <w:rStyle w:val="Hyperlink"/>
+          </w:rPr>
+          <w:t xml:space="preserve">reference group</w:t>
+        </w:r>
+      </w:hyperlink>
+      <w:r>
+        <w:t xml:space="preserve">, group 2.</w:t>
+      </w:r>
+    </w:p>
+    <w:p>
+      <w:pPr>
+        <w:pStyle w:val="FirstParagraph"/>
+      </w:pPr>
+      <w:r>
+        <w:t xml:space="preserve">The</w:t>
+      </w:r>
+      <w:r>
+        <w:t xml:space="preserve"> </w:t>
+      </w:r>
+      <w:r>
+        <w:rPr>
+          <w:b/>
+          <w:bCs/>
+        </w:rPr>
+        <w:t xml:space="preserve">risk difference</w:t>
+      </w:r>
+      <w:r>
+        <w:t xml:space="preserve">, also called the</w:t>
+      </w:r>
+      <w:r>
+        <w:t xml:space="preserve"> </w:t>
+      </w:r>
+      <w:r>
+        <w:rPr>
+          <w:b/>
+          <w:bCs/>
+        </w:rPr>
+        <w:t xml:space="preserve">absolute risk reduction</w:t>
+      </w:r>
+      <w:r>
+        <w:t xml:space="preserve">, of group 1 compared with group 2 is</w:t>
+      </w:r>
+    </w:p>
+    <w:p>
+      <w:pPr>
+        <w:pStyle w:val="BodyText"/>
+      </w:pPr>
+      <m:oMathPara>
+        <m:oMathParaPr>
+          <m:jc m:val="center"/>
+        </m:oMathParaPr>
+        <m:oMath>
+          <m:r>
+            <m:rPr>
+              <m:sty m:val="p"/>
+            </m:rPr>
+            <m:t>RD</m:t>
+          </m:r>
+          <m:limUpp>
+            <m:e>
+              <m:r>
+                <m:rPr>
+                  <m:sty m:val="p"/>
+                </m:rPr>
+                <m:t>=</m:t>
+              </m:r>
+            </m:e>
+            <m:lim>
+              <m:r>
+                <m:rPr>
+                  <m:nor/>
+                  <m:sty m:val="p"/>
+                </m:rPr>
+                <m:t>def</m:t>
+              </m:r>
+            </m:lim>
+          </m:limUpp>
+          <m:sSub>
+            <m:e>
+              <m:r>
+                <m:t>π</m:t>
+              </m:r>
+            </m:e>
+            <m:sub>
+              <m:r>
+                <m:t>1</m:t>
+              </m:r>
+            </m:sub>
+          </m:sSub>
+          <m:r>
+            <m:rPr>
+              <m:sty m:val="p"/>
+            </m:rPr>
+            <m:t>−</m:t>
+          </m:r>
+          <m:sSub>
+            <m:e>
+              <m:r>
+                <m:t>π</m:t>
+              </m:r>
+            </m:e>
+            <m:sub>
+              <m:r>
+                <m:t>2</m:t>
+              </m:r>
+            </m:sub>
+          </m:sSub>
+          <m:r>
+            <m:rPr>
+              <m:sty m:val="p"/>
+            </m:rPr>
+            <m:t>∈</m:t>
+          </m:r>
+          <m:r>
+            <m:rPr>
+              <m:sty m:val="p"/>
+            </m:rPr>
+            <m:t>[</m:t>
+          </m:r>
+          <m:r>
+            <m:rPr>
+              <m:sty m:val="p"/>
+            </m:rPr>
+            <m:t>−</m:t>
+          </m:r>
+          <m:r>
+            <m:t>1</m:t>
+          </m:r>
+          <m:r>
+            <m:rPr>
+              <m:sty m:val="p"/>
+            </m:rPr>
+            <m:t>,</m:t>
+          </m:r>
+          <m:r>
+            <m:t>1</m:t>
+          </m:r>
+          <m:r>
+            <m:rPr>
+              <m:sty m:val="p"/>
+            </m:rPr>
+            <m:t>]</m:t>
+          </m:r>
+          <m:r>
+            <m:rPr>
+              <m:sty m:val="p"/>
+            </m:rPr>
+            <m:t>.</m:t>
+          </m:r>
+        </m:oMath>
+      </m:oMathPara>
+    </w:p>
+    <w:p>
+      <w:pPr>
+        <w:pStyle w:val="FirstParagraph"/>
+      </w:pPr>
+      <w:r>
+        <w:t xml:space="preserve">Source:</w:t>
+      </w:r>
+      <w:r>
+        <w:t xml:space="preserve"> </w:t>
+      </w:r>
+      <w:r>
+        <w:t xml:space="preserve">Wikipedia contributors [8]</w:t>
+      </w:r>
+      <w:r>
+        <w:t xml:space="preserve">.</w:t>
+      </w:r>
+    </w:p>
+    <w:bookmarkEnd w:id="37"/>
+    <w:bookmarkStart w:id="38" w:name="exm-hers-risk-difference"/>
+    <w:p>
+      <w:pPr>
+        <w:pStyle w:val="BodyText"/>
+      </w:pPr>
+      <w:r>
+        <w:rPr>
+          <w:b/>
+          <w:bCs/>
+        </w:rPr>
+        <w:t xml:space="preserve">Example 7 (Risk difference of regular exercise in HERS)</w:t>
+      </w:r>
+      <w:r>
+        <w:t xml:space="preserve"> </w:t>
+      </w:r>
+      <w:r>
+        <w:t xml:space="preserve">Take group 1 to be hormone therapy and group 2, the</w:t>
+      </w:r>
+      <w:r>
+        <w:t xml:space="preserve"> </w:t>
+      </w:r>
+      <w:hyperlink w:anchor="def-reference-group">
+        <w:r>
+          <w:rPr>
+            <w:rStyle w:val="Hyperlink"/>
+          </w:rPr>
+          <w:t xml:space="preserve">reference group</w:t>
+        </w:r>
+      </w:hyperlink>
+      <w:r>
+        <w:t xml:space="preserve">, to be placebo.</w:t>
+      </w:r>
+      <w:r>
+        <w:t xml:space="preserve"> </w:t>
+      </w:r>
+      <w:r>
+        <w:t xml:space="preserve">The estimated</w:t>
+      </w:r>
+      <w:r>
+        <w:t xml:space="preserve"> </w:t>
+      </w:r>
+      <w:hyperlink w:anchor="def-risk-difference">
+        <w:r>
+          <w:rPr>
+            <w:rStyle w:val="Hyperlink"/>
+          </w:rPr>
+          <w:t xml:space="preserve">risk difference</w:t>
+        </w:r>
+      </w:hyperlink>
+      <w:r>
+        <w:t xml:space="preserve"> </w:t>
+      </w:r>
+      <w:r>
+        <w:t xml:space="preserve">for the estimated</w:t>
+      </w:r>
+      <w:r>
+        <w:t xml:space="preserve"> </w:t>
+      </w:r>
+      <w:hyperlink w:anchor="def-outcome-risk">
+        <w:r>
+          <w:rPr>
+            <w:rStyle w:val="Hyperlink"/>
+          </w:rPr>
+          <w:t xml:space="preserve">risks</w:t>
+        </w:r>
+      </w:hyperlink>
+      <w:r>
+        <w:t xml:space="preserve"> </w:t>
+      </w:r>
+      <w:r>
+        <w:t xml:space="preserve">of</w:t>
+      </w:r>
+      <w:r>
+        <w:t xml:space="preserve"> </w:t>
+      </w:r>
+      <w:hyperlink w:anchor="exm-hers-outcome-risk">
+        <w:r>
+          <w:rPr>
+            <w:rStyle w:val="Hyperlink"/>
+          </w:rPr>
+          <w:t xml:space="preserve">Example 5</w:t>
+        </w:r>
+      </w:hyperlink>
+      <w:r>
+        <w:t xml:space="preserve"> </w:t>
+      </w:r>
+      <w:r>
+        <w:t xml:space="preserve">is:</w:t>
+      </w:r>
+    </w:p>
+    <w:p>
+      <w:pPr>
+        <w:pStyle w:val="SourceCode"/>
+      </w:pPr>
+      <w:r>
+        <w:rPr>
+          <w:rStyle w:val="NormalTok"/>
+        </w:rPr>
+        <w:t xml:space="preserve">rd_hat </w:t>
+      </w:r>
+      <w:r>
+        <w:rPr>
+          <w:rStyle w:val="OtherTok"/>
+        </w:rPr>
+        <w:t xml:space="preserve">&lt;-</w:t>
+      </w:r>
+      <w:r>
+        <w:rPr>
+          <w:rStyle w:val="NormalTok"/>
+        </w:rPr>
+        <w:t xml:space="preserve"> risk_hat[[</w:t>
+      </w:r>
+      <w:r>
+        <w:rPr>
+          <w:rStyle w:val="StringTok"/>
+        </w:rPr>
+        <w:t xml:space="preserve">"hormone therapy"</w:t>
+      </w:r>
+      <w:r>
+        <w:rPr>
+          <w:rStyle w:val="NormalTok"/>
+        </w:rPr>
+        <w:t xml:space="preserve">]] </w:t>
+      </w:r>
+      <w:r>
+        <w:rPr>
+          <w:rStyle w:val="SpecialCharTok"/>
+        </w:rPr>
+        <w:t xml:space="preserve">-</w:t>
+      </w:r>
+      <w:r>
+        <w:rPr>
+          <w:rStyle w:val="NormalTok"/>
+        </w:rPr>
+        <w:t xml:space="preserve"> risk_hat[[</w:t>
+      </w:r>
+      <w:r>
+        <w:rPr>
+          <w:rStyle w:val="StringTok"/>
+        </w:rPr>
+        <w:t xml:space="preserve">"placebo"</w:t>
+      </w:r>
+      <w:r>
+        <w:rPr>
+          <w:rStyle w:val="NormalTok"/>
+        </w:rPr>
+        <w:t xml:space="preserve">]]</w:t>
+      </w:r>
+      <w:r>
+        <w:br/>
+      </w:r>
+      <w:r>
+        <w:rPr>
+          <w:rStyle w:val="NormalTok"/>
+        </w:rPr>
+        <w:t xml:space="preserve">rd_hat</w:t>
+      </w:r>
+      <w:r>
+        <w:br/>
+      </w:r>
+      <w:r>
+        <w:rPr>
+          <w:rStyle w:val="CommentTok"/>
+        </w:rPr>
+        <w:t xml:space="preserve">#&gt; [1] 0.0066302</w:t>
+      </w:r>
+    </w:p>
+    <w:p>
+      <w:pPr>
+        <w:pStyle w:val="FirstParagraph"/>
+      </w:pPr>
+      <w:r>
+        <w:t xml:space="preserve">The estimated</w:t>
+      </w:r>
+      <w:r>
+        <w:t xml:space="preserve"> </w:t>
+      </w:r>
+      <w:hyperlink w:anchor="def-outcome-risk">
+        <w:r>
+          <w:rPr>
+            <w:rStyle w:val="Hyperlink"/>
+          </w:rPr>
+          <w:t xml:space="preserve">risk</w:t>
+        </w:r>
+      </w:hyperlink>
+      <w:r>
+        <w:t xml:space="preserve"> </w:t>
+      </w:r>
+      <w:r>
+        <w:t xml:space="preserve">of regular exercise is 0.007 higher</w:t>
+      </w:r>
+      <w:r>
+        <w:t xml:space="preserve"> </w:t>
+      </w:r>
+      <w:r>
+        <w:t xml:space="preserve">in the hormone therapy group than in the placebo group.</w:t>
+      </w:r>
+      <w:r>
+        <w:t xml:space="preserve"> </w:t>
+      </w:r>
+      <w:r>
+        <w:t xml:space="preserve">Multiplying by 100 gives 0.7 percentage points.</w:t>
+      </w:r>
+    </w:p>
+    <w:bookmarkEnd w:id="38"/>
+    <w:bookmarkStart w:id="39" w:name="def-risk-ratio"/>
+    <w:p>
+      <w:pPr>
+        <w:pStyle w:val="BodyText"/>
+      </w:pPr>
+      <w:r>
+        <w:rPr>
+          <w:b/>
+          <w:bCs/>
+        </w:rPr>
+        <w:t xml:space="preserve">Definition 7 (Risk ratio (also called the relative risk))</w:t>
+      </w:r>
+      <w:r>
+        <w:t xml:space="preserve"> </w:t>
+      </w:r>
+      <w:r>
+        <w:t xml:space="preserve">Let:</w:t>
+      </w:r>
+    </w:p>
+    <w:p>
+      <w:pPr>
+        <w:pStyle w:val="Compact"/>
+        <w:numPr>
+          <w:ilvl w:val="0"/>
+          <w:numId w:val="1004"/>
+        </w:numPr>
+      </w:pPr>
+      <m:oMath>
+        <m:sSub>
+          <m:e>
+            <m:r>
+              <m:t>π</m:t>
+            </m:r>
+          </m:e>
+          <m:sub>
+            <m:r>
+              <m:t>1</m:t>
+            </m:r>
+          </m:sub>
+        </m:sSub>
+      </m:oMath>
+      <w:r>
+        <w:t xml:space="preserve"> </w:t>
+      </w:r>
+      <w:r>
+        <w:t xml:space="preserve">be the</w:t>
+      </w:r>
+      <w:r>
+        <w:t xml:space="preserve"> </w:t>
+      </w:r>
+      <w:hyperlink w:anchor="def-outcome-risk">
+        <w:r>
+          <w:rPr>
+            <w:rStyle w:val="Hyperlink"/>
+          </w:rPr>
+          <w:t xml:space="preserve">risk</w:t>
+        </w:r>
+      </w:hyperlink>
+      <w:r>
+        <w:t xml:space="preserve"> </w:t>
+      </w:r>
+      <w:r>
+        <w:t xml:space="preserve">of a</w:t>
+      </w:r>
+      <w:r>
+        <w:t xml:space="preserve"> </w:t>
+      </w:r>
+      <w:hyperlink r:id="rId30">
+        <w:r>
+          <w:rPr>
+            <w:rStyle w:val="Hyperlink"/>
+          </w:rPr>
+          <w:t xml:space="preserve">binary</w:t>
+        </w:r>
+      </w:hyperlink>
+      <w:r>
+        <w:t xml:space="preserve"> </w:t>
+      </w:r>
+      <w:r>
+        <w:t xml:space="preserve">outcome in group 1.</w:t>
+      </w:r>
+    </w:p>
+    <w:p>
+      <w:pPr>
+        <w:pStyle w:val="Compact"/>
+        <w:numPr>
+          <w:ilvl w:val="0"/>
+          <w:numId w:val="1004"/>
+        </w:numPr>
+      </w:pPr>
+      <m:oMath>
+        <m:sSub>
+          <m:e>
+            <m:r>
+              <m:t>π</m:t>
+            </m:r>
+          </m:e>
+          <m:sub>
+            <m:r>
+              <m:t>2</m:t>
+            </m:r>
+          </m:sub>
+        </m:sSub>
+        <m:r>
+          <m:rPr>
+            <m:sty m:val="p"/>
+          </m:rPr>
+          <m:t>&gt;</m:t>
+        </m:r>
+        <m:r>
+          <m:t>0</m:t>
+        </m:r>
+      </m:oMath>
+      <w:r>
+        <w:t xml:space="preserve"> </w:t>
+      </w:r>
+      <w:r>
+        <w:t xml:space="preserve">be the risk of the same outcome in the</w:t>
+      </w:r>
+      <w:r>
+        <w:t xml:space="preserve"> </w:t>
+      </w:r>
+      <w:hyperlink w:anchor="def-reference-group">
+        <w:r>
+          <w:rPr>
+            <w:rStyle w:val="Hyperlink"/>
+          </w:rPr>
+          <w:t xml:space="preserve">reference group</w:t>
+        </w:r>
+      </w:hyperlink>
+      <w:r>
+        <w:t xml:space="preserve">, group 2.</w:t>
+      </w:r>
+    </w:p>
+    <w:p>
+      <w:pPr>
+        <w:pStyle w:val="FirstParagraph"/>
+      </w:pPr>
+      <w:r>
+        <w:t xml:space="preserve">The</w:t>
+      </w:r>
+      <w:r>
+        <w:t xml:space="preserve"> </w:t>
+      </w:r>
+      <w:r>
+        <w:rPr>
+          <w:b/>
+          <w:bCs/>
+        </w:rPr>
+        <w:t xml:space="preserve">risk ratio</w:t>
+      </w:r>
+      <w:r>
+        <w:t xml:space="preserve">, also called the</w:t>
+      </w:r>
+      <w:r>
+        <w:t xml:space="preserve"> </w:t>
+      </w:r>
+      <w:r>
+        <w:rPr>
+          <w:b/>
+          <w:bCs/>
+        </w:rPr>
+        <w:t xml:space="preserve">relative risk</w:t>
+      </w:r>
+      <w:r>
+        <w:t xml:space="preserve">, of group 1 compared with group 2 is</w:t>
+      </w:r>
+    </w:p>
+    <w:p>
+      <w:pPr>
+        <w:pStyle w:val="BodyText"/>
+      </w:pPr>
+      <m:oMathPara>
+        <m:oMathParaPr>
+          <m:jc m:val="center"/>
+        </m:oMathParaPr>
+        <m:oMath>
+          <m:sSub>
+            <m:e>
+              <m:r>
+                <m:rPr>
+                  <m:nor/>
+                  <m:sty m:val="p"/>
+                </m:rPr>
+                <m:t>ϙ</m:t>
+              </m:r>
+            </m:e>
+            <m:sub>
+              <m:r>
+                <m:t>π</m:t>
+              </m:r>
+            </m:sub>
+          </m:sSub>
+          <m:limUpp>
+            <m:e>
+              <m:r>
+                <m:rPr>
+                  <m:sty m:val="p"/>
+                </m:rPr>
+                <m:t>=</m:t>
+              </m:r>
+            </m:e>
+            <m:lim>
+              <m:r>
+                <m:rPr>
+                  <m:nor/>
+                  <m:sty m:val="p"/>
+                </m:rPr>
+                <m:t>def</m:t>
+              </m:r>
+            </m:lim>
+          </m:limUpp>
+          <m:f>
+            <m:fPr>
+              <m:type m:val="bar"/>
+            </m:fPr>
+            <m:num>
+              <m:sSub>
+                <m:e>
+                  <m:r>
+                    <m:t>π</m:t>
+                  </m:r>
+                </m:e>
+                <m:sub>
+                  <m:r>
+                    <m:t>1</m:t>
+                  </m:r>
+                </m:sub>
+              </m:sSub>
+            </m:num>
+            <m:den>
+              <m:sSub>
+                <m:e>
+                  <m:r>
+                    <m:t>π</m:t>
+                  </m:r>
+                </m:e>
+                <m:sub>
+                  <m:r>
+                    <m:t>2</m:t>
+                  </m:r>
+                </m:sub>
+              </m:sSub>
+            </m:den>
+          </m:f>
+          <m:r>
+            <m:rPr>
+              <m:sty m:val="p"/>
+            </m:rPr>
+            <m:t>∈</m:t>
+          </m:r>
+          <m:r>
+            <m:rPr>
+              <m:sty m:val="p"/>
+            </m:rPr>
+            <m:t>[</m:t>
+          </m:r>
+          <m:r>
+            <m:t>0</m:t>
+          </m:r>
+          <m:r>
+            <m:rPr>
+              <m:sty m:val="p"/>
+            </m:rPr>
+            <m:t>,</m:t>
+          </m:r>
+          <m:r>
+            <m:rPr>
+              <m:sty m:val="p"/>
+            </m:rPr>
+            <m:t>∞</m:t>
+          </m:r>
+          <m:r>
+            <m:rPr>
+              <m:sty m:val="p"/>
+            </m:rPr>
+            <m:t>)</m:t>
+          </m:r>
+          <m:r>
+            <m:rPr>
+              <m:sty m:val="p"/>
+            </m:rPr>
+            <m:t>.</m:t>
+          </m:r>
+        </m:oMath>
+      </m:oMathPara>
+    </w:p>
+    <w:p>
+      <w:pPr>
+        <w:pStyle w:val="FirstParagraph"/>
+      </w:pPr>
+      <w:r>
+        <w:t xml:space="preserve">Source:</w:t>
+      </w:r>
+      <w:r>
+        <w:t xml:space="preserve"> </w:t>
+      </w:r>
+      <w:r>
+        <w:t xml:space="preserve">Wikipedia contributors [7]</w:t>
+      </w:r>
+      <w:r>
+        <w:t xml:space="preserve">.</w:t>
+      </w:r>
+    </w:p>
+    <w:bookmarkEnd w:id="39"/>
+    <w:bookmarkStart w:id="42" w:name="exm-hers-risk-ratio"/>
+    <w:p>
+      <w:pPr>
+        <w:pStyle w:val="BodyText"/>
+      </w:pPr>
+      <w:r>
+        <w:rPr>
+          <w:b/>
+          <w:bCs/>
+        </w:rPr>
+        <w:t xml:space="preserve">Example 8 (Risk ratio of regular exercise in HERS)</w:t>
+      </w:r>
+      <w:r>
+        <w:t xml:space="preserve"> </w:t>
+      </w:r>
+      <w:r>
+        <w:t xml:space="preserve">Take group 1 to be hormone therapy and group 2, the</w:t>
+      </w:r>
+      <w:r>
+        <w:t xml:space="preserve"> </w:t>
+      </w:r>
+      <w:hyperlink w:anchor="def-reference-group">
+        <w:r>
+          <w:rPr>
+            <w:rStyle w:val="Hyperlink"/>
+          </w:rPr>
+          <w:t xml:space="preserve">reference group</w:t>
+        </w:r>
+      </w:hyperlink>
+      <w:r>
+        <w:t xml:space="preserve">, to be placebo.</w:t>
+      </w:r>
+      <w:r>
+        <w:t xml:space="preserve"> </w:t>
+      </w:r>
+      <w:r>
+        <w:t xml:space="preserve">The estimated</w:t>
+      </w:r>
+      <w:r>
+        <w:t xml:space="preserve"> </w:t>
+      </w:r>
+      <w:hyperlink w:anchor="def-risk-ratio">
+        <w:r>
+          <w:rPr>
+            <w:rStyle w:val="Hyperlink"/>
+          </w:rPr>
+          <w:t xml:space="preserve">risk ratio</w:t>
+        </w:r>
+      </w:hyperlink>
+      <w:r>
+        <w:t xml:space="preserve"> </w:t>
+      </w:r>
+      <w:r>
+        <w:t xml:space="preserve">for the estimated</w:t>
+      </w:r>
+      <w:r>
+        <w:t xml:space="preserve"> </w:t>
+      </w:r>
+      <w:hyperlink w:anchor="def-outcome-risk">
+        <w:r>
+          <w:rPr>
+            <w:rStyle w:val="Hyperlink"/>
+          </w:rPr>
+          <w:t xml:space="preserve">risks</w:t>
+        </w:r>
+      </w:hyperlink>
+      <w:r>
+        <w:t xml:space="preserve"> </w:t>
+      </w:r>
+      <w:r>
+        <w:t xml:space="preserve">of</w:t>
+      </w:r>
+      <w:r>
+        <w:t xml:space="preserve"> </w:t>
+      </w:r>
+      <w:hyperlink w:anchor="exm-hers-outcome-risk">
+        <w:r>
+          <w:rPr>
+            <w:rStyle w:val="Hyperlink"/>
+          </w:rPr>
+          <w:t xml:space="preserve">Example 5</w:t>
+        </w:r>
+      </w:hyperlink>
+      <w:r>
+        <w:t xml:space="preserve"> </w:t>
+      </w:r>
+      <w:r>
+        <w:t xml:space="preserve">is:</w:t>
+      </w:r>
+    </w:p>
+    <w:p>
+      <w:pPr>
+        <w:pStyle w:val="SourceCode"/>
+      </w:pPr>
+      <w:r>
+        <w:rPr>
+          <w:rStyle w:val="NormalTok"/>
+        </w:rPr>
+        <w:t xml:space="preserve">rr_hat </w:t>
+      </w:r>
+      <w:r>
+        <w:rPr>
+          <w:rStyle w:val="OtherTok"/>
+        </w:rPr>
+        <w:t xml:space="preserve">&lt;-</w:t>
+      </w:r>
+      <w:r>
+        <w:rPr>
+          <w:rStyle w:val="NormalTok"/>
+        </w:rPr>
+        <w:t xml:space="preserve"> risk_hat[[</w:t>
+      </w:r>
+      <w:r>
+        <w:rPr>
+          <w:rStyle w:val="StringTok"/>
+        </w:rPr>
+        <w:t xml:space="preserve">"hormone therapy"</w:t>
+      </w:r>
+      <w:r>
+        <w:rPr>
+          <w:rStyle w:val="NormalTok"/>
+        </w:rPr>
+        <w:t xml:space="preserve">]] </w:t>
+      </w:r>
+      <w:r>
+        <w:rPr>
+          <w:rStyle w:val="SpecialCharTok"/>
+        </w:rPr>
+        <w:t xml:space="preserve">/</w:t>
+      </w:r>
+      <w:r>
+        <w:rPr>
+          <w:rStyle w:val="NormalTok"/>
+        </w:rPr>
+        <w:t xml:space="preserve"> risk_hat[[</w:t>
+      </w:r>
+      <w:r>
+        <w:rPr>
+          <w:rStyle w:val="StringTok"/>
+        </w:rPr>
+        <w:t xml:space="preserve">"placebo"</w:t>
+      </w:r>
+      <w:r>
+        <w:rPr>
+          <w:rStyle w:val="NormalTok"/>
+        </w:rPr>
+        <w:t xml:space="preserve">]]</w:t>
+      </w:r>
+      <w:r>
+        <w:br/>
+      </w:r>
+      <w:r>
+        <w:rPr>
+          <w:rStyle w:val="NormalTok"/>
+        </w:rPr>
+        <w:t xml:space="preserve">rr_hat</w:t>
+      </w:r>
+      <w:r>
+        <w:br/>
+      </w:r>
+      <w:r>
+        <w:rPr>
+          <w:rStyle w:val="CommentTok"/>
+        </w:rPr>
+        <w:t xml:space="preserve">#&gt; [1] 1.0173</w:t>
+      </w:r>
+    </w:p>
+    <w:p>
+      <w:pPr>
+        <w:pStyle w:val="FirstParagraph"/>
+      </w:pPr>
+      <w:r>
+        <w:t xml:space="preserve">The estimated</w:t>
+      </w:r>
+      <w:r>
+        <w:t xml:space="preserve"> </w:t>
+      </w:r>
+      <w:hyperlink w:anchor="def-outcome-risk">
+        <w:r>
+          <w:rPr>
+            <w:rStyle w:val="Hyperlink"/>
+          </w:rPr>
+          <w:t xml:space="preserve">risk</w:t>
+        </w:r>
+      </w:hyperlink>
+      <w:r>
+        <w:t xml:space="preserve"> </w:t>
+      </w:r>
+      <w:r>
+        <w:t xml:space="preserve">of regular exercise in the hormone therapy group</w:t>
+      </w:r>
+      <w:r>
+        <w:t xml:space="preserve"> </w:t>
+      </w:r>
+      <w:r>
+        <w:t xml:space="preserve">is 1.017 times the estimated risk in the placebo group.</w:t>
+      </w:r>
+      <w:r>
+        <w:t xml:space="preserve"> </w:t>
+      </w:r>
+      <w:r>
+        <w:t xml:space="preserve">This</w:t>
+      </w:r>
+      <w:r>
+        <w:t xml:space="preserve"> </w:t>
+      </w:r>
+      <w:hyperlink r:id="rId40">
+        <w:r>
+          <w:rPr>
+            <w:rStyle w:val="Hyperlink"/>
+          </w:rPr>
+          <w:t xml:space="preserve">estimate</w:t>
+        </w:r>
+      </w:hyperlink>
+      <w:r>
+        <w:t xml:space="preserve"> </w:t>
+      </w:r>
+      <w:r>
+        <w:t xml:space="preserve">is close to 1,</w:t>
+      </w:r>
+      <w:r>
+        <w:t xml:space="preserve"> </w:t>
+      </w:r>
+      <w:r>
+        <w:t xml:space="preserve">which agrees with the large</w:t>
+      </w:r>
+      <w:r>
+        <w:t xml:space="preserve"> </w:t>
+      </w:r>
+      <w:hyperlink r:id="rId41">
+        <w:r>
+          <w:rPr>
+            <w:rStyle w:val="Hyperlink"/>
+          </w:rPr>
+          <w:t xml:space="preserve">p-value</w:t>
+        </w:r>
+      </w:hyperlink>
+      <w:r>
+        <w:t xml:space="preserve"> </w:t>
+      </w:r>
+      <w:r>
+        <w:t xml:space="preserve">of</w:t>
+      </w:r>
+      <w:r>
+        <w:t xml:space="preserve"> </w:t>
+      </w:r>
+      <w:hyperlink w:anchor="exm-hers-chisq">
+        <w:r>
+          <w:rPr>
+            <w:rStyle w:val="Hyperlink"/>
+          </w:rPr>
+          <w:t xml:space="preserve">Example 3</w:t>
+        </w:r>
+      </w:hyperlink>
+      <w:r>
+        <w:t xml:space="preserve">:</w:t>
+      </w:r>
+      <w:r>
+        <w:t xml:space="preserve"> </w:t>
+      </w:r>
+      <w:r>
+        <w:t xml:space="preserve">the two groups have about the same estimated risk.</w:t>
+      </w:r>
+      <w:r>
+        <w:t xml:space="preserve"> </w:t>
+      </w:r>
+      <w:r>
+        <w:t xml:space="preserve">The estimate alone does not show how precise it is.</w:t>
+      </w:r>
+    </w:p>
+    <w:bookmarkEnd w:id="42"/>
+    <w:bookmarkStart w:id="44" w:name="def-odds-ratio"/>
+    <w:p>
+      <w:pPr>
+        <w:pStyle w:val="BodyText"/>
+      </w:pPr>
+      <w:r>
+        <w:rPr>
+          <w:b/>
+          <w:bCs/>
+        </w:rPr>
+        <w:t xml:space="preserve">Definition 8 (Odds ratio)</w:t>
+      </w:r>
+      <w:r>
+        <w:t xml:space="preserve"> </w:t>
+      </w:r>
+      <w:r>
+        <w:t xml:space="preserve">Let:</w:t>
+      </w:r>
+    </w:p>
+    <w:p>
+      <w:pPr>
+        <w:pStyle w:val="Compact"/>
+        <w:numPr>
+          <w:ilvl w:val="0"/>
+          <w:numId w:val="1005"/>
+        </w:numPr>
+      </w:pPr>
+      <m:oMath>
+        <m:sSub>
+          <m:e>
+            <m:r>
+              <m:t>ω</m:t>
+            </m:r>
+          </m:e>
+          <m:sub>
+            <m:r>
+              <m:t>1</m:t>
+            </m:r>
+          </m:sub>
+        </m:sSub>
+      </m:oMath>
+      <w:r>
+        <w:t xml:space="preserve"> </w:t>
+      </w:r>
+      <w:r>
+        <w:t xml:space="preserve">be the</w:t>
+      </w:r>
+      <w:r>
+        <w:t xml:space="preserve"> </w:t>
+      </w:r>
+      <w:hyperlink r:id="rId43">
+        <w:r>
+          <w:rPr>
+            <w:rStyle w:val="Hyperlink"/>
+          </w:rPr>
+          <w:t xml:space="preserve">odds</w:t>
+        </w:r>
+      </w:hyperlink>
+      <w:r>
+        <w:t xml:space="preserve"> </w:t>
+      </w:r>
+      <w:r>
+        <w:t xml:space="preserve">of a</w:t>
+      </w:r>
+      <w:r>
+        <w:t xml:space="preserve"> </w:t>
+      </w:r>
+      <w:hyperlink r:id="rId30">
+        <w:r>
+          <w:rPr>
+            <w:rStyle w:val="Hyperlink"/>
+          </w:rPr>
+          <w:t xml:space="preserve">binary</w:t>
+        </w:r>
+      </w:hyperlink>
+      <w:r>
+        <w:t xml:space="preserve"> </w:t>
+      </w:r>
+      <w:r>
+        <w:t xml:space="preserve">outcome in group 1.</w:t>
+      </w:r>
+    </w:p>
+    <w:p>
+      <w:pPr>
+        <w:pStyle w:val="Compact"/>
+        <w:numPr>
+          <w:ilvl w:val="0"/>
+          <w:numId w:val="1005"/>
+        </w:numPr>
+      </w:pPr>
+      <m:oMath>
+        <m:sSub>
+          <m:e>
+            <m:r>
+              <m:t>ω</m:t>
+            </m:r>
+          </m:e>
+          <m:sub>
+            <m:r>
+              <m:t>2</m:t>
+            </m:r>
+          </m:sub>
+        </m:sSub>
+      </m:oMath>
+      <w:r>
+        <w:t xml:space="preserve"> </w:t>
+      </w:r>
+      <w:r>
+        <w:t xml:space="preserve">be the odds of the same outcome in the</w:t>
+      </w:r>
+      <w:r>
+        <w:t xml:space="preserve"> </w:t>
+      </w:r>
+      <w:hyperlink w:anchor="def-reference-group">
+        <w:r>
+          <w:rPr>
+            <w:rStyle w:val="Hyperlink"/>
+          </w:rPr>
+          <w:t xml:space="preserve">reference group</w:t>
+        </w:r>
+      </w:hyperlink>
+      <w:r>
+        <w:t xml:space="preserve">, group 2.</w:t>
+      </w:r>
+    </w:p>
+    <w:p>
+      <w:pPr>
+        <w:pStyle w:val="FirstParagraph"/>
+      </w:pPr>
+      <w:r>
+        <w:t xml:space="preserve">The</w:t>
+      </w:r>
+      <w:r>
+        <w:t xml:space="preserve"> </w:t>
+      </w:r>
+      <w:r>
+        <w:rPr>
+          <w:b/>
+          <w:bCs/>
+        </w:rPr>
+        <w:t xml:space="preserve">odds ratio</w:t>
+      </w:r>
+      <w:r>
+        <w:t xml:space="preserve"> </w:t>
+      </w:r>
+      <w:r>
+        <w:t xml:space="preserve">of group 1 compared with group 2 is</w:t>
+      </w:r>
+    </w:p>
+    <w:p>
+      <w:pPr>
+        <w:pStyle w:val="BodyText"/>
+      </w:pPr>
+      <m:oMathPara>
+        <m:oMathParaPr>
+          <m:jc m:val="center"/>
+        </m:oMathParaPr>
+        <m:oMath>
+          <m:sSub>
+            <m:e>
+              <m:r>
+                <m:rPr>
+                  <m:nor/>
+                  <m:sty m:val="p"/>
+                </m:rPr>
+                <m:t>ϙ</m:t>
+              </m:r>
+            </m:e>
+            <m:sub>
+              <m:r>
+                <m:t>ω</m:t>
+              </m:r>
+            </m:sub>
+          </m:sSub>
+          <m:limUpp>
+            <m:e>
+              <m:r>
+                <m:rPr>
+                  <m:sty m:val="p"/>
+                </m:rPr>
+                <m:t>=</m:t>
+              </m:r>
+            </m:e>
+            <m:lim>
+              <m:r>
+                <m:rPr>
+                  <m:nor/>
+                  <m:sty m:val="p"/>
+                </m:rPr>
+                <m:t>def</m:t>
+              </m:r>
+            </m:lim>
+          </m:limUpp>
+          <m:f>
+            <m:fPr>
+              <m:type m:val="bar"/>
+            </m:fPr>
+            <m:num>
+              <m:sSub>
+                <m:e>
+                  <m:r>
+                    <m:t>ω</m:t>
+                  </m:r>
+                </m:e>
+                <m:sub>
+                  <m:r>
+                    <m:t>1</m:t>
+                  </m:r>
+                </m:sub>
+              </m:sSub>
+            </m:num>
+            <m:den>
+              <m:sSub>
+                <m:e>
+                  <m:r>
+                    <m:t>ω</m:t>
+                  </m:r>
+                </m:e>
+                <m:sub>
+                  <m:r>
+                    <m:t>2</m:t>
+                  </m:r>
+                </m:sub>
+              </m:sSub>
+            </m:den>
+          </m:f>
+          <m:r>
+            <m:rPr>
+              <m:sty m:val="p"/>
+            </m:rPr>
+            <m:t>∈</m:t>
+          </m:r>
+          <m:r>
+            <m:rPr>
+              <m:sty m:val="p"/>
+            </m:rPr>
+            <m:t>(</m:t>
+          </m:r>
+          <m:r>
+            <m:t>0</m:t>
+          </m:r>
+          <m:r>
+            <m:rPr>
+              <m:sty m:val="p"/>
+            </m:rPr>
+            <m:t>,</m:t>
+          </m:r>
+          <m:r>
+            <m:rPr>
+              <m:sty m:val="p"/>
+            </m:rPr>
+            <m:t>∞</m:t>
+          </m:r>
+          <m:r>
+            <m:rPr>
+              <m:sty m:val="p"/>
+            </m:rPr>
+            <m:t>)</m:t>
+          </m:r>
+          <m:r>
+            <m:rPr>
+              <m:sty m:val="p"/>
+            </m:rPr>
+            <m:t>.</m:t>
+          </m:r>
+        </m:oMath>
+      </m:oMathPara>
+    </w:p>
+    <w:p>
+      <w:pPr>
+        <w:pStyle w:val="FirstParagraph"/>
+      </w:pPr>
+      <w:r>
+        <w:t xml:space="preserve">Here</w:t>
+      </w:r>
+      <w:r>
+        <w:t xml:space="preserve"> </w:t>
+      </w:r>
+      <m:oMath>
+        <m:sSub>
+          <m:e>
+            <m:r>
+              <m:t>ω</m:t>
+            </m:r>
+          </m:e>
+          <m:sub>
+            <m:r>
+              <m:t>g</m:t>
+            </m:r>
+          </m:sub>
+        </m:sSub>
+        <m:r>
+          <m:rPr>
+            <m:sty m:val="p"/>
+          </m:rPr>
+          <m:t>=</m:t>
+        </m:r>
+        <m:sSub>
+          <m:e>
+            <m:r>
+              <m:t>π</m:t>
+            </m:r>
+          </m:e>
+          <m:sub>
+            <m:r>
+              <m:t>g</m:t>
+            </m:r>
+          </m:sub>
+        </m:sSub>
+        <m:r>
+          <m:rPr>
+            <m:sty m:val="p"/>
+          </m:rPr>
+          <m:t>/</m:t>
+        </m:r>
+        <m:r>
+          <m:rPr>
+            <m:sty m:val="p"/>
+          </m:rPr>
+          <m:t>(</m:t>
+        </m:r>
+        <m:r>
+          <m:t>1</m:t>
+        </m:r>
+        <m:r>
+          <m:rPr>
+            <m:sty m:val="p"/>
+          </m:rPr>
+          <m:t>−</m:t>
+        </m:r>
+        <m:sSub>
+          <m:e>
+            <m:r>
+              <m:t>π</m:t>
+            </m:r>
+          </m:e>
+          <m:sub>
+            <m:r>
+              <m:t>g</m:t>
+            </m:r>
+          </m:sub>
+        </m:sSub>
+        <m:r>
+          <m:rPr>
+            <m:sty m:val="p"/>
+          </m:rPr>
+          <m:t>)</m:t>
+        </m:r>
+      </m:oMath>
+      <w:r>
+        <w:t xml:space="preserve"> </w:t>
+      </w:r>
+      <w:r>
+        <w:t xml:space="preserve">for the</w:t>
+      </w:r>
+      <w:r>
+        <w:t xml:space="preserve"> </w:t>
+      </w:r>
+      <w:hyperlink w:anchor="def-outcome-risk">
+        <w:r>
+          <w:rPr>
+            <w:rStyle w:val="Hyperlink"/>
+          </w:rPr>
+          <w:t xml:space="preserve">risk</w:t>
+        </w:r>
+      </w:hyperlink>
+      <w:r>
+        <w:t xml:space="preserve"> </w:t>
+      </w:r>
+      <m:oMath>
+        <m:sSub>
+          <m:e>
+            <m:r>
+              <m:t>π</m:t>
+            </m:r>
+          </m:e>
+          <m:sub>
+            <m:r>
+              <m:t>g</m:t>
+            </m:r>
+          </m:sub>
+        </m:sSub>
+      </m:oMath>
+      <w:r>
+        <w:t xml:space="preserve"> </w:t>
+      </w:r>
+      <w:r>
+        <w:t xml:space="preserve">of group</w:t>
+      </w:r>
+      <w:r>
+        <w:t xml:space="preserve"> </w:t>
+      </w:r>
+      <m:oMath>
+        <m:r>
+          <m:t>g</m:t>
+        </m:r>
+      </m:oMath>
+      <w:r>
+        <w:t xml:space="preserve">.</w:t>
+      </w:r>
+    </w:p>
+    <w:p>
+      <w:pPr>
+        <w:pStyle w:val="BodyText"/>
+      </w:pPr>
+      <w:r>
+        <w:t xml:space="preserve">Source:</w:t>
+      </w:r>
+      <w:r>
+        <w:t xml:space="preserve"> </w:t>
+      </w:r>
+      <w:r>
+        <w:t xml:space="preserve">Wikipedia contributors [9]</w:t>
+      </w:r>
+      <w:r>
+        <w:t xml:space="preserve">.</w:t>
+      </w:r>
+    </w:p>
+    <w:bookmarkEnd w:id="44"/>
+    <w:bookmarkStart w:id="45" w:name="exm-hers-odds-ratio"/>
+    <w:p>
+      <w:pPr>
+        <w:pStyle w:val="BodyText"/>
+      </w:pPr>
+      <w:r>
+        <w:rPr>
+          <w:b/>
+          <w:bCs/>
+        </w:rPr>
+        <w:t xml:space="preserve">Example 9 (Odds ratio of regular exercise in HERS)</w:t>
+      </w:r>
+      <w:r>
+        <w:t xml:space="preserve"> </w:t>
+      </w:r>
+      <w:r>
+        <w:t xml:space="preserve">Take group 1 to be hormone therapy and group 2, the</w:t>
+      </w:r>
+      <w:r>
+        <w:t xml:space="preserve"> </w:t>
+      </w:r>
+      <w:hyperlink w:anchor="def-reference-group">
+        <w:r>
+          <w:rPr>
+            <w:rStyle w:val="Hyperlink"/>
+          </w:rPr>
+          <w:t xml:space="preserve">reference group</w:t>
+        </w:r>
+      </w:hyperlink>
+      <w:r>
+        <w:t xml:space="preserve">, to be placebo.</w:t>
+      </w:r>
+      <w:r>
+        <w:t xml:space="preserve"> </w:t>
+      </w:r>
+      <w:r>
+        <w:t xml:space="preserve">The</w:t>
+      </w:r>
+      <w:r>
+        <w:t xml:space="preserve"> </w:t>
+      </w:r>
+      <w:hyperlink r:id="rId43">
+        <w:r>
+          <w:rPr>
+            <w:rStyle w:val="Hyperlink"/>
+          </w:rPr>
+          <w:t xml:space="preserve">odds</w:t>
+        </w:r>
+      </w:hyperlink>
+      <w:r>
+        <w:t xml:space="preserve"> </w:t>
+      </w:r>
+      <w:r>
+        <w:t xml:space="preserve">of regular exercise in each group</w:t>
+      </w:r>
+      <w:r>
+        <w:t xml:space="preserve"> </w:t>
+      </w:r>
+      <w:r>
+        <w:t xml:space="preserve">follow from the estimated</w:t>
+      </w:r>
+      <w:r>
+        <w:t xml:space="preserve"> </w:t>
+      </w:r>
+      <w:hyperlink w:anchor="def-outcome-risk">
+        <w:r>
+          <w:rPr>
+            <w:rStyle w:val="Hyperlink"/>
+          </w:rPr>
+          <w:t xml:space="preserve">risks</w:t>
+        </w:r>
+      </w:hyperlink>
+      <w:r>
+        <w:t xml:space="preserve"> </w:t>
+      </w:r>
+      <w:r>
+        <w:t xml:space="preserve">of</w:t>
+      </w:r>
+      <w:r>
+        <w:t xml:space="preserve"> </w:t>
+      </w:r>
+      <w:hyperlink w:anchor="exm-hers-outcome-risk">
+        <w:r>
+          <w:rPr>
+            <w:rStyle w:val="Hyperlink"/>
+          </w:rPr>
+          <w:t xml:space="preserve">Example 5</w:t>
+        </w:r>
+      </w:hyperlink>
+      <w:r>
+        <w:t xml:space="preserve">.</w:t>
+      </w:r>
+      <w:r>
+        <w:t xml:space="preserve"> </w:t>
+      </w:r>
+      <w:r>
+        <w:t xml:space="preserve">The estimated</w:t>
+      </w:r>
+      <w:r>
+        <w:t xml:space="preserve"> </w:t>
+      </w:r>
+      <w:hyperlink w:anchor="def-odds-ratio">
+        <w:r>
+          <w:rPr>
+            <w:rStyle w:val="Hyperlink"/>
+          </w:rPr>
+          <w:t xml:space="preserve">odds ratio</w:t>
+        </w:r>
+      </w:hyperlink>
+      <w:r>
+        <w:t xml:space="preserve"> </w:t>
+      </w:r>
+      <w:r>
+        <w:t xml:space="preserve">divides the odds in the hormone therapy group</w:t>
+      </w:r>
+      <w:r>
+        <w:t xml:space="preserve"> </w:t>
+      </w:r>
+      <w:r>
+        <w:t xml:space="preserve">by the odds in the placebo group:</w:t>
+      </w:r>
+    </w:p>
+    <w:p>
+      <w:pPr>
+        <w:pStyle w:val="SourceCode"/>
+      </w:pPr>
+      <w:r>
+        <w:rPr>
+          <w:rStyle w:val="NormalTok"/>
+        </w:rPr>
+        <w:t xml:space="preserve">odds_hat </w:t>
+      </w:r>
+      <w:r>
+        <w:rPr>
+          <w:rStyle w:val="OtherTok"/>
+        </w:rPr>
+        <w:t xml:space="preserve">&lt;-</w:t>
+      </w:r>
+      <w:r>
+        <w:rPr>
+          <w:rStyle w:val="NormalTok"/>
+        </w:rPr>
+        <w:t xml:space="preserve"> risk_hat </w:t>
+      </w:r>
+      <w:r>
+        <w:rPr>
+          <w:rStyle w:val="SpecialCharTok"/>
+        </w:rPr>
+        <w:t xml:space="preserve">/</w:t>
+      </w:r>
+      <w:r>
+        <w:rPr>
+          <w:rStyle w:val="NormalTok"/>
+        </w:rPr>
+        <w:t xml:space="preserve"> (</w:t>
+      </w:r>
+      <w:r>
+        <w:rPr>
+          <w:rStyle w:val="DecValTok"/>
+        </w:rPr>
+        <w:t xml:space="preserve">1</w:t>
+      </w:r>
+      <w:r>
+        <w:rPr>
+          <w:rStyle w:val="NormalTok"/>
+        </w:rPr>
+        <w:t xml:space="preserve"> </w:t>
+      </w:r>
+      <w:r>
+        <w:rPr>
+          <w:rStyle w:val="SpecialCharTok"/>
+        </w:rPr>
+        <w:t xml:space="preserve">-</w:t>
+      </w:r>
+      <w:r>
+        <w:rPr>
+          <w:rStyle w:val="NormalTok"/>
+        </w:rPr>
+        <w:t xml:space="preserve"> risk_hat)</w:t>
+      </w:r>
+      <w:r>
+        <w:br/>
+      </w:r>
+      <w:r>
+        <w:rPr>
+          <w:rStyle w:val="NormalTok"/>
+        </w:rPr>
+        <w:t xml:space="preserve">or_hat </w:t>
+      </w:r>
+      <w:r>
+        <w:rPr>
+          <w:rStyle w:val="OtherTok"/>
+        </w:rPr>
+        <w:t xml:space="preserve">&lt;-</w:t>
+      </w:r>
+      <w:r>
+        <w:rPr>
+          <w:rStyle w:val="NormalTok"/>
+        </w:rPr>
+        <w:t xml:space="preserve"> odds_hat[[</w:t>
+      </w:r>
+      <w:r>
+        <w:rPr>
+          <w:rStyle w:val="StringTok"/>
+        </w:rPr>
+        <w:t xml:space="preserve">"hormone therapy"</w:t>
+      </w:r>
+      <w:r>
+        <w:rPr>
+          <w:rStyle w:val="NormalTok"/>
+        </w:rPr>
+        <w:t xml:space="preserve">]] </w:t>
+      </w:r>
+      <w:r>
+        <w:rPr>
+          <w:rStyle w:val="SpecialCharTok"/>
+        </w:rPr>
+        <w:t xml:space="preserve">/</w:t>
+      </w:r>
+      <w:r>
+        <w:rPr>
+          <w:rStyle w:val="NormalTok"/>
+        </w:rPr>
+        <w:t xml:space="preserve"> odds_hat[[</w:t>
+      </w:r>
+      <w:r>
+        <w:rPr>
+          <w:rStyle w:val="StringTok"/>
+        </w:rPr>
+        <w:t xml:space="preserve">"placebo"</w:t>
+      </w:r>
+      <w:r>
+        <w:rPr>
+          <w:rStyle w:val="NormalTok"/>
+        </w:rPr>
+        <w:t xml:space="preserve">]]</w:t>
+      </w:r>
+      <w:r>
+        <w:br/>
+      </w:r>
+      <w:r>
+        <w:rPr>
+          <w:rStyle w:val="FunctionTok"/>
+        </w:rPr>
+        <w:t xml:space="preserve">c</w:t>
+      </w:r>
+      <w:r>
+        <w:rPr>
+          <w:rStyle w:val="NormalTok"/>
+        </w:rPr>
+        <w:t xml:space="preserve">(odds_hat, </w:t>
+      </w:r>
+      <w:r>
+        <w:rPr>
+          <w:rStyle w:val="AttributeTok"/>
+        </w:rPr>
+        <w:t xml:space="preserve">odds_ratio =</w:t>
+      </w:r>
+      <w:r>
+        <w:rPr>
+          <w:rStyle w:val="NormalTok"/>
+        </w:rPr>
+        <w:t xml:space="preserve"> or_hat)</w:t>
+      </w:r>
+      <w:r>
+        <w:br/>
+      </w:r>
+      <w:r>
+        <w:rPr>
+          <w:rStyle w:val="CommentTok"/>
+        </w:rPr>
+        <w:t xml:space="preserve">#&gt;         placebo hormone therapy      odds_ratio </w:t>
+      </w:r>
+      <w:r>
+        <w:br/>
+      </w:r>
+      <w:r>
+        <w:rPr>
+          <w:rStyle w:val="CommentTok"/>
+        </w:rPr>
+        <w:t xml:space="preserve">#&gt;        0.621336        0.638955        1.028356</w:t>
+      </w:r>
+    </w:p>
+    <w:p>
+      <w:pPr>
+        <w:pStyle w:val="FirstParagraph"/>
+      </w:pPr>
+      <w:r>
+        <w:t xml:space="preserve">The estimated odds ratio 1.028 is close to the</w:t>
+      </w:r>
+      <w:r>
+        <w:t xml:space="preserve"> </w:t>
+      </w:r>
+      <w:hyperlink w:anchor="def-risk-ratio">
+        <w:r>
+          <w:rPr>
+            <w:rStyle w:val="Hyperlink"/>
+          </w:rPr>
+          <w:t xml:space="preserve">risk ratio</w:t>
+        </w:r>
+      </w:hyperlink>
+      <w:r>
+        <w:t xml:space="preserve"> </w:t>
+      </w:r>
+      <w:r>
+        <w:t xml:space="preserve">1.017 of</w:t>
+      </w:r>
+      <w:r>
+        <w:t xml:space="preserve"> </w:t>
+      </w:r>
+      <w:hyperlink w:anchor="exm-hers-risk-ratio">
+        <w:r>
+          <w:rPr>
+            <w:rStyle w:val="Hyperlink"/>
+          </w:rPr>
+          <w:t xml:space="preserve">Example 8</w:t>
+        </w:r>
+      </w:hyperlink>
+      <w:r>
+        <w:t xml:space="preserve">,</w:t>
+      </w:r>
+      <w:r>
+        <w:t xml:space="preserve"> </w:t>
+      </w:r>
+      <w:r>
+        <w:t xml:space="preserve">because the two groups have nearly equal risks.</w:t>
+      </w:r>
+      <w:r>
+        <w:t xml:space="preserve"> </w:t>
+      </w:r>
+      <w:r>
+        <w:t xml:space="preserve">The odds ratio is 1 exactly when the risk ratio is 1,</w:t>
+      </w:r>
+      <w:r>
+        <w:t xml:space="preserve"> </w:t>
+      </w:r>
+      <w:r>
+        <w:t xml:space="preserve">so it also agrees with the large</w:t>
+      </w:r>
+      <w:r>
+        <w:t xml:space="preserve"> </w:t>
+      </w:r>
+      <w:hyperlink r:id="rId41">
+        <w:r>
+          <w:rPr>
+            <w:rStyle w:val="Hyperlink"/>
+          </w:rPr>
+          <w:t xml:space="preserve">p-value</w:t>
+        </w:r>
+      </w:hyperlink>
+      <w:r>
+        <w:t xml:space="preserve"> </w:t>
+      </w:r>
+      <w:r>
+        <w:t xml:space="preserve">of</w:t>
+      </w:r>
+      <w:r>
+        <w:t xml:space="preserve"> </w:t>
+      </w:r>
+      <w:hyperlink w:anchor="exm-hers-chisq">
+        <w:r>
+          <w:rPr>
+            <w:rStyle w:val="Hyperlink"/>
+          </w:rPr>
+          <w:t xml:space="preserve">Example 3</w:t>
+        </w:r>
+      </w:hyperlink>
+      <w:r>
+        <w:t xml:space="preserve">.</w:t>
+      </w:r>
+    </w:p>
+    <w:bookmarkEnd w:id="45"/>
+    <w:p>
+      <w:pPr>
+        <w:pStyle w:val="BodyText"/>
+      </w:pPr>
+      <w:r>
         <w:t xml:space="preserve">Rice [5, Sec. 13.6], pp. 526–529</w:t>
       </w:r>
       <w:r>
@@ -5098,9 +7485,9 @@
         <w:t xml:space="preserve">covers odds ratios.</w:t>
       </w:r>
     </w:p>
-    <w:bookmarkEnd w:id="31"/>
-    <w:bookmarkEnd w:id="32"/>
-    <w:bookmarkStart w:id="44" w:name="references"/>
+    <w:bookmarkEnd w:id="46"/>
+    <w:bookmarkEnd w:id="47"/>
+    <w:bookmarkStart w:id="65" w:name="references"/>
     <w:p>
       <w:pPr>
         <w:pStyle w:val="Heading2"/>
@@ -5109,8 +7496,8 @@
         <w:t xml:space="preserve">References</w:t>
       </w:r>
     </w:p>
-    <w:bookmarkStart w:id="43" w:name="refs"/>
-    <w:bookmarkStart w:id="34" w:name="ref-vittinghoff2e"/>
+    <w:bookmarkStart w:id="64" w:name="refs"/>
+    <w:bookmarkStart w:id="49" w:name="ref-vittinghoff2e"/>
     <w:p>
       <w:pPr>
         <w:pStyle w:val="Bibliography"/>
@@ -5143,7 +7530,7 @@
       <w:r>
         <w:t xml:space="preserve"> </w:t>
       </w:r>
-      <w:hyperlink r:id="rId33">
+      <w:hyperlink r:id="rId48">
         <w:r>
           <w:rPr>
             <w:rStyle w:val="Hyperlink"/>
@@ -5155,8 +7542,8 @@
         <w:t xml:space="preserve">.</w:t>
       </w:r>
     </w:p>
-    <w:bookmarkEnd w:id="34"/>
-    <w:bookmarkStart w:id="35" w:name="ref-hoggtanis2015"/>
+    <w:bookmarkEnd w:id="49"/>
+    <w:bookmarkStart w:id="50" w:name="ref-hoggtanis2015"/>
     <w:p>
       <w:pPr>
         <w:pStyle w:val="Bibliography"/>
@@ -5187,8 +7574,8 @@
         <w:t xml:space="preserve">, Tenth edition. Boston: Pearson, 2019.</w:t>
       </w:r>
     </w:p>
-    <w:bookmarkEnd w:id="35"/>
-    <w:bookmarkStart w:id="37" w:name="ref-wikipedia_contingency_table"/>
+    <w:bookmarkEnd w:id="50"/>
+    <w:bookmarkStart w:id="52" w:name="ref-wikipedia_contingency_table"/>
     <w:p>
       <w:pPr>
         <w:pStyle w:val="Bibliography"/>
@@ -5235,7 +7622,7 @@
       <w:r>
         <w:t xml:space="preserve"> </w:t>
       </w:r>
-      <w:hyperlink r:id="rId36">
+      <w:hyperlink r:id="rId51">
         <w:r>
           <w:rPr>
             <w:rStyle w:val="Hyperlink"/>
@@ -5244,8 +7631,8 @@
         </w:r>
       </w:hyperlink>
     </w:p>
-    <w:bookmarkEnd w:id="37"/>
-    <w:bookmarkStart w:id="39" w:name="ref-wikipedia_pearsons_chi_squared_test"/>
+    <w:bookmarkEnd w:id="52"/>
+    <w:bookmarkStart w:id="54" w:name="ref-wikipedia_pearsons_chi_squared_test"/>
     <w:p>
       <w:pPr>
         <w:pStyle w:val="Bibliography"/>
@@ -5292,7 +7679,7 @@
       <w:r>
         <w:t xml:space="preserve"> </w:t>
       </w:r>
-      <w:hyperlink r:id="rId38">
+      <w:hyperlink r:id="rId53">
         <w:r>
           <w:rPr>
             <w:rStyle w:val="Hyperlink"/>
@@ -5301,8 +7688,8 @@
         </w:r>
       </w:hyperlink>
     </w:p>
-    <w:bookmarkEnd w:id="39"/>
-    <w:bookmarkStart w:id="40" w:name="ref-rice2007mathematical"/>
+    <w:bookmarkEnd w:id="54"/>
+    <w:bookmarkStart w:id="55" w:name="ref-rice2007mathematical"/>
     <w:p>
       <w:pPr>
         <w:pStyle w:val="Bibliography"/>
@@ -5333,8 +7720,8 @@
         <w:t xml:space="preserve">, 3rd ed. Belmont, CA: Cengage Learning, 2007.</w:t>
       </w:r>
     </w:p>
-    <w:bookmarkEnd w:id="40"/>
-    <w:bookmarkStart w:id="42" w:name="ref-wikipedia_fishers_exact_test"/>
+    <w:bookmarkEnd w:id="55"/>
+    <w:bookmarkStart w:id="57" w:name="ref-wikipedia_fishers_exact_test"/>
     <w:p>
       <w:pPr>
         <w:pStyle w:val="Bibliography"/>
@@ -5381,7 +7768,7 @@
       <w:r>
         <w:t xml:space="preserve"> </w:t>
       </w:r>
-      <w:hyperlink r:id="rId41">
+      <w:hyperlink r:id="rId56">
         <w:r>
           <w:rPr>
             <w:rStyle w:val="Hyperlink"/>
@@ -5390,9 +7777,180 @@
         </w:r>
       </w:hyperlink>
     </w:p>
-    <w:bookmarkEnd w:id="42"/>
-    <w:bookmarkEnd w:id="43"/>
-    <w:bookmarkEnd w:id="44"/>
+    <w:bookmarkEnd w:id="57"/>
+    <w:bookmarkStart w:id="59" w:name="ref-wikipedia_relative_risk"/>
+    <w:p>
+      <w:pPr>
+        <w:pStyle w:val="Bibliography"/>
+      </w:pPr>
+      <w:r>
+        <w:t xml:space="preserve">[7]</w:t>
+      </w:r>
+      <w:r>
+        <w:t xml:space="preserve"> </w:t>
+      </w:r>
+      <w:r>
+        <w:t xml:space="preserve">	</w:t>
+      </w:r>
+      <w:r>
+        <w:t xml:space="preserve">Wikipedia contributors,</w:t>
+      </w:r>
+      <w:r>
+        <w:t xml:space="preserve"> </w:t>
+      </w:r>
+      <w:r>
+        <w:t xml:space="preserve">“Relative risk —</w:t>
+      </w:r>
+      <w:r>
+        <w:t xml:space="preserve"> </w:t>
+      </w:r>
+      <w:r>
+        <w:t xml:space="preserve">Wikipedia</w:t>
+      </w:r>
+      <w:r>
+        <w:t xml:space="preserve">,</w:t>
+      </w:r>
+      <w:r>
+        <w:t xml:space="preserve"> </w:t>
+      </w:r>
+      <w:r>
+        <w:t xml:space="preserve">the free encyclopedia.”</w:t>
+      </w:r>
+      <w:r>
+        <w:t xml:space="preserve"> </w:t>
+      </w:r>
+      <w:r>
+        <w:t xml:space="preserve">2026. Available:</w:t>
+      </w:r>
+      <w:r>
+        <w:t xml:space="preserve"> </w:t>
+      </w:r>
+      <w:hyperlink r:id="rId58">
+        <w:r>
+          <w:rPr>
+            <w:rStyle w:val="Hyperlink"/>
+          </w:rPr>
+          <w:t xml:space="preserve">https://en.wikipedia.org/wiki/Relative_risk</w:t>
+        </w:r>
+      </w:hyperlink>
+    </w:p>
+    <w:bookmarkEnd w:id="59"/>
+    <w:bookmarkStart w:id="61" w:name="ref-wikipedia_absolute_risk_reduction"/>
+    <w:p>
+      <w:pPr>
+        <w:pStyle w:val="Bibliography"/>
+      </w:pPr>
+      <w:r>
+        <w:t xml:space="preserve">[8]</w:t>
+      </w:r>
+      <w:r>
+        <w:t xml:space="preserve"> </w:t>
+      </w:r>
+      <w:r>
+        <w:t xml:space="preserve">	</w:t>
+      </w:r>
+      <w:r>
+        <w:t xml:space="preserve">Wikipedia contributors,</w:t>
+      </w:r>
+      <w:r>
+        <w:t xml:space="preserve"> </w:t>
+      </w:r>
+      <w:r>
+        <w:t xml:space="preserve">“Absolute risk reduction —</w:t>
+      </w:r>
+      <w:r>
+        <w:t xml:space="preserve"> </w:t>
+      </w:r>
+      <w:r>
+        <w:t xml:space="preserve">Wikipedia</w:t>
+      </w:r>
+      <w:r>
+        <w:t xml:space="preserve">,</w:t>
+      </w:r>
+      <w:r>
+        <w:t xml:space="preserve"> </w:t>
+      </w:r>
+      <w:r>
+        <w:t xml:space="preserve">the free encyclopedia.”</w:t>
+      </w:r>
+      <w:r>
+        <w:t xml:space="preserve"> </w:t>
+      </w:r>
+      <w:r>
+        <w:t xml:space="preserve">2026. Available:</w:t>
+      </w:r>
+      <w:r>
+        <w:t xml:space="preserve"> </w:t>
+      </w:r>
+      <w:hyperlink r:id="rId60">
+        <w:r>
+          <w:rPr>
+            <w:rStyle w:val="Hyperlink"/>
+          </w:rPr>
+          <w:t xml:space="preserve">https://en.wikipedia.org/wiki/Absolute_risk_reduction</w:t>
+        </w:r>
+      </w:hyperlink>
+    </w:p>
+    <w:bookmarkEnd w:id="61"/>
+    <w:bookmarkStart w:id="63" w:name="ref-wikipedia_odds_ratio"/>
+    <w:p>
+      <w:pPr>
+        <w:pStyle w:val="Bibliography"/>
+      </w:pPr>
+      <w:r>
+        <w:t xml:space="preserve">[9]</w:t>
+      </w:r>
+      <w:r>
+        <w:t xml:space="preserve"> </w:t>
+      </w:r>
+      <w:r>
+        <w:t xml:space="preserve">	</w:t>
+      </w:r>
+      <w:r>
+        <w:t xml:space="preserve">Wikipedia contributors,</w:t>
+      </w:r>
+      <w:r>
+        <w:t xml:space="preserve"> </w:t>
+      </w:r>
+      <w:r>
+        <w:t xml:space="preserve">“Odds ratio —</w:t>
+      </w:r>
+      <w:r>
+        <w:t xml:space="preserve"> </w:t>
+      </w:r>
+      <w:r>
+        <w:t xml:space="preserve">Wikipedia</w:t>
+      </w:r>
+      <w:r>
+        <w:t xml:space="preserve">,</w:t>
+      </w:r>
+      <w:r>
+        <w:t xml:space="preserve"> </w:t>
+      </w:r>
+      <w:r>
+        <w:t xml:space="preserve">the free encyclopedia.”</w:t>
+      </w:r>
+      <w:r>
+        <w:t xml:space="preserve"> </w:t>
+      </w:r>
+      <w:r>
+        <w:t xml:space="preserve">2026. Available:</w:t>
+      </w:r>
+      <w:r>
+        <w:t xml:space="preserve"> </w:t>
+      </w:r>
+      <w:hyperlink r:id="rId62">
+        <w:r>
+          <w:rPr>
+            <w:rStyle w:val="Hyperlink"/>
+          </w:rPr>
+          <w:t xml:space="preserve">https://en.wikipedia.org/wiki/Odds_ratio</w:t>
+        </w:r>
+      </w:hyperlink>
+    </w:p>
+    <w:bookmarkEnd w:id="63"/>
+    <w:bookmarkEnd w:id="64"/>
+    <w:bookmarkEnd w:id="65"/>
     <w:sectPr>
       <w:footnotePr>
         <w:numRestart w:val="eachSect"/>
@@ -5613,6 +8171,15 @@
     <w:abstractNumId w:val="991"/>
   </w:num>
   <w:num w:numId="1002">
+    <w:abstractNumId w:val="991"/>
+  </w:num>
+  <w:num w:numId="1003">
+    <w:abstractNumId w:val="991"/>
+  </w:num>
+  <w:num w:numId="1004">
+    <w:abstractNumId w:val="991"/>
+  </w:num>
+  <w:num w:numId="1005">
     <w:abstractNumId w:val="991"/>
   </w:num>
 </w:numbering>

</xml_diff>

<commit_message>
Deploying to gh-pages from @ Morrison-Lab/sds@94930d2d931174aae815a44a13357009200f538a 🚀
</commit_message>
<xml_diff>
--- a/categorical-tests-handout.docx
+++ b/categorical-tests-handout.docx
@@ -15,7 +15,7 @@
         <w:pStyle w:val="Date"/>
       </w:pPr>
       <w:r>
-        <w:t xml:space="preserve">Last modified: 2026-10-19 10:06:41 (PDT)</w:t>
+        <w:t xml:space="preserve">Last modified: 2026-10-19 11:09:03 (PDT)</w:t>
       </w:r>
     </w:p>
     <w:p>
@@ -386,7 +386,7 @@
       </w:r>
     </w:p>
     <w:bookmarkEnd w:id="11"/>
-    <w:bookmarkStart w:id="47" w:name="sec-two-group-categorical"/>
+    <w:bookmarkStart w:id="55" w:name="sec-two-group-categorical"/>
     <w:p>
       <w:pPr>
         <w:pStyle w:val="Heading2"/>
@@ -5006,7 +5006,7 @@
       </w:r>
     </w:p>
     <w:bookmarkEnd w:id="29"/>
-    <w:bookmarkStart w:id="46" w:name="sec-2x2-measures"/>
+    <w:bookmarkStart w:id="54" w:name="sec-2x2-measures"/>
     <w:p>
       <w:pPr>
         <w:pStyle w:val="Heading3"/>
@@ -6104,7 +6104,7 @@
       </w:r>
     </w:p>
     <w:bookmarkEnd w:id="38"/>
-    <w:bookmarkStart w:id="39" w:name="def-risk-ratio"/>
+    <w:bookmarkStart w:id="39" w:name="exr-risk-difference-switch-ref"/>
     <w:p>
       <w:pPr>
         <w:pStyle w:val="BodyText"/>
@@ -6114,7 +6114,7 @@
           <w:b/>
           <w:bCs/>
         </w:rPr>
-        <w:t xml:space="preserve">Definition 7 (Risk ratio (also called the relative risk))</w:t>
+        <w:t xml:space="preserve">Exercise 1</w:t>
       </w:r>
       <w:r>
         <w:t xml:space="preserve"> </w:t>
@@ -6129,6 +6129,991 @@
         <w:numPr>
           <w:ilvl w:val="0"/>
           <w:numId w:val="1004"/>
+        </w:numPr>
+      </w:pPr>
+      <m:oMath>
+        <m:sSub>
+          <m:e>
+            <m:r>
+              <m:t>π</m:t>
+            </m:r>
+          </m:e>
+          <m:sub>
+            <m:r>
+              <m:t>1</m:t>
+            </m:r>
+          </m:sub>
+        </m:sSub>
+      </m:oMath>
+      <w:r>
+        <w:t xml:space="preserve"> </w:t>
+      </w:r>
+      <w:r>
+        <w:t xml:space="preserve">and</w:t>
+      </w:r>
+      <w:r>
+        <w:t xml:space="preserve"> </w:t>
+      </w:r>
+      <m:oMath>
+        <m:sSub>
+          <m:e>
+            <m:r>
+              <m:t>π</m:t>
+            </m:r>
+          </m:e>
+          <m:sub>
+            <m:r>
+              <m:t>2</m:t>
+            </m:r>
+          </m:sub>
+        </m:sSub>
+      </m:oMath>
+      <w:r>
+        <w:t xml:space="preserve"> </w:t>
+      </w:r>
+      <w:r>
+        <w:t xml:space="preserve">be the</w:t>
+      </w:r>
+      <w:r>
+        <w:t xml:space="preserve"> </w:t>
+      </w:r>
+      <w:hyperlink w:anchor="def-outcome-risk">
+        <w:r>
+          <w:rPr>
+            <w:rStyle w:val="Hyperlink"/>
+          </w:rPr>
+          <w:t xml:space="preserve">risks</w:t>
+        </w:r>
+      </w:hyperlink>
+      <w:r>
+        <w:t xml:space="preserve"> </w:t>
+      </w:r>
+      <w:r>
+        <w:t xml:space="preserve">of a</w:t>
+      </w:r>
+      <w:r>
+        <w:t xml:space="preserve"> </w:t>
+      </w:r>
+      <w:hyperlink r:id="rId30">
+        <w:r>
+          <w:rPr>
+            <w:rStyle w:val="Hyperlink"/>
+          </w:rPr>
+          <w:t xml:space="preserve">binary</w:t>
+        </w:r>
+      </w:hyperlink>
+      <w:r>
+        <w:t xml:space="preserve"> </w:t>
+      </w:r>
+      <w:r>
+        <w:t xml:space="preserve">outcome in group 1 and group 2.</w:t>
+      </w:r>
+    </w:p>
+    <w:p>
+      <w:pPr>
+        <w:pStyle w:val="Compact"/>
+        <w:numPr>
+          <w:ilvl w:val="0"/>
+          <w:numId w:val="1004"/>
+        </w:numPr>
+      </w:pPr>
+      <m:oMath>
+        <m:r>
+          <m:rPr>
+            <m:sty m:val="p"/>
+          </m:rPr>
+          <m:t>RD</m:t>
+        </m:r>
+        <m:limUpp>
+          <m:e>
+            <m:r>
+              <m:rPr>
+                <m:sty m:val="p"/>
+              </m:rPr>
+              <m:t>=</m:t>
+            </m:r>
+          </m:e>
+          <m:lim>
+            <m:r>
+              <m:rPr>
+                <m:nor/>
+                <m:sty m:val="p"/>
+              </m:rPr>
+              <m:t>def</m:t>
+            </m:r>
+          </m:lim>
+        </m:limUpp>
+        <m:sSub>
+          <m:e>
+            <m:r>
+              <m:t>π</m:t>
+            </m:r>
+          </m:e>
+          <m:sub>
+            <m:r>
+              <m:t>1</m:t>
+            </m:r>
+          </m:sub>
+        </m:sSub>
+        <m:r>
+          <m:rPr>
+            <m:sty m:val="p"/>
+          </m:rPr>
+          <m:t>−</m:t>
+        </m:r>
+        <m:sSub>
+          <m:e>
+            <m:r>
+              <m:t>π</m:t>
+            </m:r>
+          </m:e>
+          <m:sub>
+            <m:r>
+              <m:t>2</m:t>
+            </m:r>
+          </m:sub>
+        </m:sSub>
+      </m:oMath>
+      <w:r>
+        <w:t xml:space="preserve"> </w:t>
+      </w:r>
+      <w:r>
+        <w:t xml:space="preserve">be the</w:t>
+      </w:r>
+      <w:r>
+        <w:t xml:space="preserve"> </w:t>
+      </w:r>
+      <w:hyperlink w:anchor="def-risk-difference">
+        <w:r>
+          <w:rPr>
+            <w:rStyle w:val="Hyperlink"/>
+          </w:rPr>
+          <w:t xml:space="preserve">risk difference</w:t>
+        </w:r>
+      </w:hyperlink>
+      <w:r>
+        <w:t xml:space="preserve"> </w:t>
+      </w:r>
+      <w:r>
+        <w:t xml:space="preserve">of group 1 compared with group 2.</w:t>
+      </w:r>
+    </w:p>
+    <w:p>
+      <w:pPr>
+        <w:pStyle w:val="FirstParagraph"/>
+      </w:pPr>
+      <w:r>
+        <w:t xml:space="preserve">Express the risk difference of group 2 compared with group 1,</w:t>
+      </w:r>
+      <w:r>
+        <w:t xml:space="preserve"> </w:t>
+      </w:r>
+      <m:oMath>
+        <m:sSub>
+          <m:e>
+            <m:r>
+              <m:t>π</m:t>
+            </m:r>
+          </m:e>
+          <m:sub>
+            <m:r>
+              <m:t>2</m:t>
+            </m:r>
+          </m:sub>
+        </m:sSub>
+        <m:r>
+          <m:rPr>
+            <m:sty m:val="p"/>
+          </m:rPr>
+          <m:t>−</m:t>
+        </m:r>
+        <m:sSub>
+          <m:e>
+            <m:r>
+              <m:t>π</m:t>
+            </m:r>
+          </m:e>
+          <m:sub>
+            <m:r>
+              <m:t>1</m:t>
+            </m:r>
+          </m:sub>
+        </m:sSub>
+      </m:oMath>
+      <w:r>
+        <w:t xml:space="preserve">, in terms of</w:t>
+      </w:r>
+      <w:r>
+        <w:t xml:space="preserve"> </w:t>
+      </w:r>
+      <m:oMath>
+        <m:r>
+          <m:rPr>
+            <m:sty m:val="p"/>
+          </m:rPr>
+          <m:t>RD</m:t>
+        </m:r>
+      </m:oMath>
+      <w:r>
+        <w:t xml:space="preserve">.</w:t>
+      </w:r>
+    </w:p>
+    <w:bookmarkEnd w:id="39"/>
+    <w:bookmarkStart w:id="40" w:name="sol-risk-difference-switch-ref"/>
+    <w:p>
+      <w:pPr>
+        <w:pStyle w:val="BodyText"/>
+      </w:pPr>
+      <w:r>
+        <w:rPr>
+          <w:i/>
+          <w:iCs/>
+        </w:rPr>
+        <w:t xml:space="preserve">Solution 1</w:t>
+      </w:r>
+      <w:r>
+        <w:t xml:space="preserve">. </w:t>
+      </w:r>
+    </w:p>
+    <w:p>
+      <w:pPr>
+        <w:pStyle w:val="BodyText"/>
+      </w:pPr>
+      <m:oMathPara>
+        <m:oMathParaPr>
+          <m:jc m:val="center"/>
+        </m:oMathParaPr>
+        <m:oMath>
+          <m:eqArr>
+            <m:e>
+              <m:sSub>
+                <m:e>
+                  <m:r>
+                    <m:t>π</m:t>
+                  </m:r>
+                </m:e>
+                <m:sub>
+                  <m:r>
+                    <m:t>2</m:t>
+                  </m:r>
+                </m:sub>
+              </m:sSub>
+              <m:r>
+                <m:rPr>
+                  <m:sty m:val="p"/>
+                </m:rPr>
+                <m:t>−</m:t>
+              </m:r>
+              <m:sSub>
+                <m:e>
+                  <m:r>
+                    <m:t>π</m:t>
+                  </m:r>
+                </m:e>
+                <m:sub>
+                  <m:r>
+                    <m:t>1</m:t>
+                  </m:r>
+                </m:sub>
+              </m:sSub>
+              <m:r>
+                <m:t>&amp;</m:t>
+              </m:r>
+              <m:r>
+                <m:rPr>
+                  <m:sty m:val="p"/>
+                </m:rPr>
+                <m:t>=</m:t>
+              </m:r>
+              <m:r>
+                <m:rPr>
+                  <m:sty m:val="p"/>
+                </m:rPr>
+                <m:t>−</m:t>
+              </m:r>
+              <m:r>
+                <m:t>1</m:t>
+              </m:r>
+              <m:r>
+                <m:rPr>
+                  <m:sty m:val="p"/>
+                </m:rPr>
+                <m:t>⋅</m:t>
+              </m:r>
+              <m:r>
+                <m:t>​</m:t>
+              </m:r>
+              <m:d>
+                <m:dPr>
+                  <m:begChr m:val="("/>
+                  <m:sepChr m:val=""/>
+                  <m:endChr m:val=")"/>
+                  <m:grow/>
+                </m:dPr>
+                <m:e>
+                  <m:sSub>
+                    <m:e>
+                      <m:r>
+                        <m:t>π</m:t>
+                      </m:r>
+                    </m:e>
+                    <m:sub>
+                      <m:r>
+                        <m:t>1</m:t>
+                      </m:r>
+                    </m:sub>
+                  </m:sSub>
+                  <m:r>
+                    <m:rPr>
+                      <m:sty m:val="p"/>
+                    </m:rPr>
+                    <m:t>−</m:t>
+                  </m:r>
+                  <m:sSub>
+                    <m:e>
+                      <m:r>
+                        <m:t>π</m:t>
+                      </m:r>
+                    </m:e>
+                    <m:sub>
+                      <m:r>
+                        <m:t>2</m:t>
+                      </m:r>
+                    </m:sub>
+                  </m:sSub>
+                </m:e>
+              </m:d>
+              <m:r>
+                <m:t>​</m:t>
+              </m:r>
+              <m:r>
+                <m:t>&amp;</m:t>
+              </m:r>
+              <m:r>
+                <m:t>&amp;</m:t>
+              </m:r>
+              <m:r>
+                <m:rPr>
+                  <m:nor/>
+                  <m:sty m:val="p"/>
+                </m:rPr>
+                <m:t>(factor </m:t>
+              </m:r>
+              <m:r>
+                <m:rPr>
+                  <m:sty m:val="p"/>
+                </m:rPr>
+                <m:t>−</m:t>
+              </m:r>
+              <m:r>
+                <m:t>1</m:t>
+              </m:r>
+              <m:r>
+                <m:rPr>
+                  <m:nor/>
+                  <m:sty m:val="p"/>
+                </m:rPr>
+                <m:t> out of both terms)</m:t>
+              </m:r>
+            </m:e>
+            <m:e>
+              <m:r>
+                <m:t>&amp;</m:t>
+              </m:r>
+              <m:r>
+                <m:rPr>
+                  <m:sty m:val="p"/>
+                </m:rPr>
+                <m:t>=</m:t>
+              </m:r>
+              <m:r>
+                <m:rPr>
+                  <m:sty m:val="p"/>
+                </m:rPr>
+                <m:t>−</m:t>
+              </m:r>
+              <m:r>
+                <m:rPr>
+                  <m:sty m:val="p"/>
+                </m:rPr>
+                <m:t>RD</m:t>
+              </m:r>
+              <m:r>
+                <m:t>&amp;</m:t>
+              </m:r>
+              <m:r>
+                <m:t>&amp;</m:t>
+              </m:r>
+              <m:r>
+                <m:rPr>
+                  <m:nor/>
+                  <m:sty m:val="p"/>
+                </m:rPr>
+                <m:t>(definition of </m:t>
+              </m:r>
+              <m:r>
+                <m:rPr>
+                  <m:sty m:val="p"/>
+                </m:rPr>
+                <m:t>RD</m:t>
+              </m:r>
+              <m:r>
+                <m:rPr>
+                  <m:nor/>
+                  <m:sty m:val="p"/>
+                </m:rPr>
+                <m:t>)</m:t>
+              </m:r>
+            </m:e>
+          </m:eqArr>
+        </m:oMath>
+      </m:oMathPara>
+    </w:p>
+    <w:bookmarkEnd w:id="40"/>
+    <w:bookmarkStart w:id="41" w:name="thm-risk-difference-switch-ref"/>
+    <w:p>
+      <w:pPr>
+        <w:pStyle w:val="FirstParagraph"/>
+      </w:pPr>
+      <w:r>
+        <w:rPr>
+          <w:b/>
+          <w:bCs/>
+        </w:rPr>
+        <w:t xml:space="preserve">Theorem 2 (Switching the reference group in a risk difference)</w:t>
+      </w:r>
+      <w:r>
+        <w:t xml:space="preserve"> </w:t>
+      </w:r>
+      <w:r>
+        <w:t xml:space="preserve">Let:</w:t>
+      </w:r>
+    </w:p>
+    <w:p>
+      <w:pPr>
+        <w:pStyle w:val="Compact"/>
+        <w:numPr>
+          <w:ilvl w:val="0"/>
+          <w:numId w:val="1005"/>
+        </w:numPr>
+      </w:pPr>
+      <m:oMath>
+        <m:sSub>
+          <m:e>
+            <m:r>
+              <m:t>π</m:t>
+            </m:r>
+          </m:e>
+          <m:sub>
+            <m:r>
+              <m:t>1</m:t>
+            </m:r>
+          </m:sub>
+        </m:sSub>
+      </m:oMath>
+      <w:r>
+        <w:t xml:space="preserve"> </w:t>
+      </w:r>
+      <w:r>
+        <w:t xml:space="preserve">and</w:t>
+      </w:r>
+      <w:r>
+        <w:t xml:space="preserve"> </w:t>
+      </w:r>
+      <m:oMath>
+        <m:sSub>
+          <m:e>
+            <m:r>
+              <m:t>π</m:t>
+            </m:r>
+          </m:e>
+          <m:sub>
+            <m:r>
+              <m:t>2</m:t>
+            </m:r>
+          </m:sub>
+        </m:sSub>
+      </m:oMath>
+      <w:r>
+        <w:t xml:space="preserve"> </w:t>
+      </w:r>
+      <w:r>
+        <w:t xml:space="preserve">be the</w:t>
+      </w:r>
+      <w:r>
+        <w:t xml:space="preserve"> </w:t>
+      </w:r>
+      <w:hyperlink w:anchor="def-outcome-risk">
+        <w:r>
+          <w:rPr>
+            <w:rStyle w:val="Hyperlink"/>
+          </w:rPr>
+          <w:t xml:space="preserve">risks</w:t>
+        </w:r>
+      </w:hyperlink>
+      <w:r>
+        <w:t xml:space="preserve"> </w:t>
+      </w:r>
+      <w:r>
+        <w:t xml:space="preserve">of a</w:t>
+      </w:r>
+      <w:r>
+        <w:t xml:space="preserve"> </w:t>
+      </w:r>
+      <w:hyperlink r:id="rId30">
+        <w:r>
+          <w:rPr>
+            <w:rStyle w:val="Hyperlink"/>
+          </w:rPr>
+          <w:t xml:space="preserve">binary</w:t>
+        </w:r>
+      </w:hyperlink>
+      <w:r>
+        <w:t xml:space="preserve"> </w:t>
+      </w:r>
+      <w:r>
+        <w:t xml:space="preserve">outcome in group 1 and group 2.</w:t>
+      </w:r>
+    </w:p>
+    <w:p>
+      <w:pPr>
+        <w:pStyle w:val="Compact"/>
+        <w:numPr>
+          <w:ilvl w:val="0"/>
+          <w:numId w:val="1005"/>
+        </w:numPr>
+      </w:pPr>
+      <m:oMath>
+        <m:r>
+          <m:rPr>
+            <m:sty m:val="p"/>
+          </m:rPr>
+          <m:t>RD</m:t>
+        </m:r>
+        <m:limUpp>
+          <m:e>
+            <m:r>
+              <m:rPr>
+                <m:sty m:val="p"/>
+              </m:rPr>
+              <m:t>=</m:t>
+            </m:r>
+          </m:e>
+          <m:lim>
+            <m:r>
+              <m:rPr>
+                <m:nor/>
+                <m:sty m:val="p"/>
+              </m:rPr>
+              <m:t>def</m:t>
+            </m:r>
+          </m:lim>
+        </m:limUpp>
+        <m:sSub>
+          <m:e>
+            <m:r>
+              <m:t>π</m:t>
+            </m:r>
+          </m:e>
+          <m:sub>
+            <m:r>
+              <m:t>1</m:t>
+            </m:r>
+          </m:sub>
+        </m:sSub>
+        <m:r>
+          <m:rPr>
+            <m:sty m:val="p"/>
+          </m:rPr>
+          <m:t>−</m:t>
+        </m:r>
+        <m:sSub>
+          <m:e>
+            <m:r>
+              <m:t>π</m:t>
+            </m:r>
+          </m:e>
+          <m:sub>
+            <m:r>
+              <m:t>2</m:t>
+            </m:r>
+          </m:sub>
+        </m:sSub>
+      </m:oMath>
+      <w:r>
+        <w:t xml:space="preserve"> </w:t>
+      </w:r>
+      <w:r>
+        <w:t xml:space="preserve">be the</w:t>
+      </w:r>
+      <w:r>
+        <w:t xml:space="preserve"> </w:t>
+      </w:r>
+      <w:hyperlink w:anchor="def-risk-difference">
+        <w:r>
+          <w:rPr>
+            <w:rStyle w:val="Hyperlink"/>
+          </w:rPr>
+          <w:t xml:space="preserve">risk difference</w:t>
+        </w:r>
+      </w:hyperlink>
+      <w:r>
+        <w:t xml:space="preserve"> </w:t>
+      </w:r>
+      <w:r>
+        <w:t xml:space="preserve">of group 1 compared with group 2, with group 2 as the</w:t>
+      </w:r>
+      <w:r>
+        <w:t xml:space="preserve"> </w:t>
+      </w:r>
+      <w:hyperlink w:anchor="def-reference-group">
+        <w:r>
+          <w:rPr>
+            <w:rStyle w:val="Hyperlink"/>
+          </w:rPr>
+          <w:t xml:space="preserve">reference group</w:t>
+        </w:r>
+      </w:hyperlink>
+      <w:r>
+        <w:t xml:space="preserve">.</w:t>
+      </w:r>
+    </w:p>
+    <w:p>
+      <w:pPr>
+        <w:pStyle w:val="FirstParagraph"/>
+      </w:pPr>
+      <w:r>
+        <w:t xml:space="preserve">Then the risk difference of group 2 compared with group 1, with group 1 as the reference group, is the negative of</w:t>
+      </w:r>
+      <w:r>
+        <w:t xml:space="preserve"> </w:t>
+      </w:r>
+      <m:oMath>
+        <m:r>
+          <m:rPr>
+            <m:sty m:val="p"/>
+          </m:rPr>
+          <m:t>RD</m:t>
+        </m:r>
+      </m:oMath>
+      <w:r>
+        <w:t xml:space="preserve">:</w:t>
+      </w:r>
+    </w:p>
+    <w:p>
+      <w:pPr>
+        <w:pStyle w:val="BodyText"/>
+      </w:pPr>
+      <m:oMathPara>
+        <m:oMathParaPr>
+          <m:jc m:val="center"/>
+        </m:oMathParaPr>
+        <m:oMath>
+          <m:sSub>
+            <m:e>
+              <m:r>
+                <m:t>π</m:t>
+              </m:r>
+            </m:e>
+            <m:sub>
+              <m:r>
+                <m:t>2</m:t>
+              </m:r>
+            </m:sub>
+          </m:sSub>
+          <m:r>
+            <m:rPr>
+              <m:sty m:val="p"/>
+            </m:rPr>
+            <m:t>−</m:t>
+          </m:r>
+          <m:sSub>
+            <m:e>
+              <m:r>
+                <m:t>π</m:t>
+              </m:r>
+            </m:e>
+            <m:sub>
+              <m:r>
+                <m:t>1</m:t>
+              </m:r>
+            </m:sub>
+          </m:sSub>
+          <m:r>
+            <m:rPr>
+              <m:sty m:val="p"/>
+            </m:rPr>
+            <m:t>=</m:t>
+          </m:r>
+          <m:r>
+            <m:rPr>
+              <m:sty m:val="p"/>
+            </m:rPr>
+            <m:t>−</m:t>
+          </m:r>
+          <m:r>
+            <m:rPr>
+              <m:sty m:val="p"/>
+            </m:rPr>
+            <m:t>RD</m:t>
+          </m:r>
+          <m:r>
+            <m:rPr>
+              <m:sty m:val="p"/>
+            </m:rPr>
+            <m:t>.</m:t>
+          </m:r>
+        </m:oMath>
+      </m:oMathPara>
+    </w:p>
+    <w:bookmarkEnd w:id="41"/>
+    <w:p>
+      <w:pPr>
+        <w:pStyle w:val="FirstParagraph"/>
+      </w:pPr>
+      <w:r>
+        <w:rPr>
+          <w:i/>
+          <w:iCs/>
+        </w:rPr>
+        <w:t xml:space="preserve">Proof</w:t>
+      </w:r>
+      <w:r>
+        <w:t xml:space="preserve">. </w:t>
+      </w:r>
+      <w:r>
+        <w:t xml:space="preserve">This is the result of</w:t>
+      </w:r>
+      <w:r>
+        <w:t xml:space="preserve"> </w:t>
+      </w:r>
+      <w:hyperlink w:anchor="sol-risk-difference-switch-ref">
+        <w:r>
+          <w:rPr>
+            <w:rStyle w:val="Hyperlink"/>
+          </w:rPr>
+          <w:t xml:space="preserve">Solution 1</w:t>
+        </w:r>
+      </w:hyperlink>
+      <w:r>
+        <w:t xml:space="preserve">.</w:t>
+      </w:r>
+    </w:p>
+    <w:bookmarkStart w:id="43" w:name="exm-hers-risk-difference-switch-ref"/>
+    <w:p>
+      <w:pPr>
+        <w:pStyle w:val="BodyText"/>
+      </w:pPr>
+      <w:r>
+        <w:rPr>
+          <w:b/>
+          <w:bCs/>
+        </w:rPr>
+        <w:t xml:space="preserve">Example 8 (Switching the reference group in the HERS risk difference)</w:t>
+      </w:r>
+      <w:r>
+        <w:t xml:space="preserve"> </w:t>
+      </w:r>
+      <w:r>
+        <w:t xml:space="preserve">In</w:t>
+      </w:r>
+      <w:r>
+        <w:t xml:space="preserve"> </w:t>
+      </w:r>
+      <w:hyperlink w:anchor="exm-hers-risk-difference">
+        <w:r>
+          <w:rPr>
+            <w:rStyle w:val="Hyperlink"/>
+          </w:rPr>
+          <w:t xml:space="preserve">Example 7</w:t>
+        </w:r>
+      </w:hyperlink>
+      <w:r>
+        <w:t xml:space="preserve"> </w:t>
+      </w:r>
+      <w:r>
+        <w:t xml:space="preserve">the placebo group is the</w:t>
+      </w:r>
+      <w:r>
+        <w:t xml:space="preserve"> </w:t>
+      </w:r>
+      <w:hyperlink w:anchor="def-reference-group">
+        <w:r>
+          <w:rPr>
+            <w:rStyle w:val="Hyperlink"/>
+          </w:rPr>
+          <w:t xml:space="preserve">reference group</w:t>
+        </w:r>
+      </w:hyperlink>
+      <w:r>
+        <w:t xml:space="preserve">, and the estimated</w:t>
+      </w:r>
+      <w:r>
+        <w:t xml:space="preserve"> </w:t>
+      </w:r>
+      <w:hyperlink w:anchor="def-risk-difference">
+        <w:r>
+          <w:rPr>
+            <w:rStyle w:val="Hyperlink"/>
+          </w:rPr>
+          <w:t xml:space="preserve">risk difference</w:t>
+        </w:r>
+      </w:hyperlink>
+      <w:r>
+        <w:t xml:space="preserve"> </w:t>
+      </w:r>
+      <w:r>
+        <w:t xml:space="preserve">is 0.007.</w:t>
+      </w:r>
+      <w:r>
+        <w:t xml:space="preserve"> </w:t>
+      </w:r>
+      <w:r>
+        <w:t xml:space="preserve">Taking the hormone therapy group as the reference group instead gives:</w:t>
+      </w:r>
+    </w:p>
+    <w:p>
+      <w:pPr>
+        <w:pStyle w:val="SourceCode"/>
+      </w:pPr>
+      <w:r>
+        <w:rPr>
+          <w:rStyle w:val="NormalTok"/>
+        </w:rPr>
+        <w:t xml:space="preserve">rd_hat_switched </w:t>
+      </w:r>
+      <w:r>
+        <w:rPr>
+          <w:rStyle w:val="OtherTok"/>
+        </w:rPr>
+        <w:t xml:space="preserve">&lt;-</w:t>
+      </w:r>
+      <w:r>
+        <w:rPr>
+          <w:rStyle w:val="NormalTok"/>
+        </w:rPr>
+        <w:t xml:space="preserve"> risk_hat[[</w:t>
+      </w:r>
+      <w:r>
+        <w:rPr>
+          <w:rStyle w:val="StringTok"/>
+        </w:rPr>
+        <w:t xml:space="preserve">"placebo"</w:t>
+      </w:r>
+      <w:r>
+        <w:rPr>
+          <w:rStyle w:val="NormalTok"/>
+        </w:rPr>
+        <w:t xml:space="preserve">]] </w:t>
+      </w:r>
+      <w:r>
+        <w:rPr>
+          <w:rStyle w:val="SpecialCharTok"/>
+        </w:rPr>
+        <w:t xml:space="preserve">-</w:t>
+      </w:r>
+      <w:r>
+        <w:rPr>
+          <w:rStyle w:val="NormalTok"/>
+        </w:rPr>
+        <w:t xml:space="preserve"> risk_hat[[</w:t>
+      </w:r>
+      <w:r>
+        <w:rPr>
+          <w:rStyle w:val="StringTok"/>
+        </w:rPr>
+        <w:t xml:space="preserve">"hormone therapy"</w:t>
+      </w:r>
+      <w:r>
+        <w:rPr>
+          <w:rStyle w:val="NormalTok"/>
+        </w:rPr>
+        <w:t xml:space="preserve">]]</w:t>
+      </w:r>
+      <w:r>
+        <w:br/>
+      </w:r>
+      <w:r>
+        <w:rPr>
+          <w:rStyle w:val="NormalTok"/>
+        </w:rPr>
+        <w:t xml:space="preserve">rd_hat_switched</w:t>
+      </w:r>
+      <w:r>
+        <w:br/>
+      </w:r>
+      <w:r>
+        <w:rPr>
+          <w:rStyle w:val="CommentTok"/>
+        </w:rPr>
+        <w:t xml:space="preserve">#&gt; [1] -0.0066302</w:t>
+      </w:r>
+    </w:p>
+    <w:p>
+      <w:pPr>
+        <w:pStyle w:val="FirstParagraph"/>
+      </w:pPr>
+      <w:r>
+        <w:t xml:space="preserve">This</w:t>
+      </w:r>
+      <w:r>
+        <w:t xml:space="preserve"> </w:t>
+      </w:r>
+      <w:hyperlink r:id="rId42">
+        <w:r>
+          <w:rPr>
+            <w:rStyle w:val="Hyperlink"/>
+          </w:rPr>
+          <w:t xml:space="preserve">estimate</w:t>
+        </w:r>
+      </w:hyperlink>
+      <w:r>
+        <w:t xml:space="preserve">, -0.007, is the negative of 0.007, as</w:t>
+      </w:r>
+      <w:r>
+        <w:t xml:space="preserve"> </w:t>
+      </w:r>
+      <w:hyperlink w:anchor="thm-risk-difference-switch-ref">
+        <w:r>
+          <w:rPr>
+            <w:rStyle w:val="Hyperlink"/>
+          </w:rPr>
+          <w:t xml:space="preserve">Theorem 2</w:t>
+        </w:r>
+      </w:hyperlink>
+      <w:r>
+        <w:t xml:space="preserve"> </w:t>
+      </w:r>
+      <w:r>
+        <w:t xml:space="preserve">states.</w:t>
+      </w:r>
+    </w:p>
+    <w:bookmarkEnd w:id="43"/>
+    <w:bookmarkStart w:id="44" w:name="def-risk-ratio"/>
+    <w:p>
+      <w:pPr>
+        <w:pStyle w:val="BodyText"/>
+      </w:pPr>
+      <w:r>
+        <w:rPr>
+          <w:b/>
+          <w:bCs/>
+        </w:rPr>
+        <w:t xml:space="preserve">Definition 7 (Risk ratio (also called the relative risk))</w:t>
+      </w:r>
+      <w:r>
+        <w:t xml:space="preserve"> </w:t>
+      </w:r>
+      <w:r>
+        <w:t xml:space="preserve">Let:</w:t>
+      </w:r>
+    </w:p>
+    <w:p>
+      <w:pPr>
+        <w:pStyle w:val="Compact"/>
+        <w:numPr>
+          <w:ilvl w:val="0"/>
+          <w:numId w:val="1006"/>
         </w:numPr>
       </w:pPr>
       <m:oMath>
@@ -6191,7 +7176,7 @@
         <w:pStyle w:val="Compact"/>
         <w:numPr>
           <w:ilvl w:val="0"/>
-          <w:numId w:val="1004"/>
+          <w:numId w:val="1006"/>
         </w:numPr>
       </w:pPr>
       <m:oMath>
@@ -6408,8 +7393,8 @@
         <w:t xml:space="preserve">.</w:t>
       </w:r>
     </w:p>
-    <w:bookmarkEnd w:id="39"/>
-    <w:bookmarkStart w:id="42" w:name="exm-hers-risk-ratio"/>
+    <w:bookmarkEnd w:id="44"/>
+    <w:bookmarkStart w:id="46" w:name="exm-hers-risk-ratio"/>
     <w:p>
       <w:pPr>
         <w:pStyle w:val="BodyText"/>
@@ -6419,7 +7404,7 @@
           <w:b/>
           <w:bCs/>
         </w:rPr>
-        <w:t xml:space="preserve">Example 8 (Risk ratio of regular exercise in HERS)</w:t>
+        <w:t xml:space="preserve">Example 9 (Risk ratio of regular exercise in HERS)</w:t>
       </w:r>
       <w:r>
         <w:t xml:space="preserve"> </w:t>
@@ -6615,7 +7600,7 @@
       <w:r>
         <w:t xml:space="preserve"> </w:t>
       </w:r>
-      <w:hyperlink r:id="rId40">
+      <w:hyperlink r:id="rId42">
         <w:r>
           <w:rPr>
             <w:rStyle w:val="Hyperlink"/>
@@ -6638,7 +7623,7 @@
       <w:r>
         <w:t xml:space="preserve"> </w:t>
       </w:r>
-      <w:hyperlink r:id="rId41">
+      <w:hyperlink r:id="rId45">
         <w:r>
           <w:rPr>
             <w:rStyle w:val="Hyperlink"/>
@@ -6679,8 +7664,8 @@
         <w:t xml:space="preserve">The estimate alone does not show how precise it is.</w:t>
       </w:r>
     </w:p>
-    <w:bookmarkEnd w:id="42"/>
-    <w:bookmarkStart w:id="44" w:name="def-odds-ratio"/>
+    <w:bookmarkEnd w:id="46"/>
+    <w:bookmarkStart w:id="47" w:name="exr-risk-ratio-switch-ref"/>
     <w:p>
       <w:pPr>
         <w:pStyle w:val="BodyText"/>
@@ -6690,7 +7675,7 @@
           <w:b/>
           <w:bCs/>
         </w:rPr>
-        <w:t xml:space="preserve">Definition 8 (Odds ratio)</w:t>
+        <w:t xml:space="preserve">Exercise 2</w:t>
       </w:r>
       <w:r>
         <w:t xml:space="preserve"> </w:t>
@@ -6704,14 +7689,14 @@
         <w:pStyle w:val="Compact"/>
         <w:numPr>
           <w:ilvl w:val="0"/>
-          <w:numId w:val="1005"/>
+          <w:numId w:val="1007"/>
         </w:numPr>
       </w:pPr>
       <m:oMath>
         <m:sSub>
           <m:e>
             <m:r>
-              <m:t>ω</m:t>
+              <m:t>π</m:t>
             </m:r>
           </m:e>
           <m:sub>
@@ -6725,17 +7710,49 @@
         <w:t xml:space="preserve"> </w:t>
       </w:r>
       <w:r>
+        <w:t xml:space="preserve">and</w:t>
+      </w:r>
+      <w:r>
+        <w:t xml:space="preserve"> </w:t>
+      </w:r>
+      <m:oMath>
+        <m:sSub>
+          <m:e>
+            <m:r>
+              <m:t>π</m:t>
+            </m:r>
+          </m:e>
+          <m:sub>
+            <m:r>
+              <m:t>2</m:t>
+            </m:r>
+          </m:sub>
+        </m:sSub>
+        <m:r>
+          <m:rPr>
+            <m:sty m:val="p"/>
+          </m:rPr>
+          <m:t>&gt;</m:t>
+        </m:r>
+        <m:r>
+          <m:t>0</m:t>
+        </m:r>
+      </m:oMath>
+      <w:r>
+        <w:t xml:space="preserve"> </w:t>
+      </w:r>
+      <w:r>
         <w:t xml:space="preserve">be the</w:t>
       </w:r>
       <w:r>
         <w:t xml:space="preserve"> </w:t>
       </w:r>
-      <w:hyperlink r:id="rId43">
+      <w:hyperlink w:anchor="def-outcome-risk">
         <w:r>
           <w:rPr>
             <w:rStyle w:val="Hyperlink"/>
           </w:rPr>
-          <w:t xml:space="preserve">odds</w:t>
+          <w:t xml:space="preserve">risks</w:t>
         </w:r>
       </w:hyperlink>
       <w:r>
@@ -6759,7 +7776,7 @@
         <w:t xml:space="preserve"> </w:t>
       </w:r>
       <w:r>
-        <w:t xml:space="preserve">outcome in group 1.</w:t>
+        <w:t xml:space="preserve">outcome in group 1 and group 2.</w:t>
       </w:r>
     </w:p>
     <w:p>
@@ -6767,7 +7784,1109 @@
         <w:pStyle w:val="Compact"/>
         <w:numPr>
           <w:ilvl w:val="0"/>
-          <w:numId w:val="1005"/>
+          <w:numId w:val="1007"/>
+        </w:numPr>
+      </w:pPr>
+      <m:oMath>
+        <m:sSub>
+          <m:e>
+            <m:r>
+              <m:rPr>
+                <m:nor/>
+                <m:sty m:val="p"/>
+              </m:rPr>
+              <m:t>ϙ</m:t>
+            </m:r>
+          </m:e>
+          <m:sub>
+            <m:r>
+              <m:t>π</m:t>
+            </m:r>
+          </m:sub>
+        </m:sSub>
+        <m:limUpp>
+          <m:e>
+            <m:r>
+              <m:rPr>
+                <m:sty m:val="p"/>
+              </m:rPr>
+              <m:t>=</m:t>
+            </m:r>
+          </m:e>
+          <m:lim>
+            <m:r>
+              <m:rPr>
+                <m:nor/>
+                <m:sty m:val="p"/>
+              </m:rPr>
+              <m:t>def</m:t>
+            </m:r>
+          </m:lim>
+        </m:limUpp>
+        <m:sSub>
+          <m:e>
+            <m:r>
+              <m:t>π</m:t>
+            </m:r>
+          </m:e>
+          <m:sub>
+            <m:r>
+              <m:t>1</m:t>
+            </m:r>
+          </m:sub>
+        </m:sSub>
+        <m:r>
+          <m:rPr>
+            <m:sty m:val="p"/>
+          </m:rPr>
+          <m:t>/</m:t>
+        </m:r>
+        <m:sSub>
+          <m:e>
+            <m:r>
+              <m:t>π</m:t>
+            </m:r>
+          </m:e>
+          <m:sub>
+            <m:r>
+              <m:t>2</m:t>
+            </m:r>
+          </m:sub>
+        </m:sSub>
+      </m:oMath>
+      <w:r>
+        <w:t xml:space="preserve"> </w:t>
+      </w:r>
+      <w:r>
+        <w:t xml:space="preserve">be the</w:t>
+      </w:r>
+      <w:r>
+        <w:t xml:space="preserve"> </w:t>
+      </w:r>
+      <w:hyperlink w:anchor="def-risk-ratio">
+        <w:r>
+          <w:rPr>
+            <w:rStyle w:val="Hyperlink"/>
+          </w:rPr>
+          <w:t xml:space="preserve">risk ratio</w:t>
+        </w:r>
+      </w:hyperlink>
+      <w:r>
+        <w:t xml:space="preserve"> </w:t>
+      </w:r>
+      <w:r>
+        <w:t xml:space="preserve">of group 1 compared with group 2.</w:t>
+      </w:r>
+    </w:p>
+    <w:p>
+      <w:pPr>
+        <w:pStyle w:val="Compact"/>
+        <w:numPr>
+          <w:ilvl w:val="0"/>
+          <w:numId w:val="1007"/>
+        </w:numPr>
+      </w:pPr>
+      <m:oMath>
+        <m:sSub>
+          <m:e>
+            <m:r>
+              <m:rPr>
+                <m:nor/>
+                <m:sty m:val="p"/>
+              </m:rPr>
+              <m:t>ϙ</m:t>
+            </m:r>
+          </m:e>
+          <m:sub>
+            <m:r>
+              <m:t>π</m:t>
+            </m:r>
+          </m:sub>
+        </m:sSub>
+        <m:r>
+          <m:rPr>
+            <m:sty m:val="p"/>
+          </m:rPr>
+          <m:t>&gt;</m:t>
+        </m:r>
+        <m:r>
+          <m:t>0</m:t>
+        </m:r>
+      </m:oMath>
+      <w:r>
+        <w:t xml:space="preserve">.</w:t>
+      </w:r>
+    </w:p>
+    <w:p>
+      <w:pPr>
+        <w:pStyle w:val="FirstParagraph"/>
+      </w:pPr>
+      <w:r>
+        <w:t xml:space="preserve">Express the risk ratio of group 2 compared with group 1,</w:t>
+      </w:r>
+      <w:r>
+        <w:t xml:space="preserve"> </w:t>
+      </w:r>
+      <m:oMath>
+        <m:sSub>
+          <m:e>
+            <m:r>
+              <m:t>π</m:t>
+            </m:r>
+          </m:e>
+          <m:sub>
+            <m:r>
+              <m:t>2</m:t>
+            </m:r>
+          </m:sub>
+        </m:sSub>
+        <m:r>
+          <m:rPr>
+            <m:sty m:val="p"/>
+          </m:rPr>
+          <m:t>/</m:t>
+        </m:r>
+        <m:sSub>
+          <m:e>
+            <m:r>
+              <m:t>π</m:t>
+            </m:r>
+          </m:e>
+          <m:sub>
+            <m:r>
+              <m:t>1</m:t>
+            </m:r>
+          </m:sub>
+        </m:sSub>
+      </m:oMath>
+      <w:r>
+        <w:t xml:space="preserve">, in terms of</w:t>
+      </w:r>
+      <w:r>
+        <w:t xml:space="preserve"> </w:t>
+      </w:r>
+      <m:oMath>
+        <m:sSub>
+          <m:e>
+            <m:r>
+              <m:rPr>
+                <m:nor/>
+                <m:sty m:val="p"/>
+              </m:rPr>
+              <m:t>ϙ</m:t>
+            </m:r>
+          </m:e>
+          <m:sub>
+            <m:r>
+              <m:t>π</m:t>
+            </m:r>
+          </m:sub>
+        </m:sSub>
+      </m:oMath>
+      <w:r>
+        <w:t xml:space="preserve">.</w:t>
+      </w:r>
+    </w:p>
+    <w:bookmarkEnd w:id="47"/>
+    <w:bookmarkStart w:id="48" w:name="sol-risk-ratio-switch-ref"/>
+    <w:p>
+      <w:pPr>
+        <w:pStyle w:val="BodyText"/>
+      </w:pPr>
+      <w:r>
+        <w:rPr>
+          <w:i/>
+          <w:iCs/>
+        </w:rPr>
+        <w:t xml:space="preserve">Solution 2</w:t>
+      </w:r>
+      <w:r>
+        <w:t xml:space="preserve">. </w:t>
+      </w:r>
+    </w:p>
+    <w:p>
+      <w:pPr>
+        <w:pStyle w:val="BodyText"/>
+      </w:pPr>
+      <m:oMathPara>
+        <m:oMathParaPr>
+          <m:jc m:val="center"/>
+        </m:oMathParaPr>
+        <m:oMath>
+          <m:eqArr>
+            <m:e>
+              <m:f>
+                <m:fPr>
+                  <m:type m:val="bar"/>
+                </m:fPr>
+                <m:num>
+                  <m:sSub>
+                    <m:e>
+                      <m:r>
+                        <m:t>π</m:t>
+                      </m:r>
+                    </m:e>
+                    <m:sub>
+                      <m:r>
+                        <m:t>2</m:t>
+                      </m:r>
+                    </m:sub>
+                  </m:sSub>
+                </m:num>
+                <m:den>
+                  <m:sSub>
+                    <m:e>
+                      <m:r>
+                        <m:t>π</m:t>
+                      </m:r>
+                    </m:e>
+                    <m:sub>
+                      <m:r>
+                        <m:t>1</m:t>
+                      </m:r>
+                    </m:sub>
+                  </m:sSub>
+                </m:den>
+              </m:f>
+              <m:r>
+                <m:t>&amp;</m:t>
+              </m:r>
+              <m:r>
+                <m:rPr>
+                  <m:sty m:val="p"/>
+                </m:rPr>
+                <m:t>=</m:t>
+              </m:r>
+              <m:f>
+                <m:fPr>
+                  <m:type m:val="bar"/>
+                </m:fPr>
+                <m:num>
+                  <m:r>
+                    <m:t>1</m:t>
+                  </m:r>
+                </m:num>
+                <m:den>
+                  <m:sSub>
+                    <m:e>
+                      <m:r>
+                        <m:t>π</m:t>
+                      </m:r>
+                    </m:e>
+                    <m:sub>
+                      <m:r>
+                        <m:t>1</m:t>
+                      </m:r>
+                    </m:sub>
+                  </m:sSub>
+                  <m:r>
+                    <m:rPr>
+                      <m:sty m:val="p"/>
+                    </m:rPr>
+                    <m:t>/</m:t>
+                  </m:r>
+                  <m:sSub>
+                    <m:e>
+                      <m:r>
+                        <m:t>π</m:t>
+                      </m:r>
+                    </m:e>
+                    <m:sub>
+                      <m:r>
+                        <m:t>2</m:t>
+                      </m:r>
+                    </m:sub>
+                  </m:sSub>
+                </m:den>
+              </m:f>
+              <m:r>
+                <m:t>&amp;</m:t>
+              </m:r>
+              <m:r>
+                <m:t>&amp;</m:t>
+              </m:r>
+              <m:r>
+                <m:rPr>
+                  <m:nor/>
+                  <m:sty m:val="p"/>
+                </m:rPr>
+                <m:t>(the reciprocal of a quotient swaps numerator and denominator)</m:t>
+              </m:r>
+            </m:e>
+            <m:e>
+              <m:r>
+                <m:t>&amp;</m:t>
+              </m:r>
+              <m:r>
+                <m:rPr>
+                  <m:sty m:val="p"/>
+                </m:rPr>
+                <m:t>=</m:t>
+              </m:r>
+              <m:f>
+                <m:fPr>
+                  <m:type m:val="bar"/>
+                </m:fPr>
+                <m:num>
+                  <m:r>
+                    <m:t>1</m:t>
+                  </m:r>
+                </m:num>
+                <m:den>
+                  <m:sSub>
+                    <m:e>
+                      <m:r>
+                        <m:rPr>
+                          <m:nor/>
+                          <m:sty m:val="p"/>
+                        </m:rPr>
+                        <m:t>ϙ</m:t>
+                      </m:r>
+                    </m:e>
+                    <m:sub>
+                      <m:r>
+                        <m:t>π</m:t>
+                      </m:r>
+                    </m:sub>
+                  </m:sSub>
+                </m:den>
+              </m:f>
+              <m:r>
+                <m:t>&amp;</m:t>
+              </m:r>
+              <m:r>
+                <m:t>&amp;</m:t>
+              </m:r>
+              <m:r>
+                <m:rPr>
+                  <m:nor/>
+                  <m:sty m:val="p"/>
+                </m:rPr>
+                <m:t>(definition of </m:t>
+              </m:r>
+              <m:sSub>
+                <m:e>
+                  <m:r>
+                    <m:rPr>
+                      <m:nor/>
+                      <m:sty m:val="p"/>
+                    </m:rPr>
+                    <m:t>ϙ</m:t>
+                  </m:r>
+                </m:e>
+                <m:sub>
+                  <m:r>
+                    <m:t>π</m:t>
+                  </m:r>
+                </m:sub>
+              </m:sSub>
+              <m:r>
+                <m:rPr>
+                  <m:nor/>
+                  <m:sty m:val="p"/>
+                </m:rPr>
+                <m:t>)</m:t>
+              </m:r>
+            </m:e>
+          </m:eqArr>
+        </m:oMath>
+      </m:oMathPara>
+    </w:p>
+    <w:bookmarkEnd w:id="48"/>
+    <w:bookmarkStart w:id="49" w:name="thm-risk-ratio-switch-ref"/>
+    <w:p>
+      <w:pPr>
+        <w:pStyle w:val="FirstParagraph"/>
+      </w:pPr>
+      <w:r>
+        <w:rPr>
+          <w:b/>
+          <w:bCs/>
+        </w:rPr>
+        <w:t xml:space="preserve">Theorem 3 (Switching the reference group in a risk ratio)</w:t>
+      </w:r>
+      <w:r>
+        <w:t xml:space="preserve"> </w:t>
+      </w:r>
+      <w:r>
+        <w:t xml:space="preserve">Let:</w:t>
+      </w:r>
+    </w:p>
+    <w:p>
+      <w:pPr>
+        <w:pStyle w:val="Compact"/>
+        <w:numPr>
+          <w:ilvl w:val="0"/>
+          <w:numId w:val="1008"/>
+        </w:numPr>
+      </w:pPr>
+      <m:oMath>
+        <m:sSub>
+          <m:e>
+            <m:r>
+              <m:t>π</m:t>
+            </m:r>
+          </m:e>
+          <m:sub>
+            <m:r>
+              <m:t>1</m:t>
+            </m:r>
+          </m:sub>
+        </m:sSub>
+      </m:oMath>
+      <w:r>
+        <w:t xml:space="preserve"> </w:t>
+      </w:r>
+      <w:r>
+        <w:t xml:space="preserve">and</w:t>
+      </w:r>
+      <w:r>
+        <w:t xml:space="preserve"> </w:t>
+      </w:r>
+      <m:oMath>
+        <m:sSub>
+          <m:e>
+            <m:r>
+              <m:t>π</m:t>
+            </m:r>
+          </m:e>
+          <m:sub>
+            <m:r>
+              <m:t>2</m:t>
+            </m:r>
+          </m:sub>
+        </m:sSub>
+        <m:r>
+          <m:rPr>
+            <m:sty m:val="p"/>
+          </m:rPr>
+          <m:t>&gt;</m:t>
+        </m:r>
+        <m:r>
+          <m:t>0</m:t>
+        </m:r>
+      </m:oMath>
+      <w:r>
+        <w:t xml:space="preserve"> </w:t>
+      </w:r>
+      <w:r>
+        <w:t xml:space="preserve">be the</w:t>
+      </w:r>
+      <w:r>
+        <w:t xml:space="preserve"> </w:t>
+      </w:r>
+      <w:hyperlink w:anchor="def-outcome-risk">
+        <w:r>
+          <w:rPr>
+            <w:rStyle w:val="Hyperlink"/>
+          </w:rPr>
+          <w:t xml:space="preserve">risks</w:t>
+        </w:r>
+      </w:hyperlink>
+      <w:r>
+        <w:t xml:space="preserve"> </w:t>
+      </w:r>
+      <w:r>
+        <w:t xml:space="preserve">of a</w:t>
+      </w:r>
+      <w:r>
+        <w:t xml:space="preserve"> </w:t>
+      </w:r>
+      <w:hyperlink r:id="rId30">
+        <w:r>
+          <w:rPr>
+            <w:rStyle w:val="Hyperlink"/>
+          </w:rPr>
+          <w:t xml:space="preserve">binary</w:t>
+        </w:r>
+      </w:hyperlink>
+      <w:r>
+        <w:t xml:space="preserve"> </w:t>
+      </w:r>
+      <w:r>
+        <w:t xml:space="preserve">outcome in group 1 and group 2.</w:t>
+      </w:r>
+    </w:p>
+    <w:p>
+      <w:pPr>
+        <w:pStyle w:val="Compact"/>
+        <w:numPr>
+          <w:ilvl w:val="0"/>
+          <w:numId w:val="1008"/>
+        </w:numPr>
+      </w:pPr>
+      <m:oMath>
+        <m:sSub>
+          <m:e>
+            <m:r>
+              <m:rPr>
+                <m:nor/>
+                <m:sty m:val="p"/>
+              </m:rPr>
+              <m:t>ϙ</m:t>
+            </m:r>
+          </m:e>
+          <m:sub>
+            <m:r>
+              <m:t>π</m:t>
+            </m:r>
+          </m:sub>
+        </m:sSub>
+        <m:limUpp>
+          <m:e>
+            <m:r>
+              <m:rPr>
+                <m:sty m:val="p"/>
+              </m:rPr>
+              <m:t>=</m:t>
+            </m:r>
+          </m:e>
+          <m:lim>
+            <m:r>
+              <m:rPr>
+                <m:nor/>
+                <m:sty m:val="p"/>
+              </m:rPr>
+              <m:t>def</m:t>
+            </m:r>
+          </m:lim>
+        </m:limUpp>
+        <m:sSub>
+          <m:e>
+            <m:r>
+              <m:t>π</m:t>
+            </m:r>
+          </m:e>
+          <m:sub>
+            <m:r>
+              <m:t>1</m:t>
+            </m:r>
+          </m:sub>
+        </m:sSub>
+        <m:r>
+          <m:rPr>
+            <m:sty m:val="p"/>
+          </m:rPr>
+          <m:t>/</m:t>
+        </m:r>
+        <m:sSub>
+          <m:e>
+            <m:r>
+              <m:t>π</m:t>
+            </m:r>
+          </m:e>
+          <m:sub>
+            <m:r>
+              <m:t>2</m:t>
+            </m:r>
+          </m:sub>
+        </m:sSub>
+      </m:oMath>
+      <w:r>
+        <w:t xml:space="preserve"> </w:t>
+      </w:r>
+      <w:r>
+        <w:t xml:space="preserve">be the</w:t>
+      </w:r>
+      <w:r>
+        <w:t xml:space="preserve"> </w:t>
+      </w:r>
+      <w:hyperlink w:anchor="def-risk-ratio">
+        <w:r>
+          <w:rPr>
+            <w:rStyle w:val="Hyperlink"/>
+          </w:rPr>
+          <w:t xml:space="preserve">risk ratio</w:t>
+        </w:r>
+      </w:hyperlink>
+      <w:r>
+        <w:t xml:space="preserve"> </w:t>
+      </w:r>
+      <w:r>
+        <w:t xml:space="preserve">of group 1 compared with group 2, with group 2 as the</w:t>
+      </w:r>
+      <w:r>
+        <w:t xml:space="preserve"> </w:t>
+      </w:r>
+      <w:hyperlink w:anchor="def-reference-group">
+        <w:r>
+          <w:rPr>
+            <w:rStyle w:val="Hyperlink"/>
+          </w:rPr>
+          <w:t xml:space="preserve">reference group</w:t>
+        </w:r>
+      </w:hyperlink>
+      <w:r>
+        <w:t xml:space="preserve">.</w:t>
+      </w:r>
+    </w:p>
+    <w:p>
+      <w:pPr>
+        <w:pStyle w:val="Compact"/>
+        <w:numPr>
+          <w:ilvl w:val="0"/>
+          <w:numId w:val="1008"/>
+        </w:numPr>
+      </w:pPr>
+      <m:oMath>
+        <m:sSub>
+          <m:e>
+            <m:r>
+              <m:rPr>
+                <m:nor/>
+                <m:sty m:val="p"/>
+              </m:rPr>
+              <m:t>ϙ</m:t>
+            </m:r>
+          </m:e>
+          <m:sub>
+            <m:r>
+              <m:t>π</m:t>
+            </m:r>
+          </m:sub>
+        </m:sSub>
+        <m:r>
+          <m:rPr>
+            <m:sty m:val="p"/>
+          </m:rPr>
+          <m:t>&gt;</m:t>
+        </m:r>
+        <m:r>
+          <m:t>0</m:t>
+        </m:r>
+      </m:oMath>
+      <w:r>
+        <w:t xml:space="preserve">.</w:t>
+      </w:r>
+    </w:p>
+    <w:p>
+      <w:pPr>
+        <w:pStyle w:val="FirstParagraph"/>
+      </w:pPr>
+      <w:r>
+        <w:t xml:space="preserve">Then the risk ratio of group 2 compared with group 1, with group 1 as the reference group, is the reciprocal of</w:t>
+      </w:r>
+      <w:r>
+        <w:t xml:space="preserve"> </w:t>
+      </w:r>
+      <m:oMath>
+        <m:sSub>
+          <m:e>
+            <m:r>
+              <m:rPr>
+                <m:nor/>
+                <m:sty m:val="p"/>
+              </m:rPr>
+              <m:t>ϙ</m:t>
+            </m:r>
+          </m:e>
+          <m:sub>
+            <m:r>
+              <m:t>π</m:t>
+            </m:r>
+          </m:sub>
+        </m:sSub>
+      </m:oMath>
+      <w:r>
+        <w:t xml:space="preserve">:</w:t>
+      </w:r>
+    </w:p>
+    <w:p>
+      <w:pPr>
+        <w:pStyle w:val="BodyText"/>
+      </w:pPr>
+      <m:oMathPara>
+        <m:oMathParaPr>
+          <m:jc m:val="center"/>
+        </m:oMathParaPr>
+        <m:oMath>
+          <m:f>
+            <m:fPr>
+              <m:type m:val="bar"/>
+            </m:fPr>
+            <m:num>
+              <m:sSub>
+                <m:e>
+                  <m:r>
+                    <m:t>π</m:t>
+                  </m:r>
+                </m:e>
+                <m:sub>
+                  <m:r>
+                    <m:t>2</m:t>
+                  </m:r>
+                </m:sub>
+              </m:sSub>
+            </m:num>
+            <m:den>
+              <m:sSub>
+                <m:e>
+                  <m:r>
+                    <m:t>π</m:t>
+                  </m:r>
+                </m:e>
+                <m:sub>
+                  <m:r>
+                    <m:t>1</m:t>
+                  </m:r>
+                </m:sub>
+              </m:sSub>
+            </m:den>
+          </m:f>
+          <m:r>
+            <m:rPr>
+              <m:sty m:val="p"/>
+            </m:rPr>
+            <m:t>=</m:t>
+          </m:r>
+          <m:f>
+            <m:fPr>
+              <m:type m:val="bar"/>
+            </m:fPr>
+            <m:num>
+              <m:r>
+                <m:t>1</m:t>
+              </m:r>
+            </m:num>
+            <m:den>
+              <m:sSub>
+                <m:e>
+                  <m:r>
+                    <m:rPr>
+                      <m:nor/>
+                      <m:sty m:val="p"/>
+                    </m:rPr>
+                    <m:t>ϙ</m:t>
+                  </m:r>
+                </m:e>
+                <m:sub>
+                  <m:r>
+                    <m:t>π</m:t>
+                  </m:r>
+                </m:sub>
+              </m:sSub>
+            </m:den>
+          </m:f>
+          <m:r>
+            <m:rPr>
+              <m:sty m:val="p"/>
+            </m:rPr>
+            <m:t>.</m:t>
+          </m:r>
+        </m:oMath>
+      </m:oMathPara>
+    </w:p>
+    <w:bookmarkEnd w:id="49"/>
+    <w:p>
+      <w:pPr>
+        <w:pStyle w:val="FirstParagraph"/>
+      </w:pPr>
+      <w:r>
+        <w:rPr>
+          <w:i/>
+          <w:iCs/>
+        </w:rPr>
+        <w:t xml:space="preserve">Proof</w:t>
+      </w:r>
+      <w:r>
+        <w:t xml:space="preserve">. </w:t>
+      </w:r>
+      <w:r>
+        <w:t xml:space="preserve">This is the result of</w:t>
+      </w:r>
+      <w:r>
+        <w:t xml:space="preserve"> </w:t>
+      </w:r>
+      <w:hyperlink w:anchor="sol-risk-ratio-switch-ref">
+        <w:r>
+          <w:rPr>
+            <w:rStyle w:val="Hyperlink"/>
+          </w:rPr>
+          <w:t xml:space="preserve">Solution 2</w:t>
+        </w:r>
+      </w:hyperlink>
+      <w:r>
+        <w:t xml:space="preserve">.</w:t>
+      </w:r>
+    </w:p>
+    <w:bookmarkStart w:id="50" w:name="exm-hers-risk-ratio-switch-ref"/>
+    <w:p>
+      <w:pPr>
+        <w:pStyle w:val="BodyText"/>
+      </w:pPr>
+      <w:r>
+        <w:rPr>
+          <w:b/>
+          <w:bCs/>
+        </w:rPr>
+        <w:t xml:space="preserve">Example 10 (Switching the reference group in the HERS risk ratio)</w:t>
+      </w:r>
+      <w:r>
+        <w:t xml:space="preserve"> </w:t>
+      </w:r>
+      <w:r>
+        <w:t xml:space="preserve">In</w:t>
+      </w:r>
+      <w:r>
+        <w:t xml:space="preserve"> </w:t>
+      </w:r>
+      <w:hyperlink w:anchor="exm-hers-risk-ratio">
+        <w:r>
+          <w:rPr>
+            <w:rStyle w:val="Hyperlink"/>
+          </w:rPr>
+          <w:t xml:space="preserve">Example 9</w:t>
+        </w:r>
+      </w:hyperlink>
+      <w:r>
+        <w:t xml:space="preserve"> </w:t>
+      </w:r>
+      <w:r>
+        <w:t xml:space="preserve">the placebo group is the</w:t>
+      </w:r>
+      <w:r>
+        <w:t xml:space="preserve"> </w:t>
+      </w:r>
+      <w:hyperlink w:anchor="def-reference-group">
+        <w:r>
+          <w:rPr>
+            <w:rStyle w:val="Hyperlink"/>
+          </w:rPr>
+          <w:t xml:space="preserve">reference group</w:t>
+        </w:r>
+      </w:hyperlink>
+      <w:r>
+        <w:t xml:space="preserve">, and the estimated</w:t>
+      </w:r>
+      <w:r>
+        <w:t xml:space="preserve"> </w:t>
+      </w:r>
+      <w:hyperlink w:anchor="def-risk-ratio">
+        <w:r>
+          <w:rPr>
+            <w:rStyle w:val="Hyperlink"/>
+          </w:rPr>
+          <w:t xml:space="preserve">risk ratio</w:t>
+        </w:r>
+      </w:hyperlink>
+      <w:r>
+        <w:t xml:space="preserve"> </w:t>
+      </w:r>
+      <w:r>
+        <w:t xml:space="preserve">is 1.017.</w:t>
+      </w:r>
+      <w:r>
+        <w:t xml:space="preserve"> </w:t>
+      </w:r>
+      <w:r>
+        <w:t xml:space="preserve">Taking the hormone therapy group as the reference group instead gives:</w:t>
+      </w:r>
+    </w:p>
+    <w:p>
+      <w:pPr>
+        <w:pStyle w:val="SourceCode"/>
+      </w:pPr>
+      <w:r>
+        <w:rPr>
+          <w:rStyle w:val="NormalTok"/>
+        </w:rPr>
+        <w:t xml:space="preserve">rr_hat_switched </w:t>
+      </w:r>
+      <w:r>
+        <w:rPr>
+          <w:rStyle w:val="OtherTok"/>
+        </w:rPr>
+        <w:t xml:space="preserve">&lt;-</w:t>
+      </w:r>
+      <w:r>
+        <w:rPr>
+          <w:rStyle w:val="NormalTok"/>
+        </w:rPr>
+        <w:t xml:space="preserve"> risk_hat[[</w:t>
+      </w:r>
+      <w:r>
+        <w:rPr>
+          <w:rStyle w:val="StringTok"/>
+        </w:rPr>
+        <w:t xml:space="preserve">"placebo"</w:t>
+      </w:r>
+      <w:r>
+        <w:rPr>
+          <w:rStyle w:val="NormalTok"/>
+        </w:rPr>
+        <w:t xml:space="preserve">]] </w:t>
+      </w:r>
+      <w:r>
+        <w:rPr>
+          <w:rStyle w:val="SpecialCharTok"/>
+        </w:rPr>
+        <w:t xml:space="preserve">/</w:t>
+      </w:r>
+      <w:r>
+        <w:rPr>
+          <w:rStyle w:val="NormalTok"/>
+        </w:rPr>
+        <w:t xml:space="preserve"> risk_hat[[</w:t>
+      </w:r>
+      <w:r>
+        <w:rPr>
+          <w:rStyle w:val="StringTok"/>
+        </w:rPr>
+        <w:t xml:space="preserve">"hormone therapy"</w:t>
+      </w:r>
+      <w:r>
+        <w:rPr>
+          <w:rStyle w:val="NormalTok"/>
+        </w:rPr>
+        <w:t xml:space="preserve">]]</w:t>
+      </w:r>
+      <w:r>
+        <w:br/>
+      </w:r>
+      <w:r>
+        <w:rPr>
+          <w:rStyle w:val="NormalTok"/>
+        </w:rPr>
+        <w:t xml:space="preserve">rr_hat_switched</w:t>
+      </w:r>
+      <w:r>
+        <w:br/>
+      </w:r>
+      <w:r>
+        <w:rPr>
+          <w:rStyle w:val="CommentTok"/>
+        </w:rPr>
+        <w:t xml:space="preserve">#&gt; [1] 0.982993</w:t>
+      </w:r>
+    </w:p>
+    <w:p>
+      <w:pPr>
+        <w:pStyle w:val="FirstParagraph"/>
+      </w:pPr>
+      <w:r>
+        <w:t xml:space="preserve">This</w:t>
+      </w:r>
+      <w:r>
+        <w:t xml:space="preserve"> </w:t>
+      </w:r>
+      <w:hyperlink r:id="rId42">
+        <w:r>
+          <w:rPr>
+            <w:rStyle w:val="Hyperlink"/>
+          </w:rPr>
+          <w:t xml:space="preserve">estimate</w:t>
+        </w:r>
+      </w:hyperlink>
+      <w:r>
+        <w:t xml:space="preserve">, 0.983, is the reciprocal of 1.017, 0.983, as</w:t>
+      </w:r>
+      <w:r>
+        <w:t xml:space="preserve"> </w:t>
+      </w:r>
+      <w:hyperlink w:anchor="thm-risk-ratio-switch-ref">
+        <w:r>
+          <w:rPr>
+            <w:rStyle w:val="Hyperlink"/>
+          </w:rPr>
+          <w:t xml:space="preserve">Theorem 3</w:t>
+        </w:r>
+      </w:hyperlink>
+      <w:r>
+        <w:t xml:space="preserve"> </w:t>
+      </w:r>
+      <w:r>
+        <w:t xml:space="preserve">states.</w:t>
+      </w:r>
+    </w:p>
+    <w:bookmarkEnd w:id="50"/>
+    <w:bookmarkStart w:id="52" w:name="def-odds-ratio"/>
+    <w:p>
+      <w:pPr>
+        <w:pStyle w:val="BodyText"/>
+      </w:pPr>
+      <w:r>
+        <w:rPr>
+          <w:b/>
+          <w:bCs/>
+        </w:rPr>
+        <w:t xml:space="preserve">Definition 8 (Odds ratio)</w:t>
+      </w:r>
+      <w:r>
+        <w:t xml:space="preserve"> </w:t>
+      </w:r>
+      <w:r>
+        <w:t xml:space="preserve">Let:</w:t>
+      </w:r>
+    </w:p>
+    <w:p>
+      <w:pPr>
+        <w:pStyle w:val="Compact"/>
+        <w:numPr>
+          <w:ilvl w:val="0"/>
+          <w:numId w:val="1009"/>
+        </w:numPr>
+      </w:pPr>
+      <m:oMath>
+        <m:sSub>
+          <m:e>
+            <m:r>
+              <m:t>ω</m:t>
+            </m:r>
+          </m:e>
+          <m:sub>
+            <m:r>
+              <m:t>1</m:t>
+            </m:r>
+          </m:sub>
+        </m:sSub>
+      </m:oMath>
+      <w:r>
+        <w:t xml:space="preserve"> </w:t>
+      </w:r>
+      <w:r>
+        <w:t xml:space="preserve">be the</w:t>
+      </w:r>
+      <w:r>
+        <w:t xml:space="preserve"> </w:t>
+      </w:r>
+      <w:hyperlink r:id="rId51">
+        <w:r>
+          <w:rPr>
+            <w:rStyle w:val="Hyperlink"/>
+          </w:rPr>
+          <w:t xml:space="preserve">odds</w:t>
+        </w:r>
+      </w:hyperlink>
+      <w:r>
+        <w:t xml:space="preserve"> </w:t>
+      </w:r>
+      <w:r>
+        <w:t xml:space="preserve">of a</w:t>
+      </w:r>
+      <w:r>
+        <w:t xml:space="preserve"> </w:t>
+      </w:r>
+      <w:hyperlink r:id="rId30">
+        <w:r>
+          <w:rPr>
+            <w:rStyle w:val="Hyperlink"/>
+          </w:rPr>
+          <w:t xml:space="preserve">binary</w:t>
+        </w:r>
+      </w:hyperlink>
+      <w:r>
+        <w:t xml:space="preserve"> </w:t>
+      </w:r>
+      <w:r>
+        <w:t xml:space="preserve">outcome in group 1.</w:t>
+      </w:r>
+    </w:p>
+    <w:p>
+      <w:pPr>
+        <w:pStyle w:val="Compact"/>
+        <w:numPr>
+          <w:ilvl w:val="0"/>
+          <w:numId w:val="1009"/>
         </w:numPr>
       </w:pPr>
       <m:oMath>
@@ -7098,8 +9217,8 @@
         <w:t xml:space="preserve">.</w:t>
       </w:r>
     </w:p>
-    <w:bookmarkEnd w:id="44"/>
-    <w:bookmarkStart w:id="45" w:name="exm-hers-odds-ratio"/>
+    <w:bookmarkEnd w:id="52"/>
+    <w:bookmarkStart w:id="53" w:name="exm-hers-odds-ratio"/>
     <w:p>
       <w:pPr>
         <w:pStyle w:val="BodyText"/>
@@ -7109,7 +9228,7 @@
           <w:b/>
           <w:bCs/>
         </w:rPr>
-        <w:t xml:space="preserve">Example 9 (Odds ratio of regular exercise in HERS)</w:t>
+        <w:t xml:space="preserve">Example 11 (Odds ratio of regular exercise in HERS)</w:t>
       </w:r>
       <w:r>
         <w:t xml:space="preserve"> </w:t>
@@ -7140,7 +9259,7 @@
       <w:r>
         <w:t xml:space="preserve"> </w:t>
       </w:r>
-      <w:hyperlink r:id="rId43">
+      <w:hyperlink r:id="rId51">
         <w:r>
           <w:rPr>
             <w:rStyle w:val="Hyperlink"/>
@@ -7414,7 +9533,7 @@
           <w:rPr>
             <w:rStyle w:val="Hyperlink"/>
           </w:rPr>
-          <w:t xml:space="preserve">Example 8</w:t>
+          <w:t xml:space="preserve">Example 9</w:t>
         </w:r>
       </w:hyperlink>
       <w:r>
@@ -7441,7 +9560,7 @@
       <w:r>
         <w:t xml:space="preserve"> </w:t>
       </w:r>
-      <w:hyperlink r:id="rId41">
+      <w:hyperlink r:id="rId45">
         <w:r>
           <w:rPr>
             <w:rStyle w:val="Hyperlink"/>
@@ -7470,7 +9589,7 @@
         <w:t xml:space="preserve">.</w:t>
       </w:r>
     </w:p>
-    <w:bookmarkEnd w:id="45"/>
+    <w:bookmarkEnd w:id="53"/>
     <w:p>
       <w:pPr>
         <w:pStyle w:val="BodyText"/>
@@ -7485,9 +9604,9 @@
         <w:t xml:space="preserve">covers odds ratios.</w:t>
       </w:r>
     </w:p>
-    <w:bookmarkEnd w:id="46"/>
-    <w:bookmarkEnd w:id="47"/>
-    <w:bookmarkStart w:id="65" w:name="references"/>
+    <w:bookmarkEnd w:id="54"/>
+    <w:bookmarkEnd w:id="55"/>
+    <w:bookmarkStart w:id="73" w:name="references"/>
     <w:p>
       <w:pPr>
         <w:pStyle w:val="Heading2"/>
@@ -7496,8 +9615,8 @@
         <w:t xml:space="preserve">References</w:t>
       </w:r>
     </w:p>
-    <w:bookmarkStart w:id="64" w:name="refs"/>
-    <w:bookmarkStart w:id="49" w:name="ref-vittinghoff2e"/>
+    <w:bookmarkStart w:id="72" w:name="refs"/>
+    <w:bookmarkStart w:id="57" w:name="ref-vittinghoff2e"/>
     <w:p>
       <w:pPr>
         <w:pStyle w:val="Bibliography"/>
@@ -7530,7 +9649,7 @@
       <w:r>
         <w:t xml:space="preserve"> </w:t>
       </w:r>
-      <w:hyperlink r:id="rId48">
+      <w:hyperlink r:id="rId56">
         <w:r>
           <w:rPr>
             <w:rStyle w:val="Hyperlink"/>
@@ -7542,8 +9661,8 @@
         <w:t xml:space="preserve">.</w:t>
       </w:r>
     </w:p>
-    <w:bookmarkEnd w:id="49"/>
-    <w:bookmarkStart w:id="50" w:name="ref-hoggtanis2015"/>
+    <w:bookmarkEnd w:id="57"/>
+    <w:bookmarkStart w:id="58" w:name="ref-hoggtanis2015"/>
     <w:p>
       <w:pPr>
         <w:pStyle w:val="Bibliography"/>
@@ -7574,8 +9693,8 @@
         <w:t xml:space="preserve">, Tenth edition. Boston: Pearson, 2019.</w:t>
       </w:r>
     </w:p>
-    <w:bookmarkEnd w:id="50"/>
-    <w:bookmarkStart w:id="52" w:name="ref-wikipedia_contingency_table"/>
+    <w:bookmarkEnd w:id="58"/>
+    <w:bookmarkStart w:id="60" w:name="ref-wikipedia_contingency_table"/>
     <w:p>
       <w:pPr>
         <w:pStyle w:val="Bibliography"/>
@@ -7622,7 +9741,7 @@
       <w:r>
         <w:t xml:space="preserve"> </w:t>
       </w:r>
-      <w:hyperlink r:id="rId51">
+      <w:hyperlink r:id="rId59">
         <w:r>
           <w:rPr>
             <w:rStyle w:val="Hyperlink"/>
@@ -7631,8 +9750,8 @@
         </w:r>
       </w:hyperlink>
     </w:p>
-    <w:bookmarkEnd w:id="52"/>
-    <w:bookmarkStart w:id="54" w:name="ref-wikipedia_pearsons_chi_squared_test"/>
+    <w:bookmarkEnd w:id="60"/>
+    <w:bookmarkStart w:id="62" w:name="ref-wikipedia_pearsons_chi_squared_test"/>
     <w:p>
       <w:pPr>
         <w:pStyle w:val="Bibliography"/>
@@ -7679,7 +9798,7 @@
       <w:r>
         <w:t xml:space="preserve"> </w:t>
       </w:r>
-      <w:hyperlink r:id="rId53">
+      <w:hyperlink r:id="rId61">
         <w:r>
           <w:rPr>
             <w:rStyle w:val="Hyperlink"/>
@@ -7688,8 +9807,8 @@
         </w:r>
       </w:hyperlink>
     </w:p>
-    <w:bookmarkEnd w:id="54"/>
-    <w:bookmarkStart w:id="55" w:name="ref-rice2007mathematical"/>
+    <w:bookmarkEnd w:id="62"/>
+    <w:bookmarkStart w:id="63" w:name="ref-rice2007mathematical"/>
     <w:p>
       <w:pPr>
         <w:pStyle w:val="Bibliography"/>
@@ -7720,8 +9839,8 @@
         <w:t xml:space="preserve">, 3rd ed. Belmont, CA: Cengage Learning, 2007.</w:t>
       </w:r>
     </w:p>
-    <w:bookmarkEnd w:id="55"/>
-    <w:bookmarkStart w:id="57" w:name="ref-wikipedia_fishers_exact_test"/>
+    <w:bookmarkEnd w:id="63"/>
+    <w:bookmarkStart w:id="65" w:name="ref-wikipedia_fishers_exact_test"/>
     <w:p>
       <w:pPr>
         <w:pStyle w:val="Bibliography"/>
@@ -7768,7 +9887,7 @@
       <w:r>
         <w:t xml:space="preserve"> </w:t>
       </w:r>
-      <w:hyperlink r:id="rId56">
+      <w:hyperlink r:id="rId64">
         <w:r>
           <w:rPr>
             <w:rStyle w:val="Hyperlink"/>
@@ -7777,8 +9896,8 @@
         </w:r>
       </w:hyperlink>
     </w:p>
-    <w:bookmarkEnd w:id="57"/>
-    <w:bookmarkStart w:id="59" w:name="ref-wikipedia_relative_risk"/>
+    <w:bookmarkEnd w:id="65"/>
+    <w:bookmarkStart w:id="67" w:name="ref-wikipedia_relative_risk"/>
     <w:p>
       <w:pPr>
         <w:pStyle w:val="Bibliography"/>
@@ -7825,7 +9944,7 @@
       <w:r>
         <w:t xml:space="preserve"> </w:t>
       </w:r>
-      <w:hyperlink r:id="rId58">
+      <w:hyperlink r:id="rId66">
         <w:r>
           <w:rPr>
             <w:rStyle w:val="Hyperlink"/>
@@ -7834,8 +9953,8 @@
         </w:r>
       </w:hyperlink>
     </w:p>
-    <w:bookmarkEnd w:id="59"/>
-    <w:bookmarkStart w:id="61" w:name="ref-wikipedia_absolute_risk_reduction"/>
+    <w:bookmarkEnd w:id="67"/>
+    <w:bookmarkStart w:id="69" w:name="ref-wikipedia_absolute_risk_reduction"/>
     <w:p>
       <w:pPr>
         <w:pStyle w:val="Bibliography"/>
@@ -7882,7 +10001,7 @@
       <w:r>
         <w:t xml:space="preserve"> </w:t>
       </w:r>
-      <w:hyperlink r:id="rId60">
+      <w:hyperlink r:id="rId68">
         <w:r>
           <w:rPr>
             <w:rStyle w:val="Hyperlink"/>
@@ -7891,8 +10010,8 @@
         </w:r>
       </w:hyperlink>
     </w:p>
-    <w:bookmarkEnd w:id="61"/>
-    <w:bookmarkStart w:id="63" w:name="ref-wikipedia_odds_ratio"/>
+    <w:bookmarkEnd w:id="69"/>
+    <w:bookmarkStart w:id="71" w:name="ref-wikipedia_odds_ratio"/>
     <w:p>
       <w:pPr>
         <w:pStyle w:val="Bibliography"/>
@@ -7939,7 +10058,7 @@
       <w:r>
         <w:t xml:space="preserve"> </w:t>
       </w:r>
-      <w:hyperlink r:id="rId62">
+      <w:hyperlink r:id="rId70">
         <w:r>
           <w:rPr>
             <w:rStyle w:val="Hyperlink"/>
@@ -7948,9 +10067,9 @@
         </w:r>
       </w:hyperlink>
     </w:p>
-    <w:bookmarkEnd w:id="63"/>
-    <w:bookmarkEnd w:id="64"/>
-    <w:bookmarkEnd w:id="65"/>
+    <w:bookmarkEnd w:id="71"/>
+    <w:bookmarkEnd w:id="72"/>
+    <w:bookmarkEnd w:id="73"/>
     <w:sectPr>
       <w:footnotePr>
         <w:numRestart w:val="eachSect"/>
@@ -8180,6 +10299,18 @@
     <w:abstractNumId w:val="991"/>
   </w:num>
   <w:num w:numId="1005">
+    <w:abstractNumId w:val="991"/>
+  </w:num>
+  <w:num w:numId="1006">
+    <w:abstractNumId w:val="991"/>
+  </w:num>
+  <w:num w:numId="1007">
+    <w:abstractNumId w:val="991"/>
+  </w:num>
+  <w:num w:numId="1008">
+    <w:abstractNumId w:val="991"/>
+  </w:num>
+  <w:num w:numId="1009">
     <w:abstractNumId w:val="991"/>
   </w:num>
 </w:numbering>

</xml_diff>

<commit_message>
Deploying to gh-pages from @ Morrison-Lab/sds@c48c125dd64a0fd0ff3067a1656221100a0ea7cc 🚀
</commit_message>
<xml_diff>
--- a/categorical-tests-handout.docx
+++ b/categorical-tests-handout.docx
@@ -15,7 +15,7 @@
         <w:pStyle w:val="Date"/>
       </w:pPr>
       <w:r>
-        <w:t xml:space="preserve">Last modified: 2026-10-19 11:09:03 (PDT)</w:t>
+        <w:t xml:space="preserve">Last modified: 2026-10-19 11:24:13 (PDT)</w:t>
       </w:r>
     </w:p>
     <w:p>
@@ -386,7 +386,7 @@
       </w:r>
     </w:p>
     <w:bookmarkEnd w:id="11"/>
-    <w:bookmarkStart w:id="55" w:name="sec-two-group-categorical"/>
+    <w:bookmarkStart w:id="61" w:name="sec-two-group-categorical"/>
     <w:p>
       <w:pPr>
         <w:pStyle w:val="Heading2"/>
@@ -5006,7 +5006,7 @@
       </w:r>
     </w:p>
     <w:bookmarkEnd w:id="29"/>
-    <w:bookmarkStart w:id="54" w:name="sec-2x2-measures"/>
+    <w:bookmarkStart w:id="60" w:name="sec-2x2-measures"/>
     <w:p>
       <w:pPr>
         <w:pStyle w:val="Heading3"/>
@@ -9590,57 +9590,4137 @@
       </w:r>
     </w:p>
     <w:bookmarkEnd w:id="53"/>
+    <w:bookmarkStart w:id="54" w:name="exr-odds-from-joint-probs"/>
     <w:p>
       <w:pPr>
         <w:pStyle w:val="BodyText"/>
       </w:pPr>
       <w:r>
-        <w:t xml:space="preserve">Rice [5, Sec. 13.6], pp. 526–529</w:t>
-      </w:r>
-      <w:r>
-        <w:t xml:space="preserve"> </w:t>
-      </w:r>
-      <w:r>
-        <w:t xml:space="preserve">covers odds ratios.</w:t>
+        <w:rPr>
+          <w:b/>
+          <w:bCs/>
+        </w:rPr>
+        <w:t xml:space="preserve">Exercise 3</w:t>
+      </w:r>
+      <w:r>
+        <w:t xml:space="preserve"> </w:t>
+      </w:r>
+      <w:r>
+        <w:t xml:space="preserve">Let:</w:t>
+      </w:r>
+    </w:p>
+    <w:p>
+      <w:pPr>
+        <w:pStyle w:val="Compact"/>
+        <w:numPr>
+          <w:ilvl w:val="0"/>
+          <w:numId w:val="1010"/>
+        </w:numPr>
+      </w:pPr>
+      <m:oMath>
+        <m:r>
+          <m:t>X</m:t>
+        </m:r>
+      </m:oMath>
+      <w:r>
+        <w:t xml:space="preserve"> </w:t>
+      </w:r>
+      <w:r>
+        <w:t xml:space="preserve">and</w:t>
+      </w:r>
+      <w:r>
+        <w:t xml:space="preserve"> </w:t>
+      </w:r>
+      <m:oMath>
+        <m:r>
+          <m:t>Y</m:t>
+        </m:r>
+      </m:oMath>
+      <w:r>
+        <w:t xml:space="preserve"> </w:t>
+      </w:r>
+      <w:r>
+        <w:t xml:space="preserve">be</w:t>
+      </w:r>
+      <w:r>
+        <w:t xml:space="preserve"> </w:t>
+      </w:r>
+      <w:hyperlink r:id="rId30">
+        <w:r>
+          <w:rPr>
+            <w:rStyle w:val="Hyperlink"/>
+          </w:rPr>
+          <w:t xml:space="preserve">binary</w:t>
+        </w:r>
+      </w:hyperlink>
+      <w:r>
+        <w:t xml:space="preserve"> </w:t>
+      </w:r>
+      <w:r>
+        <w:t xml:space="preserve">random variables, each with values</w:t>
+      </w:r>
+      <w:r>
+        <w:t xml:space="preserve"> </w:t>
+      </w:r>
+      <m:oMath>
+        <m:r>
+          <m:t>0</m:t>
+        </m:r>
+      </m:oMath>
+      <w:r>
+        <w:t xml:space="preserve"> </w:t>
+      </w:r>
+      <w:r>
+        <w:t xml:space="preserve">and</w:t>
+      </w:r>
+      <w:r>
+        <w:t xml:space="preserve"> </w:t>
+      </w:r>
+      <m:oMath>
+        <m:r>
+          <m:t>1</m:t>
+        </m:r>
+      </m:oMath>
+      <w:r>
+        <w:t xml:space="preserve">.</w:t>
+      </w:r>
+    </w:p>
+    <w:p>
+      <w:pPr>
+        <w:pStyle w:val="Compact"/>
+        <w:numPr>
+          <w:ilvl w:val="0"/>
+          <w:numId w:val="1010"/>
+        </w:numPr>
+      </w:pPr>
+      <m:oMath>
+        <m:r>
+          <m:rPr>
+            <m:sty m:val="p"/>
+          </m:rPr>
+          <m:t>P</m:t>
+        </m:r>
+        <m:r>
+          <m:t>​</m:t>
+        </m:r>
+        <m:d>
+          <m:dPr>
+            <m:begChr m:val="("/>
+            <m:sepChr m:val=""/>
+            <m:endChr m:val=")"/>
+            <m:grow/>
+          </m:dPr>
+          <m:e>
+            <m:r>
+              <m:t>X</m:t>
+            </m:r>
+            <m:r>
+              <m:rPr>
+                <m:sty m:val="p"/>
+              </m:rPr>
+              <m:t>=</m:t>
+            </m:r>
+            <m:r>
+              <m:t>x</m:t>
+            </m:r>
+            <m:r>
+              <m:rPr>
+                <m:sty m:val="p"/>
+              </m:rPr>
+              <m:t>,</m:t>
+            </m:r>
+            <m:r>
+              <m:t>Y</m:t>
+            </m:r>
+            <m:r>
+              <m:rPr>
+                <m:sty m:val="p"/>
+              </m:rPr>
+              <m:t>=</m:t>
+            </m:r>
+            <m:r>
+              <m:t>y</m:t>
+            </m:r>
+          </m:e>
+        </m:d>
+        <m:r>
+          <m:t>​</m:t>
+        </m:r>
+        <m:r>
+          <m:rPr>
+            <m:sty m:val="p"/>
+          </m:rPr>
+          <m:t>&gt;</m:t>
+        </m:r>
+        <m:r>
+          <m:t>0</m:t>
+        </m:r>
+      </m:oMath>
+      <w:r>
+        <w:t xml:space="preserve"> </w:t>
+      </w:r>
+      <w:r>
+        <w:t xml:space="preserve">for each</w:t>
+      </w:r>
+      <w:r>
+        <w:t xml:space="preserve"> </w:t>
+      </w:r>
+      <m:oMath>
+        <m:r>
+          <m:t>x</m:t>
+        </m:r>
+        <m:r>
+          <m:rPr>
+            <m:sty m:val="p"/>
+          </m:rPr>
+          <m:t>,</m:t>
+        </m:r>
+        <m:r>
+          <m:t>y</m:t>
+        </m:r>
+        <m:r>
+          <m:rPr>
+            <m:sty m:val="p"/>
+          </m:rPr>
+          <m:t>∈</m:t>
+        </m:r>
+        <m:r>
+          <m:t>​</m:t>
+        </m:r>
+        <m:d>
+          <m:dPr>
+            <m:begChr m:val="{"/>
+            <m:sepChr m:val=""/>
+            <m:endChr m:val="}"/>
+            <m:grow/>
+          </m:dPr>
+          <m:e>
+            <m:r>
+              <m:t>0</m:t>
+            </m:r>
+            <m:r>
+              <m:rPr>
+                <m:sty m:val="p"/>
+              </m:rPr>
+              <m:t>,</m:t>
+            </m:r>
+            <m:r>
+              <m:t>1</m:t>
+            </m:r>
+          </m:e>
+        </m:d>
+        <m:r>
+          <m:t>​</m:t>
+        </m:r>
+      </m:oMath>
+      <w:r>
+        <w:t xml:space="preserve">.</w:t>
+      </w:r>
+    </w:p>
+    <w:p>
+      <w:pPr>
+        <w:pStyle w:val="FirstParagraph"/>
+      </w:pPr>
+      <w:r>
+        <w:t xml:space="preserve">Express the</w:t>
+      </w:r>
+      <w:r>
+        <w:t xml:space="preserve"> </w:t>
+      </w:r>
+      <w:hyperlink r:id="rId51">
+        <w:r>
+          <w:rPr>
+            <w:rStyle w:val="Hyperlink"/>
+          </w:rPr>
+          <w:t xml:space="preserve">odds</w:t>
+        </w:r>
+      </w:hyperlink>
+      <w:r>
+        <w:t xml:space="preserve"> </w:t>
+      </w:r>
+      <w:r>
+        <w:t xml:space="preserve">of</w:t>
+      </w:r>
+      <w:r>
+        <w:t xml:space="preserve"> </w:t>
+      </w:r>
+      <m:oMath>
+        <m:r>
+          <m:t>Y</m:t>
+        </m:r>
+        <m:r>
+          <m:rPr>
+            <m:sty m:val="p"/>
+          </m:rPr>
+          <m:t>=</m:t>
+        </m:r>
+        <m:r>
+          <m:t>1</m:t>
+        </m:r>
+      </m:oMath>
+      <w:r>
+        <w:t xml:space="preserve"> </w:t>
+      </w:r>
+      <w:r>
+        <w:t xml:space="preserve">given</w:t>
+      </w:r>
+      <w:r>
+        <w:t xml:space="preserve"> </w:t>
+      </w:r>
+      <m:oMath>
+        <m:r>
+          <m:t>X</m:t>
+        </m:r>
+        <m:r>
+          <m:rPr>
+            <m:sty m:val="p"/>
+          </m:rPr>
+          <m:t>=</m:t>
+        </m:r>
+        <m:r>
+          <m:t>x</m:t>
+        </m:r>
+      </m:oMath>
+      <w:r>
+        <w:t xml:space="preserve"> </w:t>
+      </w:r>
+      <w:r>
+        <w:t xml:space="preserve">in terms of the joint probabilities</w:t>
+      </w:r>
+      <w:r>
+        <w:t xml:space="preserve"> </w:t>
+      </w:r>
+      <m:oMath>
+        <m:r>
+          <m:rPr>
+            <m:sty m:val="p"/>
+          </m:rPr>
+          <m:t>P</m:t>
+        </m:r>
+        <m:r>
+          <m:t>​</m:t>
+        </m:r>
+        <m:d>
+          <m:dPr>
+            <m:begChr m:val="("/>
+            <m:sepChr m:val=""/>
+            <m:endChr m:val=")"/>
+            <m:grow/>
+          </m:dPr>
+          <m:e>
+            <m:r>
+              <m:t>X</m:t>
+            </m:r>
+            <m:r>
+              <m:rPr>
+                <m:sty m:val="p"/>
+              </m:rPr>
+              <m:t>=</m:t>
+            </m:r>
+            <m:r>
+              <m:t>x</m:t>
+            </m:r>
+            <m:r>
+              <m:rPr>
+                <m:sty m:val="p"/>
+              </m:rPr>
+              <m:t>,</m:t>
+            </m:r>
+            <m:r>
+              <m:t>Y</m:t>
+            </m:r>
+            <m:r>
+              <m:rPr>
+                <m:sty m:val="p"/>
+              </m:rPr>
+              <m:t>=</m:t>
+            </m:r>
+            <m:r>
+              <m:t>1</m:t>
+            </m:r>
+          </m:e>
+        </m:d>
+        <m:r>
+          <m:t>​</m:t>
+        </m:r>
+      </m:oMath>
+      <w:r>
+        <w:t xml:space="preserve"> </w:t>
+      </w:r>
+      <w:r>
+        <w:t xml:space="preserve">and</w:t>
+      </w:r>
+      <w:r>
+        <w:t xml:space="preserve"> </w:t>
+      </w:r>
+      <m:oMath>
+        <m:r>
+          <m:rPr>
+            <m:sty m:val="p"/>
+          </m:rPr>
+          <m:t>P</m:t>
+        </m:r>
+        <m:r>
+          <m:t>​</m:t>
+        </m:r>
+        <m:d>
+          <m:dPr>
+            <m:begChr m:val="("/>
+            <m:sepChr m:val=""/>
+            <m:endChr m:val=")"/>
+            <m:grow/>
+          </m:dPr>
+          <m:e>
+            <m:r>
+              <m:t>X</m:t>
+            </m:r>
+            <m:r>
+              <m:rPr>
+                <m:sty m:val="p"/>
+              </m:rPr>
+              <m:t>=</m:t>
+            </m:r>
+            <m:r>
+              <m:t>x</m:t>
+            </m:r>
+            <m:r>
+              <m:rPr>
+                <m:sty m:val="p"/>
+              </m:rPr>
+              <m:t>,</m:t>
+            </m:r>
+            <m:r>
+              <m:t>Y</m:t>
+            </m:r>
+            <m:r>
+              <m:rPr>
+                <m:sty m:val="p"/>
+              </m:rPr>
+              <m:t>=</m:t>
+            </m:r>
+            <m:r>
+              <m:t>0</m:t>
+            </m:r>
+          </m:e>
+        </m:d>
+        <m:r>
+          <m:t>​</m:t>
+        </m:r>
+      </m:oMath>
+      <w:r>
+        <w:t xml:space="preserve">.</w:t>
       </w:r>
     </w:p>
     <w:bookmarkEnd w:id="54"/>
-    <w:bookmarkEnd w:id="55"/>
-    <w:bookmarkStart w:id="73" w:name="references"/>
+    <w:bookmarkStart w:id="55" w:name="sol-odds-from-joint-probs"/>
     <w:p>
       <w:pPr>
-        <w:pStyle w:val="Heading2"/>
-      </w:pPr>
-      <w:r>
-        <w:t xml:space="preserve">References</w:t>
-      </w:r>
-    </w:p>
-    <w:bookmarkStart w:id="72" w:name="refs"/>
-    <w:bookmarkStart w:id="57" w:name="ref-vittinghoff2e"/>
-    <w:p>
-      <w:pPr>
-        <w:pStyle w:val="Bibliography"/>
-      </w:pPr>
-      <w:r>
-        <w:t xml:space="preserve">[1]</w:t>
-      </w:r>
-      <w:r>
-        <w:t xml:space="preserve"> </w:t>
-      </w:r>
-      <w:r>
-        <w:t xml:space="preserve">	</w:t>
-      </w:r>
-      <w:r>
-        <w:t xml:space="preserve">E. Vittinghoff, D. V. Glidden, S. C. Shiboski, and C. E. McCulloch,</w:t>
-      </w:r>
-      <w:r>
-        <w:t xml:space="preserve"> </w:t>
-      </w:r>
+        <w:pStyle w:val="BodyText"/>
+      </w:pPr>
       <w:r>
         <w:rPr>
           <w:i/>
           <w:iCs/>
         </w:rPr>
+        <w:t xml:space="preserve">Solution 3</w:t>
+      </w:r>
+      <w:r>
+        <w:t xml:space="preserve">. </w:t>
+      </w:r>
+    </w:p>
+    <w:p>
+      <w:pPr>
+        <w:pStyle w:val="BodyText"/>
+      </w:pPr>
+      <m:oMathPara>
+        <m:oMathParaPr>
+          <m:jc m:val="center"/>
+        </m:oMathParaPr>
+        <m:oMath>
+          <m:eqArr>
+            <m:e>
+              <m:r>
+                <m:t>ω</m:t>
+              </m:r>
+              <m:r>
+                <m:t>&amp;</m:t>
+              </m:r>
+              <m:r>
+                <m:rPr>
+                  <m:sty m:val="p"/>
+                </m:rPr>
+                <m:t>=</m:t>
+              </m:r>
+              <m:f>
+                <m:fPr>
+                  <m:type m:val="bar"/>
+                </m:fPr>
+                <m:num>
+                  <m:r>
+                    <m:rPr>
+                      <m:sty m:val="p"/>
+                    </m:rPr>
+                    <m:t>P</m:t>
+                  </m:r>
+                  <m:r>
+                    <m:t>​</m:t>
+                  </m:r>
+                  <m:d>
+                    <m:dPr>
+                      <m:begChr m:val="("/>
+                      <m:sepChr m:val=""/>
+                      <m:endChr m:val=")"/>
+                      <m:grow/>
+                    </m:dPr>
+                    <m:e>
+                      <m:r>
+                        <m:t>Y</m:t>
+                      </m:r>
+                      <m:r>
+                        <m:rPr>
+                          <m:sty m:val="p"/>
+                        </m:rPr>
+                        <m:t>=</m:t>
+                      </m:r>
+                      <m:r>
+                        <m:t>1</m:t>
+                      </m:r>
+                      <m:r>
+                        <m:rPr>
+                          <m:sty m:val="p"/>
+                        </m:rPr>
+                        <m:t>∣</m:t>
+                      </m:r>
+                      <m:r>
+                        <m:t>X</m:t>
+                      </m:r>
+                      <m:r>
+                        <m:rPr>
+                          <m:sty m:val="p"/>
+                        </m:rPr>
+                        <m:t>=</m:t>
+                      </m:r>
+                      <m:r>
+                        <m:t>x</m:t>
+                      </m:r>
+                    </m:e>
+                  </m:d>
+                  <m:r>
+                    <m:t>​</m:t>
+                  </m:r>
+                </m:num>
+                <m:den>
+                  <m:r>
+                    <m:t>1</m:t>
+                  </m:r>
+                  <m:r>
+                    <m:rPr>
+                      <m:sty m:val="p"/>
+                    </m:rPr>
+                    <m:t>−</m:t>
+                  </m:r>
+                  <m:r>
+                    <m:rPr>
+                      <m:sty m:val="p"/>
+                    </m:rPr>
+                    <m:t>P</m:t>
+                  </m:r>
+                  <m:r>
+                    <m:t>​</m:t>
+                  </m:r>
+                  <m:d>
+                    <m:dPr>
+                      <m:begChr m:val="("/>
+                      <m:sepChr m:val=""/>
+                      <m:endChr m:val=")"/>
+                      <m:grow/>
+                    </m:dPr>
+                    <m:e>
+                      <m:r>
+                        <m:t>Y</m:t>
+                      </m:r>
+                      <m:r>
+                        <m:rPr>
+                          <m:sty m:val="p"/>
+                        </m:rPr>
+                        <m:t>=</m:t>
+                      </m:r>
+                      <m:r>
+                        <m:t>1</m:t>
+                      </m:r>
+                      <m:r>
+                        <m:rPr>
+                          <m:sty m:val="p"/>
+                        </m:rPr>
+                        <m:t>∣</m:t>
+                      </m:r>
+                      <m:r>
+                        <m:t>X</m:t>
+                      </m:r>
+                      <m:r>
+                        <m:rPr>
+                          <m:sty m:val="p"/>
+                        </m:rPr>
+                        <m:t>=</m:t>
+                      </m:r>
+                      <m:r>
+                        <m:t>x</m:t>
+                      </m:r>
+                    </m:e>
+                  </m:d>
+                  <m:r>
+                    <m:t>​</m:t>
+                  </m:r>
+                </m:den>
+              </m:f>
+              <m:r>
+                <m:t>&amp;</m:t>
+              </m:r>
+              <m:r>
+                <m:t>&amp;</m:t>
+              </m:r>
+              <m:r>
+                <m:rPr>
+                  <m:nor/>
+                  <m:sty m:val="p"/>
+                </m:rPr>
+                <m:t>(definition of odds)</m:t>
+              </m:r>
+            </m:e>
+            <m:e>
+              <m:r>
+                <m:t>&amp;</m:t>
+              </m:r>
+              <m:r>
+                <m:rPr>
+                  <m:sty m:val="p"/>
+                </m:rPr>
+                <m:t>=</m:t>
+              </m:r>
+              <m:f>
+                <m:fPr>
+                  <m:type m:val="bar"/>
+                </m:fPr>
+                <m:num>
+                  <m:r>
+                    <m:rPr>
+                      <m:sty m:val="p"/>
+                    </m:rPr>
+                    <m:t>P</m:t>
+                  </m:r>
+                  <m:r>
+                    <m:t>​</m:t>
+                  </m:r>
+                  <m:d>
+                    <m:dPr>
+                      <m:begChr m:val="("/>
+                      <m:sepChr m:val=""/>
+                      <m:endChr m:val=")"/>
+                      <m:grow/>
+                    </m:dPr>
+                    <m:e>
+                      <m:r>
+                        <m:t>Y</m:t>
+                      </m:r>
+                      <m:r>
+                        <m:rPr>
+                          <m:sty m:val="p"/>
+                        </m:rPr>
+                        <m:t>=</m:t>
+                      </m:r>
+                      <m:r>
+                        <m:t>1</m:t>
+                      </m:r>
+                      <m:r>
+                        <m:rPr>
+                          <m:sty m:val="p"/>
+                        </m:rPr>
+                        <m:t>∣</m:t>
+                      </m:r>
+                      <m:r>
+                        <m:t>X</m:t>
+                      </m:r>
+                      <m:r>
+                        <m:rPr>
+                          <m:sty m:val="p"/>
+                        </m:rPr>
+                        <m:t>=</m:t>
+                      </m:r>
+                      <m:r>
+                        <m:t>x</m:t>
+                      </m:r>
+                    </m:e>
+                  </m:d>
+                  <m:r>
+                    <m:t>​</m:t>
+                  </m:r>
+                </m:num>
+                <m:den>
+                  <m:r>
+                    <m:rPr>
+                      <m:sty m:val="p"/>
+                    </m:rPr>
+                    <m:t>P</m:t>
+                  </m:r>
+                  <m:r>
+                    <m:t>​</m:t>
+                  </m:r>
+                  <m:d>
+                    <m:dPr>
+                      <m:begChr m:val="("/>
+                      <m:sepChr m:val=""/>
+                      <m:endChr m:val=")"/>
+                      <m:grow/>
+                    </m:dPr>
+                    <m:e>
+                      <m:r>
+                        <m:t>Y</m:t>
+                      </m:r>
+                      <m:r>
+                        <m:rPr>
+                          <m:sty m:val="p"/>
+                        </m:rPr>
+                        <m:t>=</m:t>
+                      </m:r>
+                      <m:r>
+                        <m:t>0</m:t>
+                      </m:r>
+                      <m:r>
+                        <m:rPr>
+                          <m:sty m:val="p"/>
+                        </m:rPr>
+                        <m:t>∣</m:t>
+                      </m:r>
+                      <m:r>
+                        <m:t>X</m:t>
+                      </m:r>
+                      <m:r>
+                        <m:rPr>
+                          <m:sty m:val="p"/>
+                        </m:rPr>
+                        <m:t>=</m:t>
+                      </m:r>
+                      <m:r>
+                        <m:t>x</m:t>
+                      </m:r>
+                    </m:e>
+                  </m:d>
+                  <m:r>
+                    <m:t>​</m:t>
+                  </m:r>
+                </m:den>
+              </m:f>
+              <m:r>
+                <m:t>&amp;</m:t>
+              </m:r>
+              <m:r>
+                <m:t>&amp;</m:t>
+              </m:r>
+              <m:r>
+                <m:rPr>
+                  <m:nor/>
+                  <m:sty m:val="p"/>
+                </m:rPr>
+                <m:t>(the two values of </m:t>
+              </m:r>
+              <m:r>
+                <m:t>Y</m:t>
+              </m:r>
+              <m:r>
+                <m:rPr>
+                  <m:nor/>
+                  <m:sty m:val="p"/>
+                </m:rPr>
+                <m:t> have conditional probabilities that sum to 1)</m:t>
+              </m:r>
+            </m:e>
+            <m:e>
+              <m:r>
+                <m:t>&amp;</m:t>
+              </m:r>
+              <m:r>
+                <m:rPr>
+                  <m:sty m:val="p"/>
+                </m:rPr>
+                <m:t>=</m:t>
+              </m:r>
+              <m:f>
+                <m:fPr>
+                  <m:type m:val="bar"/>
+                </m:fPr>
+                <m:num>
+                  <m:r>
+                    <m:rPr>
+                      <m:sty m:val="p"/>
+                    </m:rPr>
+                    <m:t>P</m:t>
+                  </m:r>
+                  <m:r>
+                    <m:t>​</m:t>
+                  </m:r>
+                  <m:d>
+                    <m:dPr>
+                      <m:begChr m:val="("/>
+                      <m:sepChr m:val=""/>
+                      <m:endChr m:val=")"/>
+                      <m:grow/>
+                    </m:dPr>
+                    <m:e>
+                      <m:r>
+                        <m:t>X</m:t>
+                      </m:r>
+                      <m:r>
+                        <m:rPr>
+                          <m:sty m:val="p"/>
+                        </m:rPr>
+                        <m:t>=</m:t>
+                      </m:r>
+                      <m:r>
+                        <m:t>x</m:t>
+                      </m:r>
+                      <m:r>
+                        <m:rPr>
+                          <m:sty m:val="p"/>
+                        </m:rPr>
+                        <m:t>,</m:t>
+                      </m:r>
+                      <m:r>
+                        <m:t>Y</m:t>
+                      </m:r>
+                      <m:r>
+                        <m:rPr>
+                          <m:sty m:val="p"/>
+                        </m:rPr>
+                        <m:t>=</m:t>
+                      </m:r>
+                      <m:r>
+                        <m:t>1</m:t>
+                      </m:r>
+                    </m:e>
+                  </m:d>
+                  <m:r>
+                    <m:t>​</m:t>
+                  </m:r>
+                  <m:r>
+                    <m:rPr>
+                      <m:sty m:val="p"/>
+                    </m:rPr>
+                    <m:t>/</m:t>
+                  </m:r>
+                  <m:r>
+                    <m:rPr>
+                      <m:sty m:val="p"/>
+                    </m:rPr>
+                    <m:t>P</m:t>
+                  </m:r>
+                  <m:r>
+                    <m:t>​</m:t>
+                  </m:r>
+                  <m:d>
+                    <m:dPr>
+                      <m:begChr m:val="("/>
+                      <m:sepChr m:val=""/>
+                      <m:endChr m:val=")"/>
+                      <m:grow/>
+                    </m:dPr>
+                    <m:e>
+                      <m:r>
+                        <m:t>X</m:t>
+                      </m:r>
+                      <m:r>
+                        <m:rPr>
+                          <m:sty m:val="p"/>
+                        </m:rPr>
+                        <m:t>=</m:t>
+                      </m:r>
+                      <m:r>
+                        <m:t>x</m:t>
+                      </m:r>
+                    </m:e>
+                  </m:d>
+                  <m:r>
+                    <m:t>​</m:t>
+                  </m:r>
+                </m:num>
+                <m:den>
+                  <m:r>
+                    <m:rPr>
+                      <m:sty m:val="p"/>
+                    </m:rPr>
+                    <m:t>P</m:t>
+                  </m:r>
+                  <m:r>
+                    <m:t>​</m:t>
+                  </m:r>
+                  <m:d>
+                    <m:dPr>
+                      <m:begChr m:val="("/>
+                      <m:sepChr m:val=""/>
+                      <m:endChr m:val=")"/>
+                      <m:grow/>
+                    </m:dPr>
+                    <m:e>
+                      <m:r>
+                        <m:t>X</m:t>
+                      </m:r>
+                      <m:r>
+                        <m:rPr>
+                          <m:sty m:val="p"/>
+                        </m:rPr>
+                        <m:t>=</m:t>
+                      </m:r>
+                      <m:r>
+                        <m:t>x</m:t>
+                      </m:r>
+                      <m:r>
+                        <m:rPr>
+                          <m:sty m:val="p"/>
+                        </m:rPr>
+                        <m:t>,</m:t>
+                      </m:r>
+                      <m:r>
+                        <m:t>Y</m:t>
+                      </m:r>
+                      <m:r>
+                        <m:rPr>
+                          <m:sty m:val="p"/>
+                        </m:rPr>
+                        <m:t>=</m:t>
+                      </m:r>
+                      <m:r>
+                        <m:t>0</m:t>
+                      </m:r>
+                    </m:e>
+                  </m:d>
+                  <m:r>
+                    <m:t>​</m:t>
+                  </m:r>
+                  <m:r>
+                    <m:rPr>
+                      <m:sty m:val="p"/>
+                    </m:rPr>
+                    <m:t>/</m:t>
+                  </m:r>
+                  <m:r>
+                    <m:rPr>
+                      <m:sty m:val="p"/>
+                    </m:rPr>
+                    <m:t>P</m:t>
+                  </m:r>
+                  <m:r>
+                    <m:t>​</m:t>
+                  </m:r>
+                  <m:d>
+                    <m:dPr>
+                      <m:begChr m:val="("/>
+                      <m:sepChr m:val=""/>
+                      <m:endChr m:val=")"/>
+                      <m:grow/>
+                    </m:dPr>
+                    <m:e>
+                      <m:r>
+                        <m:t>X</m:t>
+                      </m:r>
+                      <m:r>
+                        <m:rPr>
+                          <m:sty m:val="p"/>
+                        </m:rPr>
+                        <m:t>=</m:t>
+                      </m:r>
+                      <m:r>
+                        <m:t>x</m:t>
+                      </m:r>
+                    </m:e>
+                  </m:d>
+                  <m:r>
+                    <m:t>​</m:t>
+                  </m:r>
+                </m:den>
+              </m:f>
+              <m:r>
+                <m:t>&amp;</m:t>
+              </m:r>
+              <m:r>
+                <m:t>&amp;</m:t>
+              </m:r>
+              <m:r>
+                <m:rPr>
+                  <m:nor/>
+                  <m:sty m:val="p"/>
+                </m:rPr>
+                <m:t>(definition of conditional probability, in numerator and denominator)</m:t>
+              </m:r>
+            </m:e>
+            <m:e>
+              <m:r>
+                <m:t>&amp;</m:t>
+              </m:r>
+              <m:r>
+                <m:rPr>
+                  <m:sty m:val="p"/>
+                </m:rPr>
+                <m:t>=</m:t>
+              </m:r>
+              <m:f>
+                <m:fPr>
+                  <m:type m:val="bar"/>
+                </m:fPr>
+                <m:num>
+                  <m:r>
+                    <m:rPr>
+                      <m:sty m:val="p"/>
+                    </m:rPr>
+                    <m:t>P</m:t>
+                  </m:r>
+                  <m:r>
+                    <m:t>​</m:t>
+                  </m:r>
+                  <m:d>
+                    <m:dPr>
+                      <m:begChr m:val="("/>
+                      <m:sepChr m:val=""/>
+                      <m:endChr m:val=")"/>
+                      <m:grow/>
+                    </m:dPr>
+                    <m:e>
+                      <m:r>
+                        <m:t>X</m:t>
+                      </m:r>
+                      <m:r>
+                        <m:rPr>
+                          <m:sty m:val="p"/>
+                        </m:rPr>
+                        <m:t>=</m:t>
+                      </m:r>
+                      <m:r>
+                        <m:t>x</m:t>
+                      </m:r>
+                      <m:r>
+                        <m:rPr>
+                          <m:sty m:val="p"/>
+                        </m:rPr>
+                        <m:t>,</m:t>
+                      </m:r>
+                      <m:r>
+                        <m:t>Y</m:t>
+                      </m:r>
+                      <m:r>
+                        <m:rPr>
+                          <m:sty m:val="p"/>
+                        </m:rPr>
+                        <m:t>=</m:t>
+                      </m:r>
+                      <m:r>
+                        <m:t>1</m:t>
+                      </m:r>
+                    </m:e>
+                  </m:d>
+                  <m:r>
+                    <m:t>​</m:t>
+                  </m:r>
+                </m:num>
+                <m:den>
+                  <m:r>
+                    <m:rPr>
+                      <m:sty m:val="p"/>
+                    </m:rPr>
+                    <m:t>P</m:t>
+                  </m:r>
+                  <m:r>
+                    <m:t>​</m:t>
+                  </m:r>
+                  <m:d>
+                    <m:dPr>
+                      <m:begChr m:val="("/>
+                      <m:sepChr m:val=""/>
+                      <m:endChr m:val=")"/>
+                      <m:grow/>
+                    </m:dPr>
+                    <m:e>
+                      <m:r>
+                        <m:t>X</m:t>
+                      </m:r>
+                      <m:r>
+                        <m:rPr>
+                          <m:sty m:val="p"/>
+                        </m:rPr>
+                        <m:t>=</m:t>
+                      </m:r>
+                      <m:r>
+                        <m:t>x</m:t>
+                      </m:r>
+                      <m:r>
+                        <m:rPr>
+                          <m:sty m:val="p"/>
+                        </m:rPr>
+                        <m:t>,</m:t>
+                      </m:r>
+                      <m:r>
+                        <m:t>Y</m:t>
+                      </m:r>
+                      <m:r>
+                        <m:rPr>
+                          <m:sty m:val="p"/>
+                        </m:rPr>
+                        <m:t>=</m:t>
+                      </m:r>
+                      <m:r>
+                        <m:t>0</m:t>
+                      </m:r>
+                    </m:e>
+                  </m:d>
+                  <m:r>
+                    <m:t>​</m:t>
+                  </m:r>
+                </m:den>
+              </m:f>
+              <m:r>
+                <m:t>&amp;</m:t>
+              </m:r>
+              <m:r>
+                <m:t>&amp;</m:t>
+              </m:r>
+              <m:r>
+                <m:rPr>
+                  <m:nor/>
+                  <m:sty m:val="p"/>
+                </m:rPr>
+                <m:t>(divide the numerator and the denominator by the same positive number </m:t>
+              </m:r>
+              <m:r>
+                <m:rPr>
+                  <m:sty m:val="p"/>
+                </m:rPr>
+                <m:t>P</m:t>
+              </m:r>
+              <m:r>
+                <m:t>​</m:t>
+              </m:r>
+              <m:d>
+                <m:dPr>
+                  <m:begChr m:val="("/>
+                  <m:sepChr m:val=""/>
+                  <m:endChr m:val=")"/>
+                  <m:grow/>
+                </m:dPr>
+                <m:e>
+                  <m:r>
+                    <m:t>X</m:t>
+                  </m:r>
+                  <m:r>
+                    <m:rPr>
+                      <m:sty m:val="p"/>
+                    </m:rPr>
+                    <m:t>=</m:t>
+                  </m:r>
+                  <m:r>
+                    <m:t>x</m:t>
+                  </m:r>
+                </m:e>
+              </m:d>
+              <m:r>
+                <m:t>​</m:t>
+              </m:r>
+              <m:r>
+                <m:rPr>
+                  <m:nor/>
+                  <m:sty m:val="p"/>
+                </m:rPr>
+                <m:t>)</m:t>
+              </m:r>
+            </m:e>
+          </m:eqArr>
+        </m:oMath>
+      </m:oMathPara>
+    </w:p>
+    <w:bookmarkEnd w:id="55"/>
+    <w:bookmarkStart w:id="56" w:name="thm-odds-ratio-cross-product"/>
+    <w:p>
+      <w:pPr>
+        <w:pStyle w:val="FirstParagraph"/>
+      </w:pPr>
+      <w:r>
+        <w:rPr>
+          <w:b/>
+          <w:bCs/>
+        </w:rPr>
+        <w:t xml:space="preserve">Theorem 4 (The odds ratio as a ratio of cross products)</w:t>
+      </w:r>
+      <w:r>
+        <w:t xml:space="preserve"> </w:t>
+      </w:r>
+      <w:r>
+        <w:t xml:space="preserve">Let:</w:t>
+      </w:r>
+    </w:p>
+    <w:p>
+      <w:pPr>
+        <w:pStyle w:val="Compact"/>
+        <w:numPr>
+          <w:ilvl w:val="0"/>
+          <w:numId w:val="1011"/>
+        </w:numPr>
+      </w:pPr>
+      <m:oMath>
+        <m:r>
+          <m:t>X</m:t>
+        </m:r>
+      </m:oMath>
+      <w:r>
+        <w:t xml:space="preserve"> </w:t>
+      </w:r>
+      <w:r>
+        <w:t xml:space="preserve">and</w:t>
+      </w:r>
+      <w:r>
+        <w:t xml:space="preserve"> </w:t>
+      </w:r>
+      <m:oMath>
+        <m:r>
+          <m:t>Y</m:t>
+        </m:r>
+      </m:oMath>
+      <w:r>
+        <w:t xml:space="preserve"> </w:t>
+      </w:r>
+      <w:r>
+        <w:t xml:space="preserve">be</w:t>
+      </w:r>
+      <w:r>
+        <w:t xml:space="preserve"> </w:t>
+      </w:r>
+      <w:hyperlink r:id="rId30">
+        <w:r>
+          <w:rPr>
+            <w:rStyle w:val="Hyperlink"/>
+          </w:rPr>
+          <w:t xml:space="preserve">binary</w:t>
+        </w:r>
+      </w:hyperlink>
+      <w:r>
+        <w:t xml:space="preserve"> </w:t>
+      </w:r>
+      <w:r>
+        <w:t xml:space="preserve">random variables, each with values</w:t>
+      </w:r>
+      <w:r>
+        <w:t xml:space="preserve"> </w:t>
+      </w:r>
+      <m:oMath>
+        <m:r>
+          <m:t>0</m:t>
+        </m:r>
+      </m:oMath>
+      <w:r>
+        <w:t xml:space="preserve"> </w:t>
+      </w:r>
+      <w:r>
+        <w:t xml:space="preserve">and</w:t>
+      </w:r>
+      <w:r>
+        <w:t xml:space="preserve"> </w:t>
+      </w:r>
+      <m:oMath>
+        <m:r>
+          <m:t>1</m:t>
+        </m:r>
+      </m:oMath>
+      <w:r>
+        <w:t xml:space="preserve">.</w:t>
+      </w:r>
+    </w:p>
+    <w:p>
+      <w:pPr>
+        <w:pStyle w:val="Compact"/>
+        <w:numPr>
+          <w:ilvl w:val="0"/>
+          <w:numId w:val="1011"/>
+        </w:numPr>
+      </w:pPr>
+      <m:oMath>
+        <m:r>
+          <m:rPr>
+            <m:sty m:val="p"/>
+          </m:rPr>
+          <m:t>P</m:t>
+        </m:r>
+        <m:r>
+          <m:t>​</m:t>
+        </m:r>
+        <m:d>
+          <m:dPr>
+            <m:begChr m:val="("/>
+            <m:sepChr m:val=""/>
+            <m:endChr m:val=")"/>
+            <m:grow/>
+          </m:dPr>
+          <m:e>
+            <m:r>
+              <m:t>X</m:t>
+            </m:r>
+            <m:r>
+              <m:rPr>
+                <m:sty m:val="p"/>
+              </m:rPr>
+              <m:t>=</m:t>
+            </m:r>
+            <m:r>
+              <m:t>x</m:t>
+            </m:r>
+            <m:r>
+              <m:rPr>
+                <m:sty m:val="p"/>
+              </m:rPr>
+              <m:t>,</m:t>
+            </m:r>
+            <m:r>
+              <m:t>Y</m:t>
+            </m:r>
+            <m:r>
+              <m:rPr>
+                <m:sty m:val="p"/>
+              </m:rPr>
+              <m:t>=</m:t>
+            </m:r>
+            <m:r>
+              <m:t>y</m:t>
+            </m:r>
+          </m:e>
+        </m:d>
+        <m:r>
+          <m:t>​</m:t>
+        </m:r>
+        <m:r>
+          <m:rPr>
+            <m:sty m:val="p"/>
+          </m:rPr>
+          <m:t>&gt;</m:t>
+        </m:r>
+        <m:r>
+          <m:t>0</m:t>
+        </m:r>
+      </m:oMath>
+      <w:r>
+        <w:t xml:space="preserve"> </w:t>
+      </w:r>
+      <w:r>
+        <w:t xml:space="preserve">for each</w:t>
+      </w:r>
+      <w:r>
+        <w:t xml:space="preserve"> </w:t>
+      </w:r>
+      <m:oMath>
+        <m:r>
+          <m:t>x</m:t>
+        </m:r>
+        <m:r>
+          <m:rPr>
+            <m:sty m:val="p"/>
+          </m:rPr>
+          <m:t>,</m:t>
+        </m:r>
+        <m:r>
+          <m:t>y</m:t>
+        </m:r>
+        <m:r>
+          <m:rPr>
+            <m:sty m:val="p"/>
+          </m:rPr>
+          <m:t>∈</m:t>
+        </m:r>
+        <m:r>
+          <m:t>​</m:t>
+        </m:r>
+        <m:d>
+          <m:dPr>
+            <m:begChr m:val="{"/>
+            <m:sepChr m:val=""/>
+            <m:endChr m:val="}"/>
+            <m:grow/>
+          </m:dPr>
+          <m:e>
+            <m:r>
+              <m:t>0</m:t>
+            </m:r>
+            <m:r>
+              <m:rPr>
+                <m:sty m:val="p"/>
+              </m:rPr>
+              <m:t>,</m:t>
+            </m:r>
+            <m:r>
+              <m:t>1</m:t>
+            </m:r>
+          </m:e>
+        </m:d>
+        <m:r>
+          <m:t>​</m:t>
+        </m:r>
+      </m:oMath>
+      <w:r>
+        <w:t xml:space="preserve">.</w:t>
+      </w:r>
+    </w:p>
+    <w:p>
+      <w:pPr>
+        <w:pStyle w:val="FirstParagraph"/>
+      </w:pPr>
+      <w:r>
+        <w:t xml:space="preserve">The</w:t>
+      </w:r>
+      <w:r>
+        <w:t xml:space="preserve"> </w:t>
+      </w:r>
+      <w:hyperlink w:anchor="def-odds-ratio">
+        <w:r>
+          <w:rPr>
+            <w:rStyle w:val="Hyperlink"/>
+          </w:rPr>
+          <w:t xml:space="preserve">odds ratio</w:t>
+        </w:r>
+      </w:hyperlink>
+      <w:r>
+        <w:t xml:space="preserve"> </w:t>
+      </w:r>
+      <w:r>
+        <w:t xml:space="preserve">of</w:t>
+      </w:r>
+      <w:r>
+        <w:t xml:space="preserve"> </w:t>
+      </w:r>
+      <m:oMath>
+        <m:r>
+          <m:t>Y</m:t>
+        </m:r>
+        <m:r>
+          <m:rPr>
+            <m:sty m:val="p"/>
+          </m:rPr>
+          <m:t>=</m:t>
+        </m:r>
+        <m:r>
+          <m:t>1</m:t>
+        </m:r>
+      </m:oMath>
+      <w:r>
+        <w:t xml:space="preserve"> </w:t>
+      </w:r>
+      <w:r>
+        <w:t xml:space="preserve">comparing the group</w:t>
+      </w:r>
+      <w:r>
+        <w:t xml:space="preserve"> </w:t>
+      </w:r>
+      <m:oMath>
+        <m:r>
+          <m:t>X</m:t>
+        </m:r>
+        <m:r>
+          <m:rPr>
+            <m:sty m:val="p"/>
+          </m:rPr>
+          <m:t>=</m:t>
+        </m:r>
+        <m:r>
+          <m:t>1</m:t>
+        </m:r>
+      </m:oMath>
+      <w:r>
+        <w:t xml:space="preserve"> </w:t>
+      </w:r>
+      <w:r>
+        <w:t xml:space="preserve">with the</w:t>
+      </w:r>
+      <w:r>
+        <w:t xml:space="preserve"> </w:t>
+      </w:r>
+      <w:hyperlink w:anchor="def-reference-group">
+        <w:r>
+          <w:rPr>
+            <w:rStyle w:val="Hyperlink"/>
+          </w:rPr>
+          <w:t xml:space="preserve">reference group</w:t>
+        </w:r>
+      </w:hyperlink>
+      <w:r>
+        <w:t xml:space="preserve"> </w:t>
+      </w:r>
+      <m:oMath>
+        <m:r>
+          <m:t>X</m:t>
+        </m:r>
+        <m:r>
+          <m:rPr>
+            <m:sty m:val="p"/>
+          </m:rPr>
+          <m:t>=</m:t>
+        </m:r>
+        <m:r>
+          <m:t>0</m:t>
+        </m:r>
+      </m:oMath>
+      <w:r>
+        <w:t xml:space="preserve"> </w:t>
+      </w:r>
+      <w:r>
+        <w:t xml:space="preserve">is</w:t>
+      </w:r>
+    </w:p>
+    <w:p>
+      <w:pPr>
+        <w:pStyle w:val="BodyText"/>
+      </w:pPr>
+      <m:oMathPara>
+        <m:oMathParaPr>
+          <m:jc m:val="center"/>
+        </m:oMathParaPr>
+        <m:oMath>
+          <m:sSub>
+            <m:e>
+              <m:r>
+                <m:rPr>
+                  <m:nor/>
+                  <m:sty m:val="p"/>
+                </m:rPr>
+                <m:t>ϙ</m:t>
+              </m:r>
+            </m:e>
+            <m:sub>
+              <m:r>
+                <m:t>ω</m:t>
+              </m:r>
+            </m:sub>
+          </m:sSub>
+          <m:r>
+            <m:t>​</m:t>
+          </m:r>
+          <m:d>
+            <m:dPr>
+              <m:begChr m:val="("/>
+              <m:sepChr m:val=""/>
+              <m:endChr m:val=")"/>
+              <m:grow/>
+            </m:dPr>
+            <m:e>
+              <m:r>
+                <m:t>Y</m:t>
+              </m:r>
+              <m:r>
+                <m:rPr>
+                  <m:sty m:val="p"/>
+                </m:rPr>
+                <m:t>∣</m:t>
+              </m:r>
+              <m:r>
+                <m:t>X</m:t>
+              </m:r>
+            </m:e>
+          </m:d>
+          <m:r>
+            <m:t>​</m:t>
+          </m:r>
+          <m:r>
+            <m:rPr>
+              <m:sty m:val="p"/>
+            </m:rPr>
+            <m:t>=</m:t>
+          </m:r>
+          <m:f>
+            <m:fPr>
+              <m:type m:val="bar"/>
+            </m:fPr>
+            <m:num>
+              <m:r>
+                <m:rPr>
+                  <m:sty m:val="p"/>
+                </m:rPr>
+                <m:t>P</m:t>
+              </m:r>
+              <m:r>
+                <m:t>​</m:t>
+              </m:r>
+              <m:d>
+                <m:dPr>
+                  <m:begChr m:val="("/>
+                  <m:sepChr m:val=""/>
+                  <m:endChr m:val=")"/>
+                  <m:grow/>
+                </m:dPr>
+                <m:e>
+                  <m:r>
+                    <m:t>X</m:t>
+                  </m:r>
+                  <m:r>
+                    <m:rPr>
+                      <m:sty m:val="p"/>
+                    </m:rPr>
+                    <m:t>=</m:t>
+                  </m:r>
+                  <m:r>
+                    <m:t>1</m:t>
+                  </m:r>
+                  <m:r>
+                    <m:rPr>
+                      <m:sty m:val="p"/>
+                    </m:rPr>
+                    <m:t>,</m:t>
+                  </m:r>
+                  <m:r>
+                    <m:t>Y</m:t>
+                  </m:r>
+                  <m:r>
+                    <m:rPr>
+                      <m:sty m:val="p"/>
+                    </m:rPr>
+                    <m:t>=</m:t>
+                  </m:r>
+                  <m:r>
+                    <m:t>1</m:t>
+                  </m:r>
+                </m:e>
+              </m:d>
+              <m:r>
+                <m:t>​</m:t>
+              </m:r>
+              <m:r>
+                <m:rPr>
+                  <m:sty m:val="p"/>
+                </m:rPr>
+                <m:t>P</m:t>
+              </m:r>
+              <m:r>
+                <m:t>​</m:t>
+              </m:r>
+              <m:d>
+                <m:dPr>
+                  <m:begChr m:val="("/>
+                  <m:sepChr m:val=""/>
+                  <m:endChr m:val=")"/>
+                  <m:grow/>
+                </m:dPr>
+                <m:e>
+                  <m:r>
+                    <m:t>X</m:t>
+                  </m:r>
+                  <m:r>
+                    <m:rPr>
+                      <m:sty m:val="p"/>
+                    </m:rPr>
+                    <m:t>=</m:t>
+                  </m:r>
+                  <m:r>
+                    <m:t>0</m:t>
+                  </m:r>
+                  <m:r>
+                    <m:rPr>
+                      <m:sty m:val="p"/>
+                    </m:rPr>
+                    <m:t>,</m:t>
+                  </m:r>
+                  <m:r>
+                    <m:t>Y</m:t>
+                  </m:r>
+                  <m:r>
+                    <m:rPr>
+                      <m:sty m:val="p"/>
+                    </m:rPr>
+                    <m:t>=</m:t>
+                  </m:r>
+                  <m:r>
+                    <m:t>0</m:t>
+                  </m:r>
+                </m:e>
+              </m:d>
+              <m:r>
+                <m:t>​</m:t>
+              </m:r>
+            </m:num>
+            <m:den>
+              <m:r>
+                <m:rPr>
+                  <m:sty m:val="p"/>
+                </m:rPr>
+                <m:t>P</m:t>
+              </m:r>
+              <m:r>
+                <m:t>​</m:t>
+              </m:r>
+              <m:d>
+                <m:dPr>
+                  <m:begChr m:val="("/>
+                  <m:sepChr m:val=""/>
+                  <m:endChr m:val=")"/>
+                  <m:grow/>
+                </m:dPr>
+                <m:e>
+                  <m:r>
+                    <m:t>X</m:t>
+                  </m:r>
+                  <m:r>
+                    <m:rPr>
+                      <m:sty m:val="p"/>
+                    </m:rPr>
+                    <m:t>=</m:t>
+                  </m:r>
+                  <m:r>
+                    <m:t>1</m:t>
+                  </m:r>
+                  <m:r>
+                    <m:rPr>
+                      <m:sty m:val="p"/>
+                    </m:rPr>
+                    <m:t>,</m:t>
+                  </m:r>
+                  <m:r>
+                    <m:t>Y</m:t>
+                  </m:r>
+                  <m:r>
+                    <m:rPr>
+                      <m:sty m:val="p"/>
+                    </m:rPr>
+                    <m:t>=</m:t>
+                  </m:r>
+                  <m:r>
+                    <m:t>0</m:t>
+                  </m:r>
+                </m:e>
+              </m:d>
+              <m:r>
+                <m:t>​</m:t>
+              </m:r>
+              <m:r>
+                <m:rPr>
+                  <m:sty m:val="p"/>
+                </m:rPr>
+                <m:t>P</m:t>
+              </m:r>
+              <m:r>
+                <m:t>​</m:t>
+              </m:r>
+              <m:d>
+                <m:dPr>
+                  <m:begChr m:val="("/>
+                  <m:sepChr m:val=""/>
+                  <m:endChr m:val=")"/>
+                  <m:grow/>
+                </m:dPr>
+                <m:e>
+                  <m:r>
+                    <m:t>X</m:t>
+                  </m:r>
+                  <m:r>
+                    <m:rPr>
+                      <m:sty m:val="p"/>
+                    </m:rPr>
+                    <m:t>=</m:t>
+                  </m:r>
+                  <m:r>
+                    <m:t>0</m:t>
+                  </m:r>
+                  <m:r>
+                    <m:rPr>
+                      <m:sty m:val="p"/>
+                    </m:rPr>
+                    <m:t>,</m:t>
+                  </m:r>
+                  <m:r>
+                    <m:t>Y</m:t>
+                  </m:r>
+                  <m:r>
+                    <m:rPr>
+                      <m:sty m:val="p"/>
+                    </m:rPr>
+                    <m:t>=</m:t>
+                  </m:r>
+                  <m:r>
+                    <m:t>1</m:t>
+                  </m:r>
+                </m:e>
+              </m:d>
+              <m:r>
+                <m:t>​</m:t>
+              </m:r>
+            </m:den>
+          </m:f>
+          <m:r>
+            <m:rPr>
+              <m:sty m:val="p"/>
+            </m:rPr>
+            <m:t>.</m:t>
+          </m:r>
+        </m:oMath>
+      </m:oMathPara>
+    </w:p>
+    <w:bookmarkEnd w:id="56"/>
+    <w:p>
+      <w:pPr>
+        <w:pStyle w:val="FirstParagraph"/>
+      </w:pPr>
+      <w:r>
+        <w:rPr>
+          <w:i/>
+          <w:iCs/>
+        </w:rPr>
+        <w:t xml:space="preserve">Proof</w:t>
+      </w:r>
+      <w:r>
+        <w:t xml:space="preserve">. </w:t>
+      </w:r>
+      <w:r>
+        <w:t xml:space="preserve">By</w:t>
+      </w:r>
+      <w:r>
+        <w:t xml:space="preserve"> </w:t>
+      </w:r>
+      <w:hyperlink w:anchor="sol-odds-from-joint-probs">
+        <w:r>
+          <w:rPr>
+            <w:rStyle w:val="Hyperlink"/>
+          </w:rPr>
+          <w:t xml:space="preserve">Solution 3</w:t>
+        </w:r>
+      </w:hyperlink>
+      <w:r>
+        <w:t xml:space="preserve">, the</w:t>
+      </w:r>
+      <w:r>
+        <w:t xml:space="preserve"> </w:t>
+      </w:r>
+      <w:hyperlink r:id="rId51">
+        <w:r>
+          <w:rPr>
+            <w:rStyle w:val="Hyperlink"/>
+          </w:rPr>
+          <w:t xml:space="preserve">odds</w:t>
+        </w:r>
+      </w:hyperlink>
+      <w:r>
+        <w:t xml:space="preserve"> </w:t>
+      </w:r>
+      <w:r>
+        <w:t xml:space="preserve">of</w:t>
+      </w:r>
+      <w:r>
+        <w:t xml:space="preserve"> </w:t>
+      </w:r>
+      <m:oMath>
+        <m:r>
+          <m:t>Y</m:t>
+        </m:r>
+        <m:r>
+          <m:rPr>
+            <m:sty m:val="p"/>
+          </m:rPr>
+          <m:t>=</m:t>
+        </m:r>
+        <m:r>
+          <m:t>1</m:t>
+        </m:r>
+      </m:oMath>
+      <w:r>
+        <w:t xml:space="preserve"> </w:t>
+      </w:r>
+      <w:r>
+        <w:t xml:space="preserve">in the group</w:t>
+      </w:r>
+      <w:r>
+        <w:t xml:space="preserve"> </w:t>
+      </w:r>
+      <m:oMath>
+        <m:r>
+          <m:t>X</m:t>
+        </m:r>
+        <m:r>
+          <m:rPr>
+            <m:sty m:val="p"/>
+          </m:rPr>
+          <m:t>=</m:t>
+        </m:r>
+        <m:r>
+          <m:t>1</m:t>
+        </m:r>
+      </m:oMath>
+      <w:r>
+        <w:t xml:space="preserve"> </w:t>
+      </w:r>
+      <w:r>
+        <w:t xml:space="preserve">are</w:t>
+      </w:r>
+      <w:r>
+        <w:t xml:space="preserve"> </w:t>
+      </w:r>
+      <m:oMath>
+        <m:r>
+          <m:rPr>
+            <m:sty m:val="p"/>
+          </m:rPr>
+          <m:t>P</m:t>
+        </m:r>
+        <m:r>
+          <m:t>​</m:t>
+        </m:r>
+        <m:d>
+          <m:dPr>
+            <m:begChr m:val="("/>
+            <m:sepChr m:val=""/>
+            <m:endChr m:val=")"/>
+            <m:grow/>
+          </m:dPr>
+          <m:e>
+            <m:r>
+              <m:t>X</m:t>
+            </m:r>
+            <m:r>
+              <m:rPr>
+                <m:sty m:val="p"/>
+              </m:rPr>
+              <m:t>=</m:t>
+            </m:r>
+            <m:r>
+              <m:t>1</m:t>
+            </m:r>
+            <m:r>
+              <m:rPr>
+                <m:sty m:val="p"/>
+              </m:rPr>
+              <m:t>,</m:t>
+            </m:r>
+            <m:r>
+              <m:t>Y</m:t>
+            </m:r>
+            <m:r>
+              <m:rPr>
+                <m:sty m:val="p"/>
+              </m:rPr>
+              <m:t>=</m:t>
+            </m:r>
+            <m:r>
+              <m:t>1</m:t>
+            </m:r>
+          </m:e>
+        </m:d>
+        <m:r>
+          <m:t>​</m:t>
+        </m:r>
+        <m:r>
+          <m:rPr>
+            <m:sty m:val="p"/>
+          </m:rPr>
+          <m:t>/</m:t>
+        </m:r>
+        <m:r>
+          <m:rPr>
+            <m:sty m:val="p"/>
+          </m:rPr>
+          <m:t>P</m:t>
+        </m:r>
+        <m:r>
+          <m:t>​</m:t>
+        </m:r>
+        <m:d>
+          <m:dPr>
+            <m:begChr m:val="("/>
+            <m:sepChr m:val=""/>
+            <m:endChr m:val=")"/>
+            <m:grow/>
+          </m:dPr>
+          <m:e>
+            <m:r>
+              <m:t>X</m:t>
+            </m:r>
+            <m:r>
+              <m:rPr>
+                <m:sty m:val="p"/>
+              </m:rPr>
+              <m:t>=</m:t>
+            </m:r>
+            <m:r>
+              <m:t>1</m:t>
+            </m:r>
+            <m:r>
+              <m:rPr>
+                <m:sty m:val="p"/>
+              </m:rPr>
+              <m:t>,</m:t>
+            </m:r>
+            <m:r>
+              <m:t>Y</m:t>
+            </m:r>
+            <m:r>
+              <m:rPr>
+                <m:sty m:val="p"/>
+              </m:rPr>
+              <m:t>=</m:t>
+            </m:r>
+            <m:r>
+              <m:t>0</m:t>
+            </m:r>
+          </m:e>
+        </m:d>
+        <m:r>
+          <m:t>​</m:t>
+        </m:r>
+      </m:oMath>
+      <w:r>
+        <w:t xml:space="preserve">.</w:t>
+      </w:r>
+      <w:r>
+        <w:t xml:space="preserve"> </w:t>
+      </w:r>
+      <w:r>
+        <w:t xml:space="preserve">By the same solution, the odds of</w:t>
+      </w:r>
+      <w:r>
+        <w:t xml:space="preserve"> </w:t>
+      </w:r>
+      <m:oMath>
+        <m:r>
+          <m:t>Y</m:t>
+        </m:r>
+        <m:r>
+          <m:rPr>
+            <m:sty m:val="p"/>
+          </m:rPr>
+          <m:t>=</m:t>
+        </m:r>
+        <m:r>
+          <m:t>1</m:t>
+        </m:r>
+      </m:oMath>
+      <w:r>
+        <w:t xml:space="preserve"> </w:t>
+      </w:r>
+      <w:r>
+        <w:t xml:space="preserve">in the group</w:t>
+      </w:r>
+      <w:r>
+        <w:t xml:space="preserve"> </w:t>
+      </w:r>
+      <m:oMath>
+        <m:r>
+          <m:t>X</m:t>
+        </m:r>
+        <m:r>
+          <m:rPr>
+            <m:sty m:val="p"/>
+          </m:rPr>
+          <m:t>=</m:t>
+        </m:r>
+        <m:r>
+          <m:t>0</m:t>
+        </m:r>
+      </m:oMath>
+      <w:r>
+        <w:t xml:space="preserve"> </w:t>
+      </w:r>
+      <w:r>
+        <w:t xml:space="preserve">are</w:t>
+      </w:r>
+      <w:r>
+        <w:t xml:space="preserve"> </w:t>
+      </w:r>
+      <m:oMath>
+        <m:r>
+          <m:rPr>
+            <m:sty m:val="p"/>
+          </m:rPr>
+          <m:t>P</m:t>
+        </m:r>
+        <m:r>
+          <m:t>​</m:t>
+        </m:r>
+        <m:d>
+          <m:dPr>
+            <m:begChr m:val="("/>
+            <m:sepChr m:val=""/>
+            <m:endChr m:val=")"/>
+            <m:grow/>
+          </m:dPr>
+          <m:e>
+            <m:r>
+              <m:t>X</m:t>
+            </m:r>
+            <m:r>
+              <m:rPr>
+                <m:sty m:val="p"/>
+              </m:rPr>
+              <m:t>=</m:t>
+            </m:r>
+            <m:r>
+              <m:t>0</m:t>
+            </m:r>
+            <m:r>
+              <m:rPr>
+                <m:sty m:val="p"/>
+              </m:rPr>
+              <m:t>,</m:t>
+            </m:r>
+            <m:r>
+              <m:t>Y</m:t>
+            </m:r>
+            <m:r>
+              <m:rPr>
+                <m:sty m:val="p"/>
+              </m:rPr>
+              <m:t>=</m:t>
+            </m:r>
+            <m:r>
+              <m:t>1</m:t>
+            </m:r>
+          </m:e>
+        </m:d>
+        <m:r>
+          <m:t>​</m:t>
+        </m:r>
+        <m:r>
+          <m:rPr>
+            <m:sty m:val="p"/>
+          </m:rPr>
+          <m:t>/</m:t>
+        </m:r>
+        <m:r>
+          <m:rPr>
+            <m:sty m:val="p"/>
+          </m:rPr>
+          <m:t>P</m:t>
+        </m:r>
+        <m:r>
+          <m:t>​</m:t>
+        </m:r>
+        <m:d>
+          <m:dPr>
+            <m:begChr m:val="("/>
+            <m:sepChr m:val=""/>
+            <m:endChr m:val=")"/>
+            <m:grow/>
+          </m:dPr>
+          <m:e>
+            <m:r>
+              <m:t>X</m:t>
+            </m:r>
+            <m:r>
+              <m:rPr>
+                <m:sty m:val="p"/>
+              </m:rPr>
+              <m:t>=</m:t>
+            </m:r>
+            <m:r>
+              <m:t>0</m:t>
+            </m:r>
+            <m:r>
+              <m:rPr>
+                <m:sty m:val="p"/>
+              </m:rPr>
+              <m:t>,</m:t>
+            </m:r>
+            <m:r>
+              <m:t>Y</m:t>
+            </m:r>
+            <m:r>
+              <m:rPr>
+                <m:sty m:val="p"/>
+              </m:rPr>
+              <m:t>=</m:t>
+            </m:r>
+            <m:r>
+              <m:t>0</m:t>
+            </m:r>
+          </m:e>
+        </m:d>
+        <m:r>
+          <m:t>​</m:t>
+        </m:r>
+      </m:oMath>
+      <w:r>
+        <w:t xml:space="preserve">.</w:t>
+      </w:r>
+      <w:r>
+        <w:t xml:space="preserve"> </w:t>
+      </w:r>
+      <w:r>
+        <w:t xml:space="preserve">The</w:t>
+      </w:r>
+      <w:r>
+        <w:t xml:space="preserve"> </w:t>
+      </w:r>
+      <w:hyperlink w:anchor="def-odds-ratio">
+        <w:r>
+          <w:rPr>
+            <w:rStyle w:val="Hyperlink"/>
+          </w:rPr>
+          <w:t xml:space="preserve">odds ratio</w:t>
+        </w:r>
+      </w:hyperlink>
+      <w:r>
+        <w:t xml:space="preserve"> </w:t>
+      </w:r>
+      <w:r>
+        <w:t xml:space="preserve">is the first odds divided by the second.</w:t>
+      </w:r>
+      <w:r>
+        <w:t xml:space="preserve"> </w:t>
+      </w:r>
+      <w:r>
+        <w:t xml:space="preserve">Dividing by a fraction is multiplying by its reciprocal, which gives the stated product of the four joint probabilities.</w:t>
+      </w:r>
+    </w:p>
+    <w:bookmarkStart w:id="57" w:name="exm-hers-odds-ratio-cross-product"/>
+    <w:p>
+      <w:pPr>
+        <w:pStyle w:val="BodyText"/>
+      </w:pPr>
+      <w:r>
+        <w:rPr>
+          <w:b/>
+          <w:bCs/>
+        </w:rPr>
+        <w:t xml:space="preserve">Example 12 (The HERS odds ratio from the cell proportions)</w:t>
+      </w:r>
+      <w:r>
+        <w:t xml:space="preserve"> </w:t>
+      </w:r>
+      <w:r>
+        <w:t xml:space="preserve">Take</w:t>
+      </w:r>
+      <w:r>
+        <w:t xml:space="preserve"> </w:t>
+      </w:r>
+      <m:oMath>
+        <m:r>
+          <m:t>X</m:t>
+        </m:r>
+        <m:r>
+          <m:rPr>
+            <m:sty m:val="p"/>
+          </m:rPr>
+          <m:t>=</m:t>
+        </m:r>
+        <m:r>
+          <m:t>1</m:t>
+        </m:r>
+      </m:oMath>
+      <w:r>
+        <w:t xml:space="preserve"> </w:t>
+      </w:r>
+      <w:r>
+        <w:t xml:space="preserve">for hormone therapy and</w:t>
+      </w:r>
+      <w:r>
+        <w:t xml:space="preserve"> </w:t>
+      </w:r>
+      <m:oMath>
+        <m:r>
+          <m:t>X</m:t>
+        </m:r>
+        <m:r>
+          <m:rPr>
+            <m:sty m:val="p"/>
+          </m:rPr>
+          <m:t>=</m:t>
+        </m:r>
+        <m:r>
+          <m:t>0</m:t>
+        </m:r>
+      </m:oMath>
+      <w:r>
+        <w:t xml:space="preserve"> </w:t>
+      </w:r>
+      <w:r>
+        <w:t xml:space="preserve">for placebo, and</w:t>
+      </w:r>
+      <w:r>
+        <w:t xml:space="preserve"> </w:t>
+      </w:r>
+      <m:oMath>
+        <m:r>
+          <m:t>Y</m:t>
+        </m:r>
+        <m:r>
+          <m:rPr>
+            <m:sty m:val="p"/>
+          </m:rPr>
+          <m:t>=</m:t>
+        </m:r>
+        <m:r>
+          <m:t>1</m:t>
+        </m:r>
+      </m:oMath>
+      <w:r>
+        <w:t xml:space="preserve"> </w:t>
+      </w:r>
+      <w:r>
+        <w:t xml:space="preserve">for regular exercise.</w:t>
+      </w:r>
+      <w:r>
+        <w:t xml:space="preserve"> </w:t>
+      </w:r>
+      <w:r>
+        <w:t xml:space="preserve">The estimated joint probabilities are the cell proportions of the HERS table:</w:t>
+      </w:r>
+    </w:p>
+    <w:p>
+      <w:pPr>
+        <w:pStyle w:val="SourceCode"/>
+      </w:pPr>
+      <w:r>
+        <w:rPr>
+          <w:rStyle w:val="NormalTok"/>
+        </w:rPr>
+        <w:t xml:space="preserve">joint_hat </w:t>
+      </w:r>
+      <w:r>
+        <w:rPr>
+          <w:rStyle w:val="OtherTok"/>
+        </w:rPr>
+        <w:t xml:space="preserve">&lt;-</w:t>
+      </w:r>
+      <w:r>
+        <w:rPr>
+          <w:rStyle w:val="NormalTok"/>
+        </w:rPr>
+        <w:t xml:space="preserve"> </w:t>
+      </w:r>
+      <w:r>
+        <w:rPr>
+          <w:rStyle w:val="FunctionTok"/>
+        </w:rPr>
+        <w:t xml:space="preserve">prop.table</w:t>
+      </w:r>
+      <w:r>
+        <w:rPr>
+          <w:rStyle w:val="NormalTok"/>
+        </w:rPr>
+        <w:t xml:space="preserve">(</w:t>
+      </w:r>
+      <w:r>
+        <w:rPr>
+          <w:rStyle w:val="FunctionTok"/>
+        </w:rPr>
+        <w:t xml:space="preserve">table</w:t>
+      </w:r>
+      <w:r>
+        <w:rPr>
+          <w:rStyle w:val="NormalTok"/>
+        </w:rPr>
+        <w:t xml:space="preserve">(</w:t>
+      </w:r>
+      <w:r>
+        <w:rPr>
+          <w:rStyle w:val="AttributeTok"/>
+        </w:rPr>
+        <w:t xml:space="preserve">HT =</w:t>
+      </w:r>
+      <w:r>
+        <w:rPr>
+          <w:rStyle w:val="NormalTok"/>
+        </w:rPr>
+        <w:t xml:space="preserve"> hers</w:t>
+      </w:r>
+      <w:r>
+        <w:rPr>
+          <w:rStyle w:val="SpecialCharTok"/>
+        </w:rPr>
+        <w:t xml:space="preserve">$</w:t>
+      </w:r>
+      <w:r>
+        <w:rPr>
+          <w:rStyle w:val="NormalTok"/>
+        </w:rPr>
+        <w:t xml:space="preserve">HT, </w:t>
+      </w:r>
+      <w:r>
+        <w:rPr>
+          <w:rStyle w:val="AttributeTok"/>
+        </w:rPr>
+        <w:t xml:space="preserve">exercise =</w:t>
+      </w:r>
+      <w:r>
+        <w:rPr>
+          <w:rStyle w:val="NormalTok"/>
+        </w:rPr>
+        <w:t xml:space="preserve"> hers</w:t>
+      </w:r>
+      <w:r>
+        <w:rPr>
+          <w:rStyle w:val="SpecialCharTok"/>
+        </w:rPr>
+        <w:t xml:space="preserve">$</w:t>
+      </w:r>
+      <w:r>
+        <w:rPr>
+          <w:rStyle w:val="NormalTok"/>
+        </w:rPr>
+        <w:t xml:space="preserve">exercise))</w:t>
+      </w:r>
+      <w:r>
+        <w:br/>
+      </w:r>
+      <w:r>
+        <w:rPr>
+          <w:rStyle w:val="NormalTok"/>
+        </w:rPr>
+        <w:t xml:space="preserve">cross_ratio </w:t>
+      </w:r>
+      <w:r>
+        <w:rPr>
+          <w:rStyle w:val="OtherTok"/>
+        </w:rPr>
+        <w:t xml:space="preserve">&lt;-</w:t>
+      </w:r>
+      <w:r>
+        <w:br/>
+      </w:r>
+      <w:r>
+        <w:rPr>
+          <w:rStyle w:val="NormalTok"/>
+        </w:rPr>
+        <w:t xml:space="preserve">  joint_hat[</w:t>
+      </w:r>
+      <w:r>
+        <w:rPr>
+          <w:rStyle w:val="StringTok"/>
+        </w:rPr>
+        <w:t xml:space="preserve">"hormone therapy"</w:t>
+      </w:r>
+      <w:r>
+        <w:rPr>
+          <w:rStyle w:val="NormalTok"/>
+        </w:rPr>
+        <w:t xml:space="preserve">, </w:t>
+      </w:r>
+      <w:r>
+        <w:rPr>
+          <w:rStyle w:val="StringTok"/>
+        </w:rPr>
+        <w:t xml:space="preserve">"yes"</w:t>
+      </w:r>
+      <w:r>
+        <w:rPr>
+          <w:rStyle w:val="NormalTok"/>
+        </w:rPr>
+        <w:t xml:space="preserve">] </w:t>
+      </w:r>
+      <w:r>
+        <w:rPr>
+          <w:rStyle w:val="SpecialCharTok"/>
+        </w:rPr>
+        <w:t xml:space="preserve">*</w:t>
+      </w:r>
+      <w:r>
+        <w:rPr>
+          <w:rStyle w:val="NormalTok"/>
+        </w:rPr>
+        <w:t xml:space="preserve"> joint_hat[</w:t>
+      </w:r>
+      <w:r>
+        <w:rPr>
+          <w:rStyle w:val="StringTok"/>
+        </w:rPr>
+        <w:t xml:space="preserve">"placebo"</w:t>
+      </w:r>
+      <w:r>
+        <w:rPr>
+          <w:rStyle w:val="NormalTok"/>
+        </w:rPr>
+        <w:t xml:space="preserve">, </w:t>
+      </w:r>
+      <w:r>
+        <w:rPr>
+          <w:rStyle w:val="StringTok"/>
+        </w:rPr>
+        <w:t xml:space="preserve">"no"</w:t>
+      </w:r>
+      <w:r>
+        <w:rPr>
+          <w:rStyle w:val="NormalTok"/>
+        </w:rPr>
+        <w:t xml:space="preserve">] </w:t>
+      </w:r>
+      <w:r>
+        <w:rPr>
+          <w:rStyle w:val="SpecialCharTok"/>
+        </w:rPr>
+        <w:t xml:space="preserve">/</w:t>
+      </w:r>
+      <w:r>
+        <w:br/>
+      </w:r>
+      <w:r>
+        <w:rPr>
+          <w:rStyle w:val="NormalTok"/>
+        </w:rPr>
+        <w:t xml:space="preserve">  (joint_hat[</w:t>
+      </w:r>
+      <w:r>
+        <w:rPr>
+          <w:rStyle w:val="StringTok"/>
+        </w:rPr>
+        <w:t xml:space="preserve">"hormone therapy"</w:t>
+      </w:r>
+      <w:r>
+        <w:rPr>
+          <w:rStyle w:val="NormalTok"/>
+        </w:rPr>
+        <w:t xml:space="preserve">, </w:t>
+      </w:r>
+      <w:r>
+        <w:rPr>
+          <w:rStyle w:val="StringTok"/>
+        </w:rPr>
+        <w:t xml:space="preserve">"no"</w:t>
+      </w:r>
+      <w:r>
+        <w:rPr>
+          <w:rStyle w:val="NormalTok"/>
+        </w:rPr>
+        <w:t xml:space="preserve">] </w:t>
+      </w:r>
+      <w:r>
+        <w:rPr>
+          <w:rStyle w:val="SpecialCharTok"/>
+        </w:rPr>
+        <w:t xml:space="preserve">*</w:t>
+      </w:r>
+      <w:r>
+        <w:rPr>
+          <w:rStyle w:val="NormalTok"/>
+        </w:rPr>
+        <w:t xml:space="preserve"> joint_hat[</w:t>
+      </w:r>
+      <w:r>
+        <w:rPr>
+          <w:rStyle w:val="StringTok"/>
+        </w:rPr>
+        <w:t xml:space="preserve">"placebo"</w:t>
+      </w:r>
+      <w:r>
+        <w:rPr>
+          <w:rStyle w:val="NormalTok"/>
+        </w:rPr>
+        <w:t xml:space="preserve">, </w:t>
+      </w:r>
+      <w:r>
+        <w:rPr>
+          <w:rStyle w:val="StringTok"/>
+        </w:rPr>
+        <w:t xml:space="preserve">"yes"</w:t>
+      </w:r>
+      <w:r>
+        <w:rPr>
+          <w:rStyle w:val="NormalTok"/>
+        </w:rPr>
+        <w:t xml:space="preserve">])</w:t>
+      </w:r>
+      <w:r>
+        <w:br/>
+      </w:r>
+      <w:r>
+        <w:rPr>
+          <w:rStyle w:val="NormalTok"/>
+        </w:rPr>
+        <w:t xml:space="preserve">cross_ratio</w:t>
+      </w:r>
+      <w:r>
+        <w:br/>
+      </w:r>
+      <w:r>
+        <w:rPr>
+          <w:rStyle w:val="CommentTok"/>
+        </w:rPr>
+        <w:t xml:space="preserve">#&gt; [1] 1.02836</w:t>
+      </w:r>
+    </w:p>
+    <w:p>
+      <w:pPr>
+        <w:pStyle w:val="FirstParagraph"/>
+      </w:pPr>
+      <w:r>
+        <w:t xml:space="preserve">The cross-product expression equals 1.028.</w:t>
+      </w:r>
+      <w:r>
+        <w:t xml:space="preserve"> </w:t>
+      </w:r>
+      <w:r>
+        <w:t xml:space="preserve">It equals the estimated</w:t>
+      </w:r>
+      <w:r>
+        <w:t xml:space="preserve"> </w:t>
+      </w:r>
+      <w:hyperlink w:anchor="def-odds-ratio">
+        <w:r>
+          <w:rPr>
+            <w:rStyle w:val="Hyperlink"/>
+          </w:rPr>
+          <w:t xml:space="preserve">odds ratio</w:t>
+        </w:r>
+      </w:hyperlink>
+      <w:r>
+        <w:t xml:space="preserve"> </w:t>
+      </w:r>
+      <w:r>
+        <w:t xml:space="preserve">1.028 of</w:t>
+      </w:r>
+      <w:r>
+        <w:t xml:space="preserve"> </w:t>
+      </w:r>
+      <w:hyperlink w:anchor="exm-hers-odds-ratio">
+        <w:r>
+          <w:rPr>
+            <w:rStyle w:val="Hyperlink"/>
+          </w:rPr>
+          <w:t xml:space="preserve">Example 11</w:t>
+        </w:r>
+      </w:hyperlink>
+      <w:r>
+        <w:t xml:space="preserve">, as</w:t>
+      </w:r>
+      <w:r>
+        <w:t xml:space="preserve"> </w:t>
+      </w:r>
+      <w:hyperlink w:anchor="thm-odds-ratio-cross-product">
+        <w:r>
+          <w:rPr>
+            <w:rStyle w:val="Hyperlink"/>
+          </w:rPr>
+          <w:t xml:space="preserve">Theorem 4</w:t>
+        </w:r>
+      </w:hyperlink>
+      <w:r>
+        <w:t xml:space="preserve"> </w:t>
+      </w:r>
+      <w:r>
+        <w:t xml:space="preserve">states.</w:t>
+      </w:r>
+    </w:p>
+    <w:bookmarkEnd w:id="57"/>
+    <w:bookmarkStart w:id="58" w:name="thm-odds-ratio-reversible"/>
+    <w:p>
+      <w:pPr>
+        <w:pStyle w:val="BodyText"/>
+      </w:pPr>
+      <w:r>
+        <w:rPr>
+          <w:b/>
+          <w:bCs/>
+        </w:rPr>
+        <w:t xml:space="preserve">Theorem 5 (The odds ratio is reversible)</w:t>
+      </w:r>
+      <w:r>
+        <w:t xml:space="preserve"> </w:t>
+      </w:r>
+      <w:r>
+        <w:t xml:space="preserve">Let:</w:t>
+      </w:r>
+    </w:p>
+    <w:p>
+      <w:pPr>
+        <w:pStyle w:val="Compact"/>
+        <w:numPr>
+          <w:ilvl w:val="0"/>
+          <w:numId w:val="1012"/>
+        </w:numPr>
+      </w:pPr>
+      <m:oMath>
+        <m:r>
+          <m:t>X</m:t>
+        </m:r>
+      </m:oMath>
+      <w:r>
+        <w:t xml:space="preserve"> </w:t>
+      </w:r>
+      <w:r>
+        <w:t xml:space="preserve">and</w:t>
+      </w:r>
+      <w:r>
+        <w:t xml:space="preserve"> </w:t>
+      </w:r>
+      <m:oMath>
+        <m:r>
+          <m:t>Y</m:t>
+        </m:r>
+      </m:oMath>
+      <w:r>
+        <w:t xml:space="preserve"> </w:t>
+      </w:r>
+      <w:r>
+        <w:t xml:space="preserve">be</w:t>
+      </w:r>
+      <w:r>
+        <w:t xml:space="preserve"> </w:t>
+      </w:r>
+      <w:hyperlink r:id="rId30">
+        <w:r>
+          <w:rPr>
+            <w:rStyle w:val="Hyperlink"/>
+          </w:rPr>
+          <w:t xml:space="preserve">binary</w:t>
+        </w:r>
+      </w:hyperlink>
+      <w:r>
+        <w:t xml:space="preserve"> </w:t>
+      </w:r>
+      <w:r>
+        <w:t xml:space="preserve">random variables, each with values</w:t>
+      </w:r>
+      <w:r>
+        <w:t xml:space="preserve"> </w:t>
+      </w:r>
+      <m:oMath>
+        <m:r>
+          <m:t>0</m:t>
+        </m:r>
+      </m:oMath>
+      <w:r>
+        <w:t xml:space="preserve"> </w:t>
+      </w:r>
+      <w:r>
+        <w:t xml:space="preserve">and</w:t>
+      </w:r>
+      <w:r>
+        <w:t xml:space="preserve"> </w:t>
+      </w:r>
+      <m:oMath>
+        <m:r>
+          <m:t>1</m:t>
+        </m:r>
+      </m:oMath>
+      <w:r>
+        <w:t xml:space="preserve">.</w:t>
+      </w:r>
+    </w:p>
+    <w:p>
+      <w:pPr>
+        <w:pStyle w:val="Compact"/>
+        <w:numPr>
+          <w:ilvl w:val="0"/>
+          <w:numId w:val="1012"/>
+        </w:numPr>
+      </w:pPr>
+      <m:oMath>
+        <m:r>
+          <m:rPr>
+            <m:sty m:val="p"/>
+          </m:rPr>
+          <m:t>P</m:t>
+        </m:r>
+        <m:r>
+          <m:t>​</m:t>
+        </m:r>
+        <m:d>
+          <m:dPr>
+            <m:begChr m:val="("/>
+            <m:sepChr m:val=""/>
+            <m:endChr m:val=")"/>
+            <m:grow/>
+          </m:dPr>
+          <m:e>
+            <m:r>
+              <m:t>X</m:t>
+            </m:r>
+            <m:r>
+              <m:rPr>
+                <m:sty m:val="p"/>
+              </m:rPr>
+              <m:t>=</m:t>
+            </m:r>
+            <m:r>
+              <m:t>x</m:t>
+            </m:r>
+            <m:r>
+              <m:rPr>
+                <m:sty m:val="p"/>
+              </m:rPr>
+              <m:t>,</m:t>
+            </m:r>
+            <m:r>
+              <m:t>Y</m:t>
+            </m:r>
+            <m:r>
+              <m:rPr>
+                <m:sty m:val="p"/>
+              </m:rPr>
+              <m:t>=</m:t>
+            </m:r>
+            <m:r>
+              <m:t>y</m:t>
+            </m:r>
+          </m:e>
+        </m:d>
+        <m:r>
+          <m:t>​</m:t>
+        </m:r>
+        <m:r>
+          <m:rPr>
+            <m:sty m:val="p"/>
+          </m:rPr>
+          <m:t>&gt;</m:t>
+        </m:r>
+        <m:r>
+          <m:t>0</m:t>
+        </m:r>
+      </m:oMath>
+      <w:r>
+        <w:t xml:space="preserve"> </w:t>
+      </w:r>
+      <w:r>
+        <w:t xml:space="preserve">for each</w:t>
+      </w:r>
+      <w:r>
+        <w:t xml:space="preserve"> </w:t>
+      </w:r>
+      <m:oMath>
+        <m:r>
+          <m:t>x</m:t>
+        </m:r>
+        <m:r>
+          <m:rPr>
+            <m:sty m:val="p"/>
+          </m:rPr>
+          <m:t>,</m:t>
+        </m:r>
+        <m:r>
+          <m:t>y</m:t>
+        </m:r>
+        <m:r>
+          <m:rPr>
+            <m:sty m:val="p"/>
+          </m:rPr>
+          <m:t>∈</m:t>
+        </m:r>
+        <m:r>
+          <m:t>​</m:t>
+        </m:r>
+        <m:d>
+          <m:dPr>
+            <m:begChr m:val="{"/>
+            <m:sepChr m:val=""/>
+            <m:endChr m:val="}"/>
+            <m:grow/>
+          </m:dPr>
+          <m:e>
+            <m:r>
+              <m:t>0</m:t>
+            </m:r>
+            <m:r>
+              <m:rPr>
+                <m:sty m:val="p"/>
+              </m:rPr>
+              <m:t>,</m:t>
+            </m:r>
+            <m:r>
+              <m:t>1</m:t>
+            </m:r>
+          </m:e>
+        </m:d>
+        <m:r>
+          <m:t>​</m:t>
+        </m:r>
+      </m:oMath>
+      <w:r>
+        <w:t xml:space="preserve">.</w:t>
+      </w:r>
+    </w:p>
+    <w:p>
+      <w:pPr>
+        <w:pStyle w:val="FirstParagraph"/>
+      </w:pPr>
+      <w:r>
+        <w:t xml:space="preserve">The</w:t>
+      </w:r>
+      <w:r>
+        <w:t xml:space="preserve"> </w:t>
+      </w:r>
+      <w:hyperlink w:anchor="def-odds-ratio">
+        <w:r>
+          <w:rPr>
+            <w:rStyle w:val="Hyperlink"/>
+          </w:rPr>
+          <w:t xml:space="preserve">odds ratio</w:t>
+        </w:r>
+      </w:hyperlink>
+      <w:r>
+        <w:t xml:space="preserve"> </w:t>
+      </w:r>
+      <w:r>
+        <w:t xml:space="preserve">of</w:t>
+      </w:r>
+      <w:r>
+        <w:t xml:space="preserve"> </w:t>
+      </w:r>
+      <m:oMath>
+        <m:r>
+          <m:t>Y</m:t>
+        </m:r>
+        <m:r>
+          <m:rPr>
+            <m:sty m:val="p"/>
+          </m:rPr>
+          <m:t>=</m:t>
+        </m:r>
+        <m:r>
+          <m:t>1</m:t>
+        </m:r>
+      </m:oMath>
+      <w:r>
+        <w:t xml:space="preserve"> </w:t>
+      </w:r>
+      <w:r>
+        <w:t xml:space="preserve">comparing</w:t>
+      </w:r>
+      <w:r>
+        <w:t xml:space="preserve"> </w:t>
+      </w:r>
+      <m:oMath>
+        <m:r>
+          <m:t>X</m:t>
+        </m:r>
+        <m:r>
+          <m:rPr>
+            <m:sty m:val="p"/>
+          </m:rPr>
+          <m:t>=</m:t>
+        </m:r>
+        <m:r>
+          <m:t>1</m:t>
+        </m:r>
+      </m:oMath>
+      <w:r>
+        <w:t xml:space="preserve"> </w:t>
+      </w:r>
+      <w:r>
+        <w:t xml:space="preserve">with</w:t>
+      </w:r>
+      <w:r>
+        <w:t xml:space="preserve"> </w:t>
+      </w:r>
+      <m:oMath>
+        <m:r>
+          <m:t>X</m:t>
+        </m:r>
+        <m:r>
+          <m:rPr>
+            <m:sty m:val="p"/>
+          </m:rPr>
+          <m:t>=</m:t>
+        </m:r>
+        <m:r>
+          <m:t>0</m:t>
+        </m:r>
+      </m:oMath>
+      <w:r>
+        <w:t xml:space="preserve"> </w:t>
+      </w:r>
+      <w:r>
+        <w:t xml:space="preserve">equals the odds ratio of</w:t>
+      </w:r>
+      <w:r>
+        <w:t xml:space="preserve"> </w:t>
+      </w:r>
+      <m:oMath>
+        <m:r>
+          <m:t>X</m:t>
+        </m:r>
+        <m:r>
+          <m:rPr>
+            <m:sty m:val="p"/>
+          </m:rPr>
+          <m:t>=</m:t>
+        </m:r>
+        <m:r>
+          <m:t>1</m:t>
+        </m:r>
+      </m:oMath>
+      <w:r>
+        <w:t xml:space="preserve"> </w:t>
+      </w:r>
+      <w:r>
+        <w:t xml:space="preserve">comparing</w:t>
+      </w:r>
+      <w:r>
+        <w:t xml:space="preserve"> </w:t>
+      </w:r>
+      <m:oMath>
+        <m:r>
+          <m:t>Y</m:t>
+        </m:r>
+        <m:r>
+          <m:rPr>
+            <m:sty m:val="p"/>
+          </m:rPr>
+          <m:t>=</m:t>
+        </m:r>
+        <m:r>
+          <m:t>1</m:t>
+        </m:r>
+      </m:oMath>
+      <w:r>
+        <w:t xml:space="preserve"> </w:t>
+      </w:r>
+      <w:r>
+        <w:t xml:space="preserve">with</w:t>
+      </w:r>
+      <w:r>
+        <w:t xml:space="preserve"> </w:t>
+      </w:r>
+      <m:oMath>
+        <m:r>
+          <m:t>Y</m:t>
+        </m:r>
+        <m:r>
+          <m:rPr>
+            <m:sty m:val="p"/>
+          </m:rPr>
+          <m:t>=</m:t>
+        </m:r>
+        <m:r>
+          <m:t>0</m:t>
+        </m:r>
+      </m:oMath>
+      <w:r>
+        <w:t xml:space="preserve">:</w:t>
+      </w:r>
+    </w:p>
+    <w:p>
+      <w:pPr>
+        <w:pStyle w:val="BodyText"/>
+      </w:pPr>
+      <m:oMathPara>
+        <m:oMathParaPr>
+          <m:jc m:val="center"/>
+        </m:oMathParaPr>
+        <m:oMath>
+          <m:sSub>
+            <m:e>
+              <m:r>
+                <m:rPr>
+                  <m:nor/>
+                  <m:sty m:val="p"/>
+                </m:rPr>
+                <m:t>ϙ</m:t>
+              </m:r>
+            </m:e>
+            <m:sub>
+              <m:r>
+                <m:t>ω</m:t>
+              </m:r>
+            </m:sub>
+          </m:sSub>
+          <m:r>
+            <m:t>​</m:t>
+          </m:r>
+          <m:d>
+            <m:dPr>
+              <m:begChr m:val="("/>
+              <m:sepChr m:val=""/>
+              <m:endChr m:val=")"/>
+              <m:grow/>
+            </m:dPr>
+            <m:e>
+              <m:r>
+                <m:t>Y</m:t>
+              </m:r>
+              <m:r>
+                <m:rPr>
+                  <m:sty m:val="p"/>
+                </m:rPr>
+                <m:t>∣</m:t>
+              </m:r>
+              <m:r>
+                <m:t>X</m:t>
+              </m:r>
+            </m:e>
+          </m:d>
+          <m:r>
+            <m:t>​</m:t>
+          </m:r>
+          <m:r>
+            <m:rPr>
+              <m:sty m:val="p"/>
+            </m:rPr>
+            <m:t>=</m:t>
+          </m:r>
+          <m:sSub>
+            <m:e>
+              <m:r>
+                <m:rPr>
+                  <m:nor/>
+                  <m:sty m:val="p"/>
+                </m:rPr>
+                <m:t>ϙ</m:t>
+              </m:r>
+            </m:e>
+            <m:sub>
+              <m:r>
+                <m:t>ω</m:t>
+              </m:r>
+            </m:sub>
+          </m:sSub>
+          <m:r>
+            <m:t>​</m:t>
+          </m:r>
+          <m:d>
+            <m:dPr>
+              <m:begChr m:val="("/>
+              <m:sepChr m:val=""/>
+              <m:endChr m:val=")"/>
+              <m:grow/>
+            </m:dPr>
+            <m:e>
+              <m:r>
+                <m:t>X</m:t>
+              </m:r>
+              <m:r>
+                <m:rPr>
+                  <m:sty m:val="p"/>
+                </m:rPr>
+                <m:t>∣</m:t>
+              </m:r>
+              <m:r>
+                <m:t>Y</m:t>
+              </m:r>
+            </m:e>
+          </m:d>
+          <m:r>
+            <m:t>​</m:t>
+          </m:r>
+          <m:r>
+            <m:rPr>
+              <m:sty m:val="p"/>
+            </m:rPr>
+            <m:t>.</m:t>
+          </m:r>
+        </m:oMath>
+      </m:oMathPara>
+    </w:p>
+    <w:bookmarkEnd w:id="58"/>
+    <w:p>
+      <w:pPr>
+        <w:pStyle w:val="FirstParagraph"/>
+      </w:pPr>
+      <w:r>
+        <w:rPr>
+          <w:i/>
+          <w:iCs/>
+        </w:rPr>
+        <w:t xml:space="preserve">Proof</w:t>
+      </w:r>
+      <w:r>
+        <w:t xml:space="preserve">. </w:t>
+      </w:r>
+      <w:r>
+        <w:t xml:space="preserve">By</w:t>
+      </w:r>
+      <w:r>
+        <w:t xml:space="preserve"> </w:t>
+      </w:r>
+      <w:hyperlink w:anchor="thm-odds-ratio-cross-product">
+        <w:r>
+          <w:rPr>
+            <w:rStyle w:val="Hyperlink"/>
+          </w:rPr>
+          <w:t xml:space="preserve">Theorem 4</w:t>
+        </w:r>
+      </w:hyperlink>
+      <w:r>
+        <w:t xml:space="preserve">, with the roles of</w:t>
+      </w:r>
+      <w:r>
+        <w:t xml:space="preserve"> </w:t>
+      </w:r>
+      <m:oMath>
+        <m:r>
+          <m:t>X</m:t>
+        </m:r>
+      </m:oMath>
+      <w:r>
+        <w:t xml:space="preserve"> </w:t>
+      </w:r>
+      <w:r>
+        <w:t xml:space="preserve">and</w:t>
+      </w:r>
+      <w:r>
+        <w:t xml:space="preserve"> </w:t>
+      </w:r>
+      <m:oMath>
+        <m:r>
+          <m:t>Y</m:t>
+        </m:r>
+      </m:oMath>
+      <w:r>
+        <w:t xml:space="preserve"> </w:t>
+      </w:r>
+      <w:r>
+        <w:t xml:space="preserve">exchanged,</w:t>
+      </w:r>
+    </w:p>
+    <w:p>
+      <w:pPr>
+        <w:pStyle w:val="BodyText"/>
+      </w:pPr>
+      <m:oMathPara>
+        <m:oMathParaPr>
+          <m:jc m:val="center"/>
+        </m:oMathParaPr>
+        <m:oMath>
+          <m:sSub>
+            <m:e>
+              <m:r>
+                <m:rPr>
+                  <m:nor/>
+                  <m:sty m:val="p"/>
+                </m:rPr>
+                <m:t>ϙ</m:t>
+              </m:r>
+            </m:e>
+            <m:sub>
+              <m:r>
+                <m:t>ω</m:t>
+              </m:r>
+            </m:sub>
+          </m:sSub>
+          <m:r>
+            <m:t>​</m:t>
+          </m:r>
+          <m:d>
+            <m:dPr>
+              <m:begChr m:val="("/>
+              <m:sepChr m:val=""/>
+              <m:endChr m:val=")"/>
+              <m:grow/>
+            </m:dPr>
+            <m:e>
+              <m:r>
+                <m:t>X</m:t>
+              </m:r>
+              <m:r>
+                <m:rPr>
+                  <m:sty m:val="p"/>
+                </m:rPr>
+                <m:t>∣</m:t>
+              </m:r>
+              <m:r>
+                <m:t>Y</m:t>
+              </m:r>
+            </m:e>
+          </m:d>
+          <m:r>
+            <m:t>​</m:t>
+          </m:r>
+          <m:r>
+            <m:rPr>
+              <m:sty m:val="p"/>
+            </m:rPr>
+            <m:t>=</m:t>
+          </m:r>
+          <m:f>
+            <m:fPr>
+              <m:type m:val="bar"/>
+            </m:fPr>
+            <m:num>
+              <m:r>
+                <m:rPr>
+                  <m:sty m:val="p"/>
+                </m:rPr>
+                <m:t>P</m:t>
+              </m:r>
+              <m:r>
+                <m:t>​</m:t>
+              </m:r>
+              <m:d>
+                <m:dPr>
+                  <m:begChr m:val="("/>
+                  <m:sepChr m:val=""/>
+                  <m:endChr m:val=")"/>
+                  <m:grow/>
+                </m:dPr>
+                <m:e>
+                  <m:r>
+                    <m:t>Y</m:t>
+                  </m:r>
+                  <m:r>
+                    <m:rPr>
+                      <m:sty m:val="p"/>
+                    </m:rPr>
+                    <m:t>=</m:t>
+                  </m:r>
+                  <m:r>
+                    <m:t>1</m:t>
+                  </m:r>
+                  <m:r>
+                    <m:rPr>
+                      <m:sty m:val="p"/>
+                    </m:rPr>
+                    <m:t>,</m:t>
+                  </m:r>
+                  <m:r>
+                    <m:t>X</m:t>
+                  </m:r>
+                  <m:r>
+                    <m:rPr>
+                      <m:sty m:val="p"/>
+                    </m:rPr>
+                    <m:t>=</m:t>
+                  </m:r>
+                  <m:r>
+                    <m:t>1</m:t>
+                  </m:r>
+                </m:e>
+              </m:d>
+              <m:r>
+                <m:t>​</m:t>
+              </m:r>
+              <m:r>
+                <m:rPr>
+                  <m:sty m:val="p"/>
+                </m:rPr>
+                <m:t>P</m:t>
+              </m:r>
+              <m:r>
+                <m:t>​</m:t>
+              </m:r>
+              <m:d>
+                <m:dPr>
+                  <m:begChr m:val="("/>
+                  <m:sepChr m:val=""/>
+                  <m:endChr m:val=")"/>
+                  <m:grow/>
+                </m:dPr>
+                <m:e>
+                  <m:r>
+                    <m:t>Y</m:t>
+                  </m:r>
+                  <m:r>
+                    <m:rPr>
+                      <m:sty m:val="p"/>
+                    </m:rPr>
+                    <m:t>=</m:t>
+                  </m:r>
+                  <m:r>
+                    <m:t>0</m:t>
+                  </m:r>
+                  <m:r>
+                    <m:rPr>
+                      <m:sty m:val="p"/>
+                    </m:rPr>
+                    <m:t>,</m:t>
+                  </m:r>
+                  <m:r>
+                    <m:t>X</m:t>
+                  </m:r>
+                  <m:r>
+                    <m:rPr>
+                      <m:sty m:val="p"/>
+                    </m:rPr>
+                    <m:t>=</m:t>
+                  </m:r>
+                  <m:r>
+                    <m:t>0</m:t>
+                  </m:r>
+                </m:e>
+              </m:d>
+              <m:r>
+                <m:t>​</m:t>
+              </m:r>
+            </m:num>
+            <m:den>
+              <m:r>
+                <m:rPr>
+                  <m:sty m:val="p"/>
+                </m:rPr>
+                <m:t>P</m:t>
+              </m:r>
+              <m:r>
+                <m:t>​</m:t>
+              </m:r>
+              <m:d>
+                <m:dPr>
+                  <m:begChr m:val="("/>
+                  <m:sepChr m:val=""/>
+                  <m:endChr m:val=")"/>
+                  <m:grow/>
+                </m:dPr>
+                <m:e>
+                  <m:r>
+                    <m:t>Y</m:t>
+                  </m:r>
+                  <m:r>
+                    <m:rPr>
+                      <m:sty m:val="p"/>
+                    </m:rPr>
+                    <m:t>=</m:t>
+                  </m:r>
+                  <m:r>
+                    <m:t>1</m:t>
+                  </m:r>
+                  <m:r>
+                    <m:rPr>
+                      <m:sty m:val="p"/>
+                    </m:rPr>
+                    <m:t>,</m:t>
+                  </m:r>
+                  <m:r>
+                    <m:t>X</m:t>
+                  </m:r>
+                  <m:r>
+                    <m:rPr>
+                      <m:sty m:val="p"/>
+                    </m:rPr>
+                    <m:t>=</m:t>
+                  </m:r>
+                  <m:r>
+                    <m:t>0</m:t>
+                  </m:r>
+                </m:e>
+              </m:d>
+              <m:r>
+                <m:t>​</m:t>
+              </m:r>
+              <m:r>
+                <m:rPr>
+                  <m:sty m:val="p"/>
+                </m:rPr>
+                <m:t>P</m:t>
+              </m:r>
+              <m:r>
+                <m:t>​</m:t>
+              </m:r>
+              <m:d>
+                <m:dPr>
+                  <m:begChr m:val="("/>
+                  <m:sepChr m:val=""/>
+                  <m:endChr m:val=")"/>
+                  <m:grow/>
+                </m:dPr>
+                <m:e>
+                  <m:r>
+                    <m:t>Y</m:t>
+                  </m:r>
+                  <m:r>
+                    <m:rPr>
+                      <m:sty m:val="p"/>
+                    </m:rPr>
+                    <m:t>=</m:t>
+                  </m:r>
+                  <m:r>
+                    <m:t>0</m:t>
+                  </m:r>
+                  <m:r>
+                    <m:rPr>
+                      <m:sty m:val="p"/>
+                    </m:rPr>
+                    <m:t>,</m:t>
+                  </m:r>
+                  <m:r>
+                    <m:t>X</m:t>
+                  </m:r>
+                  <m:r>
+                    <m:rPr>
+                      <m:sty m:val="p"/>
+                    </m:rPr>
+                    <m:t>=</m:t>
+                  </m:r>
+                  <m:r>
+                    <m:t>1</m:t>
+                  </m:r>
+                </m:e>
+              </m:d>
+              <m:r>
+                <m:t>​</m:t>
+              </m:r>
+            </m:den>
+          </m:f>
+          <m:r>
+            <m:rPr>
+              <m:sty m:val="p"/>
+            </m:rPr>
+            <m:t>.</m:t>
+          </m:r>
+        </m:oMath>
+      </m:oMathPara>
+    </w:p>
+    <w:p>
+      <w:pPr>
+        <w:pStyle w:val="FirstParagraph"/>
+      </w:pPr>
+      <w:r>
+        <w:t xml:space="preserve">The event</w:t>
+      </w:r>
+      <w:r>
+        <w:t xml:space="preserve"> </w:t>
+      </w:r>
+      <m:oMath>
+        <m:r>
+          <m:t>​</m:t>
+        </m:r>
+        <m:d>
+          <m:dPr>
+            <m:begChr m:val="{"/>
+            <m:sepChr m:val=""/>
+            <m:endChr m:val="}"/>
+            <m:grow/>
+          </m:dPr>
+          <m:e>
+            <m:r>
+              <m:t>Y</m:t>
+            </m:r>
+            <m:r>
+              <m:rPr>
+                <m:sty m:val="p"/>
+              </m:rPr>
+              <m:t>=</m:t>
+            </m:r>
+            <m:r>
+              <m:t>y</m:t>
+            </m:r>
+            <m:r>
+              <m:rPr>
+                <m:sty m:val="p"/>
+              </m:rPr>
+              <m:t>,</m:t>
+            </m:r>
+            <m:r>
+              <m:t>X</m:t>
+            </m:r>
+            <m:r>
+              <m:rPr>
+                <m:sty m:val="p"/>
+              </m:rPr>
+              <m:t>=</m:t>
+            </m:r>
+            <m:r>
+              <m:t>x</m:t>
+            </m:r>
+          </m:e>
+        </m:d>
+        <m:r>
+          <m:t>​</m:t>
+        </m:r>
+      </m:oMath>
+      <w:r>
+        <w:t xml:space="preserve"> </w:t>
+      </w:r>
+      <w:r>
+        <w:t xml:space="preserve">is the event</w:t>
+      </w:r>
+      <w:r>
+        <w:t xml:space="preserve"> </w:t>
+      </w:r>
+      <m:oMath>
+        <m:r>
+          <m:t>​</m:t>
+        </m:r>
+        <m:d>
+          <m:dPr>
+            <m:begChr m:val="{"/>
+            <m:sepChr m:val=""/>
+            <m:endChr m:val="}"/>
+            <m:grow/>
+          </m:dPr>
+          <m:e>
+            <m:r>
+              <m:t>X</m:t>
+            </m:r>
+            <m:r>
+              <m:rPr>
+                <m:sty m:val="p"/>
+              </m:rPr>
+              <m:t>=</m:t>
+            </m:r>
+            <m:r>
+              <m:t>x</m:t>
+            </m:r>
+            <m:r>
+              <m:rPr>
+                <m:sty m:val="p"/>
+              </m:rPr>
+              <m:t>,</m:t>
+            </m:r>
+            <m:r>
+              <m:t>Y</m:t>
+            </m:r>
+            <m:r>
+              <m:rPr>
+                <m:sty m:val="p"/>
+              </m:rPr>
+              <m:t>=</m:t>
+            </m:r>
+            <m:r>
+              <m:t>y</m:t>
+            </m:r>
+          </m:e>
+        </m:d>
+        <m:r>
+          <m:t>​</m:t>
+        </m:r>
+      </m:oMath>
+      <w:r>
+        <w:t xml:space="preserve">, so each joint</w:t>
+      </w:r>
+      <w:r>
+        <w:t xml:space="preserve"> </w:t>
+      </w:r>
+      <w:hyperlink r:id="rId31">
+        <w:r>
+          <w:rPr>
+            <w:rStyle w:val="Hyperlink"/>
+          </w:rPr>
+          <w:t xml:space="preserve">probability</w:t>
+        </w:r>
+      </w:hyperlink>
+      <w:r>
+        <w:t xml:space="preserve"> </w:t>
+      </w:r>
+      <w:r>
+        <w:t xml:space="preserve">here equals the joint probability with its arguments in the other order.</w:t>
+      </w:r>
+      <w:r>
+        <w:t xml:space="preserve"> </w:t>
+      </w:r>
+      <w:r>
+        <w:t xml:space="preserve">The denominator is a product of two joint probabilities, and multiplication is commutative.</w:t>
+      </w:r>
+      <w:r>
+        <w:t xml:space="preserve"> </w:t>
+      </w:r>
+      <w:r>
+        <w:t xml:space="preserve">Reordering its two factors gives the denominator of</w:t>
+      </w:r>
+      <w:r>
+        <w:t xml:space="preserve"> </w:t>
+      </w:r>
+      <w:hyperlink w:anchor="thm-odds-ratio-cross-product">
+        <w:r>
+          <w:rPr>
+            <w:rStyle w:val="Hyperlink"/>
+          </w:rPr>
+          <w:t xml:space="preserve">Theorem 4</w:t>
+        </w:r>
+      </w:hyperlink>
+      <w:r>
+        <w:t xml:space="preserve"> </w:t>
+      </w:r>
+      <w:r>
+        <w:t xml:space="preserve">for</w:t>
+      </w:r>
+      <w:r>
+        <w:t xml:space="preserve"> </w:t>
+      </w:r>
+      <m:oMath>
+        <m:sSub>
+          <m:e>
+            <m:r>
+              <m:rPr>
+                <m:nor/>
+                <m:sty m:val="p"/>
+              </m:rPr>
+              <m:t>ϙ</m:t>
+            </m:r>
+          </m:e>
+          <m:sub>
+            <m:r>
+              <m:t>ω</m:t>
+            </m:r>
+          </m:sub>
+        </m:sSub>
+        <m:r>
+          <m:t>​</m:t>
+        </m:r>
+        <m:d>
+          <m:dPr>
+            <m:begChr m:val="("/>
+            <m:sepChr m:val=""/>
+            <m:endChr m:val=")"/>
+            <m:grow/>
+          </m:dPr>
+          <m:e>
+            <m:r>
+              <m:t>Y</m:t>
+            </m:r>
+            <m:r>
+              <m:rPr>
+                <m:sty m:val="p"/>
+              </m:rPr>
+              <m:t>∣</m:t>
+            </m:r>
+            <m:r>
+              <m:t>X</m:t>
+            </m:r>
+          </m:e>
+        </m:d>
+        <m:r>
+          <m:t>​</m:t>
+        </m:r>
+      </m:oMath>
+      <w:r>
+        <w:t xml:space="preserve">.</w:t>
+      </w:r>
+    </w:p>
+    <w:bookmarkStart w:id="59" w:name="exm-hers-odds-ratio-reversible"/>
+    <w:p>
+      <w:pPr>
+        <w:pStyle w:val="BodyText"/>
+      </w:pPr>
+      <w:r>
+        <w:rPr>
+          <w:b/>
+          <w:bCs/>
+        </w:rPr>
+        <w:t xml:space="preserve">Example 13 (Reversing the roles of treatment and exercise in HERS)</w:t>
+      </w:r>
+      <w:r>
+        <w:t xml:space="preserve"> </w:t>
+      </w:r>
+      <w:r>
+        <w:t xml:space="preserve">In</w:t>
+      </w:r>
+      <w:r>
+        <w:t xml:space="preserve"> </w:t>
+      </w:r>
+      <w:hyperlink w:anchor="exm-hers-odds-ratio-cross-product">
+        <w:r>
+          <w:rPr>
+            <w:rStyle w:val="Hyperlink"/>
+          </w:rPr>
+          <w:t xml:space="preserve">Example 12</w:t>
+        </w:r>
+      </w:hyperlink>
+      <w:r>
+        <w:t xml:space="preserve">, the</w:t>
+      </w:r>
+      <w:r>
+        <w:t xml:space="preserve"> </w:t>
+      </w:r>
+      <w:hyperlink w:anchor="def-odds-ratio">
+        <w:r>
+          <w:rPr>
+            <w:rStyle w:val="Hyperlink"/>
+          </w:rPr>
+          <w:t xml:space="preserve">odds ratio</w:t>
+        </w:r>
+      </w:hyperlink>
+      <w:r>
+        <w:t xml:space="preserve"> </w:t>
+      </w:r>
+      <w:r>
+        <w:t xml:space="preserve">compares the</w:t>
+      </w:r>
+      <w:r>
+        <w:t xml:space="preserve"> </w:t>
+      </w:r>
+      <w:hyperlink r:id="rId51">
+        <w:r>
+          <w:rPr>
+            <w:rStyle w:val="Hyperlink"/>
+          </w:rPr>
+          <w:t xml:space="preserve">odds</w:t>
+        </w:r>
+      </w:hyperlink>
+      <w:r>
+        <w:t xml:space="preserve"> </w:t>
+      </w:r>
+      <w:r>
+        <w:t xml:space="preserve">of regular exercise between the hormone therapy and placebo groups.</w:t>
+      </w:r>
+      <w:r>
+        <w:t xml:space="preserve"> </w:t>
+      </w:r>
+      <w:r>
+        <w:t xml:space="preserve">Reversing the roles compares the odds of hormone therapy between the women who exercise regularly and those who do not:</w:t>
+      </w:r>
+    </w:p>
+    <w:p>
+      <w:pPr>
+        <w:pStyle w:val="SourceCode"/>
+      </w:pPr>
+      <w:r>
+        <w:rPr>
+          <w:rStyle w:val="NormalTok"/>
+        </w:rPr>
+        <w:t xml:space="preserve">counts </w:t>
+      </w:r>
+      <w:r>
+        <w:rPr>
+          <w:rStyle w:val="OtherTok"/>
+        </w:rPr>
+        <w:t xml:space="preserve">&lt;-</w:t>
+      </w:r>
+      <w:r>
+        <w:rPr>
+          <w:rStyle w:val="NormalTok"/>
+        </w:rPr>
+        <w:t xml:space="preserve"> </w:t>
+      </w:r>
+      <w:r>
+        <w:rPr>
+          <w:rStyle w:val="FunctionTok"/>
+        </w:rPr>
+        <w:t xml:space="preserve">table</w:t>
+      </w:r>
+      <w:r>
+        <w:rPr>
+          <w:rStyle w:val="NormalTok"/>
+        </w:rPr>
+        <w:t xml:space="preserve">(</w:t>
+      </w:r>
+      <w:r>
+        <w:rPr>
+          <w:rStyle w:val="AttributeTok"/>
+        </w:rPr>
+        <w:t xml:space="preserve">HT =</w:t>
+      </w:r>
+      <w:r>
+        <w:rPr>
+          <w:rStyle w:val="NormalTok"/>
+        </w:rPr>
+        <w:t xml:space="preserve"> hers</w:t>
+      </w:r>
+      <w:r>
+        <w:rPr>
+          <w:rStyle w:val="SpecialCharTok"/>
+        </w:rPr>
+        <w:t xml:space="preserve">$</w:t>
+      </w:r>
+      <w:r>
+        <w:rPr>
+          <w:rStyle w:val="NormalTok"/>
+        </w:rPr>
+        <w:t xml:space="preserve">HT, </w:t>
+      </w:r>
+      <w:r>
+        <w:rPr>
+          <w:rStyle w:val="AttributeTok"/>
+        </w:rPr>
+        <w:t xml:space="preserve">exercise =</w:t>
+      </w:r>
+      <w:r>
+        <w:rPr>
+          <w:rStyle w:val="NormalTok"/>
+        </w:rPr>
+        <w:t xml:space="preserve"> hers</w:t>
+      </w:r>
+      <w:r>
+        <w:rPr>
+          <w:rStyle w:val="SpecialCharTok"/>
+        </w:rPr>
+        <w:t xml:space="preserve">$</w:t>
+      </w:r>
+      <w:r>
+        <w:rPr>
+          <w:rStyle w:val="NormalTok"/>
+        </w:rPr>
+        <w:t xml:space="preserve">exercise)</w:t>
+      </w:r>
+      <w:r>
+        <w:br/>
+      </w:r>
+      <w:r>
+        <w:rPr>
+          <w:rStyle w:val="NormalTok"/>
+        </w:rPr>
+        <w:t xml:space="preserve">odds_ht_exercise </w:t>
+      </w:r>
+      <w:r>
+        <w:rPr>
+          <w:rStyle w:val="OtherTok"/>
+        </w:rPr>
+        <w:t xml:space="preserve">&lt;-</w:t>
+      </w:r>
+      <w:r>
+        <w:rPr>
+          <w:rStyle w:val="NormalTok"/>
+        </w:rPr>
+        <w:t xml:space="preserve"> counts[</w:t>
+      </w:r>
+      <w:r>
+        <w:rPr>
+          <w:rStyle w:val="StringTok"/>
+        </w:rPr>
+        <w:t xml:space="preserve">"hormone therapy"</w:t>
+      </w:r>
+      <w:r>
+        <w:rPr>
+          <w:rStyle w:val="NormalTok"/>
+        </w:rPr>
+        <w:t xml:space="preserve">, </w:t>
+      </w:r>
+      <w:r>
+        <w:rPr>
+          <w:rStyle w:val="StringTok"/>
+        </w:rPr>
+        <w:t xml:space="preserve">"yes"</w:t>
+      </w:r>
+      <w:r>
+        <w:rPr>
+          <w:rStyle w:val="NormalTok"/>
+        </w:rPr>
+        <w:t xml:space="preserve">] </w:t>
+      </w:r>
+      <w:r>
+        <w:rPr>
+          <w:rStyle w:val="SpecialCharTok"/>
+        </w:rPr>
+        <w:t xml:space="preserve">/</w:t>
+      </w:r>
+      <w:r>
+        <w:rPr>
+          <w:rStyle w:val="NormalTok"/>
+        </w:rPr>
+        <w:t xml:space="preserve"> counts[</w:t>
+      </w:r>
+      <w:r>
+        <w:rPr>
+          <w:rStyle w:val="StringTok"/>
+        </w:rPr>
+        <w:t xml:space="preserve">"placebo"</w:t>
+      </w:r>
+      <w:r>
+        <w:rPr>
+          <w:rStyle w:val="NormalTok"/>
+        </w:rPr>
+        <w:t xml:space="preserve">, </w:t>
+      </w:r>
+      <w:r>
+        <w:rPr>
+          <w:rStyle w:val="StringTok"/>
+        </w:rPr>
+        <w:t xml:space="preserve">"yes"</w:t>
+      </w:r>
+      <w:r>
+        <w:rPr>
+          <w:rStyle w:val="NormalTok"/>
+        </w:rPr>
+        <w:t xml:space="preserve">]</w:t>
+      </w:r>
+      <w:r>
+        <w:br/>
+      </w:r>
+      <w:r>
+        <w:rPr>
+          <w:rStyle w:val="NormalTok"/>
+        </w:rPr>
+        <w:t xml:space="preserve">odds_ht_no_exercise </w:t>
+      </w:r>
+      <w:r>
+        <w:rPr>
+          <w:rStyle w:val="OtherTok"/>
+        </w:rPr>
+        <w:t xml:space="preserve">&lt;-</w:t>
+      </w:r>
+      <w:r>
+        <w:rPr>
+          <w:rStyle w:val="NormalTok"/>
+        </w:rPr>
+        <w:t xml:space="preserve"> counts[</w:t>
+      </w:r>
+      <w:r>
+        <w:rPr>
+          <w:rStyle w:val="StringTok"/>
+        </w:rPr>
+        <w:t xml:space="preserve">"hormone therapy"</w:t>
+      </w:r>
+      <w:r>
+        <w:rPr>
+          <w:rStyle w:val="NormalTok"/>
+        </w:rPr>
+        <w:t xml:space="preserve">, </w:t>
+      </w:r>
+      <w:r>
+        <w:rPr>
+          <w:rStyle w:val="StringTok"/>
+        </w:rPr>
+        <w:t xml:space="preserve">"no"</w:t>
+      </w:r>
+      <w:r>
+        <w:rPr>
+          <w:rStyle w:val="NormalTok"/>
+        </w:rPr>
+        <w:t xml:space="preserve">] </w:t>
+      </w:r>
+      <w:r>
+        <w:rPr>
+          <w:rStyle w:val="SpecialCharTok"/>
+        </w:rPr>
+        <w:t xml:space="preserve">/</w:t>
+      </w:r>
+      <w:r>
+        <w:rPr>
+          <w:rStyle w:val="NormalTok"/>
+        </w:rPr>
+        <w:t xml:space="preserve"> counts[</w:t>
+      </w:r>
+      <w:r>
+        <w:rPr>
+          <w:rStyle w:val="StringTok"/>
+        </w:rPr>
+        <w:t xml:space="preserve">"placebo"</w:t>
+      </w:r>
+      <w:r>
+        <w:rPr>
+          <w:rStyle w:val="NormalTok"/>
+        </w:rPr>
+        <w:t xml:space="preserve">, </w:t>
+      </w:r>
+      <w:r>
+        <w:rPr>
+          <w:rStyle w:val="StringTok"/>
+        </w:rPr>
+        <w:t xml:space="preserve">"no"</w:t>
+      </w:r>
+      <w:r>
+        <w:rPr>
+          <w:rStyle w:val="NormalTok"/>
+        </w:rPr>
+        <w:t xml:space="preserve">]</w:t>
+      </w:r>
+      <w:r>
+        <w:br/>
+      </w:r>
+      <w:r>
+        <w:rPr>
+          <w:rStyle w:val="NormalTok"/>
+        </w:rPr>
+        <w:t xml:space="preserve">or_reversed </w:t>
+      </w:r>
+      <w:r>
+        <w:rPr>
+          <w:rStyle w:val="OtherTok"/>
+        </w:rPr>
+        <w:t xml:space="preserve">&lt;-</w:t>
+      </w:r>
+      <w:r>
+        <w:rPr>
+          <w:rStyle w:val="NormalTok"/>
+        </w:rPr>
+        <w:t xml:space="preserve"> odds_ht_exercise </w:t>
+      </w:r>
+      <w:r>
+        <w:rPr>
+          <w:rStyle w:val="SpecialCharTok"/>
+        </w:rPr>
+        <w:t xml:space="preserve">/</w:t>
+      </w:r>
+      <w:r>
+        <w:rPr>
+          <w:rStyle w:val="NormalTok"/>
+        </w:rPr>
+        <w:t xml:space="preserve"> odds_ht_no_exercise</w:t>
+      </w:r>
+      <w:r>
+        <w:br/>
+      </w:r>
+      <w:r>
+        <w:rPr>
+          <w:rStyle w:val="NormalTok"/>
+        </w:rPr>
+        <w:t xml:space="preserve">or_reversed</w:t>
+      </w:r>
+      <w:r>
+        <w:br/>
+      </w:r>
+      <w:r>
+        <w:rPr>
+          <w:rStyle w:val="CommentTok"/>
+        </w:rPr>
+        <w:t xml:space="preserve">#&gt; [1] 1.02836</w:t>
+      </w:r>
+    </w:p>
+    <w:p>
+      <w:pPr>
+        <w:pStyle w:val="FirstParagraph"/>
+      </w:pPr>
+      <w:r>
+        <w:t xml:space="preserve">The reversed odds ratio is 1.028.</w:t>
+      </w:r>
+      <w:r>
+        <w:t xml:space="preserve"> </w:t>
+      </w:r>
+      <w:r>
+        <w:t xml:space="preserve">It equals the odds ratio 1.028 of</w:t>
+      </w:r>
+      <w:r>
+        <w:t xml:space="preserve"> </w:t>
+      </w:r>
+      <w:hyperlink w:anchor="exm-hers-odds-ratio">
+        <w:r>
+          <w:rPr>
+            <w:rStyle w:val="Hyperlink"/>
+          </w:rPr>
+          <w:t xml:space="preserve">Example 11</w:t>
+        </w:r>
+      </w:hyperlink>
+      <w:r>
+        <w:t xml:space="preserve">, as</w:t>
+      </w:r>
+      <w:r>
+        <w:t xml:space="preserve"> </w:t>
+      </w:r>
+      <w:hyperlink w:anchor="thm-odds-ratio-reversible">
+        <w:r>
+          <w:rPr>
+            <w:rStyle w:val="Hyperlink"/>
+          </w:rPr>
+          <w:t xml:space="preserve">Theorem 5</w:t>
+        </w:r>
+      </w:hyperlink>
+      <w:r>
+        <w:t xml:space="preserve"> </w:t>
+      </w:r>
+      <w:r>
+        <w:t xml:space="preserve">states.</w:t>
+      </w:r>
+    </w:p>
+    <w:bookmarkEnd w:id="59"/>
+    <w:p>
+      <w:pPr>
+        <w:pStyle w:val="BodyText"/>
+      </w:pPr>
+      <w:r>
+        <w:t xml:space="preserve">Rice [5, Sec. 13.6], pp. 526–529</w:t>
+      </w:r>
+      <w:r>
+        <w:t xml:space="preserve"> </w:t>
+      </w:r>
+      <w:r>
+        <w:t xml:space="preserve">covers odds ratios.</w:t>
+      </w:r>
+    </w:p>
+    <w:bookmarkEnd w:id="60"/>
+    <w:bookmarkEnd w:id="61"/>
+    <w:bookmarkStart w:id="79" w:name="references"/>
+    <w:p>
+      <w:pPr>
+        <w:pStyle w:val="Heading2"/>
+      </w:pPr>
+      <w:r>
+        <w:t xml:space="preserve">References</w:t>
+      </w:r>
+    </w:p>
+    <w:bookmarkStart w:id="78" w:name="refs"/>
+    <w:bookmarkStart w:id="63" w:name="ref-vittinghoff2e"/>
+    <w:p>
+      <w:pPr>
+        <w:pStyle w:val="Bibliography"/>
+      </w:pPr>
+      <w:r>
+        <w:t xml:space="preserve">[1]</w:t>
+      </w:r>
+      <w:r>
+        <w:t xml:space="preserve"> </w:t>
+      </w:r>
+      <w:r>
+        <w:t xml:space="preserve">	</w:t>
+      </w:r>
+      <w:r>
+        <w:t xml:space="preserve">E. Vittinghoff, D. V. Glidden, S. C. Shiboski, and C. E. McCulloch,</w:t>
+      </w:r>
+      <w:r>
+        <w:t xml:space="preserve"> </w:t>
+      </w:r>
+      <w:r>
+        <w:rPr>
+          <w:i/>
+          <w:iCs/>
+        </w:rPr>
         <w:t xml:space="preserve">Regression methods in biostatistics: Linear, logistic, survival, and repeated measures models</w:t>
       </w:r>
       <w:r>
@@ -9649,7 +13729,7 @@
       <w:r>
         <w:t xml:space="preserve"> </w:t>
       </w:r>
-      <w:hyperlink r:id="rId56">
+      <w:hyperlink r:id="rId62">
         <w:r>
           <w:rPr>
             <w:rStyle w:val="Hyperlink"/>
@@ -9661,8 +13741,8 @@
         <w:t xml:space="preserve">.</w:t>
       </w:r>
     </w:p>
-    <w:bookmarkEnd w:id="57"/>
-    <w:bookmarkStart w:id="58" w:name="ref-hoggtanis2015"/>
+    <w:bookmarkEnd w:id="63"/>
+    <w:bookmarkStart w:id="64" w:name="ref-hoggtanis2015"/>
     <w:p>
       <w:pPr>
         <w:pStyle w:val="Bibliography"/>
@@ -9693,8 +13773,8 @@
         <w:t xml:space="preserve">, Tenth edition. Boston: Pearson, 2019.</w:t>
       </w:r>
     </w:p>
-    <w:bookmarkEnd w:id="58"/>
-    <w:bookmarkStart w:id="60" w:name="ref-wikipedia_contingency_table"/>
+    <w:bookmarkEnd w:id="64"/>
+    <w:bookmarkStart w:id="66" w:name="ref-wikipedia_contingency_table"/>
     <w:p>
       <w:pPr>
         <w:pStyle w:val="Bibliography"/>
@@ -9741,7 +13821,7 @@
       <w:r>
         <w:t xml:space="preserve"> </w:t>
       </w:r>
-      <w:hyperlink r:id="rId59">
+      <w:hyperlink r:id="rId65">
         <w:r>
           <w:rPr>
             <w:rStyle w:val="Hyperlink"/>
@@ -9750,8 +13830,8 @@
         </w:r>
       </w:hyperlink>
     </w:p>
-    <w:bookmarkEnd w:id="60"/>
-    <w:bookmarkStart w:id="62" w:name="ref-wikipedia_pearsons_chi_squared_test"/>
+    <w:bookmarkEnd w:id="66"/>
+    <w:bookmarkStart w:id="68" w:name="ref-wikipedia_pearsons_chi_squared_test"/>
     <w:p>
       <w:pPr>
         <w:pStyle w:val="Bibliography"/>
@@ -9798,7 +13878,7 @@
       <w:r>
         <w:t xml:space="preserve"> </w:t>
       </w:r>
-      <w:hyperlink r:id="rId61">
+      <w:hyperlink r:id="rId67">
         <w:r>
           <w:rPr>
             <w:rStyle w:val="Hyperlink"/>
@@ -9807,8 +13887,8 @@
         </w:r>
       </w:hyperlink>
     </w:p>
-    <w:bookmarkEnd w:id="62"/>
-    <w:bookmarkStart w:id="63" w:name="ref-rice2007mathematical"/>
+    <w:bookmarkEnd w:id="68"/>
+    <w:bookmarkStart w:id="69" w:name="ref-rice2007mathematical"/>
     <w:p>
       <w:pPr>
         <w:pStyle w:val="Bibliography"/>
@@ -9839,8 +13919,8 @@
         <w:t xml:space="preserve">, 3rd ed. Belmont, CA: Cengage Learning, 2007.</w:t>
       </w:r>
     </w:p>
-    <w:bookmarkEnd w:id="63"/>
-    <w:bookmarkStart w:id="65" w:name="ref-wikipedia_fishers_exact_test"/>
+    <w:bookmarkEnd w:id="69"/>
+    <w:bookmarkStart w:id="71" w:name="ref-wikipedia_fishers_exact_test"/>
     <w:p>
       <w:pPr>
         <w:pStyle w:val="Bibliography"/>
@@ -9887,7 +13967,7 @@
       <w:r>
         <w:t xml:space="preserve"> </w:t>
       </w:r>
-      <w:hyperlink r:id="rId64">
+      <w:hyperlink r:id="rId70">
         <w:r>
           <w:rPr>
             <w:rStyle w:val="Hyperlink"/>
@@ -9896,8 +13976,8 @@
         </w:r>
       </w:hyperlink>
     </w:p>
-    <w:bookmarkEnd w:id="65"/>
-    <w:bookmarkStart w:id="67" w:name="ref-wikipedia_relative_risk"/>
+    <w:bookmarkEnd w:id="71"/>
+    <w:bookmarkStart w:id="73" w:name="ref-wikipedia_relative_risk"/>
     <w:p>
       <w:pPr>
         <w:pStyle w:val="Bibliography"/>
@@ -9944,7 +14024,7 @@
       <w:r>
         <w:t xml:space="preserve"> </w:t>
       </w:r>
-      <w:hyperlink r:id="rId66">
+      <w:hyperlink r:id="rId72">
         <w:r>
           <w:rPr>
             <w:rStyle w:val="Hyperlink"/>
@@ -9953,8 +14033,8 @@
         </w:r>
       </w:hyperlink>
     </w:p>
-    <w:bookmarkEnd w:id="67"/>
-    <w:bookmarkStart w:id="69" w:name="ref-wikipedia_absolute_risk_reduction"/>
+    <w:bookmarkEnd w:id="73"/>
+    <w:bookmarkStart w:id="75" w:name="ref-wikipedia_absolute_risk_reduction"/>
     <w:p>
       <w:pPr>
         <w:pStyle w:val="Bibliography"/>
@@ -10001,7 +14081,7 @@
       <w:r>
         <w:t xml:space="preserve"> </w:t>
       </w:r>
-      <w:hyperlink r:id="rId68">
+      <w:hyperlink r:id="rId74">
         <w:r>
           <w:rPr>
             <w:rStyle w:val="Hyperlink"/>
@@ -10010,8 +14090,8 @@
         </w:r>
       </w:hyperlink>
     </w:p>
-    <w:bookmarkEnd w:id="69"/>
-    <w:bookmarkStart w:id="71" w:name="ref-wikipedia_odds_ratio"/>
+    <w:bookmarkEnd w:id="75"/>
+    <w:bookmarkStart w:id="77" w:name="ref-wikipedia_odds_ratio"/>
     <w:p>
       <w:pPr>
         <w:pStyle w:val="Bibliography"/>
@@ -10058,7 +14138,7 @@
       <w:r>
         <w:t xml:space="preserve"> </w:t>
       </w:r>
-      <w:hyperlink r:id="rId70">
+      <w:hyperlink r:id="rId76">
         <w:r>
           <w:rPr>
             <w:rStyle w:val="Hyperlink"/>
@@ -10067,9 +14147,9 @@
         </w:r>
       </w:hyperlink>
     </w:p>
-    <w:bookmarkEnd w:id="71"/>
-    <w:bookmarkEnd w:id="72"/>
-    <w:bookmarkEnd w:id="73"/>
+    <w:bookmarkEnd w:id="77"/>
+    <w:bookmarkEnd w:id="78"/>
+    <w:bookmarkEnd w:id="79"/>
     <w:sectPr>
       <w:footnotePr>
         <w:numRestart w:val="eachSect"/>
@@ -10311,6 +14391,15 @@
     <w:abstractNumId w:val="991"/>
   </w:num>
   <w:num w:numId="1009">
+    <w:abstractNumId w:val="991"/>
+  </w:num>
+  <w:num w:numId="1010">
+    <w:abstractNumId w:val="991"/>
+  </w:num>
+  <w:num w:numId="1011">
+    <w:abstractNumId w:val="991"/>
+  </w:num>
+  <w:num w:numId="1012">
     <w:abstractNumId w:val="991"/>
   </w:num>
 </w:numbering>

</xml_diff>

<commit_message>
Deploying to gh-pages from @ Morrison-Lab/sds@cfb83fcd943049cec6f7841dabbe9d0a4c86cf0f 🚀
</commit_message>
<xml_diff>
--- a/categorical-tests-handout.docx
+++ b/categorical-tests-handout.docx
@@ -15,7 +15,7 @@
         <w:pStyle w:val="Date"/>
       </w:pPr>
       <w:r>
-        <w:t xml:space="preserve">Last modified: 2026-10-19 13:28:02 (PDT)</w:t>
+        <w:t xml:space="preserve">Last modified: 2026-10-19 13:38:50 (PDT)</w:t>
       </w:r>
     </w:p>
     <w:p>
@@ -386,7 +386,7 @@
       </w:r>
     </w:p>
     <w:bookmarkEnd w:id="11"/>
-    <w:bookmarkStart w:id="61" w:name="sec-two-group-categorical"/>
+    <w:bookmarkStart w:id="62" w:name="sec-two-group-categorical"/>
     <w:p>
       <w:pPr>
         <w:pStyle w:val="Heading2"/>
@@ -5006,7 +5006,7 @@
       </w:r>
     </w:p>
     <w:bookmarkEnd w:id="29"/>
-    <w:bookmarkStart w:id="60" w:name="sec-2x2-measures"/>
+    <w:bookmarkStart w:id="61" w:name="sec-2x2-measures"/>
     <w:p>
       <w:pPr>
         <w:pStyle w:val="Heading3"/>
@@ -5116,7 +5116,7 @@
           <w:b/>
           <w:bCs/>
         </w:rPr>
-        <w:t xml:space="preserve">Definition 4 (Risk of a binary outcome)</w:t>
+        <w:t xml:space="preserve">Definition 4 (Risk of a binary outcome (also called the incidence proportion or cumulative incidence))</w:t>
       </w:r>
       <w:r>
         <w:t xml:space="preserve"> </w:t>
@@ -5179,6 +5179,47 @@
       </w:r>
       <w:r>
         <w:t xml:space="preserve">that a member of the group has the outcome.</w:t>
+      </w:r>
+      <w:r>
+        <w:t xml:space="preserve"> </w:t>
+      </w:r>
+      <w:r>
+        <w:t xml:space="preserve">When the outcome is an event, the risk is for a specified time period.</w:t>
+      </w:r>
+      <w:r>
+        <w:t xml:space="preserve"> </w:t>
+      </w:r>
+      <w:r>
+        <w:t xml:space="preserve">The risk is also called the</w:t>
+      </w:r>
+      <w:r>
+        <w:t xml:space="preserve"> </w:t>
+      </w:r>
+      <w:r>
+        <w:rPr>
+          <w:b/>
+          <w:bCs/>
+        </w:rPr>
+        <w:t xml:space="preserve">incidence proportion</w:t>
+      </w:r>
+      <w:r>
+        <w:t xml:space="preserve"> </w:t>
+      </w:r>
+      <w:r>
+        <w:t xml:space="preserve">or</w:t>
+      </w:r>
+      <w:r>
+        <w:t xml:space="preserve"> </w:t>
+      </w:r>
+      <w:r>
+        <w:rPr>
+          <w:b/>
+          <w:bCs/>
+        </w:rPr>
+        <w:t xml:space="preserve">cumulative incidence</w:t>
+      </w:r>
+      <w:r>
+        <w:t xml:space="preserve">.</w:t>
       </w:r>
     </w:p>
     <w:p>
@@ -7099,7 +7140,7 @@
           <w:b/>
           <w:bCs/>
         </w:rPr>
-        <w:t xml:space="preserve">Definition 7 (Risk ratio (also called the relative risk))</w:t>
+        <w:t xml:space="preserve">Definition 7 (Risk ratio (also called the relative risk, relative risk ratio or probability ratio))</w:t>
       </w:r>
       <w:r>
         <w:t xml:space="preserve"> </w:t>
@@ -7252,6 +7293,35 @@
           <w:bCs/>
         </w:rPr>
         <w:t xml:space="preserve">relative risk</w:t>
+      </w:r>
+      <w:r>
+        <w:t xml:space="preserve">,</w:t>
+      </w:r>
+      <w:r>
+        <w:t xml:space="preserve"> </w:t>
+      </w:r>
+      <w:r>
+        <w:rPr>
+          <w:b/>
+          <w:bCs/>
+        </w:rPr>
+        <w:t xml:space="preserve">relative risk ratio</w:t>
+      </w:r>
+      <w:r>
+        <w:t xml:space="preserve"> </w:t>
+      </w:r>
+      <w:r>
+        <w:t xml:space="preserve">or</w:t>
+      </w:r>
+      <w:r>
+        <w:t xml:space="preserve"> </w:t>
+      </w:r>
+      <w:r>
+        <w:rPr>
+          <w:b/>
+          <w:bCs/>
+        </w:rPr>
+        <w:t xml:space="preserve">probability ratio</w:t>
       </w:r>
       <w:r>
         <w:t xml:space="preserve">, of group 1 compared with group 2 is</w:t>
@@ -7665,7 +7735,53 @@
       </w:r>
     </w:p>
     <w:bookmarkEnd w:id="46"/>
-    <w:bookmarkStart w:id="47" w:name="exr-risk-ratio-switch-ref"/>
+    <w:bookmarkStart w:id="47" w:name="rem-risk-ratio-rate-ratio"/>
+    <w:p>
+      <w:pPr>
+        <w:pStyle w:val="BodyText"/>
+      </w:pPr>
+      <w:r>
+        <w:rPr>
+          <w:i/>
+          <w:iCs/>
+        </w:rPr>
+        <w:t xml:space="preserve">Remark 4</w:t>
+      </w:r>
+      <w:r>
+        <w:t xml:space="preserve"> (The risk ratio is not the rate ratio). </w:t>
+      </w:r>
+      <w:r>
+        <w:t xml:space="preserve">Some texts call the</w:t>
+      </w:r>
+      <w:r>
+        <w:t xml:space="preserve"> </w:t>
+      </w:r>
+      <w:hyperlink w:anchor="def-risk-ratio">
+        <w:r>
+          <w:rPr>
+            <w:rStyle w:val="Hyperlink"/>
+          </w:rPr>
+          <w:t xml:space="preserve">risk ratio</w:t>
+        </w:r>
+      </w:hyperlink>
+      <w:r>
+        <w:t xml:space="preserve"> </w:t>
+      </w:r>
+      <w:r>
+        <w:t xml:space="preserve">the rate ratio.</w:t>
+      </w:r>
+      <w:r>
+        <w:t xml:space="preserve"> </w:t>
+      </w:r>
+      <w:r>
+        <w:t xml:space="preserve"> </w:t>
+      </w:r>
+      <w:r>
+        <w:t xml:space="preserve">The rate ratio is a different quantity: the quotient of two event rates, as in count regression.</w:t>
+      </w:r>
+    </w:p>
+    <w:bookmarkEnd w:id="47"/>
+    <w:bookmarkStart w:id="48" w:name="exr-risk-ratio-switch-ref"/>
     <w:p>
       <w:pPr>
         <w:pStyle w:val="BodyText"/>
@@ -7987,8 +8103,8 @@
         <w:t xml:space="preserve">.</w:t>
       </w:r>
     </w:p>
-    <w:bookmarkEnd w:id="47"/>
-    <w:bookmarkStart w:id="48" w:name="sol-risk-ratio-switch-ref"/>
+    <w:bookmarkEnd w:id="48"/>
+    <w:bookmarkStart w:id="49" w:name="sol-risk-ratio-switch-ref"/>
     <w:p>
       <w:pPr>
         <w:pStyle w:val="BodyText"/>
@@ -8192,8 +8308,8 @@
         </m:oMath>
       </m:oMathPara>
     </w:p>
-    <w:bookmarkEnd w:id="48"/>
-    <w:bookmarkStart w:id="49" w:name="thm-risk-ratio-switch-ref"/>
+    <w:bookmarkEnd w:id="49"/>
+    <w:bookmarkStart w:id="50" w:name="thm-risk-ratio-switch-ref"/>
     <w:p>
       <w:pPr>
         <w:pStyle w:val="FirstParagraph"/>
@@ -8576,7 +8692,7 @@
         </m:oMath>
       </m:oMathPara>
     </w:p>
-    <w:bookmarkEnd w:id="49"/>
+    <w:bookmarkEnd w:id="50"/>
     <w:p>
       <w:pPr>
         <w:pStyle w:val="FirstParagraph"/>
@@ -8609,7 +8725,7 @@
         <w:t xml:space="preserve">.</w:t>
       </w:r>
     </w:p>
-    <w:bookmarkStart w:id="50" w:name="exm-hers-risk-ratio-switch-ref"/>
+    <w:bookmarkStart w:id="51" w:name="exm-hers-risk-ratio-switch-ref"/>
     <w:p>
       <w:pPr>
         <w:pStyle w:val="BodyText"/>
@@ -8798,8 +8914,8 @@
         <w:t xml:space="preserve">states.</w:t>
       </w:r>
     </w:p>
-    <w:bookmarkEnd w:id="50"/>
-    <w:bookmarkStart w:id="52" w:name="def-odds-ratio"/>
+    <w:bookmarkEnd w:id="51"/>
+    <w:bookmarkStart w:id="53" w:name="def-odds-ratio"/>
     <w:p>
       <w:pPr>
         <w:pStyle w:val="BodyText"/>
@@ -8849,7 +8965,7 @@
       <w:r>
         <w:t xml:space="preserve"> </w:t>
       </w:r>
-      <w:hyperlink r:id="rId51">
+      <w:hyperlink r:id="rId52">
         <w:r>
           <w:rPr>
             <w:rStyle w:val="Hyperlink"/>
@@ -9217,8 +9333,8 @@
         <w:t xml:space="preserve">.</w:t>
       </w:r>
     </w:p>
-    <w:bookmarkEnd w:id="52"/>
-    <w:bookmarkStart w:id="53" w:name="exm-hers-odds-ratio"/>
+    <w:bookmarkEnd w:id="53"/>
+    <w:bookmarkStart w:id="54" w:name="exm-hers-odds-ratio"/>
     <w:p>
       <w:pPr>
         <w:pStyle w:val="BodyText"/>
@@ -9259,7 +9375,7 @@
       <w:r>
         <w:t xml:space="preserve"> </w:t>
       </w:r>
-      <w:hyperlink r:id="rId51">
+      <w:hyperlink r:id="rId52">
         <w:r>
           <w:rPr>
             <w:rStyle w:val="Hyperlink"/>
@@ -9589,8 +9705,8 @@
         <w:t xml:space="preserve">.</w:t>
       </w:r>
     </w:p>
-    <w:bookmarkEnd w:id="53"/>
-    <w:bookmarkStart w:id="54" w:name="exr-odds-from-joint-probs"/>
+    <w:bookmarkEnd w:id="54"/>
+    <w:bookmarkStart w:id="55" w:name="exr-odds-from-joint-probs"/>
     <w:p>
       <w:pPr>
         <w:pStyle w:val="BodyText"/>
@@ -9827,7 +9943,7 @@
       <w:r>
         <w:t xml:space="preserve"> </w:t>
       </w:r>
-      <w:hyperlink r:id="rId51">
+      <w:hyperlink r:id="rId52">
         <w:r>
           <w:rPr>
             <w:rStyle w:val="Hyperlink"/>
@@ -10011,8 +10127,8 @@
         <w:t xml:space="preserve">.</w:t>
       </w:r>
     </w:p>
-    <w:bookmarkEnd w:id="54"/>
-    <w:bookmarkStart w:id="55" w:name="sol-odds-from-joint-probs"/>
+    <w:bookmarkEnd w:id="55"/>
+    <w:bookmarkStart w:id="56" w:name="sol-odds-from-joint-probs"/>
     <w:p>
       <w:pPr>
         <w:pStyle w:val="BodyText"/>
@@ -10733,8 +10849,8 @@
         </m:oMath>
       </m:oMathPara>
     </w:p>
-    <w:bookmarkEnd w:id="55"/>
-    <w:bookmarkStart w:id="56" w:name="thm-odds-ratio-cross-product"/>
+    <w:bookmarkEnd w:id="56"/>
+    <w:bookmarkStart w:id="57" w:name="thm-odds-ratio-cross-product"/>
     <w:p>
       <w:pPr>
         <w:pStyle w:val="FirstParagraph"/>
@@ -11351,7 +11467,7 @@
         </m:oMath>
       </m:oMathPara>
     </w:p>
-    <w:bookmarkEnd w:id="56"/>
+    <w:bookmarkEnd w:id="57"/>
     <w:p>
       <w:pPr>
         <w:pStyle w:val="FirstParagraph"/>
@@ -11386,7 +11502,7 @@
       <w:r>
         <w:t xml:space="preserve"> </w:t>
       </w:r>
-      <w:hyperlink r:id="rId51">
+      <w:hyperlink r:id="rId52">
         <w:r>
           <w:rPr>
             <w:rStyle w:val="Hyperlink"/>
@@ -11764,7 +11880,7 @@
         <w:t xml:space="preserve">Dividing by a fraction is multiplying by its reciprocal, which gives the stated product of the four joint probabilities.</w:t>
       </w:r>
     </w:p>
-    <w:bookmarkStart w:id="57" w:name="exm-hers-odds-ratio-cross-product"/>
+    <w:bookmarkStart w:id="58" w:name="exm-hers-odds-ratio-cross-product"/>
     <w:p>
       <w:pPr>
         <w:pStyle w:val="BodyText"/>
@@ -12192,8 +12308,8 @@
         <w:t xml:space="preserve">states.</w:t>
       </w:r>
     </w:p>
-    <w:bookmarkEnd w:id="57"/>
-    <w:bookmarkStart w:id="58" w:name="thm-odds-ratio-reversible"/>
+    <w:bookmarkEnd w:id="58"/>
+    <w:bookmarkStart w:id="59" w:name="thm-odds-ratio-reversible"/>
     <w:p>
       <w:pPr>
         <w:pStyle w:val="BodyText"/>
@@ -12692,7 +12808,7 @@
         </m:oMath>
       </m:oMathPara>
     </w:p>
-    <w:bookmarkEnd w:id="58"/>
+    <w:bookmarkEnd w:id="59"/>
     <w:p>
       <w:pPr>
         <w:pStyle w:val="FirstParagraph"/>
@@ -13255,7 +13371,7 @@
         <w:t xml:space="preserve">.</w:t>
       </w:r>
     </w:p>
-    <w:bookmarkStart w:id="59" w:name="exm-hers-odds-ratio-reversible"/>
+    <w:bookmarkStart w:id="60" w:name="exm-hers-odds-ratio-reversible"/>
     <w:p>
       <w:pPr>
         <w:pStyle w:val="BodyText"/>
@@ -13307,7 +13423,7 @@
       <w:r>
         <w:t xml:space="preserve"> </w:t>
       </w:r>
-      <w:hyperlink r:id="rId51">
+      <w:hyperlink r:id="rId52">
         <w:r>
           <w:rPr>
             <w:rStyle w:val="Hyperlink"/>
@@ -13669,7 +13785,7 @@
         <w:t xml:space="preserve">states.</w:t>
       </w:r>
     </w:p>
-    <w:bookmarkEnd w:id="59"/>
+    <w:bookmarkEnd w:id="60"/>
     <w:p>
       <w:pPr>
         <w:pStyle w:val="BodyText"/>
@@ -13684,9 +13800,9 @@
         <w:t xml:space="preserve">covers odds ratios.</w:t>
       </w:r>
     </w:p>
-    <w:bookmarkEnd w:id="60"/>
     <w:bookmarkEnd w:id="61"/>
-    <w:bookmarkStart w:id="79" w:name="references"/>
+    <w:bookmarkEnd w:id="62"/>
+    <w:bookmarkStart w:id="80" w:name="references"/>
     <w:p>
       <w:pPr>
         <w:pStyle w:val="Heading2"/>
@@ -13695,8 +13811,8 @@
         <w:t xml:space="preserve">References</w:t>
       </w:r>
     </w:p>
-    <w:bookmarkStart w:id="78" w:name="refs"/>
-    <w:bookmarkStart w:id="63" w:name="ref-vittinghoff2e"/>
+    <w:bookmarkStart w:id="79" w:name="refs"/>
+    <w:bookmarkStart w:id="64" w:name="ref-vittinghoff2e"/>
     <w:p>
       <w:pPr>
         <w:pStyle w:val="Bibliography"/>
@@ -13729,7 +13845,7 @@
       <w:r>
         <w:t xml:space="preserve"> </w:t>
       </w:r>
-      <w:hyperlink r:id="rId62">
+      <w:hyperlink r:id="rId63">
         <w:r>
           <w:rPr>
             <w:rStyle w:val="Hyperlink"/>
@@ -13741,8 +13857,8 @@
         <w:t xml:space="preserve">.</w:t>
       </w:r>
     </w:p>
-    <w:bookmarkEnd w:id="63"/>
-    <w:bookmarkStart w:id="64" w:name="ref-hoggtanis2015"/>
+    <w:bookmarkEnd w:id="64"/>
+    <w:bookmarkStart w:id="65" w:name="ref-hoggtanis2015"/>
     <w:p>
       <w:pPr>
         <w:pStyle w:val="Bibliography"/>
@@ -13773,8 +13889,8 @@
         <w:t xml:space="preserve">, Tenth edition. Boston: Pearson, 2019.</w:t>
       </w:r>
     </w:p>
-    <w:bookmarkEnd w:id="64"/>
-    <w:bookmarkStart w:id="66" w:name="ref-wikipedia_contingency_table"/>
+    <w:bookmarkEnd w:id="65"/>
+    <w:bookmarkStart w:id="67" w:name="ref-wikipedia_contingency_table"/>
     <w:p>
       <w:pPr>
         <w:pStyle w:val="Bibliography"/>
@@ -13821,7 +13937,7 @@
       <w:r>
         <w:t xml:space="preserve"> </w:t>
       </w:r>
-      <w:hyperlink r:id="rId65">
+      <w:hyperlink r:id="rId66">
         <w:r>
           <w:rPr>
             <w:rStyle w:val="Hyperlink"/>
@@ -13830,8 +13946,8 @@
         </w:r>
       </w:hyperlink>
     </w:p>
-    <w:bookmarkEnd w:id="66"/>
-    <w:bookmarkStart w:id="68" w:name="ref-wikipedia_pearsons_chi_squared_test"/>
+    <w:bookmarkEnd w:id="67"/>
+    <w:bookmarkStart w:id="69" w:name="ref-wikipedia_pearsons_chi_squared_test"/>
     <w:p>
       <w:pPr>
         <w:pStyle w:val="Bibliography"/>
@@ -13878,7 +13994,7 @@
       <w:r>
         <w:t xml:space="preserve"> </w:t>
       </w:r>
-      <w:hyperlink r:id="rId67">
+      <w:hyperlink r:id="rId68">
         <w:r>
           <w:rPr>
             <w:rStyle w:val="Hyperlink"/>
@@ -13887,8 +14003,8 @@
         </w:r>
       </w:hyperlink>
     </w:p>
-    <w:bookmarkEnd w:id="68"/>
-    <w:bookmarkStart w:id="69" w:name="ref-rice2007mathematical"/>
+    <w:bookmarkEnd w:id="69"/>
+    <w:bookmarkStart w:id="70" w:name="ref-rice2007mathematical"/>
     <w:p>
       <w:pPr>
         <w:pStyle w:val="Bibliography"/>
@@ -13919,8 +14035,8 @@
         <w:t xml:space="preserve">, 3rd ed. Belmont, CA: Cengage Learning, 2007.</w:t>
       </w:r>
     </w:p>
-    <w:bookmarkEnd w:id="69"/>
-    <w:bookmarkStart w:id="71" w:name="ref-wikipedia_fishers_exact_test"/>
+    <w:bookmarkEnd w:id="70"/>
+    <w:bookmarkStart w:id="72" w:name="ref-wikipedia_fishers_exact_test"/>
     <w:p>
       <w:pPr>
         <w:pStyle w:val="Bibliography"/>
@@ -13967,7 +14083,7 @@
       <w:r>
         <w:t xml:space="preserve"> </w:t>
       </w:r>
-      <w:hyperlink r:id="rId70">
+      <w:hyperlink r:id="rId71">
         <w:r>
           <w:rPr>
             <w:rStyle w:val="Hyperlink"/>
@@ -13976,8 +14092,8 @@
         </w:r>
       </w:hyperlink>
     </w:p>
-    <w:bookmarkEnd w:id="71"/>
-    <w:bookmarkStart w:id="73" w:name="ref-wikipedia_relative_risk"/>
+    <w:bookmarkEnd w:id="72"/>
+    <w:bookmarkStart w:id="74" w:name="ref-wikipedia_relative_risk"/>
     <w:p>
       <w:pPr>
         <w:pStyle w:val="Bibliography"/>
@@ -14024,7 +14140,7 @@
       <w:r>
         <w:t xml:space="preserve"> </w:t>
       </w:r>
-      <w:hyperlink r:id="rId72">
+      <w:hyperlink r:id="rId73">
         <w:r>
           <w:rPr>
             <w:rStyle w:val="Hyperlink"/>
@@ -14033,8 +14149,8 @@
         </w:r>
       </w:hyperlink>
     </w:p>
-    <w:bookmarkEnd w:id="73"/>
-    <w:bookmarkStart w:id="75" w:name="ref-wikipedia_absolute_risk_reduction"/>
+    <w:bookmarkEnd w:id="74"/>
+    <w:bookmarkStart w:id="76" w:name="ref-wikipedia_absolute_risk_reduction"/>
     <w:p>
       <w:pPr>
         <w:pStyle w:val="Bibliography"/>
@@ -14081,7 +14197,7 @@
       <w:r>
         <w:t xml:space="preserve"> </w:t>
       </w:r>
-      <w:hyperlink r:id="rId74">
+      <w:hyperlink r:id="rId75">
         <w:r>
           <w:rPr>
             <w:rStyle w:val="Hyperlink"/>
@@ -14090,8 +14206,8 @@
         </w:r>
       </w:hyperlink>
     </w:p>
-    <w:bookmarkEnd w:id="75"/>
-    <w:bookmarkStart w:id="77" w:name="ref-wikipedia_odds_ratio"/>
+    <w:bookmarkEnd w:id="76"/>
+    <w:bookmarkStart w:id="78" w:name="ref-wikipedia_odds_ratio"/>
     <w:p>
       <w:pPr>
         <w:pStyle w:val="Bibliography"/>
@@ -14138,7 +14254,7 @@
       <w:r>
         <w:t xml:space="preserve"> </w:t>
       </w:r>
-      <w:hyperlink r:id="rId76">
+      <w:hyperlink r:id="rId77">
         <w:r>
           <w:rPr>
             <w:rStyle w:val="Hyperlink"/>
@@ -14147,9 +14263,9 @@
         </w:r>
       </w:hyperlink>
     </w:p>
-    <w:bookmarkEnd w:id="77"/>
     <w:bookmarkEnd w:id="78"/>
     <w:bookmarkEnd w:id="79"/>
+    <w:bookmarkEnd w:id="80"/>
     <w:sectPr>
       <w:footnotePr>
         <w:numRestart w:val="eachSect"/>

</xml_diff>

<commit_message>
Deploying to gh-pages from @ Morrison-Lab/sds@87af964fad574c1d2e1a4ee80d05cfd298955481 🚀
</commit_message>
<xml_diff>
--- a/categorical-tests-handout.docx
+++ b/categorical-tests-handout.docx
@@ -15,7 +15,7 @@
         <w:pStyle w:val="Date"/>
       </w:pPr>
       <w:r>
-        <w:t xml:space="preserve">Last modified: 2026-10-19 14:31:55 (PDT)</w:t>
+        <w:t xml:space="preserve">Last modified: 2026-10-19 14:45:09 (PDT)</w:t>
       </w:r>
     </w:p>
     <w:p>
@@ -386,7 +386,7 @@
       </w:r>
     </w:p>
     <w:bookmarkEnd w:id="11"/>
-    <w:bookmarkStart w:id="62" w:name="sec-two-group-categorical"/>
+    <w:bookmarkStart w:id="69" w:name="sec-two-group-categorical"/>
     <w:p>
       <w:pPr>
         <w:pStyle w:val="Heading2"/>
@@ -5006,7 +5006,7 @@
       </w:r>
     </w:p>
     <w:bookmarkEnd w:id="29"/>
-    <w:bookmarkStart w:id="61" w:name="sec-2x2-measures"/>
+    <w:bookmarkStart w:id="68" w:name="sec-2x2-measures"/>
     <w:p>
       <w:pPr>
         <w:pStyle w:val="Heading3"/>
@@ -13786,57 +13786,1035 @@
       </w:r>
     </w:p>
     <w:bookmarkEnd w:id="60"/>
+    <w:bookmarkStart w:id="61" w:name="def-case"/>
     <w:p>
       <w:pPr>
         <w:pStyle w:val="BodyText"/>
       </w:pPr>
       <w:r>
-        <w:t xml:space="preserve">Rice [5, Sec. 13.6], pp. 526–529</w:t>
-      </w:r>
-      <w:r>
-        <w:t xml:space="preserve"> </w:t>
-      </w:r>
-      <w:r>
-        <w:t xml:space="preserve">covers odds ratios.</w:t>
+        <w:rPr>
+          <w:b/>
+          <w:bCs/>
+        </w:rPr>
+        <w:t xml:space="preserve">Definition 9 (Case)</w:t>
+      </w:r>
+      <w:r>
+        <w:t xml:space="preserve"> </w:t>
+      </w:r>
+      <w:r>
+        <w:t xml:space="preserve">In a study that selects its participants by whether they have an outcome of interest,</w:t>
+      </w:r>
+      <w:r>
+        <w:t xml:space="preserve"> </w:t>
+      </w:r>
+      <w:r>
+        <w:t xml:space="preserve">a</w:t>
+      </w:r>
+      <w:r>
+        <w:t xml:space="preserve"> </w:t>
+      </w:r>
+      <w:r>
+        <w:rPr>
+          <w:b/>
+          <w:bCs/>
+        </w:rPr>
+        <w:t xml:space="preserve">case</w:t>
+      </w:r>
+      <w:r>
+        <w:t xml:space="preserve"> </w:t>
+      </w:r>
+      <w:r>
+        <w:t xml:space="preserve">is a participant who has the outcome</w:t>
+      </w:r>
+      <w:r>
+        <w:t xml:space="preserve"> </w:t>
+      </w:r>
+      <w:r>
+        <w:t xml:space="preserve">[10, Ch. 8]</w:t>
+      </w:r>
+      <w:r>
+        <w:t xml:space="preserve">.</w:t>
       </w:r>
     </w:p>
     <w:bookmarkEnd w:id="61"/>
-    <w:bookmarkEnd w:id="62"/>
-    <w:bookmarkStart w:id="80" w:name="references"/>
+    <w:bookmarkStart w:id="63" w:name="def-control"/>
     <w:p>
       <w:pPr>
-        <w:pStyle w:val="Heading2"/>
-      </w:pPr>
-      <w:r>
-        <w:t xml:space="preserve">References</w:t>
+        <w:pStyle w:val="BodyText"/>
+      </w:pPr>
+      <w:r>
+        <w:rPr>
+          <w:b/>
+          <w:bCs/>
+        </w:rPr>
+        <w:t xml:space="preserve">Definition 10 (Control)</w:t>
+      </w:r>
+      <w:r>
+        <w:t xml:space="preserve"> </w:t>
+      </w:r>
+      <w:r>
+        <w:t xml:space="preserve">In a study that selects its participants by whether they have an outcome of interest,</w:t>
+      </w:r>
+      <w:r>
+        <w:t xml:space="preserve"> </w:t>
+      </w:r>
+      <w:r>
+        <w:t xml:space="preserve">a</w:t>
+      </w:r>
+      <w:r>
+        <w:t xml:space="preserve"> </w:t>
+      </w:r>
+      <w:r>
+        <w:rPr>
+          <w:b/>
+          <w:bCs/>
+        </w:rPr>
+        <w:t xml:space="preserve">control</w:t>
+      </w:r>
+      <w:r>
+        <w:t xml:space="preserve"> </w:t>
+      </w:r>
+      <w:r>
+        <w:t xml:space="preserve">is a participant who does not have the outcome,</w:t>
+      </w:r>
+      <w:r>
+        <w:t xml:space="preserve"> </w:t>
+      </w:r>
+      <w:r>
+        <w:t xml:space="preserve">sampled from the same</w:t>
+      </w:r>
+      <w:r>
+        <w:t xml:space="preserve"> </w:t>
+      </w:r>
+      <w:hyperlink r:id="rId62">
+        <w:r>
+          <w:rPr>
+            <w:rStyle w:val="Hyperlink"/>
+          </w:rPr>
+          <w:t xml:space="preserve">population</w:t>
+        </w:r>
+      </w:hyperlink>
+      <w:r>
+        <w:t xml:space="preserve"> </w:t>
+      </w:r>
+      <w:r>
+        <w:t xml:space="preserve">as the</w:t>
+      </w:r>
+      <w:r>
+        <w:t xml:space="preserve"> </w:t>
+      </w:r>
+      <w:hyperlink w:anchor="def-case">
+        <w:r>
+          <w:rPr>
+            <w:rStyle w:val="Hyperlink"/>
+          </w:rPr>
+          <w:t xml:space="preserve">cases</w:t>
+        </w:r>
+      </w:hyperlink>
+      <w:r>
+        <w:t xml:space="preserve"> </w:t>
+      </w:r>
+      <w:r>
+        <w:t xml:space="preserve">[10, Ch. 8]</w:t>
+      </w:r>
+      <w:r>
+        <w:t xml:space="preserve">.</w:t>
       </w:r>
     </w:p>
-    <w:bookmarkStart w:id="79" w:name="refs"/>
-    <w:bookmarkStart w:id="64" w:name="ref-vittinghoff2e"/>
+    <w:bookmarkEnd w:id="63"/>
+    <w:bookmarkStart w:id="65" w:name="def-case-control-study"/>
     <w:p>
       <w:pPr>
-        <w:pStyle w:val="Bibliography"/>
-      </w:pPr>
-      <w:r>
-        <w:t xml:space="preserve">[1]</w:t>
-      </w:r>
-      <w:r>
-        <w:t xml:space="preserve"> </w:t>
-      </w:r>
-      <w:r>
-        <w:t xml:space="preserve">	</w:t>
-      </w:r>
-      <w:r>
-        <w:t xml:space="preserve">E. Vittinghoff, D. V. Glidden, S. C. Shiboski, and C. E. McCulloch,</w:t>
-      </w:r>
-      <w:r>
-        <w:t xml:space="preserve"> </w:t>
-      </w:r>
+        <w:pStyle w:val="BodyText"/>
+      </w:pPr>
+      <w:r>
+        <w:rPr>
+          <w:b/>
+          <w:bCs/>
+        </w:rPr>
+        <w:t xml:space="preserve">Definition 11 (Case-control study)</w:t>
+      </w:r>
+      <w:r>
+        <w:t xml:space="preserve"> </w:t>
+      </w:r>
+      <w:r>
+        <w:t xml:space="preserve">A</w:t>
+      </w:r>
+      <w:r>
+        <w:t xml:space="preserve"> </w:t>
+      </w:r>
+      <w:r>
+        <w:rPr>
+          <w:b/>
+          <w:bCs/>
+        </w:rPr>
+        <w:t xml:space="preserve">case-control study</w:t>
+      </w:r>
+      <w:r>
+        <w:t xml:space="preserve"> </w:t>
+      </w:r>
+      <w:r>
+        <w:t xml:space="preserve">is an observational study that selects its participants by outcome:</w:t>
+      </w:r>
+      <w:r>
+        <w:t xml:space="preserve"> </w:t>
+      </w:r>
+      <w:r>
+        <w:t xml:space="preserve">it includes the</w:t>
+      </w:r>
+      <w:r>
+        <w:t xml:space="preserve"> </w:t>
+      </w:r>
+      <w:hyperlink w:anchor="def-case">
+        <w:r>
+          <w:rPr>
+            <w:rStyle w:val="Hyperlink"/>
+          </w:rPr>
+          <w:t xml:space="preserve">cases</w:t>
+        </w:r>
+      </w:hyperlink>
+      <w:r>
+        <w:t xml:space="preserve"> </w:t>
+      </w:r>
+      <w:r>
+        <w:t xml:space="preserve">of a</w:t>
+      </w:r>
+      <w:r>
+        <w:t xml:space="preserve"> </w:t>
+      </w:r>
+      <w:hyperlink r:id="rId62">
+        <w:r>
+          <w:rPr>
+            <w:rStyle w:val="Hyperlink"/>
+          </w:rPr>
+          <w:t xml:space="preserve">population</w:t>
+        </w:r>
+      </w:hyperlink>
+      <w:r>
+        <w:t xml:space="preserve"> </w:t>
+      </w:r>
+      <w:r>
+        <w:t xml:space="preserve">and a</w:t>
+      </w:r>
+      <w:r>
+        <w:t xml:space="preserve"> </w:t>
+      </w:r>
+      <w:hyperlink r:id="rId64">
+        <w:r>
+          <w:rPr>
+            <w:rStyle w:val="Hyperlink"/>
+          </w:rPr>
+          <w:t xml:space="preserve">sample</w:t>
+        </w:r>
+      </w:hyperlink>
+      <w:r>
+        <w:t xml:space="preserve"> </w:t>
+      </w:r>
+      <w:r>
+        <w:t xml:space="preserve">of</w:t>
+      </w:r>
+      <w:r>
+        <w:t xml:space="preserve"> </w:t>
+      </w:r>
+      <w:hyperlink w:anchor="def-control">
+        <w:r>
+          <w:rPr>
+            <w:rStyle w:val="Hyperlink"/>
+          </w:rPr>
+          <w:t xml:space="preserve">controls</w:t>
+        </w:r>
+      </w:hyperlink>
+      <w:r>
+        <w:t xml:space="preserve"> </w:t>
+      </w:r>
+      <w:r>
+        <w:t xml:space="preserve">from the same population,</w:t>
+      </w:r>
+      <w:r>
+        <w:t xml:space="preserve"> </w:t>
+      </w:r>
+      <w:r>
+        <w:t xml:space="preserve">and then compares the exposure of the two groups</w:t>
+      </w:r>
+      <w:r>
+        <w:t xml:space="preserve"> </w:t>
+      </w:r>
+      <w:r>
+        <w:t xml:space="preserve">[10, Ch. 8]</w:t>
+      </w:r>
+      <w:r>
+        <w:t xml:space="preserve">.</w:t>
+      </w:r>
+    </w:p>
+    <w:bookmarkEnd w:id="65"/>
+    <w:bookmarkStart w:id="66" w:name="exm-hers-case-control-study"/>
+    <w:p>
+      <w:pPr>
+        <w:pStyle w:val="BodyText"/>
+      </w:pPr>
+      <w:r>
+        <w:rPr>
+          <w:b/>
+          <w:bCs/>
+        </w:rPr>
+        <w:t xml:space="preserve">Example 14 (A case-control study of regular exercise in HERS)</w:t>
+      </w:r>
+      <w:r>
+        <w:t xml:space="preserve"> </w:t>
+      </w:r>
+      <w:r>
+        <w:t xml:space="preserve">Take the women who exercise regularly as the</w:t>
+      </w:r>
+      <w:r>
+        <w:t xml:space="preserve"> </w:t>
+      </w:r>
+      <w:hyperlink w:anchor="def-case">
+        <w:r>
+          <w:rPr>
+            <w:rStyle w:val="Hyperlink"/>
+          </w:rPr>
+          <w:t xml:space="preserve">cases</w:t>
+        </w:r>
+      </w:hyperlink>
+      <w:r>
+        <w:t xml:space="preserve">.</w:t>
+      </w:r>
+      <w:r>
+        <w:t xml:space="preserve"> </w:t>
+      </w:r>
+      <w:r>
+        <w:t xml:space="preserve">Draw as many</w:t>
+      </w:r>
+      <w:r>
+        <w:t xml:space="preserve"> </w:t>
+      </w:r>
+      <w:hyperlink w:anchor="def-control">
+        <w:r>
+          <w:rPr>
+            <w:rStyle w:val="Hyperlink"/>
+          </w:rPr>
+          <w:t xml:space="preserve">controls</w:t>
+        </w:r>
+      </w:hyperlink>
+      <w:r>
+        <w:t xml:space="preserve"> </w:t>
+      </w:r>
+      <w:r>
+        <w:t xml:space="preserve">as there are cases, at random, from the women who do not exercise regularly.</w:t>
+      </w:r>
+      <w:r>
+        <w:t xml:space="preserve"> </w:t>
+      </w:r>
+      <w:r>
+        <w:t xml:space="preserve">Then compare the</w:t>
+      </w:r>
+      <w:r>
+        <w:t xml:space="preserve"> </w:t>
+      </w:r>
+      <w:hyperlink r:id="rId52">
+        <w:r>
+          <w:rPr>
+            <w:rStyle w:val="Hyperlink"/>
+          </w:rPr>
+          <w:t xml:space="preserve">odds</w:t>
+        </w:r>
+      </w:hyperlink>
+      <w:r>
+        <w:t xml:space="preserve"> </w:t>
+      </w:r>
+      <w:r>
+        <w:t xml:space="preserve">of hormone therapy between the cases and the controls:</w:t>
+      </w:r>
+    </w:p>
+    <w:p>
+      <w:pPr>
+        <w:pStyle w:val="SourceCode"/>
+      </w:pPr>
+      <w:r>
+        <w:rPr>
+          <w:rStyle w:val="FunctionTok"/>
+        </w:rPr>
+        <w:t xml:space="preserve">set.seed</w:t>
+      </w:r>
+      <w:r>
+        <w:rPr>
+          <w:rStyle w:val="NormalTok"/>
+        </w:rPr>
+        <w:t xml:space="preserve">(</w:t>
+      </w:r>
+      <w:r>
+        <w:rPr>
+          <w:rStyle w:val="DecValTok"/>
+        </w:rPr>
+        <w:t xml:space="preserve">571</w:t>
+      </w:r>
+      <w:r>
+        <w:rPr>
+          <w:rStyle w:val="NormalTok"/>
+        </w:rPr>
+        <w:t xml:space="preserve">)</w:t>
+      </w:r>
+      <w:r>
+        <w:br/>
+      </w:r>
+      <w:r>
+        <w:rPr>
+          <w:rStyle w:val="NormalTok"/>
+        </w:rPr>
+        <w:t xml:space="preserve">cases </w:t>
+      </w:r>
+      <w:r>
+        <w:rPr>
+          <w:rStyle w:val="OtherTok"/>
+        </w:rPr>
+        <w:t xml:space="preserve">&lt;-</w:t>
+      </w:r>
+      <w:r>
+        <w:rPr>
+          <w:rStyle w:val="NormalTok"/>
+        </w:rPr>
+        <w:t xml:space="preserve"> hers[hers</w:t>
+      </w:r>
+      <w:r>
+        <w:rPr>
+          <w:rStyle w:val="SpecialCharTok"/>
+        </w:rPr>
+        <w:t xml:space="preserve">$</w:t>
+      </w:r>
+      <w:r>
+        <w:rPr>
+          <w:rStyle w:val="NormalTok"/>
+        </w:rPr>
+        <w:t xml:space="preserve">exercise </w:t>
+      </w:r>
+      <w:r>
+        <w:rPr>
+          <w:rStyle w:val="SpecialCharTok"/>
+        </w:rPr>
+        <w:t xml:space="preserve">==</w:t>
+      </w:r>
+      <w:r>
+        <w:rPr>
+          <w:rStyle w:val="NormalTok"/>
+        </w:rPr>
+        <w:t xml:space="preserve"> </w:t>
+      </w:r>
+      <w:r>
+        <w:rPr>
+          <w:rStyle w:val="StringTok"/>
+        </w:rPr>
+        <w:t xml:space="preserve">"yes"</w:t>
+      </w:r>
+      <w:r>
+        <w:rPr>
+          <w:rStyle w:val="NormalTok"/>
+        </w:rPr>
+        <w:t xml:space="preserve">, ]</w:t>
+      </w:r>
+      <w:r>
+        <w:br/>
+      </w:r>
+      <w:r>
+        <w:rPr>
+          <w:rStyle w:val="NormalTok"/>
+        </w:rPr>
+        <w:t xml:space="preserve">non_cases </w:t>
+      </w:r>
+      <w:r>
+        <w:rPr>
+          <w:rStyle w:val="OtherTok"/>
+        </w:rPr>
+        <w:t xml:space="preserve">&lt;-</w:t>
+      </w:r>
+      <w:r>
+        <w:rPr>
+          <w:rStyle w:val="NormalTok"/>
+        </w:rPr>
+        <w:t xml:space="preserve"> hers[hers</w:t>
+      </w:r>
+      <w:r>
+        <w:rPr>
+          <w:rStyle w:val="SpecialCharTok"/>
+        </w:rPr>
+        <w:t xml:space="preserve">$</w:t>
+      </w:r>
+      <w:r>
+        <w:rPr>
+          <w:rStyle w:val="NormalTok"/>
+        </w:rPr>
+        <w:t xml:space="preserve">exercise </w:t>
+      </w:r>
+      <w:r>
+        <w:rPr>
+          <w:rStyle w:val="SpecialCharTok"/>
+        </w:rPr>
+        <w:t xml:space="preserve">==</w:t>
+      </w:r>
+      <w:r>
+        <w:rPr>
+          <w:rStyle w:val="NormalTok"/>
+        </w:rPr>
+        <w:t xml:space="preserve"> </w:t>
+      </w:r>
+      <w:r>
+        <w:rPr>
+          <w:rStyle w:val="StringTok"/>
+        </w:rPr>
+        <w:t xml:space="preserve">"no"</w:t>
+      </w:r>
+      <w:r>
+        <w:rPr>
+          <w:rStyle w:val="NormalTok"/>
+        </w:rPr>
+        <w:t xml:space="preserve">, ]</w:t>
+      </w:r>
+      <w:r>
+        <w:br/>
+      </w:r>
+      <w:r>
+        <w:rPr>
+          <w:rStyle w:val="NormalTok"/>
+        </w:rPr>
+        <w:t xml:space="preserve">controls </w:t>
+      </w:r>
+      <w:r>
+        <w:rPr>
+          <w:rStyle w:val="OtherTok"/>
+        </w:rPr>
+        <w:t xml:space="preserve">&lt;-</w:t>
+      </w:r>
+      <w:r>
+        <w:rPr>
+          <w:rStyle w:val="NormalTok"/>
+        </w:rPr>
+        <w:t xml:space="preserve"> non_cases[</w:t>
+      </w:r>
+      <w:r>
+        <w:rPr>
+          <w:rStyle w:val="FunctionTok"/>
+        </w:rPr>
+        <w:t xml:space="preserve">sample</w:t>
+      </w:r>
+      <w:r>
+        <w:rPr>
+          <w:rStyle w:val="NormalTok"/>
+        </w:rPr>
+        <w:t xml:space="preserve">(</w:t>
+      </w:r>
+      <w:r>
+        <w:rPr>
+          <w:rStyle w:val="FunctionTok"/>
+        </w:rPr>
+        <w:t xml:space="preserve">nrow</w:t>
+      </w:r>
+      <w:r>
+        <w:rPr>
+          <w:rStyle w:val="NormalTok"/>
+        </w:rPr>
+        <w:t xml:space="preserve">(non_cases), </w:t>
+      </w:r>
+      <w:r>
+        <w:rPr>
+          <w:rStyle w:val="FunctionTok"/>
+        </w:rPr>
+        <w:t xml:space="preserve">nrow</w:t>
+      </w:r>
+      <w:r>
+        <w:rPr>
+          <w:rStyle w:val="NormalTok"/>
+        </w:rPr>
+        <w:t xml:space="preserve">(cases)), ]</w:t>
+      </w:r>
+      <w:r>
+        <w:br/>
+      </w:r>
+      <w:r>
+        <w:rPr>
+          <w:rStyle w:val="NormalTok"/>
+        </w:rPr>
+        <w:t xml:space="preserve">odds_ht </w:t>
+      </w:r>
+      <w:r>
+        <w:rPr>
+          <w:rStyle w:val="OtherTok"/>
+        </w:rPr>
+        <w:t xml:space="preserve">&lt;-</w:t>
+      </w:r>
+      <w:r>
+        <w:rPr>
+          <w:rStyle w:val="NormalTok"/>
+        </w:rPr>
+        <w:t xml:space="preserve"> </w:t>
+      </w:r>
+      <w:r>
+        <w:rPr>
+          <w:rStyle w:val="ControlFlowTok"/>
+        </w:rPr>
+        <w:t xml:space="preserve">function</w:t>
+      </w:r>
+      <w:r>
+        <w:rPr>
+          <w:rStyle w:val="NormalTok"/>
+        </w:rPr>
+        <w:t xml:space="preserve">(d) {</w:t>
+      </w:r>
+      <w:r>
+        <w:br/>
+      </w:r>
+      <w:r>
+        <w:rPr>
+          <w:rStyle w:val="NormalTok"/>
+        </w:rPr>
+        <w:t xml:space="preserve">  </w:t>
+      </w:r>
+      <w:r>
+        <w:rPr>
+          <w:rStyle w:val="FunctionTok"/>
+        </w:rPr>
+        <w:t xml:space="preserve">sum</w:t>
+      </w:r>
+      <w:r>
+        <w:rPr>
+          <w:rStyle w:val="NormalTok"/>
+        </w:rPr>
+        <w:t xml:space="preserve">(d</w:t>
+      </w:r>
+      <w:r>
+        <w:rPr>
+          <w:rStyle w:val="SpecialCharTok"/>
+        </w:rPr>
+        <w:t xml:space="preserve">$</w:t>
+      </w:r>
+      <w:r>
+        <w:rPr>
+          <w:rStyle w:val="NormalTok"/>
+        </w:rPr>
+        <w:t xml:space="preserve">HT </w:t>
+      </w:r>
+      <w:r>
+        <w:rPr>
+          <w:rStyle w:val="SpecialCharTok"/>
+        </w:rPr>
+        <w:t xml:space="preserve">==</w:t>
+      </w:r>
+      <w:r>
+        <w:rPr>
+          <w:rStyle w:val="NormalTok"/>
+        </w:rPr>
+        <w:t xml:space="preserve"> </w:t>
+      </w:r>
+      <w:r>
+        <w:rPr>
+          <w:rStyle w:val="StringTok"/>
+        </w:rPr>
+        <w:t xml:space="preserve">"hormone therapy"</w:t>
+      </w:r>
+      <w:r>
+        <w:rPr>
+          <w:rStyle w:val="NormalTok"/>
+        </w:rPr>
+        <w:t xml:space="preserve">) </w:t>
+      </w:r>
+      <w:r>
+        <w:rPr>
+          <w:rStyle w:val="SpecialCharTok"/>
+        </w:rPr>
+        <w:t xml:space="preserve">/</w:t>
+      </w:r>
+      <w:r>
+        <w:rPr>
+          <w:rStyle w:val="NormalTok"/>
+        </w:rPr>
+        <w:t xml:space="preserve"> </w:t>
+      </w:r>
+      <w:r>
+        <w:rPr>
+          <w:rStyle w:val="FunctionTok"/>
+        </w:rPr>
+        <w:t xml:space="preserve">sum</w:t>
+      </w:r>
+      <w:r>
+        <w:rPr>
+          <w:rStyle w:val="NormalTok"/>
+        </w:rPr>
+        <w:t xml:space="preserve">(d</w:t>
+      </w:r>
+      <w:r>
+        <w:rPr>
+          <w:rStyle w:val="SpecialCharTok"/>
+        </w:rPr>
+        <w:t xml:space="preserve">$</w:t>
+      </w:r>
+      <w:r>
+        <w:rPr>
+          <w:rStyle w:val="NormalTok"/>
+        </w:rPr>
+        <w:t xml:space="preserve">HT </w:t>
+      </w:r>
+      <w:r>
+        <w:rPr>
+          <w:rStyle w:val="SpecialCharTok"/>
+        </w:rPr>
+        <w:t xml:space="preserve">==</w:t>
+      </w:r>
+      <w:r>
+        <w:rPr>
+          <w:rStyle w:val="NormalTok"/>
+        </w:rPr>
+        <w:t xml:space="preserve"> </w:t>
+      </w:r>
+      <w:r>
+        <w:rPr>
+          <w:rStyle w:val="StringTok"/>
+        </w:rPr>
+        <w:t xml:space="preserve">"placebo"</w:t>
+      </w:r>
+      <w:r>
+        <w:rPr>
+          <w:rStyle w:val="NormalTok"/>
+        </w:rPr>
+        <w:t xml:space="preserve">)</w:t>
+      </w:r>
+      <w:r>
+        <w:br/>
+      </w:r>
+      <w:r>
+        <w:rPr>
+          <w:rStyle w:val="NormalTok"/>
+        </w:rPr>
+        <w:t xml:space="preserve">}</w:t>
+      </w:r>
+      <w:r>
+        <w:br/>
+      </w:r>
+      <w:r>
+        <w:rPr>
+          <w:rStyle w:val="NormalTok"/>
+        </w:rPr>
+        <w:t xml:space="preserve">or_case_control </w:t>
+      </w:r>
+      <w:r>
+        <w:rPr>
+          <w:rStyle w:val="OtherTok"/>
+        </w:rPr>
+        <w:t xml:space="preserve">&lt;-</w:t>
+      </w:r>
+      <w:r>
+        <w:rPr>
+          <w:rStyle w:val="NormalTok"/>
+        </w:rPr>
+        <w:t xml:space="preserve"> </w:t>
+      </w:r>
+      <w:r>
+        <w:rPr>
+          <w:rStyle w:val="FunctionTok"/>
+        </w:rPr>
+        <w:t xml:space="preserve">odds_ht</w:t>
+      </w:r>
+      <w:r>
+        <w:rPr>
+          <w:rStyle w:val="NormalTok"/>
+        </w:rPr>
+        <w:t xml:space="preserve">(cases) </w:t>
+      </w:r>
+      <w:r>
+        <w:rPr>
+          <w:rStyle w:val="SpecialCharTok"/>
+        </w:rPr>
+        <w:t xml:space="preserve">/</w:t>
+      </w:r>
+      <w:r>
+        <w:rPr>
+          <w:rStyle w:val="NormalTok"/>
+        </w:rPr>
+        <w:t xml:space="preserve"> </w:t>
+      </w:r>
+      <w:r>
+        <w:rPr>
+          <w:rStyle w:val="FunctionTok"/>
+        </w:rPr>
+        <w:t xml:space="preserve">odds_ht</w:t>
+      </w:r>
+      <w:r>
+        <w:rPr>
+          <w:rStyle w:val="NormalTok"/>
+        </w:rPr>
+        <w:t xml:space="preserve">(controls)</w:t>
+      </w:r>
+      <w:r>
+        <w:br/>
+      </w:r>
+      <w:r>
+        <w:rPr>
+          <w:rStyle w:val="NormalTok"/>
+        </w:rPr>
+        <w:t xml:space="preserve">or_case_control</w:t>
+      </w:r>
+      <w:r>
+        <w:br/>
+      </w:r>
+      <w:r>
+        <w:rPr>
+          <w:rStyle w:val="CommentTok"/>
+        </w:rPr>
+        <w:t xml:space="preserve">#&gt; [1] 1.03816</w:t>
+      </w:r>
+    </w:p>
+    <w:p>
+      <w:pPr>
+        <w:pStyle w:val="FirstParagraph"/>
+      </w:pPr>
+      <w:r>
+        <w:t xml:space="preserve">The study has 1068 cases and 1068 controls.</w:t>
+      </w:r>
+      <w:r>
+        <w:t xml:space="preserve"> </w:t>
+      </w:r>
+      <w:r>
+        <w:t xml:space="preserve">Its</w:t>
+      </w:r>
+      <w:r>
+        <w:t xml:space="preserve"> </w:t>
+      </w:r>
+      <w:hyperlink w:anchor="def-odds-ratio">
+        <w:r>
+          <w:rPr>
+            <w:rStyle w:val="Hyperlink"/>
+          </w:rPr>
+          <w:t xml:space="preserve">odds ratio</w:t>
+        </w:r>
+      </w:hyperlink>
+      <w:r>
+        <w:t xml:space="preserve"> </w:t>
+      </w:r>
+      <w:r>
+        <w:t xml:space="preserve">is 1.038, near the odds ratio 1.028 of</w:t>
+      </w:r>
+      <w:r>
+        <w:t xml:space="preserve"> </w:t>
+      </w:r>
+      <w:hyperlink w:anchor="exm-hers-odds-ratio">
+        <w:r>
+          <w:rPr>
+            <w:rStyle w:val="Hyperlink"/>
+          </w:rPr>
+          <w:t xml:space="preserve">Example 11</w:t>
+        </w:r>
+      </w:hyperlink>
+      <w:r>
+        <w:t xml:space="preserve"> </w:t>
+      </w:r>
+      <w:r>
+        <w:t xml:space="preserve">from the whole cohort.</w:t>
+      </w:r>
+      <w:r>
+        <w:t xml:space="preserve"> </w:t>
+      </w:r>
+      <w:r>
+        <w:t xml:space="preserve">The two are close because the odds ratio is reversible (</w:t>
+      </w:r>
+      <w:hyperlink w:anchor="thm-odds-ratio-reversible">
+        <w:r>
+          <w:rPr>
+            <w:rStyle w:val="Hyperlink"/>
+          </w:rPr>
+          <w:t xml:space="preserve">Theorem 5</w:t>
+        </w:r>
+      </w:hyperlink>
+      <w:r>
+        <w:t xml:space="preserve">):</w:t>
+      </w:r>
+      <w:r>
+        <w:t xml:space="preserve"> </w:t>
+      </w:r>
+      <w:r>
+        <w:t xml:space="preserve">sampling by outcome does not change it, although it would change the</w:t>
+      </w:r>
+      <w:r>
+        <w:t xml:space="preserve"> </w:t>
+      </w:r>
+      <w:hyperlink w:anchor="def-outcome-risk">
+        <w:r>
+          <w:rPr>
+            <w:rStyle w:val="Hyperlink"/>
+          </w:rPr>
+          <w:t xml:space="preserve">risks</w:t>
+        </w:r>
+      </w:hyperlink>
+      <w:r>
+        <w:t xml:space="preserve">.</w:t>
+      </w:r>
+    </w:p>
+    <w:bookmarkEnd w:id="66"/>
+    <w:bookmarkStart w:id="67" w:name="rem-control-in-experiments"/>
+    <w:p>
+      <w:pPr>
+        <w:pStyle w:val="BodyText"/>
+      </w:pPr>
       <w:r>
         <w:rPr>
           <w:i/>
           <w:iCs/>
         </w:rPr>
+        <w:t xml:space="preserve">Remark 5</w:t>
+      </w:r>
+      <w:r>
+        <w:t xml:space="preserve"> (Controls in experiments). </w:t>
+      </w:r>
+      <w:r>
+        <w:t xml:space="preserve">The word</w:t>
+      </w:r>
+      <w:r>
+        <w:t xml:space="preserve"> </w:t>
+      </w:r>
+      <w:r>
+        <w:t xml:space="preserve">“control”</w:t>
+      </w:r>
+      <w:r>
+        <w:t xml:space="preserve"> </w:t>
+      </w:r>
+      <w:r>
+        <w:t xml:space="preserve">has a second meaning.</w:t>
+      </w:r>
+      <w:r>
+        <w:t xml:space="preserve"> </w:t>
+      </w:r>
+      <w:r>
+        <w:t xml:space="preserve"> </w:t>
+      </w:r>
+      <w:r>
+        <w:t xml:space="preserve">In an experiment, the investigator assigns the exposure.</w:t>
+      </w:r>
+      <w:r>
+        <w:t xml:space="preserve"> </w:t>
+      </w:r>
+      <w:r>
+        <w:t xml:space="preserve">The</w:t>
+      </w:r>
+      <w:r>
+        <w:t xml:space="preserve"> </w:t>
+      </w:r>
+      <w:r>
+        <w:rPr>
+          <w:b/>
+          <w:bCs/>
+        </w:rPr>
+        <w:t xml:space="preserve">controls</w:t>
+      </w:r>
+      <w:r>
+        <w:t xml:space="preserve"> </w:t>
+      </w:r>
+      <w:r>
+        <w:t xml:space="preserve">are the participants who receive the baseline treatment for comparison, such as a placebo</w:t>
+      </w:r>
+      <w:r>
+        <w:t xml:space="preserve"> </w:t>
+      </w:r>
+      <w:r>
+        <w:t xml:space="preserve">[10, Ch. 6]</w:t>
+      </w:r>
+      <w:r>
+        <w:t xml:space="preserve">.</w:t>
+      </w:r>
+      <w:r>
+        <w:t xml:space="preserve"> </w:t>
+      </w:r>
+      <w:r>
+        <w:t xml:space="preserve"> </w:t>
+      </w:r>
+      <w:r>
+        <w:t xml:space="preserve">These controls are chosen by assignment, not by outcome.</w:t>
+      </w:r>
+      <w:r>
+        <w:t xml:space="preserve"> </w:t>
+      </w:r>
+      <w:r>
+        <w:t xml:space="preserve">They are not the</w:t>
+      </w:r>
+      <w:r>
+        <w:t xml:space="preserve"> </w:t>
+      </w:r>
+      <w:hyperlink w:anchor="def-control">
+        <w:r>
+          <w:rPr>
+            <w:rStyle w:val="Hyperlink"/>
+          </w:rPr>
+          <w:t xml:space="preserve">controls</w:t>
+        </w:r>
+      </w:hyperlink>
+      <w:r>
+        <w:t xml:space="preserve"> </w:t>
+      </w:r>
+      <w:r>
+        <w:t xml:space="preserve">of a</w:t>
+      </w:r>
+      <w:r>
+        <w:t xml:space="preserve"> </w:t>
+      </w:r>
+      <w:hyperlink w:anchor="def-case-control-study">
+        <w:r>
+          <w:rPr>
+            <w:rStyle w:val="Hyperlink"/>
+          </w:rPr>
+          <w:t xml:space="preserve">case-control study</w:t>
+        </w:r>
+      </w:hyperlink>
+      <w:r>
+        <w:t xml:space="preserve">.</w:t>
+      </w:r>
+    </w:p>
+    <w:bookmarkEnd w:id="67"/>
+    <w:p>
+      <w:pPr>
+        <w:pStyle w:val="BodyText"/>
+      </w:pPr>
+      <w:r>
+        <w:t xml:space="preserve">Rice [5, Sec. 13.6], pp. 526–529</w:t>
+      </w:r>
+      <w:r>
+        <w:t xml:space="preserve"> </w:t>
+      </w:r>
+      <w:r>
+        <w:t xml:space="preserve">covers odds ratios.</w:t>
+      </w:r>
+    </w:p>
+    <w:bookmarkEnd w:id="68"/>
+    <w:bookmarkEnd w:id="69"/>
+    <w:bookmarkStart w:id="88" w:name="references"/>
+    <w:p>
+      <w:pPr>
+        <w:pStyle w:val="Heading2"/>
+      </w:pPr>
+      <w:r>
+        <w:t xml:space="preserve">References</w:t>
+      </w:r>
+    </w:p>
+    <w:bookmarkStart w:id="87" w:name="refs"/>
+    <w:bookmarkStart w:id="71" w:name="ref-vittinghoff2e"/>
+    <w:p>
+      <w:pPr>
+        <w:pStyle w:val="Bibliography"/>
+      </w:pPr>
+      <w:r>
+        <w:t xml:space="preserve">[1]</w:t>
+      </w:r>
+      <w:r>
+        <w:t xml:space="preserve"> </w:t>
+      </w:r>
+      <w:r>
+        <w:t xml:space="preserve">	</w:t>
+      </w:r>
+      <w:r>
+        <w:t xml:space="preserve">E. Vittinghoff, D. V. Glidden, S. C. Shiboski, and C. E. McCulloch,</w:t>
+      </w:r>
+      <w:r>
+        <w:t xml:space="preserve"> </w:t>
+      </w:r>
+      <w:r>
+        <w:rPr>
+          <w:i/>
+          <w:iCs/>
+        </w:rPr>
         <w:t xml:space="preserve">Regression methods in biostatistics: Linear, logistic, survival, and repeated measures models</w:t>
       </w:r>
       <w:r>
@@ -13845,7 +14823,7 @@
       <w:r>
         <w:t xml:space="preserve"> </w:t>
       </w:r>
-      <w:hyperlink r:id="rId63">
+      <w:hyperlink r:id="rId70">
         <w:r>
           <w:rPr>
             <w:rStyle w:val="Hyperlink"/>
@@ -13857,8 +14835,8 @@
         <w:t xml:space="preserve">.</w:t>
       </w:r>
     </w:p>
-    <w:bookmarkEnd w:id="64"/>
-    <w:bookmarkStart w:id="65" w:name="ref-hoggtanis2015"/>
+    <w:bookmarkEnd w:id="71"/>
+    <w:bookmarkStart w:id="72" w:name="ref-hoggtanis2015"/>
     <w:p>
       <w:pPr>
         <w:pStyle w:val="Bibliography"/>
@@ -13889,8 +14867,8 @@
         <w:t xml:space="preserve">, Tenth edition. Boston: Pearson, 2019.</w:t>
       </w:r>
     </w:p>
-    <w:bookmarkEnd w:id="65"/>
-    <w:bookmarkStart w:id="67" w:name="ref-wikipedia_contingency_table"/>
+    <w:bookmarkEnd w:id="72"/>
+    <w:bookmarkStart w:id="74" w:name="ref-wikipedia_contingency_table"/>
     <w:p>
       <w:pPr>
         <w:pStyle w:val="Bibliography"/>
@@ -13937,7 +14915,7 @@
       <w:r>
         <w:t xml:space="preserve"> </w:t>
       </w:r>
-      <w:hyperlink r:id="rId66">
+      <w:hyperlink r:id="rId73">
         <w:r>
           <w:rPr>
             <w:rStyle w:val="Hyperlink"/>
@@ -13946,8 +14924,8 @@
         </w:r>
       </w:hyperlink>
     </w:p>
-    <w:bookmarkEnd w:id="67"/>
-    <w:bookmarkStart w:id="69" w:name="ref-wikipedia_pearsons_chi_squared_test"/>
+    <w:bookmarkEnd w:id="74"/>
+    <w:bookmarkStart w:id="76" w:name="ref-wikipedia_pearsons_chi_squared_test"/>
     <w:p>
       <w:pPr>
         <w:pStyle w:val="Bibliography"/>
@@ -13994,7 +14972,7 @@
       <w:r>
         <w:t xml:space="preserve"> </w:t>
       </w:r>
-      <w:hyperlink r:id="rId68">
+      <w:hyperlink r:id="rId75">
         <w:r>
           <w:rPr>
             <w:rStyle w:val="Hyperlink"/>
@@ -14003,8 +14981,8 @@
         </w:r>
       </w:hyperlink>
     </w:p>
-    <w:bookmarkEnd w:id="69"/>
-    <w:bookmarkStart w:id="70" w:name="ref-rice2007mathematical"/>
+    <w:bookmarkEnd w:id="76"/>
+    <w:bookmarkStart w:id="77" w:name="ref-rice2007mathematical"/>
     <w:p>
       <w:pPr>
         <w:pStyle w:val="Bibliography"/>
@@ -14035,8 +15013,8 @@
         <w:t xml:space="preserve">, 3rd ed. Belmont, CA: Cengage Learning, 2007.</w:t>
       </w:r>
     </w:p>
-    <w:bookmarkEnd w:id="70"/>
-    <w:bookmarkStart w:id="72" w:name="ref-wikipedia_fishers_exact_test"/>
+    <w:bookmarkEnd w:id="77"/>
+    <w:bookmarkStart w:id="79" w:name="ref-wikipedia_fishers_exact_test"/>
     <w:p>
       <w:pPr>
         <w:pStyle w:val="Bibliography"/>
@@ -14083,7 +15061,7 @@
       <w:r>
         <w:t xml:space="preserve"> </w:t>
       </w:r>
-      <w:hyperlink r:id="rId71">
+      <w:hyperlink r:id="rId78">
         <w:r>
           <w:rPr>
             <w:rStyle w:val="Hyperlink"/>
@@ -14092,8 +15070,8 @@
         </w:r>
       </w:hyperlink>
     </w:p>
-    <w:bookmarkEnd w:id="72"/>
-    <w:bookmarkStart w:id="74" w:name="ref-wikipedia_relative_risk"/>
+    <w:bookmarkEnd w:id="79"/>
+    <w:bookmarkStart w:id="81" w:name="ref-wikipedia_relative_risk"/>
     <w:p>
       <w:pPr>
         <w:pStyle w:val="Bibliography"/>
@@ -14140,7 +15118,7 @@
       <w:r>
         <w:t xml:space="preserve"> </w:t>
       </w:r>
-      <w:hyperlink r:id="rId73">
+      <w:hyperlink r:id="rId80">
         <w:r>
           <w:rPr>
             <w:rStyle w:val="Hyperlink"/>
@@ -14149,8 +15127,8 @@
         </w:r>
       </w:hyperlink>
     </w:p>
-    <w:bookmarkEnd w:id="74"/>
-    <w:bookmarkStart w:id="76" w:name="ref-wikipedia_absolute_risk_reduction"/>
+    <w:bookmarkEnd w:id="81"/>
+    <w:bookmarkStart w:id="83" w:name="ref-wikipedia_absolute_risk_reduction"/>
     <w:p>
       <w:pPr>
         <w:pStyle w:val="Bibliography"/>
@@ -14197,7 +15175,7 @@
       <w:r>
         <w:t xml:space="preserve"> </w:t>
       </w:r>
-      <w:hyperlink r:id="rId75">
+      <w:hyperlink r:id="rId82">
         <w:r>
           <w:rPr>
             <w:rStyle w:val="Hyperlink"/>
@@ -14206,8 +15184,8 @@
         </w:r>
       </w:hyperlink>
     </w:p>
-    <w:bookmarkEnd w:id="76"/>
-    <w:bookmarkStart w:id="78" w:name="ref-wikipedia_odds_ratio"/>
+    <w:bookmarkEnd w:id="83"/>
+    <w:bookmarkStart w:id="85" w:name="ref-wikipedia_odds_ratio"/>
     <w:p>
       <w:pPr>
         <w:pStyle w:val="Bibliography"/>
@@ -14254,7 +15232,7 @@
       <w:r>
         <w:t xml:space="preserve"> </w:t>
       </w:r>
-      <w:hyperlink r:id="rId77">
+      <w:hyperlink r:id="rId84">
         <w:r>
           <w:rPr>
             <w:rStyle w:val="Hyperlink"/>
@@ -14263,9 +15241,41 @@
         </w:r>
       </w:hyperlink>
     </w:p>
-    <w:bookmarkEnd w:id="78"/>
-    <w:bookmarkEnd w:id="79"/>
-    <w:bookmarkEnd w:id="80"/>
+    <w:bookmarkEnd w:id="85"/>
+    <w:bookmarkStart w:id="86" w:name="ref-me4"/>
+    <w:p>
+      <w:pPr>
+        <w:pStyle w:val="Bibliography"/>
+      </w:pPr>
+      <w:r>
+        <w:t xml:space="preserve">[10]</w:t>
+      </w:r>
+      <w:r>
+        <w:t xml:space="preserve"> </w:t>
+      </w:r>
+      <w:r>
+        <w:t xml:space="preserve">	</w:t>
+      </w:r>
+      <w:r>
+        <w:t xml:space="preserve">K. J. Rothman, T. L. Lash, T. J. VanderWeele, and S. Haneuse,</w:t>
+      </w:r>
+      <w:r>
+        <w:t xml:space="preserve"> </w:t>
+      </w:r>
+      <w:r>
+        <w:rPr>
+          <w:i/>
+          <w:iCs/>
+        </w:rPr>
+        <w:t xml:space="preserve">Modern epidemiology</w:t>
+      </w:r>
+      <w:r>
+        <w:t xml:space="preserve">, 4th ed. Philadelphia: Wolters Kluwer, 2021.</w:t>
+      </w:r>
+    </w:p>
+    <w:bookmarkEnd w:id="86"/>
+    <w:bookmarkEnd w:id="87"/>
+    <w:bookmarkEnd w:id="88"/>
     <w:sectPr>
       <w:footnotePr>
         <w:numRestart w:val="eachSect"/>

</xml_diff>

<commit_message>
Deploying to gh-pages from @ Morrison-Lab/sds@1c7bcd55eb31eca7aa36514afb3b1c5dcf0af7a1 🚀
</commit_message>
<xml_diff>
--- a/categorical-tests-handout.docx
+++ b/categorical-tests-handout.docx
@@ -15,7 +15,7 @@
         <w:pStyle w:val="Date"/>
       </w:pPr>
       <w:r>
-        <w:t xml:space="preserve">Last modified: 2026-10-19 14:45:09 (PDT)</w:t>
+        <w:t xml:space="preserve">Last modified: 2026-10-19 23:28:03 (PDT)</w:t>
       </w:r>
     </w:p>
     <w:p>
@@ -386,7 +386,7 @@
       </w:r>
     </w:p>
     <w:bookmarkEnd w:id="11"/>
-    <w:bookmarkStart w:id="69" w:name="sec-two-group-categorical"/>
+    <w:bookmarkStart w:id="70" w:name="sec-two-group-categorical"/>
     <w:p>
       <w:pPr>
         <w:pStyle w:val="Heading2"/>
@@ -5006,7 +5006,7 @@
       </w:r>
     </w:p>
     <w:bookmarkEnd w:id="29"/>
-    <w:bookmarkStart w:id="68" w:name="sec-2x2-measures"/>
+    <w:bookmarkStart w:id="69" w:name="sec-2x2-measures"/>
     <w:p>
       <w:pPr>
         <w:pStyle w:val="Heading3"/>
@@ -5514,7 +5514,164 @@
       </w:r>
     </w:p>
     <w:bookmarkEnd w:id="34"/>
-    <w:bookmarkStart w:id="35" w:name="def-reference-group"/>
+    <w:bookmarkStart w:id="36" w:name="rem-cumulative-incidence"/>
+    <w:p>
+      <w:pPr>
+        <w:pStyle w:val="BodyText"/>
+      </w:pPr>
+      <w:r>
+        <w:rPr>
+          <w:i/>
+          <w:iCs/>
+        </w:rPr>
+        <w:t xml:space="preserve">Remark 4</w:t>
+      </w:r>
+      <w:r>
+        <w:t xml:space="preserve"> (Cumulative incidence has a second meaning). </w:t>
+      </w:r>
+      <w:r>
+        <w:t xml:space="preserve">The name</w:t>
+      </w:r>
+      <w:r>
+        <w:t xml:space="preserve"> </w:t>
+      </w:r>
+      <w:hyperlink w:anchor="def-outcome-risk">
+        <w:r>
+          <w:rPr>
+            <w:rStyle w:val="Hyperlink"/>
+          </w:rPr>
+          <w:t xml:space="preserve">cumulative incidence</w:t>
+        </w:r>
+      </w:hyperlink>
+      <w:r>
+        <w:t xml:space="preserve"> </w:t>
+      </w:r>
+      <w:r>
+        <w:t xml:space="preserve">for the</w:t>
+      </w:r>
+      <w:r>
+        <w:t xml:space="preserve"> </w:t>
+      </w:r>
+      <w:hyperlink w:anchor="def-outcome-risk">
+        <w:r>
+          <w:rPr>
+            <w:rStyle w:val="Hyperlink"/>
+          </w:rPr>
+          <w:t xml:space="preserve">risk</w:t>
+        </w:r>
+      </w:hyperlink>
+      <w:r>
+        <w:t xml:space="preserve"> </w:t>
+      </w:r>
+      <w:r>
+        <w:t xml:space="preserve">fits a closed</w:t>
+      </w:r>
+      <w:r>
+        <w:t xml:space="preserve"> </w:t>
+      </w:r>
+      <w:hyperlink r:id="rId35">
+        <w:r>
+          <w:rPr>
+            <w:rStyle w:val="Hyperlink"/>
+          </w:rPr>
+          <w:t xml:space="preserve">population</w:t>
+        </w:r>
+      </w:hyperlink>
+      <w:r>
+        <w:t xml:space="preserve">, where no one enters or leaves after the start of the time period</w:t>
+      </w:r>
+      <w:r>
+        <w:t xml:space="preserve"> </w:t>
+      </w:r>
+      <w:r>
+        <w:t xml:space="preserve">[8, Ch. 4]</w:t>
+      </w:r>
+      <w:r>
+        <w:t xml:space="preserve">.</w:t>
+      </w:r>
+      <w:r>
+        <w:t xml:space="preserve"> </w:t>
+      </w:r>
+      <w:r>
+        <w:t xml:space="preserve">The same name is also used for a different quantity: when several event types compete, the cumulative incidence function of one event type at time</w:t>
+      </w:r>
+      <w:r>
+        <w:t xml:space="preserve"> </w:t>
+      </w:r>
+      <m:oMath>
+        <m:r>
+          <m:t>t</m:t>
+        </m:r>
+      </m:oMath>
+      <w:r>
+        <w:t xml:space="preserve"> </w:t>
+      </w:r>
+      <w:r>
+        <w:t xml:space="preserve">is the</w:t>
+      </w:r>
+      <w:r>
+        <w:t xml:space="preserve"> </w:t>
+      </w:r>
+      <w:hyperlink r:id="rId31">
+        <w:r>
+          <w:rPr>
+            <w:rStyle w:val="Hyperlink"/>
+          </w:rPr>
+          <w:t xml:space="preserve">probability</w:t>
+        </w:r>
+      </w:hyperlink>
+      <w:r>
+        <w:t xml:space="preserve"> </w:t>
+      </w:r>
+      <w:r>
+        <w:t xml:space="preserve">that this type of event occurs by time</w:t>
+      </w:r>
+      <w:r>
+        <w:t xml:space="preserve"> </w:t>
+      </w:r>
+      <m:oMath>
+        <m:r>
+          <m:t>t</m:t>
+        </m:r>
+      </m:oMath>
+      <w:r>
+        <w:t xml:space="preserve"> </w:t>
+      </w:r>
+      <w:r>
+        <w:t xml:space="preserve">[8, Ch. 22]</w:t>
+      </w:r>
+      <w:r>
+        <w:t xml:space="preserve">.</w:t>
+      </w:r>
+      <w:r>
+        <w:t xml:space="preserve"> </w:t>
+      </w:r>
+      <w:r>
+        <w:t xml:space="preserve"> </w:t>
+      </w:r>
+      <w:r>
+        <w:t xml:space="preserve">This page uses the name only for the risk of a</w:t>
+      </w:r>
+      <w:r>
+        <w:t xml:space="preserve"> </w:t>
+      </w:r>
+      <w:hyperlink r:id="rId30">
+        <w:r>
+          <w:rPr>
+            <w:rStyle w:val="Hyperlink"/>
+          </w:rPr>
+          <w:t xml:space="preserve">binary</w:t>
+        </w:r>
+      </w:hyperlink>
+      <w:r>
+        <w:t xml:space="preserve"> </w:t>
+      </w:r>
+      <w:r>
+        <w:t xml:space="preserve">outcome.</w:t>
+      </w:r>
+    </w:p>
+    <w:bookmarkEnd w:id="36"/>
+    <w:bookmarkStart w:id="37" w:name="def-reference-group"/>
     <w:p>
       <w:pPr>
         <w:pStyle w:val="BodyText"/>
@@ -5567,8 +5724,8 @@
         <w:t xml:space="preserve">The other group is the group being compared with it.</w:t>
       </w:r>
     </w:p>
-    <w:bookmarkEnd w:id="35"/>
-    <w:bookmarkStart w:id="36" w:name="exm-hers-reference-group"/>
+    <w:bookmarkEnd w:id="37"/>
+    <w:bookmarkStart w:id="38" w:name="exm-hers-reference-group"/>
     <w:p>
       <w:pPr>
         <w:pStyle w:val="BodyText"/>
@@ -5653,8 +5810,8 @@
         <w:t xml:space="preserve">and a quotient is hormone therapy divided by placebo.</w:t>
       </w:r>
     </w:p>
-    <w:bookmarkEnd w:id="36"/>
-    <w:bookmarkStart w:id="37" w:name="def-risk-difference"/>
+    <w:bookmarkEnd w:id="38"/>
+    <w:bookmarkStart w:id="39" w:name="def-risk-difference"/>
     <w:p>
       <w:pPr>
         <w:pStyle w:val="BodyText"/>
@@ -5933,14 +6090,14 @@
         <w:t xml:space="preserve"> </w:t>
       </w:r>
       <w:r>
-        <w:t xml:space="preserve">Wikipedia contributors [8]</w:t>
+        <w:t xml:space="preserve">Wikipedia contributors [9]</w:t>
       </w:r>
       <w:r>
         <w:t xml:space="preserve">.</w:t>
       </w:r>
     </w:p>
-    <w:bookmarkEnd w:id="37"/>
-    <w:bookmarkStart w:id="38" w:name="exm-hers-risk-difference"/>
+    <w:bookmarkEnd w:id="39"/>
+    <w:bookmarkStart w:id="40" w:name="exm-hers-risk-difference"/>
     <w:p>
       <w:pPr>
         <w:pStyle w:val="BodyText"/>
@@ -6144,8 +6301,8 @@
         <w:t xml:space="preserve">Multiplying by 100 gives 0.7 percentage points.</w:t>
       </w:r>
     </w:p>
-    <w:bookmarkEnd w:id="38"/>
-    <w:bookmarkStart w:id="39" w:name="exr-risk-difference-switch-ref"/>
+    <w:bookmarkEnd w:id="40"/>
+    <w:bookmarkStart w:id="41" w:name="exr-risk-difference-switch-ref"/>
     <w:p>
       <w:pPr>
         <w:pStyle w:val="BodyText"/>
@@ -6399,8 +6556,8 @@
         <w:t xml:space="preserve">.</w:t>
       </w:r>
     </w:p>
-    <w:bookmarkEnd w:id="39"/>
-    <w:bookmarkStart w:id="40" w:name="sol-risk-difference-switch-ref"/>
+    <w:bookmarkEnd w:id="41"/>
+    <w:bookmarkStart w:id="42" w:name="sol-risk-difference-switch-ref"/>
     <w:p>
       <w:pPr>
         <w:pStyle w:val="BodyText"/>
@@ -6610,8 +6767,8 @@
         </m:oMath>
       </m:oMathPara>
     </w:p>
-    <w:bookmarkEnd w:id="40"/>
-    <w:bookmarkStart w:id="41" w:name="thm-risk-difference-switch-ref"/>
+    <w:bookmarkEnd w:id="42"/>
+    <w:bookmarkStart w:id="43" w:name="thm-risk-difference-switch-ref"/>
     <w:p>
       <w:pPr>
         <w:pStyle w:val="FirstParagraph"/>
@@ -6907,7 +7064,7 @@
         </m:oMath>
       </m:oMathPara>
     </w:p>
-    <w:bookmarkEnd w:id="41"/>
+    <w:bookmarkEnd w:id="43"/>
     <w:p>
       <w:pPr>
         <w:pStyle w:val="FirstParagraph"/>
@@ -6940,7 +7097,7 @@
         <w:t xml:space="preserve">.</w:t>
       </w:r>
     </w:p>
-    <w:bookmarkStart w:id="43" w:name="exm-hers-risk-difference-switch-ref"/>
+    <w:bookmarkStart w:id="45" w:name="exm-hers-risk-difference-switch-ref"/>
     <w:p>
       <w:pPr>
         <w:pStyle w:val="BodyText"/>
@@ -7100,7 +7257,7 @@
       <w:r>
         <w:t xml:space="preserve"> </w:t>
       </w:r>
-      <w:hyperlink r:id="rId42">
+      <w:hyperlink r:id="rId44">
         <w:r>
           <w:rPr>
             <w:rStyle w:val="Hyperlink"/>
@@ -7129,8 +7286,8 @@
         <w:t xml:space="preserve">states.</w:t>
       </w:r>
     </w:p>
-    <w:bookmarkEnd w:id="43"/>
-    <w:bookmarkStart w:id="44" w:name="def-risk-ratio"/>
+    <w:bookmarkEnd w:id="45"/>
+    <w:bookmarkStart w:id="46" w:name="def-risk-ratio"/>
     <w:p>
       <w:pPr>
         <w:pStyle w:val="BodyText"/>
@@ -7463,8 +7620,8 @@
         <w:t xml:space="preserve">.</w:t>
       </w:r>
     </w:p>
-    <w:bookmarkEnd w:id="44"/>
-    <w:bookmarkStart w:id="46" w:name="exm-hers-risk-ratio"/>
+    <w:bookmarkEnd w:id="46"/>
+    <w:bookmarkStart w:id="48" w:name="exm-hers-risk-ratio"/>
     <w:p>
       <w:pPr>
         <w:pStyle w:val="BodyText"/>
@@ -7670,7 +7827,7 @@
       <w:r>
         <w:t xml:space="preserve"> </w:t>
       </w:r>
-      <w:hyperlink r:id="rId42">
+      <w:hyperlink r:id="rId44">
         <w:r>
           <w:rPr>
             <w:rStyle w:val="Hyperlink"/>
@@ -7693,7 +7850,7 @@
       <w:r>
         <w:t xml:space="preserve"> </w:t>
       </w:r>
-      <w:hyperlink r:id="rId45">
+      <w:hyperlink r:id="rId47">
         <w:r>
           <w:rPr>
             <w:rStyle w:val="Hyperlink"/>
@@ -7734,8 +7891,8 @@
         <w:t xml:space="preserve">The estimate alone does not show how precise it is.</w:t>
       </w:r>
     </w:p>
-    <w:bookmarkEnd w:id="46"/>
-    <w:bookmarkStart w:id="47" w:name="rem-risk-ratio-rate-ratio"/>
+    <w:bookmarkEnd w:id="48"/>
+    <w:bookmarkStart w:id="49" w:name="rem-risk-ratio-rate-ratio"/>
     <w:p>
       <w:pPr>
         <w:pStyle w:val="BodyText"/>
@@ -7745,7 +7902,7 @@
           <w:i/>
           <w:iCs/>
         </w:rPr>
-        <w:t xml:space="preserve">Remark 4</w:t>
+        <w:t xml:space="preserve">Remark 5</w:t>
       </w:r>
       <w:r>
         <w:t xml:space="preserve"> (The risk ratio is not the rate ratio). </w:t>
@@ -7780,8 +7937,8 @@
         <w:t xml:space="preserve">The rate ratio is a different quantity: the quotient of two event rates, as in count regression.</w:t>
       </w:r>
     </w:p>
-    <w:bookmarkEnd w:id="47"/>
-    <w:bookmarkStart w:id="48" w:name="exr-risk-ratio-switch-ref"/>
+    <w:bookmarkEnd w:id="49"/>
+    <w:bookmarkStart w:id="50" w:name="exr-risk-ratio-switch-ref"/>
     <w:p>
       <w:pPr>
         <w:pStyle w:val="BodyText"/>
@@ -8103,8 +8260,8 @@
         <w:t xml:space="preserve">.</w:t>
       </w:r>
     </w:p>
-    <w:bookmarkEnd w:id="48"/>
-    <w:bookmarkStart w:id="49" w:name="sol-risk-ratio-switch-ref"/>
+    <w:bookmarkEnd w:id="50"/>
+    <w:bookmarkStart w:id="51" w:name="sol-risk-ratio-switch-ref"/>
     <w:p>
       <w:pPr>
         <w:pStyle w:val="BodyText"/>
@@ -8308,8 +8465,8 @@
         </m:oMath>
       </m:oMathPara>
     </w:p>
-    <w:bookmarkEnd w:id="49"/>
-    <w:bookmarkStart w:id="50" w:name="thm-risk-ratio-switch-ref"/>
+    <w:bookmarkEnd w:id="51"/>
+    <w:bookmarkStart w:id="52" w:name="thm-risk-ratio-switch-ref"/>
     <w:p>
       <w:pPr>
         <w:pStyle w:val="FirstParagraph"/>
@@ -8692,7 +8849,7 @@
         </m:oMath>
       </m:oMathPara>
     </w:p>
-    <w:bookmarkEnd w:id="50"/>
+    <w:bookmarkEnd w:id="52"/>
     <w:p>
       <w:pPr>
         <w:pStyle w:val="FirstParagraph"/>
@@ -8725,7 +8882,7 @@
         <w:t xml:space="preserve">.</w:t>
       </w:r>
     </w:p>
-    <w:bookmarkStart w:id="51" w:name="exm-hers-risk-ratio-switch-ref"/>
+    <w:bookmarkStart w:id="53" w:name="exm-hers-risk-ratio-switch-ref"/>
     <w:p>
       <w:pPr>
         <w:pStyle w:val="BodyText"/>
@@ -8885,7 +9042,7 @@
       <w:r>
         <w:t xml:space="preserve"> </w:t>
       </w:r>
-      <w:hyperlink r:id="rId42">
+      <w:hyperlink r:id="rId44">
         <w:r>
           <w:rPr>
             <w:rStyle w:val="Hyperlink"/>
@@ -8914,8 +9071,8 @@
         <w:t xml:space="preserve">states.</w:t>
       </w:r>
     </w:p>
-    <w:bookmarkEnd w:id="51"/>
-    <w:bookmarkStart w:id="53" w:name="def-odds-ratio"/>
+    <w:bookmarkEnd w:id="53"/>
+    <w:bookmarkStart w:id="55" w:name="def-odds-ratio"/>
     <w:p>
       <w:pPr>
         <w:pStyle w:val="BodyText"/>
@@ -8965,7 +9122,7 @@
       <w:r>
         <w:t xml:space="preserve"> </w:t>
       </w:r>
-      <w:hyperlink r:id="rId52">
+      <w:hyperlink r:id="rId54">
         <w:r>
           <w:rPr>
             <w:rStyle w:val="Hyperlink"/>
@@ -9327,14 +9484,14 @@
         <w:t xml:space="preserve"> </w:t>
       </w:r>
       <w:r>
-        <w:t xml:space="preserve">Wikipedia contributors [9]</w:t>
+        <w:t xml:space="preserve">Wikipedia contributors [10]</w:t>
       </w:r>
       <w:r>
         <w:t xml:space="preserve">.</w:t>
       </w:r>
     </w:p>
-    <w:bookmarkEnd w:id="53"/>
-    <w:bookmarkStart w:id="54" w:name="exm-hers-odds-ratio"/>
+    <w:bookmarkEnd w:id="55"/>
+    <w:bookmarkStart w:id="56" w:name="exm-hers-odds-ratio"/>
     <w:p>
       <w:pPr>
         <w:pStyle w:val="BodyText"/>
@@ -9375,7 +9532,7 @@
       <w:r>
         <w:t xml:space="preserve"> </w:t>
       </w:r>
-      <w:hyperlink r:id="rId52">
+      <w:hyperlink r:id="rId54">
         <w:r>
           <w:rPr>
             <w:rStyle w:val="Hyperlink"/>
@@ -9676,7 +9833,7 @@
       <w:r>
         <w:t xml:space="preserve"> </w:t>
       </w:r>
-      <w:hyperlink r:id="rId45">
+      <w:hyperlink r:id="rId47">
         <w:r>
           <w:rPr>
             <w:rStyle w:val="Hyperlink"/>
@@ -9705,8 +9862,8 @@
         <w:t xml:space="preserve">.</w:t>
       </w:r>
     </w:p>
-    <w:bookmarkEnd w:id="54"/>
-    <w:bookmarkStart w:id="55" w:name="exr-odds-from-joint-probs"/>
+    <w:bookmarkEnd w:id="56"/>
+    <w:bookmarkStart w:id="57" w:name="exr-odds-from-joint-probs"/>
     <w:p>
       <w:pPr>
         <w:pStyle w:val="BodyText"/>
@@ -9943,7 +10100,7 @@
       <w:r>
         <w:t xml:space="preserve"> </w:t>
       </w:r>
-      <w:hyperlink r:id="rId52">
+      <w:hyperlink r:id="rId54">
         <w:r>
           <w:rPr>
             <w:rStyle w:val="Hyperlink"/>
@@ -10127,8 +10284,8 @@
         <w:t xml:space="preserve">.</w:t>
       </w:r>
     </w:p>
-    <w:bookmarkEnd w:id="55"/>
-    <w:bookmarkStart w:id="56" w:name="sol-odds-from-joint-probs"/>
+    <w:bookmarkEnd w:id="57"/>
+    <w:bookmarkStart w:id="58" w:name="sol-odds-from-joint-probs"/>
     <w:p>
       <w:pPr>
         <w:pStyle w:val="BodyText"/>
@@ -10849,8 +11006,8 @@
         </m:oMath>
       </m:oMathPara>
     </w:p>
-    <w:bookmarkEnd w:id="56"/>
-    <w:bookmarkStart w:id="57" w:name="thm-odds-ratio-cross-product"/>
+    <w:bookmarkEnd w:id="58"/>
+    <w:bookmarkStart w:id="59" w:name="thm-odds-ratio-cross-product"/>
     <w:p>
       <w:pPr>
         <w:pStyle w:val="FirstParagraph"/>
@@ -11467,7 +11624,7 @@
         </m:oMath>
       </m:oMathPara>
     </w:p>
-    <w:bookmarkEnd w:id="57"/>
+    <w:bookmarkEnd w:id="59"/>
     <w:p>
       <w:pPr>
         <w:pStyle w:val="FirstParagraph"/>
@@ -11502,7 +11659,7 @@
       <w:r>
         <w:t xml:space="preserve"> </w:t>
       </w:r>
-      <w:hyperlink r:id="rId52">
+      <w:hyperlink r:id="rId54">
         <w:r>
           <w:rPr>
             <w:rStyle w:val="Hyperlink"/>
@@ -11880,7 +12037,7 @@
         <w:t xml:space="preserve">Dividing by a fraction is multiplying by its reciprocal, which gives the stated product of the four joint probabilities.</w:t>
       </w:r>
     </w:p>
-    <w:bookmarkStart w:id="58" w:name="exm-hers-odds-ratio-cross-product"/>
+    <w:bookmarkStart w:id="60" w:name="exm-hers-odds-ratio-cross-product"/>
     <w:p>
       <w:pPr>
         <w:pStyle w:val="BodyText"/>
@@ -12308,8 +12465,8 @@
         <w:t xml:space="preserve">states.</w:t>
       </w:r>
     </w:p>
-    <w:bookmarkEnd w:id="58"/>
-    <w:bookmarkStart w:id="59" w:name="thm-odds-ratio-reversible"/>
+    <w:bookmarkEnd w:id="60"/>
+    <w:bookmarkStart w:id="61" w:name="thm-odds-ratio-reversible"/>
     <w:p>
       <w:pPr>
         <w:pStyle w:val="BodyText"/>
@@ -12808,7 +12965,7 @@
         </m:oMath>
       </m:oMathPara>
     </w:p>
-    <w:bookmarkEnd w:id="59"/>
+    <w:bookmarkEnd w:id="61"/>
     <w:p>
       <w:pPr>
         <w:pStyle w:val="FirstParagraph"/>
@@ -13371,7 +13528,7 @@
         <w:t xml:space="preserve">.</w:t>
       </w:r>
     </w:p>
-    <w:bookmarkStart w:id="60" w:name="exm-hers-odds-ratio-reversible"/>
+    <w:bookmarkStart w:id="62" w:name="exm-hers-odds-ratio-reversible"/>
     <w:p>
       <w:pPr>
         <w:pStyle w:val="BodyText"/>
@@ -13423,7 +13580,7 @@
       <w:r>
         <w:t xml:space="preserve"> </w:t>
       </w:r>
-      <w:hyperlink r:id="rId52">
+      <w:hyperlink r:id="rId54">
         <w:r>
           <w:rPr>
             <w:rStyle w:val="Hyperlink"/>
@@ -13785,8 +13942,8 @@
         <w:t xml:space="preserve">states.</w:t>
       </w:r>
     </w:p>
-    <w:bookmarkEnd w:id="60"/>
-    <w:bookmarkStart w:id="61" w:name="def-case"/>
+    <w:bookmarkEnd w:id="62"/>
+    <w:bookmarkStart w:id="63" w:name="def-case"/>
     <w:p>
       <w:pPr>
         <w:pStyle w:val="BodyText"/>
@@ -13830,14 +13987,14 @@
         <w:t xml:space="preserve"> </w:t>
       </w:r>
       <w:r>
-        <w:t xml:space="preserve">[10, Ch. 8]</w:t>
+        <w:t xml:space="preserve">[8, Ch. 8]</w:t>
       </w:r>
       <w:r>
         <w:t xml:space="preserve">.</w:t>
       </w:r>
     </w:p>
-    <w:bookmarkEnd w:id="61"/>
-    <w:bookmarkStart w:id="63" w:name="def-control"/>
+    <w:bookmarkEnd w:id="63"/>
+    <w:bookmarkStart w:id="64" w:name="def-control"/>
     <w:p>
       <w:pPr>
         <w:pStyle w:val="BodyText"/>
@@ -13886,7 +14043,7 @@
       <w:r>
         <w:t xml:space="preserve"> </w:t>
       </w:r>
-      <w:hyperlink r:id="rId62">
+      <w:hyperlink r:id="rId35">
         <w:r>
           <w:rPr>
             <w:rStyle w:val="Hyperlink"/>
@@ -13915,14 +14072,14 @@
         <w:t xml:space="preserve"> </w:t>
       </w:r>
       <w:r>
-        <w:t xml:space="preserve">[10, Ch. 8]</w:t>
+        <w:t xml:space="preserve">[8, Ch. 8]</w:t>
       </w:r>
       <w:r>
         <w:t xml:space="preserve">.</w:t>
       </w:r>
     </w:p>
-    <w:bookmarkEnd w:id="63"/>
-    <w:bookmarkStart w:id="65" w:name="def-case-control-study"/>
+    <w:bookmarkEnd w:id="64"/>
+    <w:bookmarkStart w:id="66" w:name="def-case-control-study"/>
     <w:p>
       <w:pPr>
         <w:pStyle w:val="BodyText"/>
@@ -13982,7 +14139,7 @@
       <w:r>
         <w:t xml:space="preserve"> </w:t>
       </w:r>
-      <w:hyperlink r:id="rId62">
+      <w:hyperlink r:id="rId35">
         <w:r>
           <w:rPr>
             <w:rStyle w:val="Hyperlink"/>
@@ -13999,7 +14156,7 @@
       <w:r>
         <w:t xml:space="preserve"> </w:t>
       </w:r>
-      <w:hyperlink r:id="rId64">
+      <w:hyperlink r:id="rId65">
         <w:r>
           <w:rPr>
             <w:rStyle w:val="Hyperlink"/>
@@ -14040,14 +14197,14 @@
         <w:t xml:space="preserve"> </w:t>
       </w:r>
       <w:r>
-        <w:t xml:space="preserve">[10, Ch. 8]</w:t>
+        <w:t xml:space="preserve">[8, Ch. 8]</w:t>
       </w:r>
       <w:r>
         <w:t xml:space="preserve">.</w:t>
       </w:r>
     </w:p>
-    <w:bookmarkEnd w:id="65"/>
-    <w:bookmarkStart w:id="66" w:name="exm-hers-case-control-study"/>
+    <w:bookmarkEnd w:id="66"/>
+    <w:bookmarkStart w:id="67" w:name="exm-hers-case-control-study"/>
     <w:p>
       <w:pPr>
         <w:pStyle w:val="BodyText"/>
@@ -14111,7 +14268,7 @@
       <w:r>
         <w:t xml:space="preserve"> </w:t>
       </w:r>
-      <w:hyperlink r:id="rId52">
+      <w:hyperlink r:id="rId54">
         <w:r>
           <w:rPr>
             <w:rStyle w:val="Hyperlink"/>
@@ -14645,8 +14802,8 @@
         <w:t xml:space="preserve">.</w:t>
       </w:r>
     </w:p>
-    <w:bookmarkEnd w:id="66"/>
-    <w:bookmarkStart w:id="67" w:name="rem-control-in-experiments"/>
+    <w:bookmarkEnd w:id="67"/>
+    <w:bookmarkStart w:id="68" w:name="rem-control-in-experiments"/>
     <w:p>
       <w:pPr>
         <w:pStyle w:val="BodyText"/>
@@ -14656,7 +14813,7 @@
           <w:i/>
           <w:iCs/>
         </w:rPr>
-        <w:t xml:space="preserve">Remark 5</w:t>
+        <w:t xml:space="preserve">Remark 6</w:t>
       </w:r>
       <w:r>
         <w:t xml:space="preserve"> (Controls in experiments). </w:t>
@@ -14711,7 +14868,7 @@
         <w:t xml:space="preserve"> </w:t>
       </w:r>
       <w:r>
-        <w:t xml:space="preserve">[10, Ch. 6]</w:t>
+        <w:t xml:space="preserve">[8, Ch. 6]</w:t>
       </w:r>
       <w:r>
         <w:t xml:space="preserve">.</w:t>
@@ -14763,7 +14920,7 @@
         <w:t xml:space="preserve">.</w:t>
       </w:r>
     </w:p>
-    <w:bookmarkEnd w:id="67"/>
+    <w:bookmarkEnd w:id="68"/>
     <w:p>
       <w:pPr>
         <w:pStyle w:val="BodyText"/>
@@ -14778,9 +14935,9 @@
         <w:t xml:space="preserve">covers odds ratios.</w:t>
       </w:r>
     </w:p>
-    <w:bookmarkEnd w:id="68"/>
     <w:bookmarkEnd w:id="69"/>
-    <w:bookmarkStart w:id="88" w:name="references"/>
+    <w:bookmarkEnd w:id="70"/>
+    <w:bookmarkStart w:id="89" w:name="references"/>
     <w:p>
       <w:pPr>
         <w:pStyle w:val="Heading2"/>
@@ -14789,8 +14946,8 @@
         <w:t xml:space="preserve">References</w:t>
       </w:r>
     </w:p>
-    <w:bookmarkStart w:id="87" w:name="refs"/>
-    <w:bookmarkStart w:id="71" w:name="ref-vittinghoff2e"/>
+    <w:bookmarkStart w:id="88" w:name="refs"/>
+    <w:bookmarkStart w:id="72" w:name="ref-vittinghoff2e"/>
     <w:p>
       <w:pPr>
         <w:pStyle w:val="Bibliography"/>
@@ -14823,7 +14980,7 @@
       <w:r>
         <w:t xml:space="preserve"> </w:t>
       </w:r>
-      <w:hyperlink r:id="rId70">
+      <w:hyperlink r:id="rId71">
         <w:r>
           <w:rPr>
             <w:rStyle w:val="Hyperlink"/>
@@ -14835,8 +14992,8 @@
         <w:t xml:space="preserve">.</w:t>
       </w:r>
     </w:p>
-    <w:bookmarkEnd w:id="71"/>
-    <w:bookmarkStart w:id="72" w:name="ref-hoggtanis2015"/>
+    <w:bookmarkEnd w:id="72"/>
+    <w:bookmarkStart w:id="73" w:name="ref-hoggtanis2015"/>
     <w:p>
       <w:pPr>
         <w:pStyle w:val="Bibliography"/>
@@ -14867,8 +15024,8 @@
         <w:t xml:space="preserve">, Tenth edition. Boston: Pearson, 2019.</w:t>
       </w:r>
     </w:p>
-    <w:bookmarkEnd w:id="72"/>
-    <w:bookmarkStart w:id="74" w:name="ref-wikipedia_contingency_table"/>
+    <w:bookmarkEnd w:id="73"/>
+    <w:bookmarkStart w:id="75" w:name="ref-wikipedia_contingency_table"/>
     <w:p>
       <w:pPr>
         <w:pStyle w:val="Bibliography"/>
@@ -14915,7 +15072,7 @@
       <w:r>
         <w:t xml:space="preserve"> </w:t>
       </w:r>
-      <w:hyperlink r:id="rId73">
+      <w:hyperlink r:id="rId74">
         <w:r>
           <w:rPr>
             <w:rStyle w:val="Hyperlink"/>
@@ -14924,8 +15081,8 @@
         </w:r>
       </w:hyperlink>
     </w:p>
-    <w:bookmarkEnd w:id="74"/>
-    <w:bookmarkStart w:id="76" w:name="ref-wikipedia_pearsons_chi_squared_test"/>
+    <w:bookmarkEnd w:id="75"/>
+    <w:bookmarkStart w:id="77" w:name="ref-wikipedia_pearsons_chi_squared_test"/>
     <w:p>
       <w:pPr>
         <w:pStyle w:val="Bibliography"/>
@@ -14972,7 +15129,7 @@
       <w:r>
         <w:t xml:space="preserve"> </w:t>
       </w:r>
-      <w:hyperlink r:id="rId75">
+      <w:hyperlink r:id="rId76">
         <w:r>
           <w:rPr>
             <w:rStyle w:val="Hyperlink"/>
@@ -14981,8 +15138,8 @@
         </w:r>
       </w:hyperlink>
     </w:p>
-    <w:bookmarkEnd w:id="76"/>
-    <w:bookmarkStart w:id="77" w:name="ref-rice2007mathematical"/>
+    <w:bookmarkEnd w:id="77"/>
+    <w:bookmarkStart w:id="78" w:name="ref-rice2007mathematical"/>
     <w:p>
       <w:pPr>
         <w:pStyle w:val="Bibliography"/>
@@ -15013,8 +15170,8 @@
         <w:t xml:space="preserve">, 3rd ed. Belmont, CA: Cengage Learning, 2007.</w:t>
       </w:r>
     </w:p>
-    <w:bookmarkEnd w:id="77"/>
-    <w:bookmarkStart w:id="79" w:name="ref-wikipedia_fishers_exact_test"/>
+    <w:bookmarkEnd w:id="78"/>
+    <w:bookmarkStart w:id="80" w:name="ref-wikipedia_fishers_exact_test"/>
     <w:p>
       <w:pPr>
         <w:pStyle w:val="Bibliography"/>
@@ -15061,7 +15218,7 @@
       <w:r>
         <w:t xml:space="preserve"> </w:t>
       </w:r>
-      <w:hyperlink r:id="rId78">
+      <w:hyperlink r:id="rId79">
         <w:r>
           <w:rPr>
             <w:rStyle w:val="Hyperlink"/>
@@ -15070,8 +15227,8 @@
         </w:r>
       </w:hyperlink>
     </w:p>
-    <w:bookmarkEnd w:id="79"/>
-    <w:bookmarkStart w:id="81" w:name="ref-wikipedia_relative_risk"/>
+    <w:bookmarkEnd w:id="80"/>
+    <w:bookmarkStart w:id="82" w:name="ref-wikipedia_relative_risk"/>
     <w:p>
       <w:pPr>
         <w:pStyle w:val="Bibliography"/>
@@ -15118,7 +15275,7 @@
       <w:r>
         <w:t xml:space="preserve"> </w:t>
       </w:r>
-      <w:hyperlink r:id="rId80">
+      <w:hyperlink r:id="rId81">
         <w:r>
           <w:rPr>
             <w:rStyle w:val="Hyperlink"/>
@@ -15127,8 +15284,8 @@
         </w:r>
       </w:hyperlink>
     </w:p>
-    <w:bookmarkEnd w:id="81"/>
-    <w:bookmarkStart w:id="83" w:name="ref-wikipedia_absolute_risk_reduction"/>
+    <w:bookmarkEnd w:id="82"/>
+    <w:bookmarkStart w:id="83" w:name="ref-me4"/>
     <w:p>
       <w:pPr>
         <w:pStyle w:val="Bibliography"/>
@@ -15143,6 +15300,38 @@
         <w:t xml:space="preserve">	</w:t>
       </w:r>
       <w:r>
+        <w:t xml:space="preserve">K. J. Rothman, T. L. Lash, T. J. VanderWeele, and S. Haneuse,</w:t>
+      </w:r>
+      <w:r>
+        <w:t xml:space="preserve"> </w:t>
+      </w:r>
+      <w:r>
+        <w:rPr>
+          <w:i/>
+          <w:iCs/>
+        </w:rPr>
+        <w:t xml:space="preserve">Modern epidemiology</w:t>
+      </w:r>
+      <w:r>
+        <w:t xml:space="preserve">, 4th ed. Philadelphia: Wolters Kluwer, 2021.</w:t>
+      </w:r>
+    </w:p>
+    <w:bookmarkEnd w:id="83"/>
+    <w:bookmarkStart w:id="85" w:name="ref-wikipedia_absolute_risk_reduction"/>
+    <w:p>
+      <w:pPr>
+        <w:pStyle w:val="Bibliography"/>
+      </w:pPr>
+      <w:r>
+        <w:t xml:space="preserve">[9]</w:t>
+      </w:r>
+      <w:r>
+        <w:t xml:space="preserve"> </w:t>
+      </w:r>
+      <w:r>
+        <w:t xml:space="preserve">	</w:t>
+      </w:r>
+      <w:r>
         <w:t xml:space="preserve">Wikipedia contributors,</w:t>
       </w:r>
       <w:r>
@@ -15175,7 +15364,7 @@
       <w:r>
         <w:t xml:space="preserve"> </w:t>
       </w:r>
-      <w:hyperlink r:id="rId82">
+      <w:hyperlink r:id="rId84">
         <w:r>
           <w:rPr>
             <w:rStyle w:val="Hyperlink"/>
@@ -15184,14 +15373,14 @@
         </w:r>
       </w:hyperlink>
     </w:p>
-    <w:bookmarkEnd w:id="83"/>
-    <w:bookmarkStart w:id="85" w:name="ref-wikipedia_odds_ratio"/>
+    <w:bookmarkEnd w:id="85"/>
+    <w:bookmarkStart w:id="87" w:name="ref-wikipedia_odds_ratio"/>
     <w:p>
       <w:pPr>
         <w:pStyle w:val="Bibliography"/>
       </w:pPr>
       <w:r>
-        <w:t xml:space="preserve">[9]</w:t>
+        <w:t xml:space="preserve">[10]</w:t>
       </w:r>
       <w:r>
         <w:t xml:space="preserve"> </w:t>
@@ -15232,7 +15421,7 @@
       <w:r>
         <w:t xml:space="preserve"> </w:t>
       </w:r>
-      <w:hyperlink r:id="rId84">
+      <w:hyperlink r:id="rId86">
         <w:r>
           <w:rPr>
             <w:rStyle w:val="Hyperlink"/>
@@ -15241,41 +15430,9 @@
         </w:r>
       </w:hyperlink>
     </w:p>
-    <w:bookmarkEnd w:id="85"/>
-    <w:bookmarkStart w:id="86" w:name="ref-me4"/>
-    <w:p>
-      <w:pPr>
-        <w:pStyle w:val="Bibliography"/>
-      </w:pPr>
-      <w:r>
-        <w:t xml:space="preserve">[10]</w:t>
-      </w:r>
-      <w:r>
-        <w:t xml:space="preserve"> </w:t>
-      </w:r>
-      <w:r>
-        <w:t xml:space="preserve">	</w:t>
-      </w:r>
-      <w:r>
-        <w:t xml:space="preserve">K. J. Rothman, T. L. Lash, T. J. VanderWeele, and S. Haneuse,</w:t>
-      </w:r>
-      <w:r>
-        <w:t xml:space="preserve"> </w:t>
-      </w:r>
-      <w:r>
-        <w:rPr>
-          <w:i/>
-          <w:iCs/>
-        </w:rPr>
-        <w:t xml:space="preserve">Modern epidemiology</w:t>
-      </w:r>
-      <w:r>
-        <w:t xml:space="preserve">, 4th ed. Philadelphia: Wolters Kluwer, 2021.</w:t>
-      </w:r>
-    </w:p>
-    <w:bookmarkEnd w:id="86"/>
     <w:bookmarkEnd w:id="87"/>
     <w:bookmarkEnd w:id="88"/>
+    <w:bookmarkEnd w:id="89"/>
     <w:sectPr>
       <w:footnotePr>
         <w:numRestart w:val="eachSect"/>

</xml_diff>

<commit_message>
Deploying to gh-pages from @ Morrison-Lab/sds@5524aed597a0422621f726ca244bca6b4b822460 🚀
</commit_message>
<xml_diff>
--- a/categorical-tests-handout.docx
+++ b/categorical-tests-handout.docx
@@ -15,7 +15,7 @@
         <w:pStyle w:val="Date"/>
       </w:pPr>
       <w:r>
-        <w:t xml:space="preserve">Last modified: 2026-10-19 23:28:03 (PDT)</w:t>
+        <w:t xml:space="preserve">Last modified: 2026-10-19 23:38:52 (PDT)</w:t>
       </w:r>
     </w:p>
     <w:p>
@@ -386,7 +386,7 @@
       </w:r>
     </w:p>
     <w:bookmarkEnd w:id="11"/>
-    <w:bookmarkStart w:id="70" w:name="sec-two-group-categorical"/>
+    <w:bookmarkStart w:id="72" w:name="sec-two-group-categorical"/>
     <w:p>
       <w:pPr>
         <w:pStyle w:val="Heading2"/>
@@ -5006,7 +5006,7 @@
       </w:r>
     </w:p>
     <w:bookmarkEnd w:id="29"/>
-    <w:bookmarkStart w:id="69" w:name="sec-2x2-measures"/>
+    <w:bookmarkStart w:id="71" w:name="sec-2x2-measures"/>
     <w:p>
       <w:pPr>
         <w:pStyle w:val="Heading3"/>
@@ -13943,7 +13943,7 @@
       </w:r>
     </w:p>
     <w:bookmarkEnd w:id="62"/>
-    <w:bookmarkStart w:id="63" w:name="def-case"/>
+    <w:bookmarkStart w:id="63" w:name="thm-conditional-odds-ratio-reversible"/>
     <w:p>
       <w:pPr>
         <w:pStyle w:val="BodyText"/>
@@ -13953,28 +13953,3554 @@
           <w:b/>
           <w:bCs/>
         </w:rPr>
-        <w:t xml:space="preserve">Definition 9 (Case)</w:t>
-      </w:r>
-      <w:r>
-        <w:t xml:space="preserve"> </w:t>
-      </w:r>
-      <w:r>
-        <w:t xml:space="preserve">In a study that selects its participants by whether they have an outcome of interest,</w:t>
-      </w:r>
-      <w:r>
-        <w:t xml:space="preserve"> </w:t>
-      </w:r>
-      <w:r>
-        <w:t xml:space="preserve">a</w:t>
-      </w:r>
-      <w:r>
-        <w:t xml:space="preserve"> </w:t>
-      </w:r>
+        <w:t xml:space="preserve">Theorem 6 (The conditional odds ratio is reversible)</w:t>
+      </w:r>
+      <w:r>
+        <w:t xml:space="preserve"> </w:t>
+      </w:r>
+      <w:r>
+        <w:t xml:space="preserve">Let:</w:t>
+      </w:r>
+    </w:p>
+    <w:p>
+      <w:pPr>
+        <w:pStyle w:val="Compact"/>
+        <w:numPr>
+          <w:ilvl w:val="0"/>
+          <w:numId w:val="1013"/>
+        </w:numPr>
+      </w:pPr>
+      <m:oMath>
+        <m:r>
+          <m:t>X</m:t>
+        </m:r>
+      </m:oMath>
+      <w:r>
+        <w:t xml:space="preserve"> </w:t>
+      </w:r>
+      <w:r>
+        <w:t xml:space="preserve">and</w:t>
+      </w:r>
+      <w:r>
+        <w:t xml:space="preserve"> </w:t>
+      </w:r>
+      <m:oMath>
+        <m:r>
+          <m:t>Y</m:t>
+        </m:r>
+      </m:oMath>
+      <w:r>
+        <w:t xml:space="preserve"> </w:t>
+      </w:r>
+      <w:r>
+        <w:t xml:space="preserve">be</w:t>
+      </w:r>
+      <w:r>
+        <w:t xml:space="preserve"> </w:t>
+      </w:r>
+      <w:hyperlink r:id="rId30">
+        <w:r>
+          <w:rPr>
+            <w:rStyle w:val="Hyperlink"/>
+          </w:rPr>
+          <w:t xml:space="preserve">binary</w:t>
+        </w:r>
+      </w:hyperlink>
+      <w:r>
+        <w:t xml:space="preserve"> </w:t>
+      </w:r>
+      <w:r>
+        <w:t xml:space="preserve">random variables, each with values</w:t>
+      </w:r>
+      <w:r>
+        <w:t xml:space="preserve"> </w:t>
+      </w:r>
+      <m:oMath>
+        <m:r>
+          <m:t>0</m:t>
+        </m:r>
+      </m:oMath>
+      <w:r>
+        <w:t xml:space="preserve"> </w:t>
+      </w:r>
+      <w:r>
+        <w:t xml:space="preserve">and</w:t>
+      </w:r>
+      <w:r>
+        <w:t xml:space="preserve"> </w:t>
+      </w:r>
+      <m:oMath>
+        <m:r>
+          <m:t>1</m:t>
+        </m:r>
+      </m:oMath>
+      <w:r>
+        <w:t xml:space="preserve">.</w:t>
+      </w:r>
+    </w:p>
+    <w:p>
+      <w:pPr>
+        <w:pStyle w:val="Compact"/>
+        <w:numPr>
+          <w:ilvl w:val="0"/>
+          <w:numId w:val="1013"/>
+        </w:numPr>
+      </w:pPr>
+      <m:oMath>
+        <m:r>
+          <m:t>Z</m:t>
+        </m:r>
+      </m:oMath>
+      <w:r>
+        <w:t xml:space="preserve"> </w:t>
+      </w:r>
+      <w:r>
+        <w:t xml:space="preserve">be a random variable, and</w:t>
+      </w:r>
+      <w:r>
+        <w:t xml:space="preserve"> </w:t>
+      </w:r>
+      <m:oMath>
+        <m:r>
+          <m:t>z</m:t>
+        </m:r>
+      </m:oMath>
+      <w:r>
+        <w:t xml:space="preserve"> </w:t>
+      </w:r>
+      <w:r>
+        <w:t xml:space="preserve">be a value of</w:t>
+      </w:r>
+      <w:r>
+        <w:t xml:space="preserve"> </w:t>
+      </w:r>
+      <m:oMath>
+        <m:r>
+          <m:t>Z</m:t>
+        </m:r>
+      </m:oMath>
+      <w:r>
+        <w:t xml:space="preserve">.</w:t>
+      </w:r>
+    </w:p>
+    <w:p>
+      <w:pPr>
+        <w:pStyle w:val="Compact"/>
+        <w:numPr>
+          <w:ilvl w:val="0"/>
+          <w:numId w:val="1013"/>
+        </w:numPr>
+      </w:pPr>
+      <m:oMath>
+        <m:r>
+          <m:rPr>
+            <m:sty m:val="p"/>
+          </m:rPr>
+          <m:t>P</m:t>
+        </m:r>
+        <m:r>
+          <m:t>​</m:t>
+        </m:r>
+        <m:d>
+          <m:dPr>
+            <m:begChr m:val="("/>
+            <m:sepChr m:val=""/>
+            <m:endChr m:val=")"/>
+            <m:grow/>
+          </m:dPr>
+          <m:e>
+            <m:r>
+              <m:t>X</m:t>
+            </m:r>
+            <m:r>
+              <m:rPr>
+                <m:sty m:val="p"/>
+              </m:rPr>
+              <m:t>=</m:t>
+            </m:r>
+            <m:r>
+              <m:t>x</m:t>
+            </m:r>
+            <m:r>
+              <m:rPr>
+                <m:sty m:val="p"/>
+              </m:rPr>
+              <m:t>,</m:t>
+            </m:r>
+            <m:r>
+              <m:t>Y</m:t>
+            </m:r>
+            <m:r>
+              <m:rPr>
+                <m:sty m:val="p"/>
+              </m:rPr>
+              <m:t>=</m:t>
+            </m:r>
+            <m:r>
+              <m:t>y</m:t>
+            </m:r>
+            <m:r>
+              <m:rPr>
+                <m:sty m:val="p"/>
+              </m:rPr>
+              <m:t>,</m:t>
+            </m:r>
+            <m:r>
+              <m:t>Z</m:t>
+            </m:r>
+            <m:r>
+              <m:rPr>
+                <m:sty m:val="p"/>
+              </m:rPr>
+              <m:t>=</m:t>
+            </m:r>
+            <m:r>
+              <m:t>z</m:t>
+            </m:r>
+          </m:e>
+        </m:d>
+        <m:r>
+          <m:t>​</m:t>
+        </m:r>
+        <m:r>
+          <m:rPr>
+            <m:sty m:val="p"/>
+          </m:rPr>
+          <m:t>&gt;</m:t>
+        </m:r>
+        <m:r>
+          <m:t>0</m:t>
+        </m:r>
+      </m:oMath>
+      <w:r>
+        <w:t xml:space="preserve"> </w:t>
+      </w:r>
+      <w:r>
+        <w:t xml:space="preserve">for each</w:t>
+      </w:r>
+      <w:r>
+        <w:t xml:space="preserve"> </w:t>
+      </w:r>
+      <m:oMath>
+        <m:r>
+          <m:t>x</m:t>
+        </m:r>
+        <m:r>
+          <m:rPr>
+            <m:sty m:val="p"/>
+          </m:rPr>
+          <m:t>,</m:t>
+        </m:r>
+        <m:r>
+          <m:t>y</m:t>
+        </m:r>
+        <m:r>
+          <m:rPr>
+            <m:sty m:val="p"/>
+          </m:rPr>
+          <m:t>∈</m:t>
+        </m:r>
+        <m:r>
+          <m:t>​</m:t>
+        </m:r>
+        <m:d>
+          <m:dPr>
+            <m:begChr m:val="{"/>
+            <m:sepChr m:val=""/>
+            <m:endChr m:val="}"/>
+            <m:grow/>
+          </m:dPr>
+          <m:e>
+            <m:r>
+              <m:t>0</m:t>
+            </m:r>
+            <m:r>
+              <m:rPr>
+                <m:sty m:val="p"/>
+              </m:rPr>
+              <m:t>,</m:t>
+            </m:r>
+            <m:r>
+              <m:t>1</m:t>
+            </m:r>
+          </m:e>
+        </m:d>
+        <m:r>
+          <m:t>​</m:t>
+        </m:r>
+      </m:oMath>
+      <w:r>
+        <w:t xml:space="preserve">.</w:t>
+      </w:r>
+    </w:p>
+    <w:p>
+      <w:pPr>
+        <w:pStyle w:val="FirstParagraph"/>
+      </w:pPr>
+      <w:r>
+        <w:t xml:space="preserve">The</w:t>
+      </w:r>
+      <w:r>
+        <w:t xml:space="preserve"> </w:t>
+      </w:r>
+      <w:hyperlink w:anchor="def-odds-ratio">
+        <w:r>
+          <w:rPr>
+            <w:rStyle w:val="Hyperlink"/>
+          </w:rPr>
+          <w:t xml:space="preserve">odds ratio</w:t>
+        </w:r>
+      </w:hyperlink>
+      <w:r>
+        <w:t xml:space="preserve"> </w:t>
+      </w:r>
+      <w:r>
+        <w:t xml:space="preserve">of</w:t>
+      </w:r>
+      <w:r>
+        <w:t xml:space="preserve"> </w:t>
+      </w:r>
+      <m:oMath>
+        <m:r>
+          <m:t>Y</m:t>
+        </m:r>
+        <m:r>
+          <m:rPr>
+            <m:sty m:val="p"/>
+          </m:rPr>
+          <m:t>=</m:t>
+        </m:r>
+        <m:r>
+          <m:t>1</m:t>
+        </m:r>
+      </m:oMath>
+      <w:r>
+        <w:t xml:space="preserve"> </w:t>
+      </w:r>
+      <w:r>
+        <w:t xml:space="preserve">comparing</w:t>
+      </w:r>
+      <w:r>
+        <w:t xml:space="preserve"> </w:t>
+      </w:r>
+      <m:oMath>
+        <m:r>
+          <m:t>X</m:t>
+        </m:r>
+        <m:r>
+          <m:rPr>
+            <m:sty m:val="p"/>
+          </m:rPr>
+          <m:t>=</m:t>
+        </m:r>
+        <m:r>
+          <m:t>1</m:t>
+        </m:r>
+      </m:oMath>
+      <w:r>
+        <w:t xml:space="preserve"> </w:t>
+      </w:r>
+      <w:r>
+        <w:t xml:space="preserve">with the</w:t>
+      </w:r>
+      <w:r>
+        <w:t xml:space="preserve"> </w:t>
+      </w:r>
+      <w:hyperlink w:anchor="def-reference-group">
+        <w:r>
+          <w:rPr>
+            <w:rStyle w:val="Hyperlink"/>
+          </w:rPr>
+          <w:t xml:space="preserve">reference group</w:t>
+        </w:r>
+      </w:hyperlink>
+      <w:r>
+        <w:t xml:space="preserve"> </w:t>
+      </w:r>
+      <m:oMath>
+        <m:r>
+          <m:t>X</m:t>
+        </m:r>
+        <m:r>
+          <m:rPr>
+            <m:sty m:val="p"/>
+          </m:rPr>
+          <m:t>=</m:t>
+        </m:r>
+        <m:r>
+          <m:t>0</m:t>
+        </m:r>
+      </m:oMath>
+      <w:r>
+        <w:t xml:space="preserve">, among the units with</w:t>
+      </w:r>
+      <w:r>
+        <w:t xml:space="preserve"> </w:t>
+      </w:r>
+      <m:oMath>
+        <m:r>
+          <m:t>Z</m:t>
+        </m:r>
+        <m:r>
+          <m:rPr>
+            <m:sty m:val="p"/>
+          </m:rPr>
+          <m:t>=</m:t>
+        </m:r>
+        <m:r>
+          <m:t>z</m:t>
+        </m:r>
+      </m:oMath>
+      <w:r>
+        <w:t xml:space="preserve">, equals the odds ratio of</w:t>
+      </w:r>
+      <w:r>
+        <w:t xml:space="preserve"> </w:t>
+      </w:r>
+      <m:oMath>
+        <m:r>
+          <m:t>X</m:t>
+        </m:r>
+        <m:r>
+          <m:rPr>
+            <m:sty m:val="p"/>
+          </m:rPr>
+          <m:t>=</m:t>
+        </m:r>
+        <m:r>
+          <m:t>1</m:t>
+        </m:r>
+      </m:oMath>
+      <w:r>
+        <w:t xml:space="preserve"> </w:t>
+      </w:r>
+      <w:r>
+        <w:t xml:space="preserve">comparing</w:t>
+      </w:r>
+      <w:r>
+        <w:t xml:space="preserve"> </w:t>
+      </w:r>
+      <m:oMath>
+        <m:r>
+          <m:t>Y</m:t>
+        </m:r>
+        <m:r>
+          <m:rPr>
+            <m:sty m:val="p"/>
+          </m:rPr>
+          <m:t>=</m:t>
+        </m:r>
+        <m:r>
+          <m:t>1</m:t>
+        </m:r>
+      </m:oMath>
+      <w:r>
+        <w:t xml:space="preserve"> </w:t>
+      </w:r>
+      <w:r>
+        <w:t xml:space="preserve">with</w:t>
+      </w:r>
+      <w:r>
+        <w:t xml:space="preserve"> </w:t>
+      </w:r>
+      <m:oMath>
+        <m:r>
+          <m:t>Y</m:t>
+        </m:r>
+        <m:r>
+          <m:rPr>
+            <m:sty m:val="p"/>
+          </m:rPr>
+          <m:t>=</m:t>
+        </m:r>
+        <m:r>
+          <m:t>0</m:t>
+        </m:r>
+      </m:oMath>
+      <w:r>
+        <w:t xml:space="preserve">, among the units with</w:t>
+      </w:r>
+      <w:r>
+        <w:t xml:space="preserve"> </w:t>
+      </w:r>
+      <m:oMath>
+        <m:r>
+          <m:t>Z</m:t>
+        </m:r>
+        <m:r>
+          <m:rPr>
+            <m:sty m:val="p"/>
+          </m:rPr>
+          <m:t>=</m:t>
+        </m:r>
+        <m:r>
+          <m:t>z</m:t>
+        </m:r>
+      </m:oMath>
+      <w:r>
+        <w:t xml:space="preserve">:</w:t>
+      </w:r>
+    </w:p>
+    <w:p>
+      <w:pPr>
+        <w:pStyle w:val="BodyText"/>
+      </w:pPr>
+      <m:oMathPara>
+        <m:oMathParaPr>
+          <m:jc m:val="center"/>
+        </m:oMathParaPr>
+        <m:oMath>
+          <m:sSub>
+            <m:e>
+              <m:r>
+                <m:rPr>
+                  <m:nor/>
+                  <m:sty m:val="p"/>
+                </m:rPr>
+                <m:t>ϙ</m:t>
+              </m:r>
+            </m:e>
+            <m:sub>
+              <m:r>
+                <m:t>ω</m:t>
+              </m:r>
+            </m:sub>
+          </m:sSub>
+          <m:r>
+            <m:t>​</m:t>
+          </m:r>
+          <m:d>
+            <m:dPr>
+              <m:begChr m:val="("/>
+              <m:sepChr m:val=""/>
+              <m:endChr m:val=")"/>
+              <m:grow/>
+            </m:dPr>
+            <m:e>
+              <m:r>
+                <m:t>Y</m:t>
+              </m:r>
+              <m:r>
+                <m:rPr>
+                  <m:sty m:val="p"/>
+                </m:rPr>
+                <m:t>∣</m:t>
+              </m:r>
+              <m:r>
+                <m:t>X</m:t>
+              </m:r>
+              <m:r>
+                <m:rPr>
+                  <m:sty m:val="p"/>
+                </m:rPr>
+                <m:t>,</m:t>
+              </m:r>
+              <m:r>
+                <m:t>Z</m:t>
+              </m:r>
+              <m:r>
+                <m:rPr>
+                  <m:sty m:val="p"/>
+                </m:rPr>
+                <m:t>=</m:t>
+              </m:r>
+              <m:r>
+                <m:t>z</m:t>
+              </m:r>
+            </m:e>
+          </m:d>
+          <m:r>
+            <m:t>​</m:t>
+          </m:r>
+          <m:r>
+            <m:rPr>
+              <m:sty m:val="p"/>
+            </m:rPr>
+            <m:t>=</m:t>
+          </m:r>
+          <m:sSub>
+            <m:e>
+              <m:r>
+                <m:rPr>
+                  <m:nor/>
+                  <m:sty m:val="p"/>
+                </m:rPr>
+                <m:t>ϙ</m:t>
+              </m:r>
+            </m:e>
+            <m:sub>
+              <m:r>
+                <m:t>ω</m:t>
+              </m:r>
+            </m:sub>
+          </m:sSub>
+          <m:r>
+            <m:t>​</m:t>
+          </m:r>
+          <m:d>
+            <m:dPr>
+              <m:begChr m:val="("/>
+              <m:sepChr m:val=""/>
+              <m:endChr m:val=")"/>
+              <m:grow/>
+            </m:dPr>
+            <m:e>
+              <m:r>
+                <m:t>X</m:t>
+              </m:r>
+              <m:r>
+                <m:rPr>
+                  <m:sty m:val="p"/>
+                </m:rPr>
+                <m:t>∣</m:t>
+              </m:r>
+              <m:r>
+                <m:t>Y</m:t>
+              </m:r>
+              <m:r>
+                <m:rPr>
+                  <m:sty m:val="p"/>
+                </m:rPr>
+                <m:t>,</m:t>
+              </m:r>
+              <m:r>
+                <m:t>Z</m:t>
+              </m:r>
+              <m:r>
+                <m:rPr>
+                  <m:sty m:val="p"/>
+                </m:rPr>
+                <m:t>=</m:t>
+              </m:r>
+              <m:r>
+                <m:t>z</m:t>
+              </m:r>
+            </m:e>
+          </m:d>
+          <m:r>
+            <m:t>​</m:t>
+          </m:r>
+          <m:r>
+            <m:rPr>
+              <m:sty m:val="p"/>
+            </m:rPr>
+            <m:t>.</m:t>
+          </m:r>
+        </m:oMath>
+      </m:oMathPara>
+    </w:p>
+    <w:bookmarkEnd w:id="63"/>
+    <w:p>
+      <w:pPr>
+        <w:pStyle w:val="FirstParagraph"/>
+      </w:pPr>
+      <w:r>
+        <w:rPr>
+          <w:i/>
+          <w:iCs/>
+        </w:rPr>
+        <w:t xml:space="preserve">Proof</w:t>
+      </w:r>
+      <w:r>
+        <w:t xml:space="preserve">. </w:t>
+      </w:r>
+      <w:r>
+        <w:t xml:space="preserve">First, find the</w:t>
+      </w:r>
+      <w:r>
+        <w:t xml:space="preserve"> </w:t>
+      </w:r>
+      <w:hyperlink r:id="rId54">
+        <w:r>
+          <w:rPr>
+            <w:rStyle w:val="Hyperlink"/>
+          </w:rPr>
+          <w:t xml:space="preserve">odds</w:t>
+        </w:r>
+      </w:hyperlink>
+      <w:r>
+        <w:t xml:space="preserve"> </w:t>
+      </w:r>
+      <w:r>
+        <w:t xml:space="preserve">of</w:t>
+      </w:r>
+      <w:r>
+        <w:t xml:space="preserve"> </w:t>
+      </w:r>
+      <m:oMath>
+        <m:r>
+          <m:t>Y</m:t>
+        </m:r>
+        <m:r>
+          <m:rPr>
+            <m:sty m:val="p"/>
+          </m:rPr>
+          <m:t>=</m:t>
+        </m:r>
+        <m:r>
+          <m:t>1</m:t>
+        </m:r>
+      </m:oMath>
+      <w:r>
+        <w:t xml:space="preserve"> </w:t>
+      </w:r>
+      <w:r>
+        <w:t xml:space="preserve">in the group</w:t>
+      </w:r>
+      <w:r>
+        <w:t xml:space="preserve"> </w:t>
+      </w:r>
+      <m:oMath>
+        <m:r>
+          <m:t>X</m:t>
+        </m:r>
+        <m:r>
+          <m:rPr>
+            <m:sty m:val="p"/>
+          </m:rPr>
+          <m:t>=</m:t>
+        </m:r>
+        <m:r>
+          <m:t>x</m:t>
+        </m:r>
+      </m:oMath>
+      <w:r>
+        <w:t xml:space="preserve"> </w:t>
+      </w:r>
+      <w:r>
+        <w:t xml:space="preserve">among the units with</w:t>
+      </w:r>
+      <w:r>
+        <w:t xml:space="preserve"> </w:t>
+      </w:r>
+      <m:oMath>
+        <m:r>
+          <m:t>Z</m:t>
+        </m:r>
+        <m:r>
+          <m:rPr>
+            <m:sty m:val="p"/>
+          </m:rPr>
+          <m:t>=</m:t>
+        </m:r>
+        <m:r>
+          <m:t>z</m:t>
+        </m:r>
+      </m:oMath>
+      <w:r>
+        <w:t xml:space="preserve">:</w:t>
+      </w:r>
+    </w:p>
+    <w:p>
+      <w:pPr>
+        <w:pStyle w:val="BodyText"/>
+      </w:pPr>
+      <m:oMathPara>
+        <m:oMathParaPr>
+          <m:jc m:val="center"/>
+        </m:oMathParaPr>
+        <m:oMath>
+          <m:eqArr>
+            <m:e>
+              <m:sSub>
+                <m:e>
+                  <m:r>
+                    <m:t>ω</m:t>
+                  </m:r>
+                </m:e>
+                <m:sub>
+                  <m:r>
+                    <m:t>x</m:t>
+                  </m:r>
+                </m:sub>
+              </m:sSub>
+              <m:r>
+                <m:t>&amp;</m:t>
+              </m:r>
+              <m:r>
+                <m:rPr>
+                  <m:sty m:val="p"/>
+                </m:rPr>
+                <m:t>=</m:t>
+              </m:r>
+              <m:f>
+                <m:fPr>
+                  <m:type m:val="bar"/>
+                </m:fPr>
+                <m:num>
+                  <m:r>
+                    <m:rPr>
+                      <m:sty m:val="p"/>
+                    </m:rPr>
+                    <m:t>P</m:t>
+                  </m:r>
+                  <m:r>
+                    <m:t>​</m:t>
+                  </m:r>
+                  <m:d>
+                    <m:dPr>
+                      <m:begChr m:val="("/>
+                      <m:sepChr m:val=""/>
+                      <m:endChr m:val=")"/>
+                      <m:grow/>
+                    </m:dPr>
+                    <m:e>
+                      <m:r>
+                        <m:t>Y</m:t>
+                      </m:r>
+                      <m:r>
+                        <m:rPr>
+                          <m:sty m:val="p"/>
+                        </m:rPr>
+                        <m:t>=</m:t>
+                      </m:r>
+                      <m:r>
+                        <m:t>1</m:t>
+                      </m:r>
+                      <m:r>
+                        <m:rPr>
+                          <m:sty m:val="p"/>
+                        </m:rPr>
+                        <m:t>∣</m:t>
+                      </m:r>
+                      <m:r>
+                        <m:t>X</m:t>
+                      </m:r>
+                      <m:r>
+                        <m:rPr>
+                          <m:sty m:val="p"/>
+                        </m:rPr>
+                        <m:t>=</m:t>
+                      </m:r>
+                      <m:r>
+                        <m:t>x</m:t>
+                      </m:r>
+                      <m:r>
+                        <m:rPr>
+                          <m:sty m:val="p"/>
+                        </m:rPr>
+                        <m:t>,</m:t>
+                      </m:r>
+                      <m:r>
+                        <m:t>Z</m:t>
+                      </m:r>
+                      <m:r>
+                        <m:rPr>
+                          <m:sty m:val="p"/>
+                        </m:rPr>
+                        <m:t>=</m:t>
+                      </m:r>
+                      <m:r>
+                        <m:t>z</m:t>
+                      </m:r>
+                    </m:e>
+                  </m:d>
+                  <m:r>
+                    <m:t>​</m:t>
+                  </m:r>
+                </m:num>
+                <m:den>
+                  <m:r>
+                    <m:t>1</m:t>
+                  </m:r>
+                  <m:r>
+                    <m:rPr>
+                      <m:sty m:val="p"/>
+                    </m:rPr>
+                    <m:t>−</m:t>
+                  </m:r>
+                  <m:r>
+                    <m:rPr>
+                      <m:sty m:val="p"/>
+                    </m:rPr>
+                    <m:t>P</m:t>
+                  </m:r>
+                  <m:r>
+                    <m:t>​</m:t>
+                  </m:r>
+                  <m:d>
+                    <m:dPr>
+                      <m:begChr m:val="("/>
+                      <m:sepChr m:val=""/>
+                      <m:endChr m:val=")"/>
+                      <m:grow/>
+                    </m:dPr>
+                    <m:e>
+                      <m:r>
+                        <m:t>Y</m:t>
+                      </m:r>
+                      <m:r>
+                        <m:rPr>
+                          <m:sty m:val="p"/>
+                        </m:rPr>
+                        <m:t>=</m:t>
+                      </m:r>
+                      <m:r>
+                        <m:t>1</m:t>
+                      </m:r>
+                      <m:r>
+                        <m:rPr>
+                          <m:sty m:val="p"/>
+                        </m:rPr>
+                        <m:t>∣</m:t>
+                      </m:r>
+                      <m:r>
+                        <m:t>X</m:t>
+                      </m:r>
+                      <m:r>
+                        <m:rPr>
+                          <m:sty m:val="p"/>
+                        </m:rPr>
+                        <m:t>=</m:t>
+                      </m:r>
+                      <m:r>
+                        <m:t>x</m:t>
+                      </m:r>
+                      <m:r>
+                        <m:rPr>
+                          <m:sty m:val="p"/>
+                        </m:rPr>
+                        <m:t>,</m:t>
+                      </m:r>
+                      <m:r>
+                        <m:t>Z</m:t>
+                      </m:r>
+                      <m:r>
+                        <m:rPr>
+                          <m:sty m:val="p"/>
+                        </m:rPr>
+                        <m:t>=</m:t>
+                      </m:r>
+                      <m:r>
+                        <m:t>z</m:t>
+                      </m:r>
+                    </m:e>
+                  </m:d>
+                  <m:r>
+                    <m:t>​</m:t>
+                  </m:r>
+                </m:den>
+              </m:f>
+              <m:r>
+                <m:t>&amp;</m:t>
+              </m:r>
+              <m:r>
+                <m:t>&amp;</m:t>
+              </m:r>
+              <m:r>
+                <m:rPr>
+                  <m:nor/>
+                  <m:sty m:val="p"/>
+                </m:rPr>
+                <m:t>(definition of odds)</m:t>
+              </m:r>
+            </m:e>
+            <m:e>
+              <m:r>
+                <m:t>&amp;</m:t>
+              </m:r>
+              <m:r>
+                <m:rPr>
+                  <m:sty m:val="p"/>
+                </m:rPr>
+                <m:t>=</m:t>
+              </m:r>
+              <m:f>
+                <m:fPr>
+                  <m:type m:val="bar"/>
+                </m:fPr>
+                <m:num>
+                  <m:r>
+                    <m:rPr>
+                      <m:sty m:val="p"/>
+                    </m:rPr>
+                    <m:t>P</m:t>
+                  </m:r>
+                  <m:r>
+                    <m:t>​</m:t>
+                  </m:r>
+                  <m:d>
+                    <m:dPr>
+                      <m:begChr m:val="("/>
+                      <m:sepChr m:val=""/>
+                      <m:endChr m:val=")"/>
+                      <m:grow/>
+                    </m:dPr>
+                    <m:e>
+                      <m:r>
+                        <m:t>Y</m:t>
+                      </m:r>
+                      <m:r>
+                        <m:rPr>
+                          <m:sty m:val="p"/>
+                        </m:rPr>
+                        <m:t>=</m:t>
+                      </m:r>
+                      <m:r>
+                        <m:t>1</m:t>
+                      </m:r>
+                      <m:r>
+                        <m:rPr>
+                          <m:sty m:val="p"/>
+                        </m:rPr>
+                        <m:t>∣</m:t>
+                      </m:r>
+                      <m:r>
+                        <m:t>X</m:t>
+                      </m:r>
+                      <m:r>
+                        <m:rPr>
+                          <m:sty m:val="p"/>
+                        </m:rPr>
+                        <m:t>=</m:t>
+                      </m:r>
+                      <m:r>
+                        <m:t>x</m:t>
+                      </m:r>
+                      <m:r>
+                        <m:rPr>
+                          <m:sty m:val="p"/>
+                        </m:rPr>
+                        <m:t>,</m:t>
+                      </m:r>
+                      <m:r>
+                        <m:t>Z</m:t>
+                      </m:r>
+                      <m:r>
+                        <m:rPr>
+                          <m:sty m:val="p"/>
+                        </m:rPr>
+                        <m:t>=</m:t>
+                      </m:r>
+                      <m:r>
+                        <m:t>z</m:t>
+                      </m:r>
+                    </m:e>
+                  </m:d>
+                  <m:r>
+                    <m:t>​</m:t>
+                  </m:r>
+                </m:num>
+                <m:den>
+                  <m:r>
+                    <m:rPr>
+                      <m:sty m:val="p"/>
+                    </m:rPr>
+                    <m:t>P</m:t>
+                  </m:r>
+                  <m:r>
+                    <m:t>​</m:t>
+                  </m:r>
+                  <m:d>
+                    <m:dPr>
+                      <m:begChr m:val="("/>
+                      <m:sepChr m:val=""/>
+                      <m:endChr m:val=")"/>
+                      <m:grow/>
+                    </m:dPr>
+                    <m:e>
+                      <m:r>
+                        <m:t>Y</m:t>
+                      </m:r>
+                      <m:r>
+                        <m:rPr>
+                          <m:sty m:val="p"/>
+                        </m:rPr>
+                        <m:t>=</m:t>
+                      </m:r>
+                      <m:r>
+                        <m:t>0</m:t>
+                      </m:r>
+                      <m:r>
+                        <m:rPr>
+                          <m:sty m:val="p"/>
+                        </m:rPr>
+                        <m:t>∣</m:t>
+                      </m:r>
+                      <m:r>
+                        <m:t>X</m:t>
+                      </m:r>
+                      <m:r>
+                        <m:rPr>
+                          <m:sty m:val="p"/>
+                        </m:rPr>
+                        <m:t>=</m:t>
+                      </m:r>
+                      <m:r>
+                        <m:t>x</m:t>
+                      </m:r>
+                      <m:r>
+                        <m:rPr>
+                          <m:sty m:val="p"/>
+                        </m:rPr>
+                        <m:t>,</m:t>
+                      </m:r>
+                      <m:r>
+                        <m:t>Z</m:t>
+                      </m:r>
+                      <m:r>
+                        <m:rPr>
+                          <m:sty m:val="p"/>
+                        </m:rPr>
+                        <m:t>=</m:t>
+                      </m:r>
+                      <m:r>
+                        <m:t>z</m:t>
+                      </m:r>
+                    </m:e>
+                  </m:d>
+                  <m:r>
+                    <m:t>​</m:t>
+                  </m:r>
+                </m:den>
+              </m:f>
+              <m:r>
+                <m:t>&amp;</m:t>
+              </m:r>
+              <m:r>
+                <m:t>&amp;</m:t>
+              </m:r>
+              <m:r>
+                <m:rPr>
+                  <m:nor/>
+                  <m:sty m:val="p"/>
+                </m:rPr>
+                <m:t>(the two values of </m:t>
+              </m:r>
+              <m:r>
+                <m:t>Y</m:t>
+              </m:r>
+              <m:r>
+                <m:rPr>
+                  <m:nor/>
+                  <m:sty m:val="p"/>
+                </m:rPr>
+                <m:t> have conditional probabilities that sum to 1)</m:t>
+              </m:r>
+            </m:e>
+            <m:e>
+              <m:r>
+                <m:t>&amp;</m:t>
+              </m:r>
+              <m:r>
+                <m:rPr>
+                  <m:sty m:val="p"/>
+                </m:rPr>
+                <m:t>=</m:t>
+              </m:r>
+              <m:f>
+                <m:fPr>
+                  <m:type m:val="bar"/>
+                </m:fPr>
+                <m:num>
+                  <m:r>
+                    <m:rPr>
+                      <m:sty m:val="p"/>
+                    </m:rPr>
+                    <m:t>P</m:t>
+                  </m:r>
+                  <m:r>
+                    <m:t>​</m:t>
+                  </m:r>
+                  <m:d>
+                    <m:dPr>
+                      <m:begChr m:val="("/>
+                      <m:sepChr m:val=""/>
+                      <m:endChr m:val=")"/>
+                      <m:grow/>
+                    </m:dPr>
+                    <m:e>
+                      <m:r>
+                        <m:t>X</m:t>
+                      </m:r>
+                      <m:r>
+                        <m:rPr>
+                          <m:sty m:val="p"/>
+                        </m:rPr>
+                        <m:t>=</m:t>
+                      </m:r>
+                      <m:r>
+                        <m:t>x</m:t>
+                      </m:r>
+                      <m:r>
+                        <m:rPr>
+                          <m:sty m:val="p"/>
+                        </m:rPr>
+                        <m:t>,</m:t>
+                      </m:r>
+                      <m:r>
+                        <m:t>Y</m:t>
+                      </m:r>
+                      <m:r>
+                        <m:rPr>
+                          <m:sty m:val="p"/>
+                        </m:rPr>
+                        <m:t>=</m:t>
+                      </m:r>
+                      <m:r>
+                        <m:t>1</m:t>
+                      </m:r>
+                      <m:r>
+                        <m:rPr>
+                          <m:sty m:val="p"/>
+                        </m:rPr>
+                        <m:t>,</m:t>
+                      </m:r>
+                      <m:r>
+                        <m:t>Z</m:t>
+                      </m:r>
+                      <m:r>
+                        <m:rPr>
+                          <m:sty m:val="p"/>
+                        </m:rPr>
+                        <m:t>=</m:t>
+                      </m:r>
+                      <m:r>
+                        <m:t>z</m:t>
+                      </m:r>
+                    </m:e>
+                  </m:d>
+                  <m:r>
+                    <m:t>​</m:t>
+                  </m:r>
+                  <m:r>
+                    <m:rPr>
+                      <m:sty m:val="p"/>
+                    </m:rPr>
+                    <m:t>/</m:t>
+                  </m:r>
+                  <m:r>
+                    <m:rPr>
+                      <m:sty m:val="p"/>
+                    </m:rPr>
+                    <m:t>P</m:t>
+                  </m:r>
+                  <m:r>
+                    <m:t>​</m:t>
+                  </m:r>
+                  <m:d>
+                    <m:dPr>
+                      <m:begChr m:val="("/>
+                      <m:sepChr m:val=""/>
+                      <m:endChr m:val=")"/>
+                      <m:grow/>
+                    </m:dPr>
+                    <m:e>
+                      <m:r>
+                        <m:t>X</m:t>
+                      </m:r>
+                      <m:r>
+                        <m:rPr>
+                          <m:sty m:val="p"/>
+                        </m:rPr>
+                        <m:t>=</m:t>
+                      </m:r>
+                      <m:r>
+                        <m:t>x</m:t>
+                      </m:r>
+                      <m:r>
+                        <m:rPr>
+                          <m:sty m:val="p"/>
+                        </m:rPr>
+                        <m:t>,</m:t>
+                      </m:r>
+                      <m:r>
+                        <m:t>Z</m:t>
+                      </m:r>
+                      <m:r>
+                        <m:rPr>
+                          <m:sty m:val="p"/>
+                        </m:rPr>
+                        <m:t>=</m:t>
+                      </m:r>
+                      <m:r>
+                        <m:t>z</m:t>
+                      </m:r>
+                    </m:e>
+                  </m:d>
+                  <m:r>
+                    <m:t>​</m:t>
+                  </m:r>
+                </m:num>
+                <m:den>
+                  <m:r>
+                    <m:rPr>
+                      <m:sty m:val="p"/>
+                    </m:rPr>
+                    <m:t>P</m:t>
+                  </m:r>
+                  <m:r>
+                    <m:t>​</m:t>
+                  </m:r>
+                  <m:d>
+                    <m:dPr>
+                      <m:begChr m:val="("/>
+                      <m:sepChr m:val=""/>
+                      <m:endChr m:val=")"/>
+                      <m:grow/>
+                    </m:dPr>
+                    <m:e>
+                      <m:r>
+                        <m:t>X</m:t>
+                      </m:r>
+                      <m:r>
+                        <m:rPr>
+                          <m:sty m:val="p"/>
+                        </m:rPr>
+                        <m:t>=</m:t>
+                      </m:r>
+                      <m:r>
+                        <m:t>x</m:t>
+                      </m:r>
+                      <m:r>
+                        <m:rPr>
+                          <m:sty m:val="p"/>
+                        </m:rPr>
+                        <m:t>,</m:t>
+                      </m:r>
+                      <m:r>
+                        <m:t>Y</m:t>
+                      </m:r>
+                      <m:r>
+                        <m:rPr>
+                          <m:sty m:val="p"/>
+                        </m:rPr>
+                        <m:t>=</m:t>
+                      </m:r>
+                      <m:r>
+                        <m:t>0</m:t>
+                      </m:r>
+                      <m:r>
+                        <m:rPr>
+                          <m:sty m:val="p"/>
+                        </m:rPr>
+                        <m:t>,</m:t>
+                      </m:r>
+                      <m:r>
+                        <m:t>Z</m:t>
+                      </m:r>
+                      <m:r>
+                        <m:rPr>
+                          <m:sty m:val="p"/>
+                        </m:rPr>
+                        <m:t>=</m:t>
+                      </m:r>
+                      <m:r>
+                        <m:t>z</m:t>
+                      </m:r>
+                    </m:e>
+                  </m:d>
+                  <m:r>
+                    <m:t>​</m:t>
+                  </m:r>
+                  <m:r>
+                    <m:rPr>
+                      <m:sty m:val="p"/>
+                    </m:rPr>
+                    <m:t>/</m:t>
+                  </m:r>
+                  <m:r>
+                    <m:rPr>
+                      <m:sty m:val="p"/>
+                    </m:rPr>
+                    <m:t>P</m:t>
+                  </m:r>
+                  <m:r>
+                    <m:t>​</m:t>
+                  </m:r>
+                  <m:d>
+                    <m:dPr>
+                      <m:begChr m:val="("/>
+                      <m:sepChr m:val=""/>
+                      <m:endChr m:val=")"/>
+                      <m:grow/>
+                    </m:dPr>
+                    <m:e>
+                      <m:r>
+                        <m:t>X</m:t>
+                      </m:r>
+                      <m:r>
+                        <m:rPr>
+                          <m:sty m:val="p"/>
+                        </m:rPr>
+                        <m:t>=</m:t>
+                      </m:r>
+                      <m:r>
+                        <m:t>x</m:t>
+                      </m:r>
+                      <m:r>
+                        <m:rPr>
+                          <m:sty m:val="p"/>
+                        </m:rPr>
+                        <m:t>,</m:t>
+                      </m:r>
+                      <m:r>
+                        <m:t>Z</m:t>
+                      </m:r>
+                      <m:r>
+                        <m:rPr>
+                          <m:sty m:val="p"/>
+                        </m:rPr>
+                        <m:t>=</m:t>
+                      </m:r>
+                      <m:r>
+                        <m:t>z</m:t>
+                      </m:r>
+                    </m:e>
+                  </m:d>
+                  <m:r>
+                    <m:t>​</m:t>
+                  </m:r>
+                </m:den>
+              </m:f>
+              <m:r>
+                <m:t>&amp;</m:t>
+              </m:r>
+              <m:r>
+                <m:t>&amp;</m:t>
+              </m:r>
+              <m:r>
+                <m:rPr>
+                  <m:nor/>
+                  <m:sty m:val="p"/>
+                </m:rPr>
+                <m:t>(definition of conditional probability, in numerator and denominator)</m:t>
+              </m:r>
+            </m:e>
+            <m:e>
+              <m:r>
+                <m:t>&amp;</m:t>
+              </m:r>
+              <m:r>
+                <m:rPr>
+                  <m:sty m:val="p"/>
+                </m:rPr>
+                <m:t>=</m:t>
+              </m:r>
+              <m:f>
+                <m:fPr>
+                  <m:type m:val="bar"/>
+                </m:fPr>
+                <m:num>
+                  <m:r>
+                    <m:rPr>
+                      <m:sty m:val="p"/>
+                    </m:rPr>
+                    <m:t>P</m:t>
+                  </m:r>
+                  <m:r>
+                    <m:t>​</m:t>
+                  </m:r>
+                  <m:d>
+                    <m:dPr>
+                      <m:begChr m:val="("/>
+                      <m:sepChr m:val=""/>
+                      <m:endChr m:val=")"/>
+                      <m:grow/>
+                    </m:dPr>
+                    <m:e>
+                      <m:r>
+                        <m:t>X</m:t>
+                      </m:r>
+                      <m:r>
+                        <m:rPr>
+                          <m:sty m:val="p"/>
+                        </m:rPr>
+                        <m:t>=</m:t>
+                      </m:r>
+                      <m:r>
+                        <m:t>x</m:t>
+                      </m:r>
+                      <m:r>
+                        <m:rPr>
+                          <m:sty m:val="p"/>
+                        </m:rPr>
+                        <m:t>,</m:t>
+                      </m:r>
+                      <m:r>
+                        <m:t>Y</m:t>
+                      </m:r>
+                      <m:r>
+                        <m:rPr>
+                          <m:sty m:val="p"/>
+                        </m:rPr>
+                        <m:t>=</m:t>
+                      </m:r>
+                      <m:r>
+                        <m:t>1</m:t>
+                      </m:r>
+                      <m:r>
+                        <m:rPr>
+                          <m:sty m:val="p"/>
+                        </m:rPr>
+                        <m:t>,</m:t>
+                      </m:r>
+                      <m:r>
+                        <m:t>Z</m:t>
+                      </m:r>
+                      <m:r>
+                        <m:rPr>
+                          <m:sty m:val="p"/>
+                        </m:rPr>
+                        <m:t>=</m:t>
+                      </m:r>
+                      <m:r>
+                        <m:t>z</m:t>
+                      </m:r>
+                    </m:e>
+                  </m:d>
+                  <m:r>
+                    <m:t>​</m:t>
+                  </m:r>
+                </m:num>
+                <m:den>
+                  <m:r>
+                    <m:rPr>
+                      <m:sty m:val="p"/>
+                    </m:rPr>
+                    <m:t>P</m:t>
+                  </m:r>
+                  <m:r>
+                    <m:t>​</m:t>
+                  </m:r>
+                  <m:d>
+                    <m:dPr>
+                      <m:begChr m:val="("/>
+                      <m:sepChr m:val=""/>
+                      <m:endChr m:val=")"/>
+                      <m:grow/>
+                    </m:dPr>
+                    <m:e>
+                      <m:r>
+                        <m:t>X</m:t>
+                      </m:r>
+                      <m:r>
+                        <m:rPr>
+                          <m:sty m:val="p"/>
+                        </m:rPr>
+                        <m:t>=</m:t>
+                      </m:r>
+                      <m:r>
+                        <m:t>x</m:t>
+                      </m:r>
+                      <m:r>
+                        <m:rPr>
+                          <m:sty m:val="p"/>
+                        </m:rPr>
+                        <m:t>,</m:t>
+                      </m:r>
+                      <m:r>
+                        <m:t>Y</m:t>
+                      </m:r>
+                      <m:r>
+                        <m:rPr>
+                          <m:sty m:val="p"/>
+                        </m:rPr>
+                        <m:t>=</m:t>
+                      </m:r>
+                      <m:r>
+                        <m:t>0</m:t>
+                      </m:r>
+                      <m:r>
+                        <m:rPr>
+                          <m:sty m:val="p"/>
+                        </m:rPr>
+                        <m:t>,</m:t>
+                      </m:r>
+                      <m:r>
+                        <m:t>Z</m:t>
+                      </m:r>
+                      <m:r>
+                        <m:rPr>
+                          <m:sty m:val="p"/>
+                        </m:rPr>
+                        <m:t>=</m:t>
+                      </m:r>
+                      <m:r>
+                        <m:t>z</m:t>
+                      </m:r>
+                    </m:e>
+                  </m:d>
+                  <m:r>
+                    <m:t>​</m:t>
+                  </m:r>
+                </m:den>
+              </m:f>
+              <m:r>
+                <m:t>&amp;</m:t>
+              </m:r>
+              <m:r>
+                <m:t>&amp;</m:t>
+              </m:r>
+              <m:r>
+                <m:rPr>
+                  <m:nor/>
+                  <m:sty m:val="p"/>
+                </m:rPr>
+                <m:t>(divide the numerator and the denominator by the same positive number </m:t>
+              </m:r>
+              <m:r>
+                <m:rPr>
+                  <m:sty m:val="p"/>
+                </m:rPr>
+                <m:t>P</m:t>
+              </m:r>
+              <m:r>
+                <m:t>​</m:t>
+              </m:r>
+              <m:d>
+                <m:dPr>
+                  <m:begChr m:val="("/>
+                  <m:sepChr m:val=""/>
+                  <m:endChr m:val=")"/>
+                  <m:grow/>
+                </m:dPr>
+                <m:e>
+                  <m:r>
+                    <m:t>X</m:t>
+                  </m:r>
+                  <m:r>
+                    <m:rPr>
+                      <m:sty m:val="p"/>
+                    </m:rPr>
+                    <m:t>=</m:t>
+                  </m:r>
+                  <m:r>
+                    <m:t>x</m:t>
+                  </m:r>
+                  <m:r>
+                    <m:rPr>
+                      <m:sty m:val="p"/>
+                    </m:rPr>
+                    <m:t>,</m:t>
+                  </m:r>
+                  <m:r>
+                    <m:t>Z</m:t>
+                  </m:r>
+                  <m:r>
+                    <m:rPr>
+                      <m:sty m:val="p"/>
+                    </m:rPr>
+                    <m:t>=</m:t>
+                  </m:r>
+                  <m:r>
+                    <m:t>z</m:t>
+                  </m:r>
+                </m:e>
+              </m:d>
+              <m:r>
+                <m:t>​</m:t>
+              </m:r>
+              <m:r>
+                <m:rPr>
+                  <m:nor/>
+                  <m:sty m:val="p"/>
+                </m:rPr>
+                <m:t>)</m:t>
+              </m:r>
+            </m:e>
+          </m:eqArr>
+        </m:oMath>
+      </m:oMathPara>
+    </w:p>
+    <w:p>
+      <w:pPr>
+        <w:pStyle w:val="FirstParagraph"/>
+      </w:pPr>
+      <w:r>
+        <w:t xml:space="preserve">The</w:t>
+      </w:r>
+      <w:r>
+        <w:t xml:space="preserve"> </w:t>
+      </w:r>
+      <w:hyperlink w:anchor="def-odds-ratio">
+        <w:r>
+          <w:rPr>
+            <w:rStyle w:val="Hyperlink"/>
+          </w:rPr>
+          <w:t xml:space="preserve">odds ratio</w:t>
+        </w:r>
+      </w:hyperlink>
+      <w:r>
+        <w:t xml:space="preserve"> </w:t>
+      </w:r>
+      <w:r>
+        <w:t xml:space="preserve">is the odds</w:t>
+      </w:r>
+      <w:r>
+        <w:t xml:space="preserve"> </w:t>
+      </w:r>
+      <m:oMath>
+        <m:sSub>
+          <m:e>
+            <m:r>
+              <m:t>ω</m:t>
+            </m:r>
+          </m:e>
+          <m:sub>
+            <m:r>
+              <m:t>1</m:t>
+            </m:r>
+          </m:sub>
+        </m:sSub>
+      </m:oMath>
+      <w:r>
+        <w:t xml:space="preserve"> </w:t>
+      </w:r>
+      <w:r>
+        <w:t xml:space="preserve">divided by the odds</w:t>
+      </w:r>
+      <w:r>
+        <w:t xml:space="preserve"> </w:t>
+      </w:r>
+      <m:oMath>
+        <m:sSub>
+          <m:e>
+            <m:r>
+              <m:t>ω</m:t>
+            </m:r>
+          </m:e>
+          <m:sub>
+            <m:r>
+              <m:t>0</m:t>
+            </m:r>
+          </m:sub>
+        </m:sSub>
+      </m:oMath>
+      <w:r>
+        <w:t xml:space="preserve">.</w:t>
+      </w:r>
+      <w:r>
+        <w:t xml:space="preserve"> </w:t>
+      </w:r>
+      <w:r>
+        <w:t xml:space="preserve">Dividing by a fraction is multiplying by its reciprocal, so</w:t>
+      </w:r>
+    </w:p>
+    <w:p>
+      <w:pPr>
+        <w:pStyle w:val="BodyText"/>
+      </w:pPr>
+      <m:oMathPara>
+        <m:oMathParaPr>
+          <m:jc m:val="center"/>
+        </m:oMathParaPr>
+        <m:oMath>
+          <m:sSub>
+            <m:e>
+              <m:r>
+                <m:rPr>
+                  <m:nor/>
+                  <m:sty m:val="p"/>
+                </m:rPr>
+                <m:t>ϙ</m:t>
+              </m:r>
+            </m:e>
+            <m:sub>
+              <m:r>
+                <m:t>ω</m:t>
+              </m:r>
+            </m:sub>
+          </m:sSub>
+          <m:r>
+            <m:t>​</m:t>
+          </m:r>
+          <m:d>
+            <m:dPr>
+              <m:begChr m:val="("/>
+              <m:sepChr m:val=""/>
+              <m:endChr m:val=")"/>
+              <m:grow/>
+            </m:dPr>
+            <m:e>
+              <m:r>
+                <m:t>Y</m:t>
+              </m:r>
+              <m:r>
+                <m:rPr>
+                  <m:sty m:val="p"/>
+                </m:rPr>
+                <m:t>∣</m:t>
+              </m:r>
+              <m:r>
+                <m:t>X</m:t>
+              </m:r>
+              <m:r>
+                <m:rPr>
+                  <m:sty m:val="p"/>
+                </m:rPr>
+                <m:t>,</m:t>
+              </m:r>
+              <m:r>
+                <m:t>Z</m:t>
+              </m:r>
+              <m:r>
+                <m:rPr>
+                  <m:sty m:val="p"/>
+                </m:rPr>
+                <m:t>=</m:t>
+              </m:r>
+              <m:r>
+                <m:t>z</m:t>
+              </m:r>
+            </m:e>
+          </m:d>
+          <m:r>
+            <m:t>​</m:t>
+          </m:r>
+          <m:r>
+            <m:rPr>
+              <m:sty m:val="p"/>
+            </m:rPr>
+            <m:t>=</m:t>
+          </m:r>
+          <m:f>
+            <m:fPr>
+              <m:type m:val="bar"/>
+            </m:fPr>
+            <m:num>
+              <m:r>
+                <m:rPr>
+                  <m:sty m:val="p"/>
+                </m:rPr>
+                <m:t>P</m:t>
+              </m:r>
+              <m:r>
+                <m:t>​</m:t>
+              </m:r>
+              <m:d>
+                <m:dPr>
+                  <m:begChr m:val="("/>
+                  <m:sepChr m:val=""/>
+                  <m:endChr m:val=")"/>
+                  <m:grow/>
+                </m:dPr>
+                <m:e>
+                  <m:r>
+                    <m:t>X</m:t>
+                  </m:r>
+                  <m:r>
+                    <m:rPr>
+                      <m:sty m:val="p"/>
+                    </m:rPr>
+                    <m:t>=</m:t>
+                  </m:r>
+                  <m:r>
+                    <m:t>1</m:t>
+                  </m:r>
+                  <m:r>
+                    <m:rPr>
+                      <m:sty m:val="p"/>
+                    </m:rPr>
+                    <m:t>,</m:t>
+                  </m:r>
+                  <m:r>
+                    <m:t>Y</m:t>
+                  </m:r>
+                  <m:r>
+                    <m:rPr>
+                      <m:sty m:val="p"/>
+                    </m:rPr>
+                    <m:t>=</m:t>
+                  </m:r>
+                  <m:r>
+                    <m:t>1</m:t>
+                  </m:r>
+                  <m:r>
+                    <m:rPr>
+                      <m:sty m:val="p"/>
+                    </m:rPr>
+                    <m:t>,</m:t>
+                  </m:r>
+                  <m:r>
+                    <m:t>Z</m:t>
+                  </m:r>
+                  <m:r>
+                    <m:rPr>
+                      <m:sty m:val="p"/>
+                    </m:rPr>
+                    <m:t>=</m:t>
+                  </m:r>
+                  <m:r>
+                    <m:t>z</m:t>
+                  </m:r>
+                </m:e>
+              </m:d>
+              <m:r>
+                <m:t>​</m:t>
+              </m:r>
+              <m:r>
+                <m:rPr>
+                  <m:sty m:val="p"/>
+                </m:rPr>
+                <m:t>P</m:t>
+              </m:r>
+              <m:r>
+                <m:t>​</m:t>
+              </m:r>
+              <m:d>
+                <m:dPr>
+                  <m:begChr m:val="("/>
+                  <m:sepChr m:val=""/>
+                  <m:endChr m:val=")"/>
+                  <m:grow/>
+                </m:dPr>
+                <m:e>
+                  <m:r>
+                    <m:t>X</m:t>
+                  </m:r>
+                  <m:r>
+                    <m:rPr>
+                      <m:sty m:val="p"/>
+                    </m:rPr>
+                    <m:t>=</m:t>
+                  </m:r>
+                  <m:r>
+                    <m:t>0</m:t>
+                  </m:r>
+                  <m:r>
+                    <m:rPr>
+                      <m:sty m:val="p"/>
+                    </m:rPr>
+                    <m:t>,</m:t>
+                  </m:r>
+                  <m:r>
+                    <m:t>Y</m:t>
+                  </m:r>
+                  <m:r>
+                    <m:rPr>
+                      <m:sty m:val="p"/>
+                    </m:rPr>
+                    <m:t>=</m:t>
+                  </m:r>
+                  <m:r>
+                    <m:t>0</m:t>
+                  </m:r>
+                  <m:r>
+                    <m:rPr>
+                      <m:sty m:val="p"/>
+                    </m:rPr>
+                    <m:t>,</m:t>
+                  </m:r>
+                  <m:r>
+                    <m:t>Z</m:t>
+                  </m:r>
+                  <m:r>
+                    <m:rPr>
+                      <m:sty m:val="p"/>
+                    </m:rPr>
+                    <m:t>=</m:t>
+                  </m:r>
+                  <m:r>
+                    <m:t>z</m:t>
+                  </m:r>
+                </m:e>
+              </m:d>
+              <m:r>
+                <m:t>​</m:t>
+              </m:r>
+            </m:num>
+            <m:den>
+              <m:r>
+                <m:rPr>
+                  <m:sty m:val="p"/>
+                </m:rPr>
+                <m:t>P</m:t>
+              </m:r>
+              <m:r>
+                <m:t>​</m:t>
+              </m:r>
+              <m:d>
+                <m:dPr>
+                  <m:begChr m:val="("/>
+                  <m:sepChr m:val=""/>
+                  <m:endChr m:val=")"/>
+                  <m:grow/>
+                </m:dPr>
+                <m:e>
+                  <m:r>
+                    <m:t>X</m:t>
+                  </m:r>
+                  <m:r>
+                    <m:rPr>
+                      <m:sty m:val="p"/>
+                    </m:rPr>
+                    <m:t>=</m:t>
+                  </m:r>
+                  <m:r>
+                    <m:t>1</m:t>
+                  </m:r>
+                  <m:r>
+                    <m:rPr>
+                      <m:sty m:val="p"/>
+                    </m:rPr>
+                    <m:t>,</m:t>
+                  </m:r>
+                  <m:r>
+                    <m:t>Y</m:t>
+                  </m:r>
+                  <m:r>
+                    <m:rPr>
+                      <m:sty m:val="p"/>
+                    </m:rPr>
+                    <m:t>=</m:t>
+                  </m:r>
+                  <m:r>
+                    <m:t>0</m:t>
+                  </m:r>
+                  <m:r>
+                    <m:rPr>
+                      <m:sty m:val="p"/>
+                    </m:rPr>
+                    <m:t>,</m:t>
+                  </m:r>
+                  <m:r>
+                    <m:t>Z</m:t>
+                  </m:r>
+                  <m:r>
+                    <m:rPr>
+                      <m:sty m:val="p"/>
+                    </m:rPr>
+                    <m:t>=</m:t>
+                  </m:r>
+                  <m:r>
+                    <m:t>z</m:t>
+                  </m:r>
+                </m:e>
+              </m:d>
+              <m:r>
+                <m:t>​</m:t>
+              </m:r>
+              <m:r>
+                <m:rPr>
+                  <m:sty m:val="p"/>
+                </m:rPr>
+                <m:t>P</m:t>
+              </m:r>
+              <m:r>
+                <m:t>​</m:t>
+              </m:r>
+              <m:d>
+                <m:dPr>
+                  <m:begChr m:val="("/>
+                  <m:sepChr m:val=""/>
+                  <m:endChr m:val=")"/>
+                  <m:grow/>
+                </m:dPr>
+                <m:e>
+                  <m:r>
+                    <m:t>X</m:t>
+                  </m:r>
+                  <m:r>
+                    <m:rPr>
+                      <m:sty m:val="p"/>
+                    </m:rPr>
+                    <m:t>=</m:t>
+                  </m:r>
+                  <m:r>
+                    <m:t>0</m:t>
+                  </m:r>
+                  <m:r>
+                    <m:rPr>
+                      <m:sty m:val="p"/>
+                    </m:rPr>
+                    <m:t>,</m:t>
+                  </m:r>
+                  <m:r>
+                    <m:t>Y</m:t>
+                  </m:r>
+                  <m:r>
+                    <m:rPr>
+                      <m:sty m:val="p"/>
+                    </m:rPr>
+                    <m:t>=</m:t>
+                  </m:r>
+                  <m:r>
+                    <m:t>1</m:t>
+                  </m:r>
+                  <m:r>
+                    <m:rPr>
+                      <m:sty m:val="p"/>
+                    </m:rPr>
+                    <m:t>,</m:t>
+                  </m:r>
+                  <m:r>
+                    <m:t>Z</m:t>
+                  </m:r>
+                  <m:r>
+                    <m:rPr>
+                      <m:sty m:val="p"/>
+                    </m:rPr>
+                    <m:t>=</m:t>
+                  </m:r>
+                  <m:r>
+                    <m:t>z</m:t>
+                  </m:r>
+                </m:e>
+              </m:d>
+              <m:r>
+                <m:t>​</m:t>
+              </m:r>
+            </m:den>
+          </m:f>
+          <m:r>
+            <m:rPr>
+              <m:sty m:val="p"/>
+            </m:rPr>
+            <m:t>.</m:t>
+          </m:r>
+        </m:oMath>
+      </m:oMathPara>
+    </w:p>
+    <w:p>
+      <w:pPr>
+        <w:pStyle w:val="FirstParagraph"/>
+      </w:pPr>
+      <w:r>
+        <w:t xml:space="preserve">The same steps with the roles of</w:t>
+      </w:r>
+      <w:r>
+        <w:t xml:space="preserve"> </w:t>
+      </w:r>
+      <m:oMath>
+        <m:r>
+          <m:t>X</m:t>
+        </m:r>
+      </m:oMath>
+      <w:r>
+        <w:t xml:space="preserve"> </w:t>
+      </w:r>
+      <w:r>
+        <w:t xml:space="preserve">and</w:t>
+      </w:r>
+      <w:r>
+        <w:t xml:space="preserve"> </w:t>
+      </w:r>
+      <m:oMath>
+        <m:r>
+          <m:t>Y</m:t>
+        </m:r>
+      </m:oMath>
+      <w:r>
+        <w:t xml:space="preserve"> </w:t>
+      </w:r>
+      <w:r>
+        <w:t xml:space="preserve">exchanged give</w:t>
+      </w:r>
+    </w:p>
+    <w:p>
+      <w:pPr>
+        <w:pStyle w:val="BodyText"/>
+      </w:pPr>
+      <m:oMathPara>
+        <m:oMathParaPr>
+          <m:jc m:val="center"/>
+        </m:oMathParaPr>
+        <m:oMath>
+          <m:sSub>
+            <m:e>
+              <m:r>
+                <m:rPr>
+                  <m:nor/>
+                  <m:sty m:val="p"/>
+                </m:rPr>
+                <m:t>ϙ</m:t>
+              </m:r>
+            </m:e>
+            <m:sub>
+              <m:r>
+                <m:t>ω</m:t>
+              </m:r>
+            </m:sub>
+          </m:sSub>
+          <m:r>
+            <m:t>​</m:t>
+          </m:r>
+          <m:d>
+            <m:dPr>
+              <m:begChr m:val="("/>
+              <m:sepChr m:val=""/>
+              <m:endChr m:val=")"/>
+              <m:grow/>
+            </m:dPr>
+            <m:e>
+              <m:r>
+                <m:t>X</m:t>
+              </m:r>
+              <m:r>
+                <m:rPr>
+                  <m:sty m:val="p"/>
+                </m:rPr>
+                <m:t>∣</m:t>
+              </m:r>
+              <m:r>
+                <m:t>Y</m:t>
+              </m:r>
+              <m:r>
+                <m:rPr>
+                  <m:sty m:val="p"/>
+                </m:rPr>
+                <m:t>,</m:t>
+              </m:r>
+              <m:r>
+                <m:t>Z</m:t>
+              </m:r>
+              <m:r>
+                <m:rPr>
+                  <m:sty m:val="p"/>
+                </m:rPr>
+                <m:t>=</m:t>
+              </m:r>
+              <m:r>
+                <m:t>z</m:t>
+              </m:r>
+            </m:e>
+          </m:d>
+          <m:r>
+            <m:t>​</m:t>
+          </m:r>
+          <m:r>
+            <m:rPr>
+              <m:sty m:val="p"/>
+            </m:rPr>
+            <m:t>=</m:t>
+          </m:r>
+          <m:f>
+            <m:fPr>
+              <m:type m:val="bar"/>
+            </m:fPr>
+            <m:num>
+              <m:r>
+                <m:rPr>
+                  <m:sty m:val="p"/>
+                </m:rPr>
+                <m:t>P</m:t>
+              </m:r>
+              <m:r>
+                <m:t>​</m:t>
+              </m:r>
+              <m:d>
+                <m:dPr>
+                  <m:begChr m:val="("/>
+                  <m:sepChr m:val=""/>
+                  <m:endChr m:val=")"/>
+                  <m:grow/>
+                </m:dPr>
+                <m:e>
+                  <m:r>
+                    <m:t>Y</m:t>
+                  </m:r>
+                  <m:r>
+                    <m:rPr>
+                      <m:sty m:val="p"/>
+                    </m:rPr>
+                    <m:t>=</m:t>
+                  </m:r>
+                  <m:r>
+                    <m:t>1</m:t>
+                  </m:r>
+                  <m:r>
+                    <m:rPr>
+                      <m:sty m:val="p"/>
+                    </m:rPr>
+                    <m:t>,</m:t>
+                  </m:r>
+                  <m:r>
+                    <m:t>X</m:t>
+                  </m:r>
+                  <m:r>
+                    <m:rPr>
+                      <m:sty m:val="p"/>
+                    </m:rPr>
+                    <m:t>=</m:t>
+                  </m:r>
+                  <m:r>
+                    <m:t>1</m:t>
+                  </m:r>
+                  <m:r>
+                    <m:rPr>
+                      <m:sty m:val="p"/>
+                    </m:rPr>
+                    <m:t>,</m:t>
+                  </m:r>
+                  <m:r>
+                    <m:t>Z</m:t>
+                  </m:r>
+                  <m:r>
+                    <m:rPr>
+                      <m:sty m:val="p"/>
+                    </m:rPr>
+                    <m:t>=</m:t>
+                  </m:r>
+                  <m:r>
+                    <m:t>z</m:t>
+                  </m:r>
+                </m:e>
+              </m:d>
+              <m:r>
+                <m:t>​</m:t>
+              </m:r>
+              <m:r>
+                <m:rPr>
+                  <m:sty m:val="p"/>
+                </m:rPr>
+                <m:t>P</m:t>
+              </m:r>
+              <m:r>
+                <m:t>​</m:t>
+              </m:r>
+              <m:d>
+                <m:dPr>
+                  <m:begChr m:val="("/>
+                  <m:sepChr m:val=""/>
+                  <m:endChr m:val=")"/>
+                  <m:grow/>
+                </m:dPr>
+                <m:e>
+                  <m:r>
+                    <m:t>Y</m:t>
+                  </m:r>
+                  <m:r>
+                    <m:rPr>
+                      <m:sty m:val="p"/>
+                    </m:rPr>
+                    <m:t>=</m:t>
+                  </m:r>
+                  <m:r>
+                    <m:t>0</m:t>
+                  </m:r>
+                  <m:r>
+                    <m:rPr>
+                      <m:sty m:val="p"/>
+                    </m:rPr>
+                    <m:t>,</m:t>
+                  </m:r>
+                  <m:r>
+                    <m:t>X</m:t>
+                  </m:r>
+                  <m:r>
+                    <m:rPr>
+                      <m:sty m:val="p"/>
+                    </m:rPr>
+                    <m:t>=</m:t>
+                  </m:r>
+                  <m:r>
+                    <m:t>0</m:t>
+                  </m:r>
+                  <m:r>
+                    <m:rPr>
+                      <m:sty m:val="p"/>
+                    </m:rPr>
+                    <m:t>,</m:t>
+                  </m:r>
+                  <m:r>
+                    <m:t>Z</m:t>
+                  </m:r>
+                  <m:r>
+                    <m:rPr>
+                      <m:sty m:val="p"/>
+                    </m:rPr>
+                    <m:t>=</m:t>
+                  </m:r>
+                  <m:r>
+                    <m:t>z</m:t>
+                  </m:r>
+                </m:e>
+              </m:d>
+              <m:r>
+                <m:t>​</m:t>
+              </m:r>
+            </m:num>
+            <m:den>
+              <m:r>
+                <m:rPr>
+                  <m:sty m:val="p"/>
+                </m:rPr>
+                <m:t>P</m:t>
+              </m:r>
+              <m:r>
+                <m:t>​</m:t>
+              </m:r>
+              <m:d>
+                <m:dPr>
+                  <m:begChr m:val="("/>
+                  <m:sepChr m:val=""/>
+                  <m:endChr m:val=")"/>
+                  <m:grow/>
+                </m:dPr>
+                <m:e>
+                  <m:r>
+                    <m:t>Y</m:t>
+                  </m:r>
+                  <m:r>
+                    <m:rPr>
+                      <m:sty m:val="p"/>
+                    </m:rPr>
+                    <m:t>=</m:t>
+                  </m:r>
+                  <m:r>
+                    <m:t>1</m:t>
+                  </m:r>
+                  <m:r>
+                    <m:rPr>
+                      <m:sty m:val="p"/>
+                    </m:rPr>
+                    <m:t>,</m:t>
+                  </m:r>
+                  <m:r>
+                    <m:t>X</m:t>
+                  </m:r>
+                  <m:r>
+                    <m:rPr>
+                      <m:sty m:val="p"/>
+                    </m:rPr>
+                    <m:t>=</m:t>
+                  </m:r>
+                  <m:r>
+                    <m:t>0</m:t>
+                  </m:r>
+                  <m:r>
+                    <m:rPr>
+                      <m:sty m:val="p"/>
+                    </m:rPr>
+                    <m:t>,</m:t>
+                  </m:r>
+                  <m:r>
+                    <m:t>Z</m:t>
+                  </m:r>
+                  <m:r>
+                    <m:rPr>
+                      <m:sty m:val="p"/>
+                    </m:rPr>
+                    <m:t>=</m:t>
+                  </m:r>
+                  <m:r>
+                    <m:t>z</m:t>
+                  </m:r>
+                </m:e>
+              </m:d>
+              <m:r>
+                <m:t>​</m:t>
+              </m:r>
+              <m:r>
+                <m:rPr>
+                  <m:sty m:val="p"/>
+                </m:rPr>
+                <m:t>P</m:t>
+              </m:r>
+              <m:r>
+                <m:t>​</m:t>
+              </m:r>
+              <m:d>
+                <m:dPr>
+                  <m:begChr m:val="("/>
+                  <m:sepChr m:val=""/>
+                  <m:endChr m:val=")"/>
+                  <m:grow/>
+                </m:dPr>
+                <m:e>
+                  <m:r>
+                    <m:t>Y</m:t>
+                  </m:r>
+                  <m:r>
+                    <m:rPr>
+                      <m:sty m:val="p"/>
+                    </m:rPr>
+                    <m:t>=</m:t>
+                  </m:r>
+                  <m:r>
+                    <m:t>0</m:t>
+                  </m:r>
+                  <m:r>
+                    <m:rPr>
+                      <m:sty m:val="p"/>
+                    </m:rPr>
+                    <m:t>,</m:t>
+                  </m:r>
+                  <m:r>
+                    <m:t>X</m:t>
+                  </m:r>
+                  <m:r>
+                    <m:rPr>
+                      <m:sty m:val="p"/>
+                    </m:rPr>
+                    <m:t>=</m:t>
+                  </m:r>
+                  <m:r>
+                    <m:t>1</m:t>
+                  </m:r>
+                  <m:r>
+                    <m:rPr>
+                      <m:sty m:val="p"/>
+                    </m:rPr>
+                    <m:t>,</m:t>
+                  </m:r>
+                  <m:r>
+                    <m:t>Z</m:t>
+                  </m:r>
+                  <m:r>
+                    <m:rPr>
+                      <m:sty m:val="p"/>
+                    </m:rPr>
+                    <m:t>=</m:t>
+                  </m:r>
+                  <m:r>
+                    <m:t>z</m:t>
+                  </m:r>
+                </m:e>
+              </m:d>
+              <m:r>
+                <m:t>​</m:t>
+              </m:r>
+            </m:den>
+          </m:f>
+          <m:r>
+            <m:rPr>
+              <m:sty m:val="p"/>
+            </m:rPr>
+            <m:t>.</m:t>
+          </m:r>
+        </m:oMath>
+      </m:oMathPara>
+    </w:p>
+    <w:p>
+      <w:pPr>
+        <w:pStyle w:val="FirstParagraph"/>
+      </w:pPr>
+      <w:r>
+        <w:t xml:space="preserve">The event</w:t>
+      </w:r>
+      <w:r>
+        <w:t xml:space="preserve"> </w:t>
+      </w:r>
+      <m:oMath>
+        <m:r>
+          <m:t>​</m:t>
+        </m:r>
+        <m:d>
+          <m:dPr>
+            <m:begChr m:val="{"/>
+            <m:sepChr m:val=""/>
+            <m:endChr m:val="}"/>
+            <m:grow/>
+          </m:dPr>
+          <m:e>
+            <m:r>
+              <m:t>Y</m:t>
+            </m:r>
+            <m:r>
+              <m:rPr>
+                <m:sty m:val="p"/>
+              </m:rPr>
+              <m:t>=</m:t>
+            </m:r>
+            <m:r>
+              <m:t>y</m:t>
+            </m:r>
+            <m:r>
+              <m:rPr>
+                <m:sty m:val="p"/>
+              </m:rPr>
+              <m:t>,</m:t>
+            </m:r>
+            <m:r>
+              <m:t>X</m:t>
+            </m:r>
+            <m:r>
+              <m:rPr>
+                <m:sty m:val="p"/>
+              </m:rPr>
+              <m:t>=</m:t>
+            </m:r>
+            <m:r>
+              <m:t>x</m:t>
+            </m:r>
+            <m:r>
+              <m:rPr>
+                <m:sty m:val="p"/>
+              </m:rPr>
+              <m:t>,</m:t>
+            </m:r>
+            <m:r>
+              <m:t>Z</m:t>
+            </m:r>
+            <m:r>
+              <m:rPr>
+                <m:sty m:val="p"/>
+              </m:rPr>
+              <m:t>=</m:t>
+            </m:r>
+            <m:r>
+              <m:t>z</m:t>
+            </m:r>
+          </m:e>
+        </m:d>
+        <m:r>
+          <m:t>​</m:t>
+        </m:r>
+      </m:oMath>
+      <w:r>
+        <w:t xml:space="preserve"> </w:t>
+      </w:r>
+      <w:r>
+        <w:t xml:space="preserve">is the event</w:t>
+      </w:r>
+      <w:r>
+        <w:t xml:space="preserve"> </w:t>
+      </w:r>
+      <m:oMath>
+        <m:r>
+          <m:t>​</m:t>
+        </m:r>
+        <m:d>
+          <m:dPr>
+            <m:begChr m:val="{"/>
+            <m:sepChr m:val=""/>
+            <m:endChr m:val="}"/>
+            <m:grow/>
+          </m:dPr>
+          <m:e>
+            <m:r>
+              <m:t>X</m:t>
+            </m:r>
+            <m:r>
+              <m:rPr>
+                <m:sty m:val="p"/>
+              </m:rPr>
+              <m:t>=</m:t>
+            </m:r>
+            <m:r>
+              <m:t>x</m:t>
+            </m:r>
+            <m:r>
+              <m:rPr>
+                <m:sty m:val="p"/>
+              </m:rPr>
+              <m:t>,</m:t>
+            </m:r>
+            <m:r>
+              <m:t>Y</m:t>
+            </m:r>
+            <m:r>
+              <m:rPr>
+                <m:sty m:val="p"/>
+              </m:rPr>
+              <m:t>=</m:t>
+            </m:r>
+            <m:r>
+              <m:t>y</m:t>
+            </m:r>
+            <m:r>
+              <m:rPr>
+                <m:sty m:val="p"/>
+              </m:rPr>
+              <m:t>,</m:t>
+            </m:r>
+            <m:r>
+              <m:t>Z</m:t>
+            </m:r>
+            <m:r>
+              <m:rPr>
+                <m:sty m:val="p"/>
+              </m:rPr>
+              <m:t>=</m:t>
+            </m:r>
+            <m:r>
+              <m:t>z</m:t>
+            </m:r>
+          </m:e>
+        </m:d>
+        <m:r>
+          <m:t>​</m:t>
+        </m:r>
+      </m:oMath>
+      <w:r>
+        <w:t xml:space="preserve">, so each joint</w:t>
+      </w:r>
+      <w:r>
+        <w:t xml:space="preserve"> </w:t>
+      </w:r>
+      <w:hyperlink r:id="rId31">
+        <w:r>
+          <w:rPr>
+            <w:rStyle w:val="Hyperlink"/>
+          </w:rPr>
+          <w:t xml:space="preserve">probability</w:t>
+        </w:r>
+      </w:hyperlink>
+      <w:r>
+        <w:t xml:space="preserve"> </w:t>
+      </w:r>
+      <w:r>
+        <w:t xml:space="preserve">here equals the joint probability with its arguments in the other order.</w:t>
+      </w:r>
+      <w:r>
+        <w:t xml:space="preserve"> </w:t>
+      </w:r>
+      <w:r>
+        <w:t xml:space="preserve">The denominator is a product of two joint probabilities, and multiplication is commutative.</w:t>
+      </w:r>
+      <w:r>
+        <w:t xml:space="preserve"> </w:t>
+      </w:r>
+      <w:r>
+        <w:t xml:space="preserve">Reordering its two factors gives the denominator of the first display.</w:t>
+      </w:r>
+    </w:p>
+    <w:bookmarkStart w:id="64" w:name="X45013e739f674d27d576529951fe29b1e969716"/>
+    <w:p>
+      <w:pPr>
+        <w:pStyle w:val="BodyText"/>
+      </w:pPr>
       <w:r>
         <w:rPr>
           <w:b/>
           <w:bCs/>
         </w:rPr>
+        <w:t xml:space="preserve">Example 14 (Reversing the roles of treatment and exercise within diabetes strata in HERS)</w:t>
+      </w:r>
+      <w:r>
+        <w:t xml:space="preserve"> </w:t>
+      </w:r>
+      <w:r>
+        <w:t xml:space="preserve">In</w:t>
+      </w:r>
+      <w:r>
+        <w:t xml:space="preserve"> </w:t>
+      </w:r>
+      <w:hyperlink w:anchor="exm-hers-odds-ratio-reversible">
+        <w:r>
+          <w:rPr>
+            <w:rStyle w:val="Hyperlink"/>
+          </w:rPr>
+          <w:t xml:space="preserve">Example 13</w:t>
+        </w:r>
+      </w:hyperlink>
+      <w:r>
+        <w:t xml:space="preserve">, the roles of hormone therapy and regular exercise are reversed among all the women.</w:t>
+      </w:r>
+      <w:r>
+        <w:t xml:space="preserve"> </w:t>
+      </w:r>
+      <w:r>
+        <w:t xml:space="preserve">Here the same two</w:t>
+      </w:r>
+      <w:r>
+        <w:t xml:space="preserve"> </w:t>
+      </w:r>
+      <w:hyperlink w:anchor="def-odds-ratio">
+        <w:r>
+          <w:rPr>
+            <w:rStyle w:val="Hyperlink"/>
+          </w:rPr>
+          <w:t xml:space="preserve">odds ratios</w:t>
+        </w:r>
+      </w:hyperlink>
+      <w:r>
+        <w:t xml:space="preserve"> </w:t>
+      </w:r>
+      <w:r>
+        <w:t xml:space="preserve">are computed separately for the women with diabetes and the women without it:</w:t>
+      </w:r>
+    </w:p>
+    <w:p>
+      <w:pPr>
+        <w:pStyle w:val="SourceCode"/>
+      </w:pPr>
+      <w:r>
+        <w:rPr>
+          <w:rStyle w:val="NormalTok"/>
+        </w:rPr>
+        <w:t xml:space="preserve">or_by_diabetes </w:t>
+      </w:r>
+      <w:r>
+        <w:rPr>
+          <w:rStyle w:val="OtherTok"/>
+        </w:rPr>
+        <w:t xml:space="preserve">&lt;-</w:t>
+      </w:r>
+      <w:r>
+        <w:rPr>
+          <w:rStyle w:val="NormalTok"/>
+        </w:rPr>
+        <w:t xml:space="preserve"> </w:t>
+      </w:r>
+      <w:r>
+        <w:rPr>
+          <w:rStyle w:val="FunctionTok"/>
+        </w:rPr>
+        <w:t xml:space="preserve">sapply</w:t>
+      </w:r>
+      <w:r>
+        <w:rPr>
+          <w:rStyle w:val="NormalTok"/>
+        </w:rPr>
+        <w:t xml:space="preserve">(</w:t>
+      </w:r>
+      <w:r>
+        <w:rPr>
+          <w:rStyle w:val="FunctionTok"/>
+        </w:rPr>
+        <w:t xml:space="preserve">c</w:t>
+      </w:r>
+      <w:r>
+        <w:rPr>
+          <w:rStyle w:val="NormalTok"/>
+        </w:rPr>
+        <w:t xml:space="preserve">(</w:t>
+      </w:r>
+      <w:r>
+        <w:rPr>
+          <w:rStyle w:val="StringTok"/>
+        </w:rPr>
+        <w:t xml:space="preserve">"no"</w:t>
+      </w:r>
+      <w:r>
+        <w:rPr>
+          <w:rStyle w:val="NormalTok"/>
+        </w:rPr>
+        <w:t xml:space="preserve">, </w:t>
+      </w:r>
+      <w:r>
+        <w:rPr>
+          <w:rStyle w:val="StringTok"/>
+        </w:rPr>
+        <w:t xml:space="preserve">"yes"</w:t>
+      </w:r>
+      <w:r>
+        <w:rPr>
+          <w:rStyle w:val="NormalTok"/>
+        </w:rPr>
+        <w:t xml:space="preserve">), </w:t>
+      </w:r>
+      <w:r>
+        <w:rPr>
+          <w:rStyle w:val="ControlFlowTok"/>
+        </w:rPr>
+        <w:t xml:space="preserve">function</w:t>
+      </w:r>
+      <w:r>
+        <w:rPr>
+          <w:rStyle w:val="NormalTok"/>
+        </w:rPr>
+        <w:t xml:space="preserve">(z) {</w:t>
+      </w:r>
+      <w:r>
+        <w:br/>
+      </w:r>
+      <w:r>
+        <w:rPr>
+          <w:rStyle w:val="NormalTok"/>
+        </w:rPr>
+        <w:t xml:space="preserve">  counts </w:t>
+      </w:r>
+      <w:r>
+        <w:rPr>
+          <w:rStyle w:val="OtherTok"/>
+        </w:rPr>
+        <w:t xml:space="preserve">&lt;-</w:t>
+      </w:r>
+      <w:r>
+        <w:rPr>
+          <w:rStyle w:val="NormalTok"/>
+        </w:rPr>
+        <w:t xml:space="preserve"> </w:t>
+      </w:r>
+      <w:r>
+        <w:rPr>
+          <w:rStyle w:val="FunctionTok"/>
+        </w:rPr>
+        <w:t xml:space="preserve">table</w:t>
+      </w:r>
+      <w:r>
+        <w:rPr>
+          <w:rStyle w:val="NormalTok"/>
+        </w:rPr>
+        <w:t xml:space="preserve">(</w:t>
+      </w:r>
+      <w:r>
+        <w:br/>
+      </w:r>
+      <w:r>
+        <w:rPr>
+          <w:rStyle w:val="NormalTok"/>
+        </w:rPr>
+        <w:t xml:space="preserve">    </w:t>
+      </w:r>
+      <w:r>
+        <w:rPr>
+          <w:rStyle w:val="AttributeTok"/>
+        </w:rPr>
+        <w:t xml:space="preserve">HT =</w:t>
+      </w:r>
+      <w:r>
+        <w:rPr>
+          <w:rStyle w:val="NormalTok"/>
+        </w:rPr>
+        <w:t xml:space="preserve"> hers</w:t>
+      </w:r>
+      <w:r>
+        <w:rPr>
+          <w:rStyle w:val="SpecialCharTok"/>
+        </w:rPr>
+        <w:t xml:space="preserve">$</w:t>
+      </w:r>
+      <w:r>
+        <w:rPr>
+          <w:rStyle w:val="NormalTok"/>
+        </w:rPr>
+        <w:t xml:space="preserve">HT[hers</w:t>
+      </w:r>
+      <w:r>
+        <w:rPr>
+          <w:rStyle w:val="SpecialCharTok"/>
+        </w:rPr>
+        <w:t xml:space="preserve">$</w:t>
+      </w:r>
+      <w:r>
+        <w:rPr>
+          <w:rStyle w:val="NormalTok"/>
+        </w:rPr>
+        <w:t xml:space="preserve">diabetes </w:t>
+      </w:r>
+      <w:r>
+        <w:rPr>
+          <w:rStyle w:val="SpecialCharTok"/>
+        </w:rPr>
+        <w:t xml:space="preserve">==</w:t>
+      </w:r>
+      <w:r>
+        <w:rPr>
+          <w:rStyle w:val="NormalTok"/>
+        </w:rPr>
+        <w:t xml:space="preserve"> z],</w:t>
+      </w:r>
+      <w:r>
+        <w:br/>
+      </w:r>
+      <w:r>
+        <w:rPr>
+          <w:rStyle w:val="NormalTok"/>
+        </w:rPr>
+        <w:t xml:space="preserve">    </w:t>
+      </w:r>
+      <w:r>
+        <w:rPr>
+          <w:rStyle w:val="AttributeTok"/>
+        </w:rPr>
+        <w:t xml:space="preserve">exercise =</w:t>
+      </w:r>
+      <w:r>
+        <w:rPr>
+          <w:rStyle w:val="NormalTok"/>
+        </w:rPr>
+        <w:t xml:space="preserve"> hers</w:t>
+      </w:r>
+      <w:r>
+        <w:rPr>
+          <w:rStyle w:val="SpecialCharTok"/>
+        </w:rPr>
+        <w:t xml:space="preserve">$</w:t>
+      </w:r>
+      <w:r>
+        <w:rPr>
+          <w:rStyle w:val="NormalTok"/>
+        </w:rPr>
+        <w:t xml:space="preserve">exercise[hers</w:t>
+      </w:r>
+      <w:r>
+        <w:rPr>
+          <w:rStyle w:val="SpecialCharTok"/>
+        </w:rPr>
+        <w:t xml:space="preserve">$</w:t>
+      </w:r>
+      <w:r>
+        <w:rPr>
+          <w:rStyle w:val="NormalTok"/>
+        </w:rPr>
+        <w:t xml:space="preserve">diabetes </w:t>
+      </w:r>
+      <w:r>
+        <w:rPr>
+          <w:rStyle w:val="SpecialCharTok"/>
+        </w:rPr>
+        <w:t xml:space="preserve">==</w:t>
+      </w:r>
+      <w:r>
+        <w:rPr>
+          <w:rStyle w:val="NormalTok"/>
+        </w:rPr>
+        <w:t xml:space="preserve"> z]</w:t>
+      </w:r>
+      <w:r>
+        <w:br/>
+      </w:r>
+      <w:r>
+        <w:rPr>
+          <w:rStyle w:val="NormalTok"/>
+        </w:rPr>
+        <w:t xml:space="preserve">  )</w:t>
+      </w:r>
+      <w:r>
+        <w:br/>
+      </w:r>
+      <w:r>
+        <w:rPr>
+          <w:rStyle w:val="NormalTok"/>
+        </w:rPr>
+        <w:t xml:space="preserve">  ht </w:t>
+      </w:r>
+      <w:r>
+        <w:rPr>
+          <w:rStyle w:val="OtherTok"/>
+        </w:rPr>
+        <w:t xml:space="preserve">&lt;-</w:t>
+      </w:r>
+      <w:r>
+        <w:rPr>
+          <w:rStyle w:val="NormalTok"/>
+        </w:rPr>
+        <w:t xml:space="preserve"> </w:t>
+      </w:r>
+      <w:r>
+        <w:rPr>
+          <w:rStyle w:val="StringTok"/>
+        </w:rPr>
+        <w:t xml:space="preserve">"hormone therapy"</w:t>
+      </w:r>
+      <w:r>
+        <w:br/>
+      </w:r>
+      <w:r>
+        <w:rPr>
+          <w:rStyle w:val="NormalTok"/>
+        </w:rPr>
+        <w:t xml:space="preserve">  </w:t>
+      </w:r>
+      <w:r>
+        <w:rPr>
+          <w:rStyle w:val="FunctionTok"/>
+        </w:rPr>
+        <w:t xml:space="preserve">c</w:t>
+      </w:r>
+      <w:r>
+        <w:rPr>
+          <w:rStyle w:val="NormalTok"/>
+        </w:rPr>
+        <w:t xml:space="preserve">(</w:t>
+      </w:r>
+      <w:r>
+        <w:br/>
+      </w:r>
+      <w:r>
+        <w:rPr>
+          <w:rStyle w:val="NormalTok"/>
+        </w:rPr>
+        <w:t xml:space="preserve">    </w:t>
+      </w:r>
+      <w:r>
+        <w:rPr>
+          <w:rStyle w:val="AttributeTok"/>
+        </w:rPr>
+        <w:t xml:space="preserve">ht_odds_ratio =</w:t>
+      </w:r>
+      <w:r>
+        <w:rPr>
+          <w:rStyle w:val="NormalTok"/>
+        </w:rPr>
+        <w:t xml:space="preserve"> </w:t>
+      </w:r>
+      <w:r>
+        <w:rPr>
+          <w:rStyle w:val="FunctionTok"/>
+        </w:rPr>
+        <w:t xml:space="preserve">unname</w:t>
+      </w:r>
+      <w:r>
+        <w:rPr>
+          <w:rStyle w:val="NormalTok"/>
+        </w:rPr>
+        <w:t xml:space="preserve">(</w:t>
+      </w:r>
+      <w:r>
+        <w:br/>
+      </w:r>
+      <w:r>
+        <w:rPr>
+          <w:rStyle w:val="NormalTok"/>
+        </w:rPr>
+        <w:t xml:space="preserve">      (counts[ht, </w:t>
+      </w:r>
+      <w:r>
+        <w:rPr>
+          <w:rStyle w:val="StringTok"/>
+        </w:rPr>
+        <w:t xml:space="preserve">"yes"</w:t>
+      </w:r>
+      <w:r>
+        <w:rPr>
+          <w:rStyle w:val="NormalTok"/>
+        </w:rPr>
+        <w:t xml:space="preserve">] </w:t>
+      </w:r>
+      <w:r>
+        <w:rPr>
+          <w:rStyle w:val="SpecialCharTok"/>
+        </w:rPr>
+        <w:t xml:space="preserve">/</w:t>
+      </w:r>
+      <w:r>
+        <w:rPr>
+          <w:rStyle w:val="NormalTok"/>
+        </w:rPr>
+        <w:t xml:space="preserve"> counts[</w:t>
+      </w:r>
+      <w:r>
+        <w:rPr>
+          <w:rStyle w:val="StringTok"/>
+        </w:rPr>
+        <w:t xml:space="preserve">"placebo"</w:t>
+      </w:r>
+      <w:r>
+        <w:rPr>
+          <w:rStyle w:val="NormalTok"/>
+        </w:rPr>
+        <w:t xml:space="preserve">, </w:t>
+      </w:r>
+      <w:r>
+        <w:rPr>
+          <w:rStyle w:val="StringTok"/>
+        </w:rPr>
+        <w:t xml:space="preserve">"yes"</w:t>
+      </w:r>
+      <w:r>
+        <w:rPr>
+          <w:rStyle w:val="NormalTok"/>
+        </w:rPr>
+        <w:t xml:space="preserve">]) </w:t>
+      </w:r>
+      <w:r>
+        <w:rPr>
+          <w:rStyle w:val="SpecialCharTok"/>
+        </w:rPr>
+        <w:t xml:space="preserve">/</w:t>
+      </w:r>
+      <w:r>
+        <w:br/>
+      </w:r>
+      <w:r>
+        <w:rPr>
+          <w:rStyle w:val="NormalTok"/>
+        </w:rPr>
+        <w:t xml:space="preserve">        (counts[ht, </w:t>
+      </w:r>
+      <w:r>
+        <w:rPr>
+          <w:rStyle w:val="StringTok"/>
+        </w:rPr>
+        <w:t xml:space="preserve">"no"</w:t>
+      </w:r>
+      <w:r>
+        <w:rPr>
+          <w:rStyle w:val="NormalTok"/>
+        </w:rPr>
+        <w:t xml:space="preserve">] </w:t>
+      </w:r>
+      <w:r>
+        <w:rPr>
+          <w:rStyle w:val="SpecialCharTok"/>
+        </w:rPr>
+        <w:t xml:space="preserve">/</w:t>
+      </w:r>
+      <w:r>
+        <w:rPr>
+          <w:rStyle w:val="NormalTok"/>
+        </w:rPr>
+        <w:t xml:space="preserve"> counts[</w:t>
+      </w:r>
+      <w:r>
+        <w:rPr>
+          <w:rStyle w:val="StringTok"/>
+        </w:rPr>
+        <w:t xml:space="preserve">"placebo"</w:t>
+      </w:r>
+      <w:r>
+        <w:rPr>
+          <w:rStyle w:val="NormalTok"/>
+        </w:rPr>
+        <w:t xml:space="preserve">, </w:t>
+      </w:r>
+      <w:r>
+        <w:rPr>
+          <w:rStyle w:val="StringTok"/>
+        </w:rPr>
+        <w:t xml:space="preserve">"no"</w:t>
+      </w:r>
+      <w:r>
+        <w:rPr>
+          <w:rStyle w:val="NormalTok"/>
+        </w:rPr>
+        <w:t xml:space="preserve">])</w:t>
+      </w:r>
+      <w:r>
+        <w:br/>
+      </w:r>
+      <w:r>
+        <w:rPr>
+          <w:rStyle w:val="NormalTok"/>
+        </w:rPr>
+        <w:t xml:space="preserve">    ),</w:t>
+      </w:r>
+      <w:r>
+        <w:br/>
+      </w:r>
+      <w:r>
+        <w:rPr>
+          <w:rStyle w:val="NormalTok"/>
+        </w:rPr>
+        <w:t xml:space="preserve">    </w:t>
+      </w:r>
+      <w:r>
+        <w:rPr>
+          <w:rStyle w:val="AttributeTok"/>
+        </w:rPr>
+        <w:t xml:space="preserve">exercise_odds_ratio =</w:t>
+      </w:r>
+      <w:r>
+        <w:rPr>
+          <w:rStyle w:val="NormalTok"/>
+        </w:rPr>
+        <w:t xml:space="preserve"> </w:t>
+      </w:r>
+      <w:r>
+        <w:rPr>
+          <w:rStyle w:val="FunctionTok"/>
+        </w:rPr>
+        <w:t xml:space="preserve">unname</w:t>
+      </w:r>
+      <w:r>
+        <w:rPr>
+          <w:rStyle w:val="NormalTok"/>
+        </w:rPr>
+        <w:t xml:space="preserve">(</w:t>
+      </w:r>
+      <w:r>
+        <w:br/>
+      </w:r>
+      <w:r>
+        <w:rPr>
+          <w:rStyle w:val="NormalTok"/>
+        </w:rPr>
+        <w:t xml:space="preserve">      (counts[ht, </w:t>
+      </w:r>
+      <w:r>
+        <w:rPr>
+          <w:rStyle w:val="StringTok"/>
+        </w:rPr>
+        <w:t xml:space="preserve">"yes"</w:t>
+      </w:r>
+      <w:r>
+        <w:rPr>
+          <w:rStyle w:val="NormalTok"/>
+        </w:rPr>
+        <w:t xml:space="preserve">] </w:t>
+      </w:r>
+      <w:r>
+        <w:rPr>
+          <w:rStyle w:val="SpecialCharTok"/>
+        </w:rPr>
+        <w:t xml:space="preserve">/</w:t>
+      </w:r>
+      <w:r>
+        <w:rPr>
+          <w:rStyle w:val="NormalTok"/>
+        </w:rPr>
+        <w:t xml:space="preserve"> counts[ht, </w:t>
+      </w:r>
+      <w:r>
+        <w:rPr>
+          <w:rStyle w:val="StringTok"/>
+        </w:rPr>
+        <w:t xml:space="preserve">"no"</w:t>
+      </w:r>
+      <w:r>
+        <w:rPr>
+          <w:rStyle w:val="NormalTok"/>
+        </w:rPr>
+        <w:t xml:space="preserve">]) </w:t>
+      </w:r>
+      <w:r>
+        <w:rPr>
+          <w:rStyle w:val="SpecialCharTok"/>
+        </w:rPr>
+        <w:t xml:space="preserve">/</w:t>
+      </w:r>
+      <w:r>
+        <w:br/>
+      </w:r>
+      <w:r>
+        <w:rPr>
+          <w:rStyle w:val="NormalTok"/>
+        </w:rPr>
+        <w:t xml:space="preserve">        (counts[</w:t>
+      </w:r>
+      <w:r>
+        <w:rPr>
+          <w:rStyle w:val="StringTok"/>
+        </w:rPr>
+        <w:t xml:space="preserve">"placebo"</w:t>
+      </w:r>
+      <w:r>
+        <w:rPr>
+          <w:rStyle w:val="NormalTok"/>
+        </w:rPr>
+        <w:t xml:space="preserve">, </w:t>
+      </w:r>
+      <w:r>
+        <w:rPr>
+          <w:rStyle w:val="StringTok"/>
+        </w:rPr>
+        <w:t xml:space="preserve">"yes"</w:t>
+      </w:r>
+      <w:r>
+        <w:rPr>
+          <w:rStyle w:val="NormalTok"/>
+        </w:rPr>
+        <w:t xml:space="preserve">] </w:t>
+      </w:r>
+      <w:r>
+        <w:rPr>
+          <w:rStyle w:val="SpecialCharTok"/>
+        </w:rPr>
+        <w:t xml:space="preserve">/</w:t>
+      </w:r>
+      <w:r>
+        <w:rPr>
+          <w:rStyle w:val="NormalTok"/>
+        </w:rPr>
+        <w:t xml:space="preserve"> counts[</w:t>
+      </w:r>
+      <w:r>
+        <w:rPr>
+          <w:rStyle w:val="StringTok"/>
+        </w:rPr>
+        <w:t xml:space="preserve">"placebo"</w:t>
+      </w:r>
+      <w:r>
+        <w:rPr>
+          <w:rStyle w:val="NormalTok"/>
+        </w:rPr>
+        <w:t xml:space="preserve">, </w:t>
+      </w:r>
+      <w:r>
+        <w:rPr>
+          <w:rStyle w:val="StringTok"/>
+        </w:rPr>
+        <w:t xml:space="preserve">"no"</w:t>
+      </w:r>
+      <w:r>
+        <w:rPr>
+          <w:rStyle w:val="NormalTok"/>
+        </w:rPr>
+        <w:t xml:space="preserve">])</w:t>
+      </w:r>
+      <w:r>
+        <w:br/>
+      </w:r>
+      <w:r>
+        <w:rPr>
+          <w:rStyle w:val="NormalTok"/>
+        </w:rPr>
+        <w:t xml:space="preserve">    )</w:t>
+      </w:r>
+      <w:r>
+        <w:br/>
+      </w:r>
+      <w:r>
+        <w:rPr>
+          <w:rStyle w:val="NormalTok"/>
+        </w:rPr>
+        <w:t xml:space="preserve">  )</w:t>
+      </w:r>
+      <w:r>
+        <w:br/>
+      </w:r>
+      <w:r>
+        <w:rPr>
+          <w:rStyle w:val="NormalTok"/>
+        </w:rPr>
+        <w:t xml:space="preserve">})</w:t>
+      </w:r>
+      <w:r>
+        <w:br/>
+      </w:r>
+      <w:r>
+        <w:rPr>
+          <w:rStyle w:val="NormalTok"/>
+        </w:rPr>
+        <w:t xml:space="preserve">or_by_diabetes</w:t>
+      </w:r>
+      <w:r>
+        <w:br/>
+      </w:r>
+      <w:r>
+        <w:rPr>
+          <w:rStyle w:val="CommentTok"/>
+        </w:rPr>
+        <w:t xml:space="preserve">#&gt;                          no     yes</w:t>
+      </w:r>
+      <w:r>
+        <w:br/>
+      </w:r>
+      <w:r>
+        <w:rPr>
+          <w:rStyle w:val="CommentTok"/>
+        </w:rPr>
+        <w:t xml:space="preserve">#&gt; ht_odds_ratio       1.02222 1.08842</w:t>
+      </w:r>
+      <w:r>
+        <w:br/>
+      </w:r>
+      <w:r>
+        <w:rPr>
+          <w:rStyle w:val="CommentTok"/>
+        </w:rPr>
+        <w:t xml:space="preserve">#&gt; exercise_odds_ratio 1.02222 1.08842</w:t>
+      </w:r>
+    </w:p>
+    <w:p>
+      <w:pPr>
+        <w:pStyle w:val="FirstParagraph"/>
+      </w:pPr>
+      <w:r>
+        <w:t xml:space="preserve">The first row compares the</w:t>
+      </w:r>
+      <w:r>
+        <w:t xml:space="preserve"> </w:t>
+      </w:r>
+      <w:hyperlink r:id="rId54">
+        <w:r>
+          <w:rPr>
+            <w:rStyle w:val="Hyperlink"/>
+          </w:rPr>
+          <w:t xml:space="preserve">odds</w:t>
+        </w:r>
+      </w:hyperlink>
+      <w:r>
+        <w:t xml:space="preserve"> </w:t>
+      </w:r>
+      <w:r>
+        <w:t xml:space="preserve">of hormone therapy between the women who exercise regularly and those who do not.</w:t>
+      </w:r>
+      <w:r>
+        <w:t xml:space="preserve"> </w:t>
+      </w:r>
+      <w:r>
+        <w:t xml:space="preserve">The second row compares the odds of regular exercise between the hormone therapy and placebo groups.</w:t>
+      </w:r>
+      <w:r>
+        <w:t xml:space="preserve"> </w:t>
+      </w:r>
+      <w:r>
+        <w:t xml:space="preserve">Among the women without diabetes the two odds ratios are 1.022 and 1.022, and among the women with diabetes they are 1.088 and 1.088.</w:t>
+      </w:r>
+      <w:r>
+        <w:t xml:space="preserve"> </w:t>
+      </w:r>
+      <w:r>
+        <w:t xml:space="preserve">In each stratum the two agree, as</w:t>
+      </w:r>
+      <w:r>
+        <w:t xml:space="preserve"> </w:t>
+      </w:r>
+      <w:hyperlink w:anchor="thm-conditional-odds-ratio-reversible">
+        <w:r>
+          <w:rPr>
+            <w:rStyle w:val="Hyperlink"/>
+          </w:rPr>
+          <w:t xml:space="preserve">Theorem 6</w:t>
+        </w:r>
+      </w:hyperlink>
+      <w:r>
+        <w:t xml:space="preserve"> </w:t>
+      </w:r>
+      <w:r>
+        <w:t xml:space="preserve">states.</w:t>
+      </w:r>
+      <w:r>
+        <w:t xml:space="preserve"> </w:t>
+      </w:r>
+      <w:r>
+        <w:t xml:space="preserve">The stratum odds ratios differ from the</w:t>
+      </w:r>
+      <w:r>
+        <w:t xml:space="preserve"> </w:t>
+      </w:r>
+      <w:hyperlink w:anchor="def-odds-ratio">
+        <w:r>
+          <w:rPr>
+            <w:rStyle w:val="Hyperlink"/>
+          </w:rPr>
+          <w:t xml:space="preserve">odds ratio</w:t>
+        </w:r>
+      </w:hyperlink>
+      <w:r>
+        <w:t xml:space="preserve"> </w:t>
+      </w:r>
+      <w:r>
+        <w:t xml:space="preserve">1.028 of</w:t>
+      </w:r>
+      <w:r>
+        <w:t xml:space="preserve"> </w:t>
+      </w:r>
+      <w:hyperlink w:anchor="exm-hers-odds-ratio">
+        <w:r>
+          <w:rPr>
+            <w:rStyle w:val="Hyperlink"/>
+          </w:rPr>
+          <w:t xml:space="preserve">Example 11</w:t>
+        </w:r>
+      </w:hyperlink>
+      <w:r>
+        <w:t xml:space="preserve"> </w:t>
+      </w:r>
+      <w:r>
+        <w:t xml:space="preserve">for all the women, because the theorem equates the two odds ratios within a stratum, not either one with the marginal odds ratio.</w:t>
+      </w:r>
+    </w:p>
+    <w:bookmarkEnd w:id="64"/>
+    <w:bookmarkStart w:id="65" w:name="def-case"/>
+    <w:p>
+      <w:pPr>
+        <w:pStyle w:val="BodyText"/>
+      </w:pPr>
+      <w:r>
+        <w:rPr>
+          <w:b/>
+          <w:bCs/>
+        </w:rPr>
+        <w:t xml:space="preserve">Definition 9 (Case)</w:t>
+      </w:r>
+      <w:r>
+        <w:t xml:space="preserve"> </w:t>
+      </w:r>
+      <w:r>
+        <w:t xml:space="preserve">In a study that selects its participants by whether they have an outcome of interest,</w:t>
+      </w:r>
+      <w:r>
+        <w:t xml:space="preserve"> </w:t>
+      </w:r>
+      <w:r>
+        <w:t xml:space="preserve">a</w:t>
+      </w:r>
+      <w:r>
+        <w:t xml:space="preserve"> </w:t>
+      </w:r>
+      <w:r>
+        <w:rPr>
+          <w:b/>
+          <w:bCs/>
+        </w:rPr>
         <w:t xml:space="preserve">case</w:t>
       </w:r>
       <w:r>
@@ -13993,8 +17519,8 @@
         <w:t xml:space="preserve">.</w:t>
       </w:r>
     </w:p>
-    <w:bookmarkEnd w:id="63"/>
-    <w:bookmarkStart w:id="64" w:name="def-control"/>
+    <w:bookmarkEnd w:id="65"/>
+    <w:bookmarkStart w:id="66" w:name="def-control"/>
     <w:p>
       <w:pPr>
         <w:pStyle w:val="BodyText"/>
@@ -14078,8 +17604,8 @@
         <w:t xml:space="preserve">.</w:t>
       </w:r>
     </w:p>
-    <w:bookmarkEnd w:id="64"/>
-    <w:bookmarkStart w:id="66" w:name="def-case-control-study"/>
+    <w:bookmarkEnd w:id="66"/>
+    <w:bookmarkStart w:id="68" w:name="def-case-control-study"/>
     <w:p>
       <w:pPr>
         <w:pStyle w:val="BodyText"/>
@@ -14156,7 +17682,7 @@
       <w:r>
         <w:t xml:space="preserve"> </w:t>
       </w:r>
-      <w:hyperlink r:id="rId65">
+      <w:hyperlink r:id="rId67">
         <w:r>
           <w:rPr>
             <w:rStyle w:val="Hyperlink"/>
@@ -14203,8 +17729,8 @@
         <w:t xml:space="preserve">.</w:t>
       </w:r>
     </w:p>
-    <w:bookmarkEnd w:id="66"/>
-    <w:bookmarkStart w:id="67" w:name="exm-hers-case-control-study"/>
+    <w:bookmarkEnd w:id="68"/>
+    <w:bookmarkStart w:id="69" w:name="exm-hers-case-control-study"/>
     <w:p>
       <w:pPr>
         <w:pStyle w:val="BodyText"/>
@@ -14214,7 +17740,7 @@
           <w:b/>
           <w:bCs/>
         </w:rPr>
-        <w:t xml:space="preserve">Example 14 (A case-control study of regular exercise in HERS)</w:t>
+        <w:t xml:space="preserve">Example 15 (A case-control study of regular exercise in HERS)</w:t>
       </w:r>
       <w:r>
         <w:t xml:space="preserve"> </w:t>
@@ -14802,8 +18328,8 @@
         <w:t xml:space="preserve">.</w:t>
       </w:r>
     </w:p>
-    <w:bookmarkEnd w:id="67"/>
-    <w:bookmarkStart w:id="68" w:name="rem-control-in-experiments"/>
+    <w:bookmarkEnd w:id="69"/>
+    <w:bookmarkStart w:id="70" w:name="rem-control-in-experiments"/>
     <w:p>
       <w:pPr>
         <w:pStyle w:val="BodyText"/>
@@ -14920,7 +18446,7 @@
         <w:t xml:space="preserve">.</w:t>
       </w:r>
     </w:p>
-    <w:bookmarkEnd w:id="68"/>
+    <w:bookmarkEnd w:id="70"/>
     <w:p>
       <w:pPr>
         <w:pStyle w:val="BodyText"/>
@@ -14935,9 +18461,9 @@
         <w:t xml:space="preserve">covers odds ratios.</w:t>
       </w:r>
     </w:p>
-    <w:bookmarkEnd w:id="69"/>
-    <w:bookmarkEnd w:id="70"/>
-    <w:bookmarkStart w:id="89" w:name="references"/>
+    <w:bookmarkEnd w:id="71"/>
+    <w:bookmarkEnd w:id="72"/>
+    <w:bookmarkStart w:id="91" w:name="references"/>
     <w:p>
       <w:pPr>
         <w:pStyle w:val="Heading2"/>
@@ -14946,8 +18472,8 @@
         <w:t xml:space="preserve">References</w:t>
       </w:r>
     </w:p>
-    <w:bookmarkStart w:id="88" w:name="refs"/>
-    <w:bookmarkStart w:id="72" w:name="ref-vittinghoff2e"/>
+    <w:bookmarkStart w:id="90" w:name="refs"/>
+    <w:bookmarkStart w:id="74" w:name="ref-vittinghoff2e"/>
     <w:p>
       <w:pPr>
         <w:pStyle w:val="Bibliography"/>
@@ -14980,7 +18506,7 @@
       <w:r>
         <w:t xml:space="preserve"> </w:t>
       </w:r>
-      <w:hyperlink r:id="rId71">
+      <w:hyperlink r:id="rId73">
         <w:r>
           <w:rPr>
             <w:rStyle w:val="Hyperlink"/>
@@ -14992,8 +18518,8 @@
         <w:t xml:space="preserve">.</w:t>
       </w:r>
     </w:p>
-    <w:bookmarkEnd w:id="72"/>
-    <w:bookmarkStart w:id="73" w:name="ref-hoggtanis2015"/>
+    <w:bookmarkEnd w:id="74"/>
+    <w:bookmarkStart w:id="75" w:name="ref-hoggtanis2015"/>
     <w:p>
       <w:pPr>
         <w:pStyle w:val="Bibliography"/>
@@ -15024,8 +18550,8 @@
         <w:t xml:space="preserve">, Tenth edition. Boston: Pearson, 2019.</w:t>
       </w:r>
     </w:p>
-    <w:bookmarkEnd w:id="73"/>
-    <w:bookmarkStart w:id="75" w:name="ref-wikipedia_contingency_table"/>
+    <w:bookmarkEnd w:id="75"/>
+    <w:bookmarkStart w:id="77" w:name="ref-wikipedia_contingency_table"/>
     <w:p>
       <w:pPr>
         <w:pStyle w:val="Bibliography"/>
@@ -15072,7 +18598,7 @@
       <w:r>
         <w:t xml:space="preserve"> </w:t>
       </w:r>
-      <w:hyperlink r:id="rId74">
+      <w:hyperlink r:id="rId76">
         <w:r>
           <w:rPr>
             <w:rStyle w:val="Hyperlink"/>
@@ -15081,8 +18607,8 @@
         </w:r>
       </w:hyperlink>
     </w:p>
-    <w:bookmarkEnd w:id="75"/>
-    <w:bookmarkStart w:id="77" w:name="ref-wikipedia_pearsons_chi_squared_test"/>
+    <w:bookmarkEnd w:id="77"/>
+    <w:bookmarkStart w:id="79" w:name="ref-wikipedia_pearsons_chi_squared_test"/>
     <w:p>
       <w:pPr>
         <w:pStyle w:val="Bibliography"/>
@@ -15129,7 +18655,7 @@
       <w:r>
         <w:t xml:space="preserve"> </w:t>
       </w:r>
-      <w:hyperlink r:id="rId76">
+      <w:hyperlink r:id="rId78">
         <w:r>
           <w:rPr>
             <w:rStyle w:val="Hyperlink"/>
@@ -15138,8 +18664,8 @@
         </w:r>
       </w:hyperlink>
     </w:p>
-    <w:bookmarkEnd w:id="77"/>
-    <w:bookmarkStart w:id="78" w:name="ref-rice2007mathematical"/>
+    <w:bookmarkEnd w:id="79"/>
+    <w:bookmarkStart w:id="80" w:name="ref-rice2007mathematical"/>
     <w:p>
       <w:pPr>
         <w:pStyle w:val="Bibliography"/>
@@ -15170,8 +18696,8 @@
         <w:t xml:space="preserve">, 3rd ed. Belmont, CA: Cengage Learning, 2007.</w:t>
       </w:r>
     </w:p>
-    <w:bookmarkEnd w:id="78"/>
-    <w:bookmarkStart w:id="80" w:name="ref-wikipedia_fishers_exact_test"/>
+    <w:bookmarkEnd w:id="80"/>
+    <w:bookmarkStart w:id="82" w:name="ref-wikipedia_fishers_exact_test"/>
     <w:p>
       <w:pPr>
         <w:pStyle w:val="Bibliography"/>
@@ -15218,7 +18744,7 @@
       <w:r>
         <w:t xml:space="preserve"> </w:t>
       </w:r>
-      <w:hyperlink r:id="rId79">
+      <w:hyperlink r:id="rId81">
         <w:r>
           <w:rPr>
             <w:rStyle w:val="Hyperlink"/>
@@ -15227,8 +18753,8 @@
         </w:r>
       </w:hyperlink>
     </w:p>
-    <w:bookmarkEnd w:id="80"/>
-    <w:bookmarkStart w:id="82" w:name="ref-wikipedia_relative_risk"/>
+    <w:bookmarkEnd w:id="82"/>
+    <w:bookmarkStart w:id="84" w:name="ref-wikipedia_relative_risk"/>
     <w:p>
       <w:pPr>
         <w:pStyle w:val="Bibliography"/>
@@ -15275,7 +18801,7 @@
       <w:r>
         <w:t xml:space="preserve"> </w:t>
       </w:r>
-      <w:hyperlink r:id="rId81">
+      <w:hyperlink r:id="rId83">
         <w:r>
           <w:rPr>
             <w:rStyle w:val="Hyperlink"/>
@@ -15284,8 +18810,8 @@
         </w:r>
       </w:hyperlink>
     </w:p>
-    <w:bookmarkEnd w:id="82"/>
-    <w:bookmarkStart w:id="83" w:name="ref-me4"/>
+    <w:bookmarkEnd w:id="84"/>
+    <w:bookmarkStart w:id="85" w:name="ref-me4"/>
     <w:p>
       <w:pPr>
         <w:pStyle w:val="Bibliography"/>
@@ -15316,8 +18842,8 @@
         <w:t xml:space="preserve">, 4th ed. Philadelphia: Wolters Kluwer, 2021.</w:t>
       </w:r>
     </w:p>
-    <w:bookmarkEnd w:id="83"/>
-    <w:bookmarkStart w:id="85" w:name="ref-wikipedia_absolute_risk_reduction"/>
+    <w:bookmarkEnd w:id="85"/>
+    <w:bookmarkStart w:id="87" w:name="ref-wikipedia_absolute_risk_reduction"/>
     <w:p>
       <w:pPr>
         <w:pStyle w:val="Bibliography"/>
@@ -15364,7 +18890,7 @@
       <w:r>
         <w:t xml:space="preserve"> </w:t>
       </w:r>
-      <w:hyperlink r:id="rId84">
+      <w:hyperlink r:id="rId86">
         <w:r>
           <w:rPr>
             <w:rStyle w:val="Hyperlink"/>
@@ -15373,8 +18899,8 @@
         </w:r>
       </w:hyperlink>
     </w:p>
-    <w:bookmarkEnd w:id="85"/>
-    <w:bookmarkStart w:id="87" w:name="ref-wikipedia_odds_ratio"/>
+    <w:bookmarkEnd w:id="87"/>
+    <w:bookmarkStart w:id="89" w:name="ref-wikipedia_odds_ratio"/>
     <w:p>
       <w:pPr>
         <w:pStyle w:val="Bibliography"/>
@@ -15421,7 +18947,7 @@
       <w:r>
         <w:t xml:space="preserve"> </w:t>
       </w:r>
-      <w:hyperlink r:id="rId86">
+      <w:hyperlink r:id="rId88">
         <w:r>
           <w:rPr>
             <w:rStyle w:val="Hyperlink"/>
@@ -15430,9 +18956,9 @@
         </w:r>
       </w:hyperlink>
     </w:p>
-    <w:bookmarkEnd w:id="87"/>
-    <w:bookmarkEnd w:id="88"/>
     <w:bookmarkEnd w:id="89"/>
+    <w:bookmarkEnd w:id="90"/>
+    <w:bookmarkEnd w:id="91"/>
     <w:sectPr>
       <w:footnotePr>
         <w:numRestart w:val="eachSect"/>
@@ -15683,6 +19209,9 @@
     <w:abstractNumId w:val="991"/>
   </w:num>
   <w:num w:numId="1012">
+    <w:abstractNumId w:val="991"/>
+  </w:num>
+  <w:num w:numId="1013">
     <w:abstractNumId w:val="991"/>
   </w:num>
 </w:numbering>

</xml_diff>